<commit_message>
Draft_013: prefer Working Test over structural position for potential+noun
When position and Working Test conflict, code as Lexical hedge (EC) if
removing the token changes epistemic commitment—even in intro/rationale.
Applied in Coding Revisions and Appendix A Extensions.
</commit_message>
<xml_diff>
--- a/thesis/003_ThesisProposal_Draft_013.docx
+++ b/thesis/003_ThesisProposal_Draft_013.docx
@@ -3272,7 +3272,7 @@
           <w:szCs w:val="22"/>
           <w:rtl w:val="0"/>
         </w:rPr>
-        <w:t xml:space="preserve">Following an initial coding pass, borderline tokens were re-examined using the contextual decision rules in Appendix A. Particular attention was given to potentially ambiguous forms such as can, potential, indicating, and possibility, because these forms may function either as epistemic hedges or as non-epistemic lexical items depending on context. Four rule refinements were applied during this revision pass. First, “can” combined with an active content verb describing a treatment effect (enhance, promote, reduce, help) was classified as capability (FP-Cap) regardless of whether it appeared inside a “suggests that” clause, because the Working Test showed that removing “can” alone did not change the epistemic weight of the clause when “suggests” was already carrying the hedge. Second, the “indicating” tautology test was extended beyond numeric restatement to cover field-standard interpretive thresholds: “non-toxic” from no mortality observed, “limited benefits” from poor performance, and “superior feed efficiency” from lower feed conversion ratio were all reclassified as operational restatements (FP-Gen) rather than inferential hedges. Third, the “potential + noun” topic-naming rule was extended to “possibility + noun” in aim and methods sentences. Fourth, a multi-hedge Working Test rule was added: when a sentence contains multiple hedge-like tokens, each token is tested individually in isolation, ignoring the other hedges in the sentence; a token counts only if removing it alone changes the epistemic weight of its own clause. The final corpus therefore reflects contextual rather than purely lexical classification, and the 63 rejected candidates document the decision trail for tokens that were considered but ultimately excluded. Additionally, the outlier abstract Acs2 was found to use a repeated hedging template (“This suggests that while X might not have been Y, Z could still [verb] beneficial effects”) twice with light variation, inflating its own token count through formulaic repetition rather than independent hedging decisions.</w:t>
+        <w:t xml:space="preserve">Following an initial coding pass, borderline tokens were re-examined using the contextual decision rules in Appendix A. Particular attention was given to potentially ambiguous forms such as can, potential, indicating, and possibility, because these forms may function either as epistemic hedges or as non-epistemic lexical items depending on context. Four rule refinements were applied during this revision pass. First, “can” combined with an active content verb describing a treatment effect (enhance, promote, reduce, help) was classified as capability (FP-Cap) regardless of whether it appeared inside a “suggests that” clause, because the Working Test showed that removing “can” alone did not change the epistemic weight of the clause when “suggests” was already carrying the hedge. Second, the “indicating” tautology test was extended beyond numeric restatement to cover field-standard interpretive thresholds: “non-toxic” from no mortality observed, “limited benefits” from poor performance, and “superior feed efficiency” from lower feed conversion ratio were all reclassified as operational restatements (FP-Gen) rather than inferential hedges. Third, the “potential + noun” topic-naming rule was extended to “possibility + noun” in aim and methods sentences. Structural position is used as a coding heuristic for these forms, but the Working Test takes priority when the two conflict: a token that changes epistemic commitment is coded as a Lexical hedge (EC) even in an introduction or rationale sentence. Fourth, a multi-hedge Working Test rule was added: when a sentence contains multiple hedge-like tokens, each token is tested individually in isolation, ignoring the other hedges in the sentence; a token counts only if removing it alone changes the epistemic weight of its own clause. The final corpus therefore reflects contextual rather than purely lexical classification, and the 63 rejected candidates document the decision trail for tokens that were considered but ultimately excluded. Additionally, the outlier abstract Acs2 was found to use a repeated hedging template (“This suggests that while X might not have been Y, Z could still [verb] beneficial effects”) twice with light variation, inflating its own token count through formulaic repetition rather than independent hedging decisions.</w:t>
       </w:r>
       <w:r>
         <w:rPr>
@@ -12233,7 +12233,7 @@
           <w:szCs w:val="22"/>
           <w:rtl w:val="0"/>
         </w:rPr>
-        <w:t xml:space="preserve">Extensions: </w:t>
+        <w:t xml:space="preserve">Extensions: “imply/implies/implying” functions as suggest. “Can be concluded / derived / stated / attributed to / seen as” is an inferential hedge, distinct from capability “can” (see Decision Rules). “Potentially” is an adverbial hedge. “Potential” naming the research object itself (e.g., “assessed the potential of X”) is not markable, it names a topic rather than qualifying a claim. Stricter rule for “potential + noun” constructions: if the phrase sits in an introduction/rationale sentence (motivating why the topic matters, before any data is presented), treat as topic-naming (FP-Gen) regardless of the verb used. If it sits in a results/conclusion sentence qualifying a claim about findings, treat as a Lexical hedge (EC). The distinction is structural position, not verb choice. Prefer the Working Test over structural position when the two conflict: if removing the token changes the writer’s commitment to a proposition, code it as a Lexical hedge (EC) even in an introduction or rationale sentence.</w:t>
       </w:r>
       <w:r>
         <w:rPr>
@@ -12247,21 +12247,21 @@
           <w:szCs w:val="22"/>
           <w:rtl w:val="0"/>
         </w:rPr>
-        <w:t xml:space="preserve">“imply/implies/implying”</w:t>
-      </w:r>
-      <w:r>
-        <w:rPr>
-          <w:rFonts w:ascii="Georgia" w:cs="Georgia" w:eastAsia="Georgia" w:hAnsi="Georgia"/>
-          <w:b w:val="0"/>
-          <w:bCs w:val="0"/>
-          <w:i w:val="0"/>
-          <w:iCs w:val="0"/>
-          <w:color w:val="000000"/>
-          <w:sz w:val="22"/>
-          <w:szCs w:val="22"/>
-          <w:rtl w:val="0"/>
-        </w:rPr>
-        <w:t xml:space="preserve"> functions as </w:t>
+        <w:t xml:space="preserve"/>
+      </w:r>
+      <w:r>
+        <w:rPr>
+          <w:rFonts w:ascii="Georgia" w:cs="Georgia" w:eastAsia="Georgia" w:hAnsi="Georgia"/>
+          <w:b w:val="0"/>
+          <w:bCs w:val="0"/>
+          <w:i w:val="0"/>
+          <w:iCs w:val="0"/>
+          <w:color w:val="000000"/>
+          <w:sz w:val="22"/>
+          <w:szCs w:val="22"/>
+          <w:rtl w:val="0"/>
+        </w:rPr>
+        <w:t xml:space="preserve"/>
       </w:r>
       <w:r>
         <w:rPr>
@@ -12275,21 +12275,21 @@
           <w:szCs w:val="22"/>
           <w:rtl w:val="0"/>
         </w:rPr>
-        <w:t xml:space="preserve">suggest</w:t>
-      </w:r>
-      <w:r>
-        <w:rPr>
-          <w:rFonts w:ascii="Georgia" w:cs="Georgia" w:eastAsia="Georgia" w:hAnsi="Georgia"/>
-          <w:b w:val="0"/>
-          <w:bCs w:val="0"/>
-          <w:i w:val="0"/>
-          <w:iCs w:val="0"/>
-          <w:color w:val="000000"/>
-          <w:sz w:val="22"/>
-          <w:szCs w:val="22"/>
-          <w:rtl w:val="0"/>
-        </w:rPr>
-        <w:t xml:space="preserve">. </w:t>
+        <w:t xml:space="preserve"/>
+      </w:r>
+      <w:r>
+        <w:rPr>
+          <w:rFonts w:ascii="Georgia" w:cs="Georgia" w:eastAsia="Georgia" w:hAnsi="Georgia"/>
+          <w:b w:val="0"/>
+          <w:bCs w:val="0"/>
+          <w:i w:val="0"/>
+          <w:iCs w:val="0"/>
+          <w:color w:val="000000"/>
+          <w:sz w:val="22"/>
+          <w:szCs w:val="22"/>
+          <w:rtl w:val="0"/>
+        </w:rPr>
+        <w:t xml:space="preserve"/>
       </w:r>
       <w:r>
         <w:rPr>
@@ -12303,21 +12303,21 @@
           <w:szCs w:val="22"/>
           <w:rtl w:val="0"/>
         </w:rPr>
-        <w:t xml:space="preserve">“Can be concluded / derived / stated / attributed to / seen as”</w:t>
-      </w:r>
-      <w:r>
-        <w:rPr>
-          <w:rFonts w:ascii="Georgia" w:cs="Georgia" w:eastAsia="Georgia" w:hAnsi="Georgia"/>
-          <w:b w:val="0"/>
-          <w:bCs w:val="0"/>
-          <w:i w:val="0"/>
-          <w:iCs w:val="0"/>
-          <w:color w:val="000000"/>
-          <w:sz w:val="22"/>
-          <w:szCs w:val="22"/>
-          <w:rtl w:val="0"/>
-        </w:rPr>
-        <w:t xml:space="preserve"> is an inferential hedge, distinct from capability </w:t>
+        <w:t xml:space="preserve"/>
+      </w:r>
+      <w:r>
+        <w:rPr>
+          <w:rFonts w:ascii="Georgia" w:cs="Georgia" w:eastAsia="Georgia" w:hAnsi="Georgia"/>
+          <w:b w:val="0"/>
+          <w:bCs w:val="0"/>
+          <w:i w:val="0"/>
+          <w:iCs w:val="0"/>
+          <w:color w:val="000000"/>
+          <w:sz w:val="22"/>
+          <w:szCs w:val="22"/>
+          <w:rtl w:val="0"/>
+        </w:rPr>
+        <w:t xml:space="preserve"/>
       </w:r>
       <w:r>
         <w:rPr>
@@ -12331,21 +12331,21 @@
           <w:szCs w:val="22"/>
           <w:rtl w:val="0"/>
         </w:rPr>
-        <w:t xml:space="preserve">“can”</w:t>
-      </w:r>
-      <w:r>
-        <w:rPr>
-          <w:rFonts w:ascii="Georgia" w:cs="Georgia" w:eastAsia="Georgia" w:hAnsi="Georgia"/>
-          <w:b w:val="0"/>
-          <w:bCs w:val="0"/>
-          <w:i w:val="0"/>
-          <w:iCs w:val="0"/>
-          <w:color w:val="000000"/>
-          <w:sz w:val="22"/>
-          <w:szCs w:val="22"/>
-          <w:rtl w:val="0"/>
-        </w:rPr>
-        <w:t xml:space="preserve"> (see Decision Rules). </w:t>
+        <w:t xml:space="preserve"/>
+      </w:r>
+      <w:r>
+        <w:rPr>
+          <w:rFonts w:ascii="Georgia" w:cs="Georgia" w:eastAsia="Georgia" w:hAnsi="Georgia"/>
+          <w:b w:val="0"/>
+          <w:bCs w:val="0"/>
+          <w:i w:val="0"/>
+          <w:iCs w:val="0"/>
+          <w:color w:val="000000"/>
+          <w:sz w:val="22"/>
+          <w:szCs w:val="22"/>
+          <w:rtl w:val="0"/>
+        </w:rPr>
+        <w:t xml:space="preserve"/>
       </w:r>
       <w:r>
         <w:rPr>
@@ -12359,21 +12359,21 @@
           <w:szCs w:val="22"/>
           <w:rtl w:val="0"/>
         </w:rPr>
-        <w:t xml:space="preserve">“Potentially”</w:t>
-      </w:r>
-      <w:r>
-        <w:rPr>
-          <w:rFonts w:ascii="Georgia" w:cs="Georgia" w:eastAsia="Georgia" w:hAnsi="Georgia"/>
-          <w:b w:val="0"/>
-          <w:bCs w:val="0"/>
-          <w:i w:val="0"/>
-          <w:iCs w:val="0"/>
-          <w:color w:val="000000"/>
-          <w:sz w:val="22"/>
-          <w:szCs w:val="22"/>
-          <w:rtl w:val="0"/>
-        </w:rPr>
-        <w:t xml:space="preserve"> is an adverbial hedge. </w:t>
+        <w:t xml:space="preserve"/>
+      </w:r>
+      <w:r>
+        <w:rPr>
+          <w:rFonts w:ascii="Georgia" w:cs="Georgia" w:eastAsia="Georgia" w:hAnsi="Georgia"/>
+          <w:b w:val="0"/>
+          <w:bCs w:val="0"/>
+          <w:i w:val="0"/>
+          <w:iCs w:val="0"/>
+          <w:color w:val="000000"/>
+          <w:sz w:val="22"/>
+          <w:szCs w:val="22"/>
+          <w:rtl w:val="0"/>
+        </w:rPr>
+        <w:t xml:space="preserve"/>
       </w:r>
       <w:r>
         <w:rPr>
@@ -12387,21 +12387,21 @@
           <w:szCs w:val="22"/>
           <w:rtl w:val="0"/>
         </w:rPr>
-        <w:t xml:space="preserve">“Potential”</w:t>
-      </w:r>
-      <w:r>
-        <w:rPr>
-          <w:rFonts w:ascii="Georgia" w:cs="Georgia" w:eastAsia="Georgia" w:hAnsi="Georgia"/>
-          <w:b w:val="0"/>
-          <w:bCs w:val="0"/>
-          <w:i w:val="0"/>
-          <w:iCs w:val="0"/>
-          <w:color w:val="000000"/>
-          <w:sz w:val="22"/>
-          <w:szCs w:val="22"/>
-          <w:rtl w:val="0"/>
-        </w:rPr>
-        <w:t xml:space="preserve"> naming the research object itself (e.g., </w:t>
+        <w:t xml:space="preserve"/>
+      </w:r>
+      <w:r>
+        <w:rPr>
+          <w:rFonts w:ascii="Georgia" w:cs="Georgia" w:eastAsia="Georgia" w:hAnsi="Georgia"/>
+          <w:b w:val="0"/>
+          <w:bCs w:val="0"/>
+          <w:i w:val="0"/>
+          <w:iCs w:val="0"/>
+          <w:color w:val="000000"/>
+          <w:sz w:val="22"/>
+          <w:szCs w:val="22"/>
+          <w:rtl w:val="0"/>
+        </w:rPr>
+        <w:t xml:space="preserve"/>
       </w:r>
       <w:r>
         <w:rPr>
@@ -12415,21 +12415,21 @@
           <w:szCs w:val="22"/>
           <w:rtl w:val="0"/>
         </w:rPr>
-        <w:t xml:space="preserve">“assessed the potential of X”</w:t>
-      </w:r>
-      <w:r>
-        <w:rPr>
-          <w:rFonts w:ascii="Georgia" w:cs="Georgia" w:eastAsia="Georgia" w:hAnsi="Georgia"/>
-          <w:b w:val="0"/>
-          <w:bCs w:val="0"/>
-          <w:i w:val="0"/>
-          <w:iCs w:val="0"/>
-          <w:color w:val="000000"/>
-          <w:sz w:val="22"/>
-          <w:szCs w:val="22"/>
-          <w:rtl w:val="0"/>
-        </w:rPr>
-        <w:t xml:space="preserve">) is not markable, it names a topic rather than qualifying a claim. </w:t>
+        <w:t xml:space="preserve"/>
+      </w:r>
+      <w:r>
+        <w:rPr>
+          <w:rFonts w:ascii="Georgia" w:cs="Georgia" w:eastAsia="Georgia" w:hAnsi="Georgia"/>
+          <w:b w:val="0"/>
+          <w:bCs w:val="0"/>
+          <w:i w:val="0"/>
+          <w:iCs w:val="0"/>
+          <w:color w:val="000000"/>
+          <w:sz w:val="22"/>
+          <w:szCs w:val="22"/>
+          <w:rtl w:val="0"/>
+        </w:rPr>
+        <w:t xml:space="preserve"/>
       </w:r>
       <w:r>
         <w:rPr>
@@ -12443,7 +12443,7 @@
           <w:szCs w:val="22"/>
           <w:rtl w:val="0"/>
         </w:rPr>
-        <w:t xml:space="preserve">Stricter rule for “potential + noun” constructions: if the phrase sits in an introduction/rationale sentence (motivating why the topic matters, before any data is presented), treat as topic-naming (FP-Gen) regardless of the verb used. If it sits in a results/conclusion sentence qualifying a claim about findings, treat as a Lexical hedge (EC). The distinction is structural position, not verb choice.</w:t>
+        <w:t xml:space="preserve"/>
       </w:r>
       <w:r>
         <w:rPr>

</xml_diff>

<commit_message>
Draft_013 final: fix Extensions bold; add PDF export
- Unbold Extensions paragraph (prior edit had left entire run bold)
- Export 003_ThesisProposal_Draft_013.pdf for viewer-stable formatting
</commit_message>
<xml_diff>
--- a/thesis/003_ThesisProposal_Draft_013.docx
+++ b/thesis/003_ThesisProposal_Draft_013.docx
@@ -12224,8 +12224,6 @@
       <w:r>
         <w:rPr>
           <w:rFonts w:ascii="Georgia" w:cs="Georgia" w:eastAsia="Georgia" w:hAnsi="Georgia"/>
-          <w:b w:val="1"/>
-          <w:bCs w:val="1"/>
           <w:i w:val="0"/>
           <w:iCs w:val="0"/>
           <w:color w:val="000000"/>
@@ -12238,8 +12236,6 @@
       <w:r>
         <w:rPr>
           <w:rFonts w:ascii="Georgia" w:cs="Georgia" w:eastAsia="Georgia" w:hAnsi="Georgia"/>
-          <w:b w:val="0"/>
-          <w:bCs w:val="0"/>
           <w:i w:val="1"/>
           <w:iCs w:val="1"/>
           <w:color w:val="000000"/>
@@ -12252,8 +12248,6 @@
       <w:r>
         <w:rPr>
           <w:rFonts w:ascii="Georgia" w:cs="Georgia" w:eastAsia="Georgia" w:hAnsi="Georgia"/>
-          <w:b w:val="0"/>
-          <w:bCs w:val="0"/>
           <w:i w:val="0"/>
           <w:iCs w:val="0"/>
           <w:color w:val="000000"/>
@@ -12266,8 +12260,6 @@
       <w:r>
         <w:rPr>
           <w:rFonts w:ascii="Georgia" w:cs="Georgia" w:eastAsia="Georgia" w:hAnsi="Georgia"/>
-          <w:b w:val="0"/>
-          <w:bCs w:val="0"/>
           <w:i w:val="1"/>
           <w:iCs w:val="1"/>
           <w:color w:val="000000"/>
@@ -12280,8 +12272,6 @@
       <w:r>
         <w:rPr>
           <w:rFonts w:ascii="Georgia" w:cs="Georgia" w:eastAsia="Georgia" w:hAnsi="Georgia"/>
-          <w:b w:val="0"/>
-          <w:bCs w:val="0"/>
           <w:i w:val="0"/>
           <w:iCs w:val="0"/>
           <w:color w:val="000000"/>
@@ -12294,8 +12284,6 @@
       <w:r>
         <w:rPr>
           <w:rFonts w:ascii="Georgia" w:cs="Georgia" w:eastAsia="Georgia" w:hAnsi="Georgia"/>
-          <w:b w:val="0"/>
-          <w:bCs w:val="0"/>
           <w:i w:val="1"/>
           <w:iCs w:val="1"/>
           <w:color w:val="000000"/>
@@ -12308,8 +12296,6 @@
       <w:r>
         <w:rPr>
           <w:rFonts w:ascii="Georgia" w:cs="Georgia" w:eastAsia="Georgia" w:hAnsi="Georgia"/>
-          <w:b w:val="0"/>
-          <w:bCs w:val="0"/>
           <w:i w:val="0"/>
           <w:iCs w:val="0"/>
           <w:color w:val="000000"/>
@@ -12322,8 +12308,6 @@
       <w:r>
         <w:rPr>
           <w:rFonts w:ascii="Georgia" w:cs="Georgia" w:eastAsia="Georgia" w:hAnsi="Georgia"/>
-          <w:b w:val="0"/>
-          <w:bCs w:val="0"/>
           <w:i w:val="1"/>
           <w:iCs w:val="1"/>
           <w:color w:val="000000"/>
@@ -12336,8 +12320,6 @@
       <w:r>
         <w:rPr>
           <w:rFonts w:ascii="Georgia" w:cs="Georgia" w:eastAsia="Georgia" w:hAnsi="Georgia"/>
-          <w:b w:val="0"/>
-          <w:bCs w:val="0"/>
           <w:i w:val="0"/>
           <w:iCs w:val="0"/>
           <w:color w:val="000000"/>
@@ -12350,8 +12332,6 @@
       <w:r>
         <w:rPr>
           <w:rFonts w:ascii="Georgia" w:cs="Georgia" w:eastAsia="Georgia" w:hAnsi="Georgia"/>
-          <w:b w:val="0"/>
-          <w:bCs w:val="0"/>
           <w:i w:val="1"/>
           <w:iCs w:val="1"/>
           <w:color w:val="000000"/>
@@ -12364,8 +12344,6 @@
       <w:r>
         <w:rPr>
           <w:rFonts w:ascii="Georgia" w:cs="Georgia" w:eastAsia="Georgia" w:hAnsi="Georgia"/>
-          <w:b w:val="0"/>
-          <w:bCs w:val="0"/>
           <w:i w:val="0"/>
           <w:iCs w:val="0"/>
           <w:color w:val="000000"/>
@@ -12378,8 +12356,6 @@
       <w:r>
         <w:rPr>
           <w:rFonts w:ascii="Georgia" w:cs="Georgia" w:eastAsia="Georgia" w:hAnsi="Georgia"/>
-          <w:b w:val="0"/>
-          <w:bCs w:val="0"/>
           <w:i w:val="1"/>
           <w:iCs w:val="1"/>
           <w:color w:val="000000"/>
@@ -12392,8 +12368,6 @@
       <w:r>
         <w:rPr>
           <w:rFonts w:ascii="Georgia" w:cs="Georgia" w:eastAsia="Georgia" w:hAnsi="Georgia"/>
-          <w:b w:val="0"/>
-          <w:bCs w:val="0"/>
           <w:i w:val="0"/>
           <w:iCs w:val="0"/>
           <w:color w:val="000000"/>
@@ -12406,8 +12380,6 @@
       <w:r>
         <w:rPr>
           <w:rFonts w:ascii="Georgia" w:cs="Georgia" w:eastAsia="Georgia" w:hAnsi="Georgia"/>
-          <w:b w:val="0"/>
-          <w:bCs w:val="0"/>
           <w:i w:val="1"/>
           <w:iCs w:val="1"/>
           <w:color w:val="000000"/>
@@ -12420,8 +12392,6 @@
       <w:r>
         <w:rPr>
           <w:rFonts w:ascii="Georgia" w:cs="Georgia" w:eastAsia="Georgia" w:hAnsi="Georgia"/>
-          <w:b w:val="0"/>
-          <w:bCs w:val="0"/>
           <w:i w:val="0"/>
           <w:iCs w:val="0"/>
           <w:color w:val="000000"/>
@@ -12434,8 +12404,6 @@
       <w:r>
         <w:rPr>
           <w:rFonts w:ascii="Georgia" w:cs="Georgia" w:eastAsia="Georgia" w:hAnsi="Georgia"/>
-          <w:b w:val="0"/>
-          <w:bCs w:val="0"/>
           <w:i w:val="1"/>
           <w:iCs w:val="1"/>
           <w:color w:val="000000"/>

</xml_diff>

<commit_message>
Draft_013: tighten body spacing; drop trailing blank page
- Remove 62 empty body paragraphs (INTRO–REFERENCES); heading
  spacing already provides separation
- Remove final nextPage sectPr that produced an empty last page
- Re-export PDF (109 pages; last page has content)
</commit_message>
<xml_diff>
--- a/thesis/003_ThesisProposal_Draft_013.docx
+++ b/thesis/003_ThesisProposal_Draft_013.docx
@@ -638,37 +638,6 @@
     </w:p>
     <w:p>
       <w:pPr>
-        <w:spacing w:after="0" w:before="0" w:lineRule="auto"/>
-        <w:rPr/>
-      </w:pPr>
-      <w:r>
-        <w:rPr>
-          <w:rtl w:val="0"/>
-        </w:rPr>
-      </w:r>
-    </w:p>
-    <w:p>
-      <w:pPr>
-        <w:rPr/>
-      </w:pPr>
-      <w:r>
-        <w:rPr>
-          <w:rtl w:val="0"/>
-        </w:rPr>
-      </w:r>
-    </w:p>
-    <w:p>
-      <w:pPr>
-        <w:rPr/>
-      </w:pPr>
-      <w:r>
-        <w:rPr>
-          <w:rtl w:val="0"/>
-        </w:rPr>
-      </w:r>
-    </w:p>
-    <w:p>
-      <w:pPr>
         <w:keepNext w:val="1"/>
         <w:keepLines w:val="1"/>
         <w:spacing w:after="240" w:before="240" w:line="480" w:lineRule="auto"/>
@@ -800,16 +769,6 @@
     </w:p>
     <w:p>
       <w:pPr>
-        <w:rPr/>
-      </w:pPr>
-      <w:r>
-        <w:rPr>
-          <w:rtl w:val="0"/>
-        </w:rPr>
-      </w:r>
-    </w:p>
-    <w:p>
-      <w:pPr>
         <w:keepNext w:val="1"/>
         <w:keepLines w:val="1"/>
         <w:spacing w:after="240" w:before="240" w:line="480" w:lineRule="auto"/>
@@ -889,16 +848,6 @@
     </w:p>
     <w:p>
       <w:pPr>
-        <w:rPr/>
-      </w:pPr>
-      <w:r>
-        <w:rPr>
-          <w:rtl w:val="0"/>
-        </w:rPr>
-      </w:r>
-    </w:p>
-    <w:p>
-      <w:pPr>
         <w:keepNext w:val="1"/>
         <w:keepLines w:val="1"/>
         <w:spacing w:after="240" w:before="240" w:line="480" w:lineRule="auto"/>
@@ -978,16 +927,6 @@
     </w:p>
     <w:p>
       <w:pPr>
-        <w:rPr/>
-      </w:pPr>
-      <w:r>
-        <w:rPr>
-          <w:rtl w:val="0"/>
-        </w:rPr>
-      </w:r>
-    </w:p>
-    <w:p>
-      <w:pPr>
         <w:keepNext w:val="1"/>
         <w:keepLines w:val="1"/>
         <w:spacing w:after="240" w:before="240" w:line="480" w:lineRule="auto"/>
@@ -1120,16 +1059,6 @@
     </w:p>
     <w:p>
       <w:pPr>
-        <w:rPr/>
-      </w:pPr>
-      <w:r>
-        <w:rPr>
-          <w:rtl w:val="0"/>
-        </w:rPr>
-      </w:r>
-    </w:p>
-    <w:p>
-      <w:pPr>
         <w:keepNext w:val="1"/>
         <w:keepLines w:val="1"/>
         <w:spacing w:after="240" w:before="240" w:line="480" w:lineRule="auto"/>
@@ -1190,6 +1119,19 @@
       </w:pPr>
       <w:r>
         <w:rPr>
+          <w:rFonts w:ascii="Georgia" w:cs="Georgia" w:eastAsia="Georgia" w:hAnsi="Georgia"/>
+          <w:b w:val="0"/>
+          <w:bCs w:val="0"/>
+          <w:i w:val="0"/>
+          <w:iCs w:val="0"/>
+          <w:sz w:val="22"/>
+          <w:szCs w:val="22"/>
+          <w:rtl w:val="0"/>
+        </w:rPr>
+        <w:t xml:space="preserve">Across the literature, expert writers show measurable disciplinary differentiation in hedging shaped by epistemic demands rather than a simple hard/soft divide (Salager-Meyer, 1994; Afshar et al., 2014). Developing researchers across contexts show limited hedge variety and tend to default to modal verbs (Khunasathitchai et al., 2025; Wang, 2022). L2 writers face additional constraints from linguistic factors and limited explicit instruction (Demir, 2018; Petchkij, 2019). Philippine and ASEAN studies confirm reliance on modals and, in some contexts, a preference for boosters (Ningrum et al., 2024; Escalona, 2025; Lopez et al., 2025).</w:t>
+      </w:r>
+      <w:r>
+        <w:rPr>
           <w:rtl w:val="0"/>
         </w:rPr>
       </w:r>
@@ -1212,44 +1154,8 @@
           <w:szCs w:val="22"/>
           <w:rtl w:val="0"/>
         </w:rPr>
-        <w:t xml:space="preserve">Across the literature, expert writers show measurable disciplinary differentiation in hedging shaped by epistemic demands rather than a simple hard/soft divide (Salager-Meyer, 1994; Afshar et al., 2014). Developing researchers across contexts show limited hedge variety and tend to default to modal verbs (Khunasathitchai et al., 2025; Wang, 2022). L2 writers face additional constraints from linguistic factors and limited explicit instruction (Demir, 2018; Petchkij, 2019). Philippine and ASEAN studies confirm reliance on modals and, in some contexts, a preference for boosters (Ningrum et al., 2024; Escalona, 2025; Lopez et al., 2025).</w:t>
-      </w:r>
-      <w:r>
-        <w:rPr>
-          <w:rtl w:val="0"/>
-        </w:rPr>
-      </w:r>
-    </w:p>
-    <w:p>
-      <w:pPr>
-        <w:spacing w:after="0" w:before="0" w:line="480" w:lineRule="auto"/>
-        <w:ind w:firstLine="720"/>
-        <w:jc w:val="both"/>
-        <w:rPr/>
-      </w:pPr>
-      <w:r>
-        <w:rPr>
-          <w:rFonts w:ascii="Georgia" w:cs="Georgia" w:eastAsia="Georgia" w:hAnsi="Georgia"/>
-          <w:b w:val="0"/>
-          <w:bCs w:val="0"/>
-          <w:i w:val="0"/>
-          <w:iCs w:val="0"/>
-          <w:sz w:val="22"/>
-          <w:szCs w:val="22"/>
-          <w:rtl w:val="0"/>
-        </w:rPr>
         <w:t xml:space="preserve">No published study identified in this review has examined hedging in undergraduate thesis abstracts from applied science disciplines in a Philippine L2 context. This study addresses that intersection at PSAU by mapping hedging patterns across three applied life sciences programs that share an institution but differ in their relationship to evidence.</w:t>
       </w:r>
-      <w:r>
-        <w:rPr>
-          <w:rtl w:val="0"/>
-        </w:rPr>
-      </w:r>
-    </w:p>
-    <w:p>
-      <w:pPr>
-        <w:rPr/>
-      </w:pPr>
       <w:r>
         <w:rPr>
           <w:rtl w:val="0"/>
@@ -1437,16 +1343,6 @@
     </w:p>
     <w:p>
       <w:pPr>
-        <w:rPr/>
-      </w:pPr>
-      <w:r>
-        <w:rPr>
-          <w:rtl w:val="0"/>
-        </w:rPr>
-      </w:r>
-    </w:p>
-    <w:p>
-      <w:pPr>
         <w:keepNext w:val="1"/>
         <w:keepLines w:val="1"/>
         <w:spacing w:after="240" w:before="240" w:line="480" w:lineRule="auto"/>
@@ -1628,63 +1524,6 @@
     </w:p>
     <w:p>
       <w:pPr>
-        <w:spacing w:after="240" w:before="120" w:lineRule="auto"/>
-        <w:jc w:val="center"/>
-        <w:rPr/>
-      </w:pPr>
-      <w:r>
-        <w:rPr/>
-        <w:drawing>
-          <wp:inline distB="0" distT="0" distL="114300" distR="114300">
-            <wp:extent cx="5029200" cy="3981450"/>
-            <wp:effectExtent b="0" l="0" r="0" t="0"/>
-            <wp:docPr id="1" name="image1.png"/>
-            <a:graphic>
-              <a:graphicData uri="http://schemas.openxmlformats.org/drawingml/2006/picture">
-                <pic:pic>
-                  <pic:nvPicPr>
-                    <pic:cNvPr id="0" name="image1.png"/>
-                    <pic:cNvPicPr preferRelativeResize="0"/>
-                  </pic:nvPicPr>
-                  <pic:blipFill>
-                    <a:blip r:embed="rId8"/>
-                    <a:srcRect b="0" l="0" r="0" t="0"/>
-                    <a:stretch>
-                      <a:fillRect/>
-                    </a:stretch>
-                  </pic:blipFill>
-                  <pic:spPr>
-                    <a:xfrm>
-                      <a:off x="0" y="0"/>
-                      <a:ext cx="5029200" cy="3981450"/>
-                    </a:xfrm>
-                    <a:prstGeom prst="rect"/>
-                    <a:ln/>
-                  </pic:spPr>
-                </pic:pic>
-              </a:graphicData>
-            </a:graphic>
-          </wp:inline>
-        </w:drawing>
-      </w:r>
-      <w:r>
-        <w:rPr>
-          <w:rtl w:val="0"/>
-        </w:rPr>
-      </w:r>
-    </w:p>
-    <w:p>
-      <w:pPr>
-        <w:rPr/>
-      </w:pPr>
-      <w:r>
-        <w:rPr>
-          <w:rtl w:val="0"/>
-        </w:rPr>
-      </w:r>
-    </w:p>
-    <w:p>
-      <w:pPr>
         <w:keepNext w:val="1"/>
         <w:keepLines w:val="1"/>
         <w:spacing w:after="240" w:before="240" w:line="480" w:lineRule="auto"/>
@@ -1828,16 +1667,6 @@
     </w:p>
     <w:p>
       <w:pPr>
-        <w:rPr/>
-      </w:pPr>
-      <w:r>
-        <w:rPr>
-          <w:rtl w:val="0"/>
-        </w:rPr>
-      </w:r>
-    </w:p>
-    <w:p>
-      <w:pPr>
         <w:keepNext w:val="1"/>
         <w:keepLines w:val="1"/>
         <w:spacing w:after="240" w:before="240" w:line="480" w:lineRule="auto"/>
@@ -2015,16 +1844,6 @@
         </w:rPr>
         <w:t xml:space="preserve">Crucially, this study analyzes the archived thesis abstract as a ratified textual product rather than a measure of individual cognition. Undergraduate theses are heavily supervised, and abstracts are often the product of multiple revisions guided by advisers. Consequently, observed hedging patterns do not solely reflect the independent rhetorical choices or internalized norms of developing researchers; rather, they reflect the standards of the disciplinary community as enforced by faculty advisers. Therefore, while the study investigates patterns within texts produced by developing researchers, its claims are limited to the epistemic stance constructed in the final abstracts and the departmental standards they represent, rather than the internal cognitive processes of the writers themselves. The findings are strictly descriptive of the observed patterns within the PSAU context.</w:t>
       </w:r>
-      <w:r>
-        <w:rPr>
-          <w:rtl w:val="0"/>
-        </w:rPr>
-      </w:r>
-    </w:p>
-    <w:p>
-      <w:pPr>
-        <w:rPr/>
-      </w:pPr>
       <w:r>
         <w:rPr>
           <w:rtl w:val="0"/>
@@ -2640,26 +2459,6 @@
     </w:p>
     <w:p>
       <w:pPr>
-        <w:rPr/>
-      </w:pPr>
-      <w:r>
-        <w:rPr>
-          <w:rtl w:val="0"/>
-        </w:rPr>
-      </w:r>
-    </w:p>
-    <w:p>
-      <w:pPr>
-        <w:rPr/>
-      </w:pPr>
-      <w:r>
-        <w:rPr>
-          <w:rtl w:val="0"/>
-        </w:rPr>
-      </w:r>
-    </w:p>
-    <w:p>
-      <w:pPr>
         <w:keepNext w:val="1"/>
         <w:keepLines w:val="1"/>
         <w:spacing w:after="0" w:before="0" w:line="480" w:lineRule="auto"/>
@@ -2687,37 +2486,6 @@
     </w:p>
     <w:p>
       <w:pPr>
-        <w:spacing w:after="0" w:before="0" w:lineRule="auto"/>
-        <w:rPr/>
-      </w:pPr>
-      <w:r>
-        <w:rPr>
-          <w:rtl w:val="0"/>
-        </w:rPr>
-      </w:r>
-    </w:p>
-    <w:p>
-      <w:pPr>
-        <w:rPr/>
-      </w:pPr>
-      <w:r>
-        <w:rPr>
-          <w:rtl w:val="0"/>
-        </w:rPr>
-      </w:r>
-    </w:p>
-    <w:p>
-      <w:pPr>
-        <w:rPr/>
-      </w:pPr>
-      <w:r>
-        <w:rPr>
-          <w:rtl w:val="0"/>
-        </w:rPr>
-      </w:r>
-    </w:p>
-    <w:p>
-      <w:pPr>
         <w:spacing w:after="0" w:before="0" w:line="480" w:lineRule="auto"/>
         <w:ind w:firstLine="720"/>
         <w:jc w:val="both"/>
@@ -2736,16 +2504,6 @@
         </w:rPr>
         <w:t xml:space="preserve">This chapter describes the research design, institutional context, data collection process, and corpus selection for the study. Each methodological decision was justified by the nature of the research questions and the practical constraints of an undergraduate thesis.</w:t>
       </w:r>
-      <w:r>
-        <w:rPr>
-          <w:rtl w:val="0"/>
-        </w:rPr>
-      </w:r>
-    </w:p>
-    <w:p>
-      <w:pPr>
-        <w:rPr/>
-      </w:pPr>
       <w:r>
         <w:rPr>
           <w:rtl w:val="0"/>
@@ -2859,16 +2617,6 @@
     </w:p>
     <w:p>
       <w:pPr>
-        <w:rPr/>
-      </w:pPr>
-      <w:r>
-        <w:rPr>
-          <w:rtl w:val="0"/>
-        </w:rPr>
-      </w:r>
-    </w:p>
-    <w:p>
-      <w:pPr>
         <w:keepNext w:val="1"/>
         <w:keepLines w:val="1"/>
         <w:spacing w:after="240" w:before="240" w:line="480" w:lineRule="auto"/>
@@ -2922,16 +2670,6 @@
     </w:p>
     <w:p>
       <w:pPr>
-        <w:rPr/>
-      </w:pPr>
-      <w:r>
-        <w:rPr>
-          <w:rtl w:val="0"/>
-        </w:rPr>
-      </w:r>
-    </w:p>
-    <w:p>
-      <w:pPr>
         <w:keepNext w:val="1"/>
         <w:keepLines w:val="1"/>
         <w:spacing w:after="240" w:before="240" w:line="480" w:lineRule="auto"/>
@@ -3219,16 +2957,6 @@
     </w:p>
     <w:p>
       <w:pPr>
-        <w:rPr/>
-      </w:pPr>
-      <w:r>
-        <w:rPr>
-          <w:rtl w:val="0"/>
-        </w:rPr>
-      </w:r>
-    </w:p>
-    <w:p>
-      <w:pPr>
         <w:keepNext w:val="1"/>
         <w:keepLines w:val="1"/>
         <w:spacing w:after="240" w:before="240" w:line="480" w:lineRule="auto"/>
@@ -3282,16 +3010,6 @@
     </w:p>
     <w:p>
       <w:pPr>
-        <w:rPr/>
-      </w:pPr>
-      <w:r>
-        <w:rPr>
-          <w:rtl w:val="0"/>
-        </w:rPr>
-      </w:r>
-    </w:p>
-    <w:p>
-      <w:pPr>
         <w:keepNext w:val="1"/>
         <w:keepLines w:val="1"/>
         <w:spacing w:after="240" w:before="240" w:line="480" w:lineRule="auto"/>
@@ -3337,62 +3055,6 @@
         </w:rPr>
         <w:t xml:space="preserve">This study uses a text corpus rather than human participants. The corpus consists of 60 undergraduate thesis abstracts from Agriculture, Veterinary Medicine, and Biology programs at PSAU. This study employs disproportionate stratified systematic sampling, with discipline as the stratification variable and fixed analytical targets per stratum (n=20 for Biology, n=20 for Veterinary Medicine, n=10 for Animal Science, and n=10 for Crop Science) to ensure equal representation regardless of population size. This means the sampling rate varies by population size, prioritizing equal sample sizes over proportional representation. For the Agriculture discipline, the sample is equally split between Crop Science (n=10) and Animal Science (n=10) to ensure balanced representation of the sub-disciplines. Within each stratum, a sampling interval k was calculated as k = N/n. The intervals were Biology k=7 (145÷20=7.25), Veterinary Medicine k=5 (104÷20=5.2), Animal Science k=4 (38÷10=3.8), and Crop Science k=9 (94÷10=9.4). Sampling began from a randomly selected position around the middle of each stratum’s catalog, proceeded forward by taking every kth thesis, and wrapped around to the beginning of the catalog when needed until the target sample was met. This sample size is appropriate for the study’s scope. Khunasathitchai et al. (2025) used 60 abstracts in a comparable corpus study, and Wang (2022) used similar per-discipline proportions. For a manually coded functional analysis at a single institution, 60 texts allow sufficient depth of interpretation within the timeframe and resources of a BA thesis. The study treats findings as baseline descriptive data for institutional curriculum review.</w:t>
       </w:r>
-      <w:r>
-        <w:rPr>
-          <w:rtl w:val="0"/>
-        </w:rPr>
-      </w:r>
-    </w:p>
-    <w:p>
-      <w:pPr>
-        <w:spacing w:after="0" w:before="240" w:lineRule="auto"/>
-        <w:rPr>
-          <w:b w:val="1"/>
-          <w:bCs w:val="1"/>
-        </w:rPr>
-      </w:pPr>
-      <w:r>
-        <w:rPr>
-          <w:rtl w:val="0"/>
-        </w:rPr>
-      </w:r>
-    </w:p>
-    <w:p>
-      <w:pPr>
-        <w:spacing w:after="0" w:before="240" w:lineRule="auto"/>
-        <w:rPr>
-          <w:b w:val="1"/>
-          <w:bCs w:val="1"/>
-        </w:rPr>
-      </w:pPr>
-      <w:r>
-        <w:rPr>
-          <w:rtl w:val="0"/>
-        </w:rPr>
-      </w:r>
-    </w:p>
-    <w:p>
-      <w:pPr>
-        <w:spacing w:after="0" w:before="240" w:lineRule="auto"/>
-        <w:rPr>
-          <w:b w:val="1"/>
-          <w:bCs w:val="1"/>
-        </w:rPr>
-      </w:pPr>
-      <w:r>
-        <w:rPr>
-          <w:rtl w:val="0"/>
-        </w:rPr>
-      </w:r>
-    </w:p>
-    <w:p>
-      <w:pPr>
-        <w:spacing w:after="0" w:before="240" w:lineRule="auto"/>
-        <w:rPr>
-          <w:b w:val="1"/>
-          <w:bCs w:val="1"/>
-        </w:rPr>
-      </w:pPr>
       <w:r>
         <w:rPr>
           <w:rtl w:val="0"/>
@@ -4488,19 +4150,6 @@
       </w:pPr>
       <w:r>
         <w:rPr>
-          <w:rtl w:val="0"/>
-        </w:rPr>
-      </w:r>
-    </w:p>
-    <w:p>
-      <w:pPr>
-        <w:spacing w:after="0" w:before="0" w:line="480" w:lineRule="auto"/>
-        <w:ind w:firstLine="720"/>
-        <w:jc w:val="both"/>
-        <w:rPr/>
-      </w:pPr>
-      <w:r>
-        <w:rPr>
           <w:rFonts w:ascii="Georgia" w:cs="Georgia" w:eastAsia="Georgia" w:hAnsi="Georgia"/>
           <w:b w:val="0"/>
           <w:bCs w:val="0"/>
@@ -4645,26 +4294,6 @@
     </w:p>
     <w:p>
       <w:pPr>
-        <w:rPr/>
-      </w:pPr>
-      <w:r>
-        <w:rPr>
-          <w:rtl w:val="0"/>
-        </w:rPr>
-      </w:r>
-    </w:p>
-    <w:p>
-      <w:pPr>
-        <w:rPr/>
-      </w:pPr>
-      <w:r>
-        <w:rPr>
-          <w:rtl w:val="0"/>
-        </w:rPr>
-      </w:r>
-    </w:p>
-    <w:p>
-      <w:pPr>
         <w:keepNext w:val="1"/>
         <w:keepLines w:val="1"/>
         <w:spacing w:after="0" w:before="0" w:line="480" w:lineRule="auto"/>
@@ -4692,37 +4321,6 @@
     </w:p>
     <w:p>
       <w:pPr>
-        <w:spacing w:after="0" w:before="0" w:lineRule="auto"/>
-        <w:rPr/>
-      </w:pPr>
-      <w:r>
-        <w:rPr>
-          <w:rtl w:val="0"/>
-        </w:rPr>
-      </w:r>
-    </w:p>
-    <w:p>
-      <w:pPr>
-        <w:rPr/>
-      </w:pPr>
-      <w:r>
-        <w:rPr>
-          <w:rtl w:val="0"/>
-        </w:rPr>
-      </w:r>
-    </w:p>
-    <w:p>
-      <w:pPr>
-        <w:rPr/>
-      </w:pPr>
-      <w:r>
-        <w:rPr>
-          <w:rtl w:val="0"/>
-        </w:rPr>
-      </w:r>
-    </w:p>
-    <w:p>
-      <w:pPr>
         <w:spacing w:after="0" w:before="0" w:line="480" w:lineRule="auto"/>
         <w:ind w:firstLine="720"/>
         <w:jc w:val="both"/>
@@ -4741,16 +4339,6 @@
         </w:rPr>
         <w:t xml:space="preserve">This chapter presents the results, analysis, and discussion of the hedging patterns identified in the 60 undergraduate thesis abstracts across Agriculture, Veterinary Medicine, and Biology at Pampanga State Agricultural University. The chapter is organized into four parts, each corresponding to a research question. Part I presents the types of hedging devices found across the three disciplines. Part II examines how hedge frequency varies across Agriculture, Veterinary Medicine, and Biology. Part III identifies the rhetorical functions served by the hedging devices. Part IV discusses what the frequency and functional patterns suggest about the discipline-specific hedging profile of developing researchers.</w:t>
       </w:r>
-      <w:r>
-        <w:rPr>
-          <w:rtl w:val="0"/>
-        </w:rPr>
-      </w:r>
-    </w:p>
-    <w:p>
-      <w:pPr>
-        <w:rPr/>
-      </w:pPr>
       <w:r>
         <w:rPr>
           <w:rtl w:val="0"/>
@@ -5413,6 +5001,19 @@
       </w:pPr>
       <w:r>
         <w:rPr>
+          <w:rFonts w:ascii="Georgia" w:cs="Georgia" w:eastAsia="Georgia" w:hAnsi="Georgia"/>
+          <w:b w:val="0"/>
+          <w:bCs w:val="0"/>
+          <w:i w:val="0"/>
+          <w:iCs w:val="0"/>
+          <w:sz w:val="22"/>
+          <w:szCs w:val="22"/>
+          <w:rtl w:val="0"/>
+        </w:rPr>
+        <w:t xml:space="preserve">Table 2 presents the overall distribution of hedge types. Lexical hedges dominated the corpus with 36 instances (60.0%), followed by modal verbs with 21 instances (35.0%), and adverbial hedges with 3 instances (5.0%). No clause-level hedges were identified in any of the 60 abstracts. This finding partially confirms the pattern reported in the literature, where modal verbs are typically the most frequent hedge type in developing researchers' writing (Khunasathitchai et al., 2025; Wang, 2022). In this corpus, however, lexical hedges outnumber modal verbs, a pattern that diverges from the modal-dominated writing documented in prior studies.</w:t>
+      </w:r>
+      <w:r>
+        <w:rPr>
           <w:rtl w:val="0"/>
         </w:rPr>
       </w:r>
@@ -5435,7 +5036,7 @@
           <w:szCs w:val="22"/>
           <w:rtl w:val="0"/>
         </w:rPr>
-        <w:t xml:space="preserve">Table 2 presents the overall distribution of hedge types. Lexical hedges dominated the corpus with 36 instances (60.0%), followed by modal verbs with 21 instances (35.0%), and adverbial hedges with 3 instances (5.0%). No clause-level hedges were identified in any of the 60 abstracts. This finding partially confirms the pattern reported in the literature, where modal verbs are typically the most frequent hedge type in developing researchers' writing (Khunasathitchai et al., 2025; Wang, 2022). In this corpus, however, lexical hedges outnumber modal verbs, a pattern that diverges from the modal-dominated writing documented in prior studies.</w:t>
+        <w:t xml:space="preserve">Within the lexical hedge category, the token “potential” accounted for 14 of the 36 lexical instances (38.9%), the single most frequent hedge token in the corpus. Other frequent lexical forms included “suggests” (7), “indicating” (6), and “suggesting” (3). Modal verbs were led by “can” (9), “could” (7), and “may” (6). Concordance of the 14 potential instances shows recurring frames such as “the potential of X as a Y,” “has potential as an X,” and “highlight their potential as X.” That recurrence supports reading many uses as learned formula rather than fully calibrated epistemic choice. Agriculture and Biology account for 11 of the 14 instances; Veterinary Medicine for 3.</w:t>
       </w:r>
       <w:r>
         <w:rPr>
@@ -5461,90 +5062,8 @@
           <w:szCs w:val="22"/>
           <w:rtl w:val="0"/>
         </w:rPr>
-        <w:t xml:space="preserve">Within the lexical hedge category, the token “potential” accounted for 14 of the 36 lexical instances (38.9%), the single most frequent hedge token in the corpus. Other frequent lexical forms included “suggests” (7), “indicating” (6), and “suggesting” (3). Modal verbs were led by “can” (9), “could” (7), and “may” (6). Concordance of the 14 potential instances shows recurring frames such as “the potential of X as a Y,” “has potential as an X,” and “highlight their potential as X.” That recurrence supports reading many uses as learned formula rather than fully calibrated epistemic choice. Agriculture and Biology account for 11 of the 14 instances; Veterinary Medicine for 3.</w:t>
-      </w:r>
-      <w:r>
-        <w:rPr>
-          <w:rtl w:val="0"/>
-        </w:rPr>
-      </w:r>
-    </w:p>
-    <w:p>
-      <w:pPr>
-        <w:spacing w:after="0" w:before="0" w:line="480" w:lineRule="auto"/>
-        <w:ind w:firstLine="720"/>
-        <w:jc w:val="both"/>
-        <w:rPr/>
-      </w:pPr>
-      <w:r>
-        <w:rPr>
-          <w:rFonts w:ascii="Georgia" w:cs="Georgia" w:eastAsia="Georgia" w:hAnsi="Georgia"/>
-          <w:b w:val="0"/>
-          <w:bCs w:val="0"/>
-          <w:i w:val="0"/>
-          <w:iCs w:val="0"/>
-          <w:sz w:val="22"/>
-          <w:szCs w:val="22"/>
-          <w:rtl w:val="0"/>
-        </w:rPr>
         <w:t xml:space="preserve">The distribution of hedge types also varies meaningfully across disciplines. Table 3 presents the per-discipline breakdown of hedge types.</w:t>
       </w:r>
-      <w:r>
-        <w:rPr>
-          <w:rtl w:val="0"/>
-        </w:rPr>
-      </w:r>
-    </w:p>
-    <w:p>
-      <w:pPr>
-        <w:spacing w:after="0" w:before="240" w:lineRule="auto"/>
-        <w:rPr>
-          <w:b w:val="1"/>
-          <w:bCs w:val="1"/>
-        </w:rPr>
-      </w:pPr>
-      <w:r>
-        <w:rPr>
-          <w:rtl w:val="0"/>
-        </w:rPr>
-      </w:r>
-    </w:p>
-    <w:p>
-      <w:pPr>
-        <w:spacing w:after="0" w:before="240" w:lineRule="auto"/>
-        <w:rPr>
-          <w:b w:val="1"/>
-          <w:bCs w:val="1"/>
-        </w:rPr>
-      </w:pPr>
-      <w:r>
-        <w:rPr>
-          <w:rtl w:val="0"/>
-        </w:rPr>
-      </w:r>
-    </w:p>
-    <w:p>
-      <w:pPr>
-        <w:spacing w:after="0" w:before="240" w:lineRule="auto"/>
-        <w:rPr>
-          <w:b w:val="1"/>
-          <w:bCs w:val="1"/>
-        </w:rPr>
-      </w:pPr>
-      <w:r>
-        <w:rPr>
-          <w:rtl w:val="0"/>
-        </w:rPr>
-      </w:r>
-    </w:p>
-    <w:p>
-      <w:pPr>
-        <w:spacing w:after="0" w:before="240" w:lineRule="auto"/>
-        <w:rPr>
-          <w:b w:val="1"/>
-          <w:bCs w:val="1"/>
-        </w:rPr>
-      </w:pPr>
       <w:r>
         <w:rPr>
           <w:rtl w:val="0"/>
@@ -6504,6 +6023,19 @@
       </w:pPr>
       <w:r>
         <w:rPr>
+          <w:rFonts w:ascii="Georgia" w:cs="Georgia" w:eastAsia="Georgia" w:hAnsi="Georgia"/>
+          <w:b w:val="0"/>
+          <w:bCs w:val="0"/>
+          <w:i w:val="0"/>
+          <w:iCs w:val="0"/>
+          <w:sz w:val="22"/>
+          <w:szCs w:val="22"/>
+          <w:rtl w:val="0"/>
+        </w:rPr>
+        <w:t xml:space="preserve">Table 3 reveals that Agriculture has a nearly balanced distribution (14 modal verbs, 53.8% vs. 12 lexical hedges, 46.2%), while Biology is heavily lexical (17 of 25 hedges, 68.0%, with only 5 modal verbs). Veterinary Medicine, with only 9 total hedges, is also predominantly lexical (7 of 9, 77.8%). This pattern suggests that Agriculture is the only discipline where modal verbs are used with any frequency, possibly reflecting a rhetorical style where writers are more comfortable expressing possibility directly through modal constructions. Biology’s heavy reliance on lexical hedges, particularly “potential,” suggests a preference for qualifying implications at the word level rather than managing uncertainty through modal verbs. The near-absence of adverbial hedges across all disciplines (only 3 instances, all in Biology) further confirms the narrowness of the hedging repertoire in this corpus.</w:t>
+      </w:r>
+      <w:r>
+        <w:rPr>
           <w:rtl w:val="0"/>
         </w:rPr>
       </w:r>
@@ -6526,7 +6058,7 @@
           <w:szCs w:val="22"/>
           <w:rtl w:val="0"/>
         </w:rPr>
-        <w:t xml:space="preserve">Table 3 reveals that Agriculture has a nearly balanced distribution (14 modal verbs, 53.8% vs. 12 lexical hedges, 46.2%), while Biology is heavily lexical (17 of 25 hedges, 68.0%, with only 5 modal verbs). Veterinary Medicine, with only 9 total hedges, is also predominantly lexical (7 of 9, 77.8%). This pattern suggests that Agriculture is the only discipline where modal verbs are used with any frequency, possibly reflecting a rhetorical style where writers are more comfortable expressing possibility directly through modal constructions. Biology’s heavy reliance on lexical hedges, particularly “potential,” suggests a preference for qualifying implications at the word level rather than managing uncertainty through modal verbs. The near-absence of adverbial hedges across all disciplines (only 3 instances, all in Biology) further confirms the narrowness of the hedging repertoire in this corpus.</w:t>
+        <w:t xml:space="preserve">The absence of clause-level hedges is consistent with findings that developing researchers rarely use complex syntactic structures for epistemic management (Hyland &amp; Milton, 1997). Clause-level hedges such as “it seems that” or “it is possible that” require a degree of syntactic sophistication and rhetorical awareness that these researchers may not yet have developed. Their absence in this corpus suggests that PSAU researchers rely on simpler, word-level devices rather than clause-level constructions to manage uncertainty.</w:t>
       </w:r>
       <w:r>
         <w:rPr>
@@ -6552,7 +6084,7 @@
           <w:szCs w:val="22"/>
           <w:rtl w:val="0"/>
         </w:rPr>
-        <w:t xml:space="preserve">The absence of clause-level hedges is consistent with findings that developing researchers rarely use complex syntactic structures for epistemic management (Hyland &amp; Milton, 1997). Clause-level hedges such as “it seems that” or “it is possible that” require a degree of syntactic sophistication and rhetorical awareness that these researchers may not yet have developed. Their absence in this corpus suggests that PSAU researchers rely on simpler, word-level devices rather than clause-level constructions to manage uncertainty.</w:t>
+        <w:t xml:space="preserve">The corpus also yielded 63 false positive tokens, hedge-like words that were initially flagged but rejected after applying the codebook’s Working Test. The false positive breakdown shows FP-Gen (general exclusion, including topic-naming and evidential pointers) at 38 instances, FP-Rec (recommendations) at 15, FP-Proc (procedural norms) at 2, and FP-Cap (capability) at 8. The high number of FP-Gen instances, particularly involving the word “potential” in aim and methods statements, reflects a systematic ambiguity in the corpus: the same word functions as a hedge in conclusion sentences but as topic-naming in introduction and methods sentences. This distinction was codified in the codebook’s stricter rule for “potential + noun” constructions based on structural position rather than verb choice. This disambiguation rule is the most methodologically interesting feature of the coding scheme, as it demonstrates that surface-level keyword matching would have inflated the hedge count by treating topic-naming instances as epistemic hedges.</w:t>
       </w:r>
       <w:r>
         <w:rPr>
@@ -6578,7 +6110,7 @@
           <w:szCs w:val="22"/>
           <w:rtl w:val="0"/>
         </w:rPr>
-        <w:t xml:space="preserve">The corpus also yielded 63 false positive tokens, hedge-like words that were initially flagged but rejected after applying the codebook’s Working Test. The false positive breakdown shows FP-Gen (general exclusion, including topic-naming and evidential pointers) at 38 instances, FP-Rec (recommendations) at 15, FP-Proc (procedural norms) at 2, and FP-Cap (capability) at 8. The high number of FP-Gen instances, particularly involving the word “potential” in aim and methods statements, reflects a systematic ambiguity in the corpus: the same word functions as a hedge in conclusion sentences but as topic-naming in introduction and methods sentences. This distinction was codified in the codebook’s stricter rule for “potential + noun” constructions based on structural position rather than verb choice. This disambiguation rule is the most methodologically interesting feature of the coding scheme, as it demonstrates that surface-level keyword matching would have inflated the hedge count by treating topic-naming instances as epistemic hedges.</w:t>
+        <w:t xml:space="preserve">Additionally, 37 unhedged assertion sites were identified in the 28 zero-hedge abstracts. Of these, 24 were classified as result claims [R], 9 as generalizations [G], and 4 as causal claims [C]. These sites represent clauses where a hedge could have been inserted without changing the underlying facts, but the writer chose to state the claim with bare certainty. The presence of these unhedged sites in abstracts that contain zero hedges indicates an absence of overt hedging rather than cautious reporting. Expert abstracts rarely contain zero hedges (Hyland, 1998), making the 46.7% zero-hedge rate in this corpus a sharp departure from expert norms.</w:t>
       </w:r>
       <w:r>
         <w:rPr>
@@ -6604,44 +6136,8 @@
           <w:szCs w:val="22"/>
           <w:rtl w:val="0"/>
         </w:rPr>
-        <w:t xml:space="preserve">Additionally, 37 unhedged assertion sites were identified in the 28 zero-hedge abstracts. Of these, 24 were classified as result claims [R], 9 as generalizations [G], and 4 as causal claims [C]. These sites represent clauses where a hedge could have been inserted without changing the underlying facts, but the writer chose to state the claim with bare certainty. The presence of these unhedged sites in abstracts that contain zero hedges indicates an absence of overt hedging rather than cautious reporting. Expert abstracts rarely contain zero hedges (Hyland, 1998), making the 46.7% zero-hedge rate in this corpus a sharp departure from expert norms.</w:t>
-      </w:r>
-      <w:r>
-        <w:rPr>
-          <w:rtl w:val="0"/>
-        </w:rPr>
-      </w:r>
-    </w:p>
-    <w:p>
-      <w:pPr>
-        <w:spacing w:after="0" w:before="0" w:line="480" w:lineRule="auto"/>
-        <w:ind w:firstLine="720"/>
-        <w:jc w:val="both"/>
-        <w:rPr/>
-      </w:pPr>
-      <w:r>
-        <w:rPr>
-          <w:rFonts w:ascii="Georgia" w:cs="Georgia" w:eastAsia="Georgia" w:hAnsi="Georgia"/>
-          <w:b w:val="0"/>
-          <w:bCs w:val="0"/>
-          <w:i w:val="0"/>
-          <w:iCs w:val="0"/>
-          <w:sz w:val="22"/>
-          <w:szCs w:val="22"/>
-          <w:rtl w:val="0"/>
-        </w:rPr>
         <w:t xml:space="preserve">Booster analysis of the 28 zero-hedge abstracts revealed 88 booster tokens, averaging approximately 3.1 boosters per abstract. The most frequent boosters were showed (18 instances), revealed (13), observed (12), and highest (12). This density of assertive markers confirms that zero-hedge abstracts do not represent neutral reporting but rather an absence of overt hedging, where findings are stated with emphatic rather than tentative language.</w:t>
       </w:r>
-      <w:r>
-        <w:rPr>
-          <w:rtl w:val="0"/>
-        </w:rPr>
-      </w:r>
-    </w:p>
-    <w:p>
-      <w:pPr>
-        <w:rPr/>
-      </w:pPr>
       <w:r>
         <w:rPr>
           <w:rtl w:val="0"/>
@@ -7954,6 +7450,19 @@
       </w:pPr>
       <w:r>
         <w:rPr>
+          <w:rFonts w:ascii="Georgia" w:cs="Georgia" w:eastAsia="Georgia" w:hAnsi="Georgia"/>
+          <w:b w:val="0"/>
+          <w:bCs w:val="0"/>
+          <w:i w:val="0"/>
+          <w:iCs w:val="0"/>
+          <w:sz w:val="22"/>
+          <w:szCs w:val="22"/>
+          <w:rtl w:val="0"/>
+        </w:rPr>
+        <w:t xml:space="preserve">Table 4 shows that Agriculture had the highest hedge density at 0.60 per 100 words (26 hedges across 4,300 words), followed by Biology at 0.55 (25 hedges across 4,509 words), and Veterinary Medicine at 0.18 (9 hedges across 5,060 words). The overall corpus density was 0.43 hedges per 100 words. Agriculture’s lead over Biology is modest (0.05 hedges per 100 words), but Veterinary Medicine’s density is notably lower than both, at approximately one-third of Agriculture’s rate and one-third of Biology’s.</w:t>
+      </w:r>
+      <w:r>
+        <w:rPr>
           <w:rtl w:val="0"/>
         </w:rPr>
       </w:r>
@@ -7976,7 +7485,7 @@
           <w:szCs w:val="22"/>
           <w:rtl w:val="0"/>
         </w:rPr>
-        <w:t xml:space="preserve">Table 4 shows that Agriculture had the highest hedge density at 0.60 per 100 words (26 hedges across 4,300 words), followed by Biology at 0.55 (25 hedges across 4,509 words), and Veterinary Medicine at 0.18 (9 hedges across 5,060 words). The overall corpus density was 0.43 hedges per 100 words. Agriculture’s lead over Biology is modest (0.05 hedges per 100 words), but Veterinary Medicine’s density is notably lower than both, at approximately one-third of Agriculture’s rate and one-third of Biology’s.</w:t>
+        <w:t xml:space="preserve">The zero-hedge abstract count further sharpens this contrast. Of the 60 abstracts, 28 (46.7%) contained zero hedge tokens. Veterinary Medicine accounted for 13 of these zero-hedge abstracts (65% of VM abstracts), Biology for 7 (35%), and Agriculture for 8 (40%). The overrepresentation of Veterinary Medicine in the zero-hedge category is the primary driver of its low density. More than half of VM abstracts contained no hedging devices at all, compared to 40% in Agriculture and 35% in Biology. A chi-square test of independence on the zero-hedge distribution across disciplines (discipline × zero/nonzero) was not significant (χ² = 4.15, df = 2, p = 0.13), indicating that the observed disciplinary differences in zero-hedge rates do not reach statistical significance with the current sample size.</w:t>
       </w:r>
       <w:r>
         <w:rPr>
@@ -7993,16 +7502,16 @@
       </w:pPr>
       <w:r>
         <w:rPr>
-          <w:rFonts w:ascii="Georgia" w:cs="Georgia" w:eastAsia="Georgia" w:hAnsi="Georgia"/>
-          <w:b w:val="0"/>
-          <w:bCs w:val="0"/>
-          <w:i w:val="0"/>
-          <w:iCs w:val="0"/>
-          <w:sz w:val="22"/>
-          <w:szCs w:val="22"/>
-          <w:rtl w:val="0"/>
-        </w:rPr>
-        <w:t xml:space="preserve">The zero-hedge abstract count further sharpens this contrast. Of the 60 abstracts, 28 (46.7%) contained zero hedge tokens. Veterinary Medicine accounted for 13 of these zero-hedge abstracts (65% of VM abstracts), Biology for 7 (35%), and Agriculture for 8 (40%). The overrepresentation of Veterinary Medicine in the zero-hedge category is the primary driver of its low density. More than half of VM abstracts contained no hedging devices at all, compared to 40% in Agriculture and 35% in Biology. A chi-square test of independence on the zero-hedge distribution across disciplines (discipline × zero/nonzero) was not significant (χ² = 4.15, df = 2, p = 0.13), indicating that the observed disciplinary differences in zero-hedge rates do not reach statistical significance with the current sample size.</w:t>
+          <w:rFonts w:ascii="Gungsuh" w:cs="Gungsuh" w:eastAsia="Gungsuh" w:hAnsi="Gungsuh"/>
+          <w:b w:val="0"/>
+          <w:bCs w:val="0"/>
+          <w:i w:val="0"/>
+          <w:iCs w:val="0"/>
+          <w:sz w:val="22"/>
+          <w:szCs w:val="22"/>
+          <w:rtl w:val="0"/>
+        </w:rPr>
+        <w:t xml:space="preserve">Per-abstract hedge distributions reveal substantial skew. Agriculture abstracts averaged 1.30 hedges (median = 1, SD = 1.84, range = 0–8), Biology averaged 1.25 (median = 1, SD = 1.25, range = 0–4), and Veterinary Medicine averaged 0.45 (median = 0, SD = 0.76, range = 0–3). The high standard deviation in Agriculture reflects the influence of Acs2, which contained 8 hedges alone. When Acs2 is excluded as a sensitivity check, Agriculture's density drops to 0.44 per 100 words, below Biology's 0.55, suggesting that the Agriculture &gt; Biology ranking is partly driven by a single outlier abstract. An exploratory Kruskal-Wallis test on per-abstract hedge counts yielded H ≈ 5.91, p ≈ .052, suggesting a possible difference in the distribution of hedge counts across disciplines. Given the small sample size and zero-inflated distribution, this result should be treated as preliminary rather than as evidence of a significant disciplinary difference.</w:t>
       </w:r>
       <w:r>
         <w:rPr>
@@ -8019,16 +7528,16 @@
       </w:pPr>
       <w:r>
         <w:rPr>
-          <w:rFonts w:ascii="Gungsuh" w:cs="Gungsuh" w:eastAsia="Gungsuh" w:hAnsi="Gungsuh"/>
-          <w:b w:val="0"/>
-          <w:bCs w:val="0"/>
-          <w:i w:val="0"/>
-          <w:iCs w:val="0"/>
-          <w:sz w:val="22"/>
-          <w:szCs w:val="22"/>
-          <w:rtl w:val="0"/>
-        </w:rPr>
-        <w:t xml:space="preserve">Per-abstract hedge distributions reveal substantial skew. Agriculture abstracts averaged 1.30 hedges (median = 1, SD = 1.84, range = 0–8), Biology averaged 1.25 (median = 1, SD = 1.25, range = 0–4), and Veterinary Medicine averaged 0.45 (median = 0, SD = 0.76, range = 0–3). The high standard deviation in Agriculture reflects the influence of Acs2, which contained 8 hedges alone. When Acs2 is excluded as a sensitivity check, Agriculture's density drops to 0.44 per 100 words, below Biology's 0.55, suggesting that the Agriculture &gt; Biology ranking is partly driven by a single outlier abstract. An exploratory Kruskal-Wallis test on per-abstract hedge counts yielded H ≈ 5.91, p ≈ .052, suggesting a possible difference in the distribution of hedge counts across disciplines. Given the small sample size and zero-inflated distribution, this result should be treated as preliminary rather than as evidence of a significant disciplinary difference.</w:t>
+          <w:rFonts w:ascii="Georgia" w:cs="Georgia" w:eastAsia="Georgia" w:hAnsi="Georgia"/>
+          <w:b w:val="0"/>
+          <w:bCs w:val="0"/>
+          <w:i w:val="0"/>
+          <w:iCs w:val="0"/>
+          <w:sz w:val="22"/>
+          <w:szCs w:val="22"/>
+          <w:rtl w:val="0"/>
+        </w:rPr>
+        <w:t xml:space="preserve">These frequency patterns partially align with, and partially diverge from, prior work. Afshar et al. (2014) found agriculture using the fewest hedges among expert research articles. Here Agriculture has the highest undergraduate-abstract density. The discrepancy likely reflects the gap between expert RAs and developing-researcher abstracts, and the specific epistemic demands of each PSAU program.</w:t>
       </w:r>
       <w:r>
         <w:rPr>
@@ -8054,7 +7563,7 @@
           <w:szCs w:val="22"/>
           <w:rtl w:val="0"/>
         </w:rPr>
-        <w:t xml:space="preserve">These frequency patterns partially align with, and partially diverge from, prior work. Afshar et al. (2014) found agriculture using the fewest hedges among expert research articles. Here Agriculture has the highest undergraduate-abstract density. The discrepancy likely reflects the gap between expert RAs and developing-researcher abstracts, and the specific epistemic demands of each PSAU program.</w:t>
+        <w:t xml:space="preserve">Veterinary Medicine’s low density is more difficult to interpret. One possible explanation relates to the nature of VM research in this corpus. Many VM abstracts reported clinical findings from animal studies (e.g., drug efficacy trials, disease detection, hematological profiling). Several abstracts in the VM subset involved diagnostic or presence/absence-type outcomes, which may provide one possible explanation for the relatively categorical reporting observed in this corpus. A writer who finds that “no positive results were observed” may see little need to hedge, since the absence of a finding is reported as a fact rather than an interpretation. This is consistent with Salager-Meyer’s (1994) claim-responsibility framework: when the evidence is binary, the epistemic responsibility is lower, and hedging becomes less necessary.</w:t>
       </w:r>
       <w:r>
         <w:rPr>
@@ -8080,44 +7589,8 @@
           <w:szCs w:val="22"/>
           <w:rtl w:val="0"/>
         </w:rPr>
-        <w:t xml:space="preserve">Veterinary Medicine’s low density is more difficult to interpret. One possible explanation relates to the nature of VM research in this corpus. Many VM abstracts reported clinical findings from animal studies (e.g., drug efficacy trials, disease detection, hematological profiling). Several abstracts in the VM subset involved diagnostic or presence/absence-type outcomes, which may provide one possible explanation for the relatively categorical reporting observed in this corpus. A writer who finds that “no positive results were observed” may see little need to hedge, since the absence of a finding is reported as a fact rather than an interpretation. This is consistent with Salager-Meyer’s (1994) claim-responsibility framework: when the evidence is binary, the epistemic responsibility is lower, and hedging becomes less necessary.</w:t>
-      </w:r>
-      <w:r>
-        <w:rPr>
-          <w:rtl w:val="0"/>
-        </w:rPr>
-      </w:r>
-    </w:p>
-    <w:p>
-      <w:pPr>
-        <w:spacing w:after="0" w:before="0" w:line="480" w:lineRule="auto"/>
-        <w:ind w:firstLine="720"/>
-        <w:jc w:val="both"/>
-        <w:rPr/>
-      </w:pPr>
-      <w:r>
-        <w:rPr>
-          <w:rFonts w:ascii="Georgia" w:cs="Georgia" w:eastAsia="Georgia" w:hAnsi="Georgia"/>
-          <w:b w:val="0"/>
-          <w:bCs w:val="0"/>
-          <w:i w:val="0"/>
-          <w:iCs w:val="0"/>
-          <w:sz w:val="22"/>
-          <w:szCs w:val="22"/>
-          <w:rtl w:val="0"/>
-        </w:rPr>
         <w:t xml:space="preserve">The false positive distribution also varies by discipline. Biology produced 35 false positives, far more than Agriculture (15) or Veterinary Medicine (13). This is partly because Biology abstracts contained more instances of “potential” in aim statements and “indicated by” evidential pointers, constructions that look like hedges but do not express uncertainty about a claim. The higher false positive count in Biology does not necessarily mean Biology writers hedge more. It means they use more hedge-like vocabulary in non-hedging functions.</w:t>
       </w:r>
-      <w:r>
-        <w:rPr>
-          <w:rtl w:val="0"/>
-        </w:rPr>
-      </w:r>
-    </w:p>
-    <w:p>
-      <w:pPr>
-        <w:rPr/>
-      </w:pPr>
       <w:r>
         <w:rPr>
           <w:rtl w:val="0"/>
@@ -8698,6 +8171,7 @@
         <w:rPr>
           <w:rtl w:val="0"/>
         </w:rPr>
+        <w:t xml:space="preserve">The uniform assignment may reflect a restricted repertoire, the compressed abstract genre, the coding scheme, or single-rater interpretation; that limitation is noted in Scope. The narrow functional range is consistent with earlier findings on developing L2 writers (Hyland &amp; Milton, 1997).</w:t>
       </w:r>
     </w:p>
     <w:p>
@@ -8709,9 +8183,21 @@
       </w:pPr>
       <w:r>
         <w:rPr>
-          <w:rtl w:val="0"/>
-        </w:rPr>
-        <w:t xml:space="preserve">The uniform assignment may reflect a restricted repertoire, the compressed abstract genre, the coding scheme, or single-rater interpretation; that limitation is noted in Scope. The narrow functional range is consistent with earlier findings on developing L2 writers (Hyland &amp; Milton, 1997).</w:t>
+          <w:rFonts w:ascii="Georgia" w:cs="Georgia" w:eastAsia="Georgia" w:hAnsi="Georgia"/>
+          <w:b w:val="0"/>
+          <w:bCs w:val="0"/>
+          <w:i w:val="0"/>
+          <w:iCs w:val="0"/>
+          <w:sz w:val="22"/>
+          <w:szCs w:val="22"/>
+          <w:rtl w:val="0"/>
+        </w:rPr>
+        <w:t xml:space="preserve">Most hedges fall in implication and conclusion sentences rather than in direct results reporting. Forms such as potential and suggests/suggesting typically frame applications or interpretations, while results sentences more often use factive verbs (showed, revealed, demonstrated) without qualification. A formal move-structured count was not performed; this remains a qualitative pattern.</w:t>
+      </w:r>
+      <w:r>
+        <w:rPr>
+          <w:rtl w:val="0"/>
+        </w:rPr>
       </w:r>
     </w:p>
     <w:p>
@@ -8732,57 +8218,8 @@
           <w:szCs w:val="22"/>
           <w:rtl w:val="0"/>
         </w:rPr>
-        <w:t xml:space="preserve">Most hedges fall in implication and conclusion sentences rather than in direct results reporting. Forms such as potential and suggests/suggesting typically frame applications or interpretations, while results sentences more often use factive verbs (showed, revealed, demonstrated) without qualification. A formal move-structured count was not performed; this remains a qualitative pattern.</w:t>
-      </w:r>
-      <w:r>
-        <w:rPr>
-          <w:rtl w:val="0"/>
-        </w:rPr>
-      </w:r>
-    </w:p>
-    <w:p>
-      <w:pPr>
-        <w:spacing w:after="0" w:before="0" w:line="480" w:lineRule="auto"/>
-        <w:ind w:firstLine="720"/>
-        <w:jc w:val="both"/>
-        <w:rPr/>
-      </w:pPr>
-      <w:r>
-        <w:rPr>
-          <w:rtl w:val="0"/>
-        </w:rPr>
-      </w:r>
-    </w:p>
-    <w:p>
-      <w:pPr>
-        <w:spacing w:after="0" w:before="0" w:line="480" w:lineRule="auto"/>
-        <w:ind w:firstLine="720"/>
-        <w:jc w:val="both"/>
-        <w:rPr/>
-      </w:pPr>
-      <w:r>
-        <w:rPr>
-          <w:rFonts w:ascii="Georgia" w:cs="Georgia" w:eastAsia="Georgia" w:hAnsi="Georgia"/>
-          <w:b w:val="0"/>
-          <w:bCs w:val="0"/>
-          <w:i w:val="0"/>
-          <w:iCs w:val="0"/>
-          <w:sz w:val="22"/>
-          <w:szCs w:val="22"/>
-          <w:rtl w:val="0"/>
-        </w:rPr>
         <w:t xml:space="preserve">The relationship between hedge type and function further illuminates the patterns. Modal verbs (21 instances, all EC) were used almost exclusively to express possibility about results or implications, as in “the biosynthesis... may affect the overall development.” Lexical hedges (36 instances, all EC) were used to qualify the strength of findings, as in “results suggest that fermented banana peel... can significantly enhance growth.” The convergence of all hedge types on a single function reinforces the interpretation that these writers view hedging primarily as a tool for managing factual certainty, not for managing social or textual relationships.</w:t>
       </w:r>
-      <w:r>
-        <w:rPr>
-          <w:rtl w:val="0"/>
-        </w:rPr>
-      </w:r>
-    </w:p>
-    <w:p>
-      <w:pPr>
-        <w:rPr/>
-      </w:pPr>
       <w:r>
         <w:rPr>
           <w:rtl w:val="0"/>
@@ -8991,98 +8428,6 @@
     </w:p>
     <w:p>
       <w:pPr>
-        <w:spacing w:after="0" w:before="0" w:line="480" w:lineRule="auto"/>
-        <w:ind w:firstLine="720"/>
-        <w:jc w:val="both"/>
-        <w:rPr/>
-      </w:pPr>
-      <w:r>
-        <w:rPr>
-          <w:rtl w:val="0"/>
-        </w:rPr>
-      </w:r>
-    </w:p>
-    <w:p>
-      <w:pPr>
-        <w:spacing w:after="0" w:before="0" w:line="480" w:lineRule="auto"/>
-        <w:rPr/>
-      </w:pPr>
-      <w:r>
-        <w:rPr>
-          <w:rtl w:val="0"/>
-        </w:rPr>
-      </w:r>
-    </w:p>
-    <w:p>
-      <w:pPr>
-        <w:rPr/>
-      </w:pPr>
-      <w:r>
-        <w:rPr>
-          <w:rtl w:val="0"/>
-        </w:rPr>
-      </w:r>
-    </w:p>
-    <w:p>
-      <w:pPr>
-        <w:keepNext w:val="1"/>
-        <w:keepLines w:val="1"/>
-        <w:pageBreakBefore w:val="1"/>
-        <w:spacing w:after="0" w:before="0" w:line="480" w:lineRule="auto"/>
-        <w:jc w:val="left"/>
-        <w:rPr>
-          <w:b w:val="1"/>
-          <w:bCs w:val="1"/>
-          <w:sz w:val="28"/>
-          <w:szCs w:val="28"/>
-        </w:rPr>
-      </w:pPr>
-      <w:r>
-        <w:rPr>
-          <w:rtl w:val="0"/>
-        </w:rPr>
-      </w:r>
-    </w:p>
-    <w:p>
-      <w:pPr>
-        <w:keepNext w:val="1"/>
-        <w:keepLines w:val="1"/>
-        <w:spacing w:after="0" w:before="0" w:line="480" w:lineRule="auto"/>
-        <w:jc w:val="left"/>
-        <w:rPr>
-          <w:b w:val="1"/>
-          <w:bCs w:val="1"/>
-          <w:sz w:val="28"/>
-          <w:szCs w:val="28"/>
-        </w:rPr>
-      </w:pPr>
-      <w:r>
-        <w:rPr>
-          <w:rtl w:val="0"/>
-        </w:rPr>
-      </w:r>
-    </w:p>
-    <w:p>
-      <w:pPr>
-        <w:keepNext w:val="1"/>
-        <w:keepLines w:val="1"/>
-        <w:spacing w:after="0" w:before="0" w:line="480" w:lineRule="auto"/>
-        <w:jc w:val="left"/>
-        <w:rPr>
-          <w:b w:val="1"/>
-          <w:bCs w:val="1"/>
-          <w:sz w:val="28"/>
-          <w:szCs w:val="28"/>
-        </w:rPr>
-      </w:pPr>
-      <w:r>
-        <w:rPr>
-          <w:rtl w:val="0"/>
-        </w:rPr>
-      </w:r>
-    </w:p>
-    <w:p>
-      <w:pPr>
         <w:keepNext w:val="1"/>
         <w:keepLines w:val="1"/>
         <w:spacing w:after="0" w:before="0" w:line="480" w:lineRule="auto"/>
@@ -9110,37 +8455,6 @@
     </w:p>
     <w:p>
       <w:pPr>
-        <w:spacing w:after="0" w:before="0" w:lineRule="auto"/>
-        <w:rPr/>
-      </w:pPr>
-      <w:r>
-        <w:rPr>
-          <w:rtl w:val="0"/>
-        </w:rPr>
-      </w:r>
-    </w:p>
-    <w:p>
-      <w:pPr>
-        <w:rPr/>
-      </w:pPr>
-      <w:r>
-        <w:rPr>
-          <w:rtl w:val="0"/>
-        </w:rPr>
-      </w:r>
-    </w:p>
-    <w:p>
-      <w:pPr>
-        <w:rPr/>
-      </w:pPr>
-      <w:r>
-        <w:rPr>
-          <w:rtl w:val="0"/>
-        </w:rPr>
-      </w:r>
-    </w:p>
-    <w:p>
-      <w:pPr>
         <w:spacing w:after="0" w:before="0" w:line="480" w:lineRule="auto"/>
         <w:ind w:firstLine="720"/>
         <w:jc w:val="both"/>
@@ -9159,16 +8473,6 @@
         </w:rPr>
         <w:t xml:space="preserve">This study mapped hedging in 60 undergraduate thesis abstracts across Agriculture, Veterinary Medicine, and Biology at PSAU.</w:t>
       </w:r>
-      <w:r>
-        <w:rPr>
-          <w:rtl w:val="0"/>
-        </w:rPr>
-      </w:r>
-    </w:p>
-    <w:p>
-      <w:pPr>
-        <w:rPr/>
-      </w:pPr>
       <w:r>
         <w:rPr>
           <w:rtl w:val="0"/>
@@ -9256,16 +8560,6 @@
     </w:p>
     <w:p>
       <w:pPr>
-        <w:rPr/>
-      </w:pPr>
-      <w:r>
-        <w:rPr>
-          <w:rtl w:val="0"/>
-        </w:rPr>
-      </w:r>
-    </w:p>
-    <w:p>
-      <w:pPr>
         <w:keepNext w:val="1"/>
         <w:keepLines w:val="1"/>
         <w:spacing w:after="240" w:before="240" w:line="480" w:lineRule="auto"/>
@@ -9337,17 +8631,6 @@
         </w:rPr>
         <w:t xml:space="preserve">Rather than prescribing a target number of hedges per abstract, advisers can focus feedback on whether implication and conclusion sentences claim more than the data support. Binary or measured results often need no hedge; uncertainty belongs on inferences that go beyond the finding. Instruction should also distinguish topic-naming potential in aim statements from epistemic potential in conclusions, without treating hedging as a quota to fill.</w:t>
       </w:r>
-      <w:r>
-        <w:rPr>
-          <w:rtl w:val="0"/>
-        </w:rPr>
-      </w:r>
-    </w:p>
-    <w:p>
-      <w:pPr>
-        <w:spacing w:after="0" w:before="240" w:lineRule="auto"/>
-        <w:rPr/>
-      </w:pPr>
       <w:r>
         <w:rPr>
           <w:rtl w:val="0"/>
@@ -9479,26 +8762,6 @@
         </w:rPr>
         <w:t xml:space="preserve">The coding methodology developed in this study, including the codebook’s decision rules and the Layer 3 unhedged assertion site analysis, can serve as a template for similar studies in other disciplines, genres, or institutions. Future researchers may adapt the codebook for analyzing hedging in full-length thesis sections, research articles, or other academic genres where rhetorical space allows for greater hedge variety than the compressed abstract. Additionally, future studies should examine boosters (e.g., clearly, demonstrated, confirmed) alongside hedges to provide a fuller picture of epistemic stance, since some abstracts in this corpus contain zero hedges but still make assertive claims that may involve booster language.</w:t>
       </w:r>
-      <w:r>
-        <w:rPr>
-          <w:rtl w:val="0"/>
-        </w:rPr>
-      </w:r>
-    </w:p>
-    <w:p>
-      <w:pPr>
-        <w:rPr/>
-      </w:pPr>
-      <w:r>
-        <w:rPr>
-          <w:rtl w:val="0"/>
-        </w:rPr>
-      </w:r>
-    </w:p>
-    <w:p>
-      <w:pPr>
-        <w:rPr/>
-      </w:pPr>
       <w:r>
         <w:rPr>
           <w:rtl w:val="0"/>
@@ -28659,14 +27922,6 @@
         <w:spacing w:after="240" w:before="0" w:line="480" w:lineRule="auto"/>
         <w:jc w:val="both"/>
         <w:rPr/>
-        <w:sectPr>
-          <w:headerReference r:id="rId19" w:type="default"/>
-          <w:headerReference r:id="rId20" w:type="first"/>
-          <w:type w:val="nextPage"/>
-          <w:pgSz w:h="16838" w:w="11906" w:orient="portrait"/>
-          <w:pgMar w:bottom="1440" w:top="1440" w:left="2160" w:right="1440" w:header="720" w:footer="720"/>
-          <w:titlePg w:val="1"/>
-        </w:sectPr>
       </w:pPr>
       <w:r>
         <w:rPr>
@@ -28848,31 +28103,6 @@
         </w:rPr>
         <w:t xml:space="preserve"> help breeders to lessen the feed cost in production.</w:t>
       </w:r>
-      <w:r>
-        <w:rPr>
-          <w:rtl w:val="0"/>
-        </w:rPr>
-      </w:r>
-    </w:p>
-    <w:p>
-      <w:pPr>
-        <w:keepNext w:val="0"/>
-        <w:keepLines w:val="0"/>
-        <w:pageBreakBefore w:val="0"/>
-        <w:widowControl w:val="0"/>
-        <w:pBdr>
-          <w:top w:space="0" w:sz="0" w:val="nil"/>
-          <w:left w:space="0" w:sz="0" w:val="nil"/>
-          <w:bottom w:space="0" w:sz="0" w:val="nil"/>
-          <w:right w:space="0" w:sz="0" w:val="nil"/>
-          <w:between w:space="0" w:sz="0" w:val="nil"/>
-        </w:pBdr>
-        <w:shd w:fill="auto" w:val="clear"/>
-        <w:spacing w:after="0" w:before="0" w:line="276" w:lineRule="auto"/>
-        <w:ind w:left="0" w:right="0" w:firstLine="0"/>
-        <w:jc w:val="left"/>
-        <w:rPr/>
-      </w:pPr>
       <w:r>
         <w:rPr>
           <w:rtl w:val="0"/>

</xml_diff>

<commit_message>
Draft_013: restore Figure 1; heading spacing; keep-with-next
- Restore Figure 1 drawing (rId8 / image1.png)
- Major heads: new page via pageBreakBefore unless after sectPr;
  spacing 3-3 (240/240), before=0 when section already breaks page
- Sub1 / lit heads: 3-3, keepNext
- Appendix C abstract IDs: 1-0, keepNext
- Table/figure captions keepNext; ≥120 after tables
- Table rows cantSplit + header repeat
</commit_message>
<xml_diff>
--- a/thesis/003_ThesisProposal_Draft_013.docx
+++ b/thesis/003_ThesisProposal_Draft_013.docx
@@ -613,7 +613,7 @@
       <w:pPr>
         <w:keepNext w:val="1"/>
         <w:keepLines w:val="1"/>
-        <w:spacing w:after="0" w:before="0" w:line="480" w:lineRule="auto"/>
+        <w:spacing w:after="240" w:before="0" w:line="480" w:lineRule="auto"/>
         <w:jc w:val="center"/>
         <w:rPr/>
       </w:pPr>
@@ -1474,7 +1474,9 @@
     </w:p>
     <w:p>
       <w:pPr>
-        <w:spacing w:after="0" w:before="240" w:lineRule="auto"/>
+        <w:keepNext w:val="1"/>
+        <w:keepLines w:val="1"/>
+        <w:spacing w:after="120" w:before="240" w:lineRule="auto" w:line="480"/>
         <w:jc w:val="center"/>
         <w:rPr/>
       </w:pPr>
@@ -1495,6 +1497,46 @@
         <w:rPr>
           <w:rtl w:val="0"/>
         </w:rPr>
+      </w:r>
+    </w:p>
+    <w:p>
+      <w:pPr>
+        <w:spacing w:before="120" w:after="240"/>
+        <w:jc w:val="center"/>
+      </w:pPr>
+      <w:r>
+        <w:drawing>
+          <wp:inline>
+            <wp:extent cx="5029200" cy="3981450"/>
+            <wp:docPr id="1" name="Picture 1"/>
+            <wp:cNvGraphicFramePr>
+              <a:graphicFrameLocks noChangeAspect="1"/>
+            </wp:cNvGraphicFramePr>
+            <a:graphic>
+              <a:graphicData uri="http://schemas.openxmlformats.org/drawingml/2006/picture">
+                <pic:pic>
+                  <pic:nvPicPr>
+                    <pic:cNvPr id="0" name="figure1_framework.png"/>
+                    <pic:cNvPicPr/>
+                  </pic:nvPicPr>
+                  <pic:blipFill>
+                    <a:blip r:embed="rId8"/>
+                    <a:stretch>
+                      <a:fillRect/>
+                    </a:stretch>
+                  </pic:blipFill>
+                  <pic:spPr>
+                    <a:xfrm>
+                      <a:off x="0" y="0"/>
+                      <a:ext cx="5029200" cy="3981450"/>
+                    </a:xfrm>
+                    <a:prstGeom prst="rect"/>
+                  </pic:spPr>
+                </pic:pic>
+              </a:graphicData>
+            </a:graphic>
+          </wp:inline>
+        </w:drawing>
       </w:r>
     </w:p>
     <w:p>
@@ -2461,7 +2503,7 @@
       <w:pPr>
         <w:keepNext w:val="1"/>
         <w:keepLines w:val="1"/>
-        <w:spacing w:after="0" w:before="0" w:line="480" w:lineRule="auto"/>
+        <w:spacing w:after="240" w:before="0" w:line="480" w:lineRule="auto"/>
         <w:jc w:val="center"/>
         <w:rPr/>
       </w:pPr>
@@ -3063,7 +3105,9 @@
     </w:p>
     <w:p>
       <w:pPr>
-        <w:spacing w:after="0" w:before="240" w:lineRule="auto"/>
+        <w:keepNext w:val="1"/>
+        <w:keepLines w:val="1"/>
+        <w:spacing w:after="120" w:before="240" w:lineRule="auto" w:line="480"/>
         <w:rPr/>
       </w:pPr>
       <w:r>
@@ -4143,7 +4187,7 @@
     </w:tbl>
     <w:p>
       <w:pPr>
-        <w:spacing w:after="0" w:before="0" w:line="480" w:lineRule="auto"/>
+        <w:spacing w:after="0" w:before="120" w:line="480" w:lineRule="auto"/>
         <w:ind w:firstLine="720"/>
         <w:jc w:val="both"/>
         <w:rPr/>
@@ -4296,7 +4340,7 @@
       <w:pPr>
         <w:keepNext w:val="1"/>
         <w:keepLines w:val="1"/>
-        <w:spacing w:after="0" w:before="0" w:line="480" w:lineRule="auto"/>
+        <w:spacing w:after="240" w:before="0" w:line="480" w:lineRule="auto"/>
         <w:jc w:val="center"/>
         <w:rPr/>
       </w:pPr>
@@ -4400,7 +4444,9 @@
     </w:p>
     <w:p>
       <w:pPr>
-        <w:spacing w:after="0" w:before="240" w:lineRule="auto"/>
+        <w:keepNext w:val="1"/>
+        <w:keepLines w:val="1"/>
+        <w:spacing w:after="120" w:before="240" w:lineRule="auto" w:line="480"/>
         <w:rPr/>
       </w:pPr>
       <w:r>
@@ -4994,6 +5040,32 @@
     </w:tbl>
     <w:p>
       <w:pPr>
+        <w:spacing w:after="0" w:before="120" w:line="480" w:lineRule="auto"/>
+        <w:ind w:firstLine="720"/>
+        <w:jc w:val="both"/>
+        <w:rPr/>
+      </w:pPr>
+      <w:r>
+        <w:rPr>
+          <w:rFonts w:ascii="Georgia" w:cs="Georgia" w:eastAsia="Georgia" w:hAnsi="Georgia"/>
+          <w:b w:val="0"/>
+          <w:bCs w:val="0"/>
+          <w:i w:val="0"/>
+          <w:iCs w:val="0"/>
+          <w:sz w:val="22"/>
+          <w:szCs w:val="22"/>
+          <w:rtl w:val="0"/>
+        </w:rPr>
+        <w:t xml:space="preserve">Table 2 presents the overall distribution of hedge types. Lexical hedges dominated the corpus with 36 instances (60.0%), followed by modal verbs with 21 instances (35.0%), and adverbial hedges with 3 instances (5.0%). No clause-level hedges were identified in any of the 60 abstracts. This finding partially confirms the pattern reported in the literature, where modal verbs are typically the most frequent hedge type in developing researchers' writing (Khunasathitchai et al., 2025; Wang, 2022). In this corpus, however, lexical hedges outnumber modal verbs, a pattern that diverges from the modal-dominated writing documented in prior studies.</w:t>
+      </w:r>
+      <w:r>
+        <w:rPr>
+          <w:rtl w:val="0"/>
+        </w:rPr>
+      </w:r>
+    </w:p>
+    <w:p>
+      <w:pPr>
         <w:spacing w:after="0" w:before="0" w:line="480" w:lineRule="auto"/>
         <w:ind w:firstLine="720"/>
         <w:jc w:val="both"/>
@@ -5010,7 +5082,7 @@
           <w:szCs w:val="22"/>
           <w:rtl w:val="0"/>
         </w:rPr>
-        <w:t xml:space="preserve">Table 2 presents the overall distribution of hedge types. Lexical hedges dominated the corpus with 36 instances (60.0%), followed by modal verbs with 21 instances (35.0%), and adverbial hedges with 3 instances (5.0%). No clause-level hedges were identified in any of the 60 abstracts. This finding partially confirms the pattern reported in the literature, where modal verbs are typically the most frequent hedge type in developing researchers' writing (Khunasathitchai et al., 2025; Wang, 2022). In this corpus, however, lexical hedges outnumber modal verbs, a pattern that diverges from the modal-dominated writing documented in prior studies.</w:t>
+        <w:t xml:space="preserve">Within the lexical hedge category, the token “potential” accounted for 14 of the 36 lexical instances (38.9%), the single most frequent hedge token in the corpus. Other frequent lexical forms included “suggests” (7), “indicating” (6), and “suggesting” (3). Modal verbs were led by “can” (9), “could” (7), and “may” (6). Concordance of the 14 potential instances shows recurring frames such as “the potential of X as a Y,” “has potential as an X,” and “highlight their potential as X.” That recurrence supports reading many uses as learned formula rather than fully calibrated epistemic choice. Agriculture and Biology account for 11 of the 14 instances; Veterinary Medicine for 3.</w:t>
       </w:r>
       <w:r>
         <w:rPr>
@@ -5036,32 +5108,6 @@
           <w:szCs w:val="22"/>
           <w:rtl w:val="0"/>
         </w:rPr>
-        <w:t xml:space="preserve">Within the lexical hedge category, the token “potential” accounted for 14 of the 36 lexical instances (38.9%), the single most frequent hedge token in the corpus. Other frequent lexical forms included “suggests” (7), “indicating” (6), and “suggesting” (3). Modal verbs were led by “can” (9), “could” (7), and “may” (6). Concordance of the 14 potential instances shows recurring frames such as “the potential of X as a Y,” “has potential as an X,” and “highlight their potential as X.” That recurrence supports reading many uses as learned formula rather than fully calibrated epistemic choice. Agriculture and Biology account for 11 of the 14 instances; Veterinary Medicine for 3.</w:t>
-      </w:r>
-      <w:r>
-        <w:rPr>
-          <w:rtl w:val="0"/>
-        </w:rPr>
-      </w:r>
-    </w:p>
-    <w:p>
-      <w:pPr>
-        <w:spacing w:after="0" w:before="0" w:line="480" w:lineRule="auto"/>
-        <w:ind w:firstLine="720"/>
-        <w:jc w:val="both"/>
-        <w:rPr/>
-      </w:pPr>
-      <w:r>
-        <w:rPr>
-          <w:rFonts w:ascii="Georgia" w:cs="Georgia" w:eastAsia="Georgia" w:hAnsi="Georgia"/>
-          <w:b w:val="0"/>
-          <w:bCs w:val="0"/>
-          <w:i w:val="0"/>
-          <w:iCs w:val="0"/>
-          <w:sz w:val="22"/>
-          <w:szCs w:val="22"/>
-          <w:rtl w:val="0"/>
-        </w:rPr>
         <w:t xml:space="preserve">The distribution of hedge types also varies meaningfully across disciplines. Table 3 presents the per-discipline breakdown of hedge types.</w:t>
       </w:r>
       <w:r>
@@ -5072,7 +5118,9 @@
     </w:p>
     <w:p>
       <w:pPr>
-        <w:spacing w:after="0" w:before="240" w:lineRule="auto"/>
+        <w:keepNext w:val="1"/>
+        <w:keepLines w:val="1"/>
+        <w:spacing w:after="120" w:before="240" w:lineRule="auto" w:line="480"/>
         <w:rPr/>
       </w:pPr>
       <w:r>
@@ -6016,7 +6064,7 @@
     </w:tbl>
     <w:p>
       <w:pPr>
-        <w:spacing w:after="0" w:before="0" w:line="480" w:lineRule="auto"/>
+        <w:spacing w:after="0" w:before="120" w:line="480" w:lineRule="auto"/>
         <w:ind w:firstLine="720"/>
         <w:jc w:val="both"/>
         <w:rPr/>
@@ -6199,7 +6247,9 @@
     </w:p>
     <w:p>
       <w:pPr>
-        <w:spacing w:after="0" w:before="240" w:lineRule="auto"/>
+        <w:keepNext w:val="1"/>
+        <w:keepLines w:val="1"/>
+        <w:spacing w:after="120" w:before="240" w:lineRule="auto" w:line="480"/>
         <w:rPr/>
       </w:pPr>
       <w:r>
@@ -7443,7 +7493,7 @@
     </w:tbl>
     <w:p>
       <w:pPr>
-        <w:spacing w:after="0" w:before="0" w:line="480" w:lineRule="auto"/>
+        <w:spacing w:after="0" w:before="120" w:line="480" w:lineRule="auto"/>
         <w:ind w:firstLine="720"/>
         <w:jc w:val="both"/>
         <w:rPr/>
@@ -7652,7 +7702,9 @@
     </w:p>
     <w:p>
       <w:pPr>
-        <w:spacing w:after="0" w:before="240" w:lineRule="auto"/>
+        <w:keepNext w:val="1"/>
+        <w:keepLines w:val="1"/>
+        <w:spacing w:after="120" w:before="240" w:lineRule="auto" w:line="480"/>
         <w:rPr/>
       </w:pPr>
       <w:r>
@@ -8162,7 +8214,7 @@
     </w:tbl>
     <w:p>
       <w:pPr>
-        <w:spacing w:after="0" w:before="0" w:line="480" w:lineRule="auto"/>
+        <w:spacing w:after="0" w:before="120" w:line="480" w:lineRule="auto"/>
         <w:ind w:firstLine="720"/>
         <w:jc w:val="both"/>
         <w:rPr/>
@@ -8430,7 +8482,8 @@
       <w:pPr>
         <w:keepNext w:val="1"/>
         <w:keepLines w:val="1"/>
-        <w:spacing w:after="0" w:before="0" w:line="480" w:lineRule="auto"/>
+        <w:pageBreakBefore w:val="1"/>
+        <w:spacing w:after="240" w:before="240" w:line="480" w:lineRule="auto"/>
         <w:jc w:val="center"/>
         <w:rPr/>
       </w:pPr>
@@ -8772,7 +8825,7 @@
       <w:pPr>
         <w:keepNext w:val="1"/>
         <w:keepLines w:val="1"/>
-        <w:spacing w:after="0" w:before="0" w:line="480" w:lineRule="auto"/>
+        <w:spacing w:after="240" w:before="0" w:line="480" w:lineRule="auto"/>
         <w:jc w:val="center"/>
         <w:rPr/>
       </w:pPr>
@@ -9784,7 +9837,7 @@
       <w:pPr>
         <w:keepNext w:val="1"/>
         <w:keepLines w:val="1"/>
-        <w:spacing w:after="240" w:before="0" w:line="240" w:lineRule="auto"/>
+        <w:spacing w:after="240" w:before="0" w:line="480" w:lineRule="auto"/>
         <w:jc w:val="center"/>
         <w:rPr/>
       </w:pPr>
@@ -9842,7 +9895,10 @@
     </w:p>
     <w:p>
       <w:pPr>
-        <w:spacing w:after="200" w:before="120" w:line="240" w:lineRule="auto"/>
+        <w:keepNext w:val="1"/>
+        <w:keepLines w:val="1"/>
+        <w:pageBreakBefore w:val="1"/>
+        <w:spacing w:after="240" w:before="240" w:line="480" w:lineRule="auto"/>
         <w:jc w:val="left"/>
         <w:rPr/>
       </w:pPr>
@@ -11424,7 +11480,7 @@
     </w:p>
     <w:p>
       <w:pPr>
-        <w:spacing w:after="120" w:before="0" w:line="240" w:lineRule="auto"/>
+        <w:spacing w:after="120" w:before="120" w:line="240" w:lineRule="auto"/>
         <w:ind w:firstLine="720"/>
         <w:jc w:val="both"/>
         <w:rPr/>
@@ -13254,7 +13310,7 @@
     </w:p>
     <w:p>
       <w:pPr>
-        <w:spacing w:after="120" w:before="0" w:line="240" w:lineRule="auto"/>
+        <w:spacing w:after="120" w:before="120" w:line="240" w:lineRule="auto"/>
         <w:ind w:firstLine="720"/>
         <w:jc w:val="both"/>
         <w:rPr/>
@@ -16276,7 +16332,7 @@
     </w:p>
     <w:p>
       <w:pPr>
-        <w:spacing w:after="120" w:before="0" w:line="240" w:lineRule="auto"/>
+        <w:spacing w:after="120" w:before="120" w:line="240" w:lineRule="auto"/>
         <w:ind w:firstLine="720"/>
         <w:jc w:val="both"/>
         <w:rPr/>
@@ -16779,7 +16835,7 @@
       <w:pPr>
         <w:keepNext w:val="1"/>
         <w:keepLines w:val="1"/>
-        <w:spacing w:after="120" w:before="0" w:line="240" w:lineRule="auto"/>
+        <w:spacing w:after="120" w:before="120" w:line="240" w:lineRule="auto"/>
         <w:jc w:val="left"/>
         <w:rPr/>
       </w:pPr>
@@ -17218,7 +17274,10 @@
     </w:p>
     <w:p>
       <w:pPr>
-        <w:spacing w:after="200" w:before="360" w:line="240" w:lineRule="auto"/>
+        <w:keepNext w:val="1"/>
+        <w:keepLines w:val="1"/>
+        <w:pageBreakBefore w:val="1"/>
+        <w:spacing w:after="240" w:before="240" w:line="480" w:lineRule="auto"/>
         <w:jc w:val="left"/>
         <w:rPr/>
       </w:pPr>
@@ -18091,7 +18150,9 @@
     </w:p>
     <w:p>
       <w:pPr>
-        <w:spacing w:after="200" w:before="360" w:line="240" w:lineRule="auto"/>
+        <w:keepNext w:val="1"/>
+        <w:keepLines w:val="1"/>
+        <w:spacing w:after="240" w:before="0" w:line="480" w:lineRule="auto"/>
         <w:jc w:val="left"/>
         <w:rPr/>
       </w:pPr>
@@ -18165,7 +18226,9 @@
     </w:p>
     <w:p>
       <w:pPr>
-        <w:spacing w:after="120" w:before="360" w:line="480" w:lineRule="auto"/>
+        <w:keepNext w:val="1"/>
+        <w:keepLines w:val="1"/>
+        <w:spacing w:after="0" w:before="120" w:line="480" w:lineRule="auto"/>
         <w:jc w:val="left"/>
         <w:rPr/>
       </w:pPr>
@@ -18382,7 +18445,9 @@
     </w:p>
     <w:p>
       <w:pPr>
-        <w:spacing w:after="120" w:before="360" w:line="480" w:lineRule="auto"/>
+        <w:keepNext w:val="1"/>
+        <w:keepLines w:val="1"/>
+        <w:spacing w:after="0" w:before="120" w:line="480" w:lineRule="auto"/>
         <w:jc w:val="left"/>
         <w:rPr/>
       </w:pPr>
@@ -18616,7 +18681,9 @@
     </w:p>
     <w:p>
       <w:pPr>
-        <w:spacing w:after="120" w:before="360" w:line="480" w:lineRule="auto"/>
+        <w:keepNext w:val="1"/>
+        <w:keepLines w:val="1"/>
+        <w:spacing w:after="0" w:before="120" w:line="480" w:lineRule="auto"/>
         <w:jc w:val="left"/>
         <w:rPr/>
       </w:pPr>
@@ -18709,7 +18776,9 @@
     </w:p>
     <w:p>
       <w:pPr>
-        <w:spacing w:after="120" w:before="360" w:line="480" w:lineRule="auto"/>
+        <w:keepNext w:val="1"/>
+        <w:keepLines w:val="1"/>
+        <w:spacing w:after="0" w:before="120" w:line="480" w:lineRule="auto"/>
         <w:jc w:val="left"/>
         <w:rPr/>
       </w:pPr>
@@ -19009,7 +19078,9 @@
     </w:p>
     <w:p>
       <w:pPr>
-        <w:spacing w:after="120" w:before="360" w:line="480" w:lineRule="auto"/>
+        <w:keepNext w:val="1"/>
+        <w:keepLines w:val="1"/>
+        <w:spacing w:after="0" w:before="120" w:line="480" w:lineRule="auto"/>
         <w:jc w:val="left"/>
         <w:rPr/>
       </w:pPr>
@@ -19184,7 +19255,9 @@
     </w:p>
     <w:p>
       <w:pPr>
-        <w:spacing w:after="120" w:before="360" w:line="480" w:lineRule="auto"/>
+        <w:keepNext w:val="1"/>
+        <w:keepLines w:val="1"/>
+        <w:spacing w:after="0" w:before="120" w:line="480" w:lineRule="auto"/>
         <w:jc w:val="left"/>
         <w:rPr/>
       </w:pPr>
@@ -19418,7 +19491,9 @@
     </w:p>
     <w:p>
       <w:pPr>
-        <w:spacing w:after="120" w:before="360" w:line="480" w:lineRule="auto"/>
+        <w:keepNext w:val="1"/>
+        <w:keepLines w:val="1"/>
+        <w:spacing w:after="0" w:before="120" w:line="480" w:lineRule="auto"/>
         <w:jc w:val="left"/>
         <w:rPr/>
       </w:pPr>
@@ -19653,7 +19728,9 @@
     </w:p>
     <w:p>
       <w:pPr>
-        <w:spacing w:after="120" w:before="360" w:line="480" w:lineRule="auto"/>
+        <w:keepNext w:val="1"/>
+        <w:keepLines w:val="1"/>
+        <w:spacing w:after="0" w:before="120" w:line="480" w:lineRule="auto"/>
         <w:jc w:val="left"/>
         <w:rPr/>
       </w:pPr>
@@ -19829,7 +19906,9 @@
     </w:p>
     <w:p>
       <w:pPr>
-        <w:spacing w:after="120" w:before="360" w:line="480" w:lineRule="auto"/>
+        <w:keepNext w:val="1"/>
+        <w:keepLines w:val="1"/>
+        <w:spacing w:after="0" w:before="120" w:line="480" w:lineRule="auto"/>
         <w:jc w:val="left"/>
         <w:rPr/>
       </w:pPr>
@@ -20005,7 +20084,9 @@
     </w:p>
     <w:p>
       <w:pPr>
-        <w:spacing w:after="120" w:before="360" w:line="480" w:lineRule="auto"/>
+        <w:keepNext w:val="1"/>
+        <w:keepLines w:val="1"/>
+        <w:spacing w:after="0" w:before="120" w:line="480" w:lineRule="auto"/>
         <w:jc w:val="left"/>
         <w:rPr/>
       </w:pPr>
@@ -20180,7 +20261,9 @@
     </w:p>
     <w:p>
       <w:pPr>
-        <w:spacing w:after="120" w:before="360" w:line="480" w:lineRule="auto"/>
+        <w:keepNext w:val="1"/>
+        <w:keepLines w:val="1"/>
+        <w:spacing w:after="0" w:before="120" w:line="480" w:lineRule="auto"/>
         <w:jc w:val="left"/>
         <w:rPr/>
       </w:pPr>
@@ -20397,7 +20480,9 @@
     </w:p>
     <w:p>
       <w:pPr>
-        <w:spacing w:after="120" w:before="360" w:line="480" w:lineRule="auto"/>
+        <w:keepNext w:val="1"/>
+        <w:keepLines w:val="1"/>
+        <w:spacing w:after="0" w:before="120" w:line="480" w:lineRule="auto"/>
         <w:jc w:val="left"/>
         <w:rPr/>
       </w:pPr>
@@ -20573,7 +20658,9 @@
     </w:p>
     <w:p>
       <w:pPr>
-        <w:spacing w:after="120" w:before="360" w:line="480" w:lineRule="auto"/>
+        <w:keepNext w:val="1"/>
+        <w:keepLines w:val="1"/>
+        <w:spacing w:after="0" w:before="120" w:line="480" w:lineRule="auto"/>
         <w:jc w:val="left"/>
         <w:rPr/>
       </w:pPr>
@@ -20665,7 +20752,9 @@
     </w:p>
     <w:p>
       <w:pPr>
-        <w:spacing w:after="120" w:before="360" w:line="480" w:lineRule="auto"/>
+        <w:keepNext w:val="1"/>
+        <w:keepLines w:val="1"/>
+        <w:spacing w:after="0" w:before="120" w:line="480" w:lineRule="auto"/>
         <w:jc w:val="left"/>
         <w:rPr/>
       </w:pPr>
@@ -20965,7 +21054,9 @@
     </w:p>
     <w:p>
       <w:pPr>
-        <w:spacing w:after="120" w:before="360" w:line="480" w:lineRule="auto"/>
+        <w:keepNext w:val="1"/>
+        <w:keepLines w:val="1"/>
+        <w:spacing w:after="0" w:before="120" w:line="480" w:lineRule="auto"/>
         <w:jc w:val="left"/>
         <w:rPr/>
       </w:pPr>
@@ -21057,7 +21148,9 @@
     </w:p>
     <w:p>
       <w:pPr>
-        <w:spacing w:after="120" w:before="360" w:line="480" w:lineRule="auto"/>
+        <w:keepNext w:val="1"/>
+        <w:keepLines w:val="1"/>
+        <w:spacing w:after="0" w:before="120" w:line="480" w:lineRule="auto"/>
         <w:jc w:val="left"/>
         <w:rPr/>
       </w:pPr>
@@ -21358,7 +21451,9 @@
     </w:p>
     <w:p>
       <w:pPr>
-        <w:spacing w:after="120" w:before="360" w:line="480" w:lineRule="auto"/>
+        <w:keepNext w:val="1"/>
+        <w:keepLines w:val="1"/>
+        <w:spacing w:after="0" w:before="120" w:line="480" w:lineRule="auto"/>
         <w:jc w:val="left"/>
         <w:rPr/>
       </w:pPr>
@@ -21657,7 +21752,9 @@
     </w:p>
     <w:p>
       <w:pPr>
-        <w:spacing w:after="120" w:before="360" w:line="480" w:lineRule="auto"/>
+        <w:keepNext w:val="1"/>
+        <w:keepLines w:val="1"/>
+        <w:spacing w:after="0" w:before="120" w:line="480" w:lineRule="auto"/>
         <w:jc w:val="left"/>
         <w:rPr/>
       </w:pPr>
@@ -21750,7 +21847,9 @@
     </w:p>
     <w:p>
       <w:pPr>
-        <w:spacing w:after="120" w:before="360" w:line="480" w:lineRule="auto"/>
+        <w:keepNext w:val="1"/>
+        <w:keepLines w:val="1"/>
+        <w:spacing w:after="0" w:before="120" w:line="480" w:lineRule="auto"/>
         <w:jc w:val="left"/>
         <w:rPr/>
       </w:pPr>
@@ -21925,7 +22024,9 @@
     </w:p>
     <w:p>
       <w:pPr>
-        <w:spacing w:after="120" w:before="360" w:line="480" w:lineRule="auto"/>
+        <w:keepNext w:val="1"/>
+        <w:keepLines w:val="1"/>
+        <w:spacing w:after="0" w:before="120" w:line="480" w:lineRule="auto"/>
         <w:jc w:val="left"/>
         <w:rPr/>
       </w:pPr>
@@ -22166,7 +22267,9 @@
     </w:p>
     <w:p>
       <w:pPr>
-        <w:spacing w:after="120" w:before="360" w:line="480" w:lineRule="auto"/>
+        <w:keepNext w:val="1"/>
+        <w:keepLines w:val="1"/>
+        <w:spacing w:after="0" w:before="120" w:line="480" w:lineRule="auto"/>
         <w:jc w:val="left"/>
         <w:rPr/>
       </w:pPr>
@@ -22301,7 +22404,9 @@
     </w:p>
     <w:p>
       <w:pPr>
-        <w:spacing w:after="120" w:before="360" w:line="480" w:lineRule="auto"/>
+        <w:keepNext w:val="1"/>
+        <w:keepLines w:val="1"/>
+        <w:spacing w:after="0" w:before="120" w:line="480" w:lineRule="auto"/>
         <w:jc w:val="left"/>
         <w:rPr/>
       </w:pPr>
@@ -22478,7 +22583,9 @@
     </w:p>
     <w:p>
       <w:pPr>
-        <w:spacing w:after="120" w:before="360" w:line="480" w:lineRule="auto"/>
+        <w:keepNext w:val="1"/>
+        <w:keepLines w:val="1"/>
+        <w:spacing w:after="0" w:before="120" w:line="480" w:lineRule="auto"/>
         <w:jc w:val="left"/>
         <w:rPr/>
       </w:pPr>
@@ -22612,7 +22719,9 @@
     </w:p>
     <w:p>
       <w:pPr>
-        <w:spacing w:after="120" w:before="360" w:line="480" w:lineRule="auto"/>
+        <w:keepNext w:val="1"/>
+        <w:keepLines w:val="1"/>
+        <w:spacing w:after="0" w:before="120" w:line="480" w:lineRule="auto"/>
         <w:jc w:val="left"/>
         <w:rPr/>
       </w:pPr>
@@ -22746,7 +22855,9 @@
     </w:p>
     <w:p>
       <w:pPr>
-        <w:spacing w:after="120" w:before="360" w:line="480" w:lineRule="auto"/>
+        <w:keepNext w:val="1"/>
+        <w:keepLines w:val="1"/>
+        <w:spacing w:after="0" w:before="120" w:line="480" w:lineRule="auto"/>
         <w:jc w:val="left"/>
         <w:rPr/>
       </w:pPr>
@@ -22880,7 +22991,9 @@
     </w:p>
     <w:p>
       <w:pPr>
-        <w:spacing w:after="120" w:before="360" w:line="480" w:lineRule="auto"/>
+        <w:keepNext w:val="1"/>
+        <w:keepLines w:val="1"/>
+        <w:spacing w:after="0" w:before="120" w:line="480" w:lineRule="auto"/>
         <w:jc w:val="left"/>
         <w:rPr/>
       </w:pPr>
@@ -22973,7 +23086,9 @@
     </w:p>
     <w:p>
       <w:pPr>
-        <w:spacing w:after="120" w:before="360" w:line="480" w:lineRule="auto"/>
+        <w:keepNext w:val="1"/>
+        <w:keepLines w:val="1"/>
+        <w:spacing w:after="0" w:before="120" w:line="480" w:lineRule="auto"/>
         <w:jc w:val="left"/>
         <w:rPr/>
       </w:pPr>
@@ -23148,7 +23263,9 @@
     </w:p>
     <w:p>
       <w:pPr>
-        <w:spacing w:after="120" w:before="360" w:line="480" w:lineRule="auto"/>
+        <w:keepNext w:val="1"/>
+        <w:keepLines w:val="1"/>
+        <w:spacing w:after="0" w:before="120" w:line="480" w:lineRule="auto"/>
         <w:jc w:val="left"/>
         <w:rPr/>
       </w:pPr>
@@ -23241,7 +23358,9 @@
     </w:p>
     <w:p>
       <w:pPr>
-        <w:spacing w:after="120" w:before="360" w:line="480" w:lineRule="auto"/>
+        <w:keepNext w:val="1"/>
+        <w:keepLines w:val="1"/>
+        <w:spacing w:after="0" w:before="120" w:line="480" w:lineRule="auto"/>
         <w:jc w:val="left"/>
         <w:rPr/>
       </w:pPr>
@@ -23433,7 +23552,9 @@
     </w:p>
     <w:p>
       <w:pPr>
-        <w:spacing w:after="120" w:before="360" w:line="480" w:lineRule="auto"/>
+        <w:keepNext w:val="1"/>
+        <w:keepLines w:val="1"/>
+        <w:spacing w:after="0" w:before="120" w:line="480" w:lineRule="auto"/>
         <w:jc w:val="left"/>
         <w:rPr/>
       </w:pPr>
@@ -23568,7 +23689,9 @@
     </w:p>
     <w:p>
       <w:pPr>
-        <w:spacing w:after="120" w:before="360" w:line="480" w:lineRule="auto"/>
+        <w:keepNext w:val="1"/>
+        <w:keepLines w:val="1"/>
+        <w:spacing w:after="0" w:before="120" w:line="480" w:lineRule="auto"/>
         <w:jc w:val="left"/>
         <w:rPr/>
       </w:pPr>
@@ -23660,7 +23783,9 @@
     </w:p>
     <w:p>
       <w:pPr>
-        <w:spacing w:after="120" w:before="360" w:line="480" w:lineRule="auto"/>
+        <w:keepNext w:val="1"/>
+        <w:keepLines w:val="1"/>
+        <w:spacing w:after="0" w:before="120" w:line="480" w:lineRule="auto"/>
         <w:jc w:val="left"/>
         <w:rPr/>
       </w:pPr>
@@ -23794,7 +23919,9 @@
     </w:p>
     <w:p>
       <w:pPr>
-        <w:spacing w:after="120" w:before="360" w:line="480" w:lineRule="auto"/>
+        <w:keepNext w:val="1"/>
+        <w:keepLines w:val="1"/>
+        <w:spacing w:after="0" w:before="120" w:line="480" w:lineRule="auto"/>
         <w:jc w:val="left"/>
         <w:rPr/>
       </w:pPr>
@@ -23887,7 +24014,9 @@
     </w:p>
     <w:p>
       <w:pPr>
-        <w:spacing w:after="120" w:before="360" w:line="480" w:lineRule="auto"/>
+        <w:keepNext w:val="1"/>
+        <w:keepLines w:val="1"/>
+        <w:spacing w:after="0" w:before="120" w:line="480" w:lineRule="auto"/>
         <w:jc w:val="left"/>
         <w:rPr/>
       </w:pPr>
@@ -23979,7 +24108,9 @@
     </w:p>
     <w:p>
       <w:pPr>
-        <w:spacing w:after="120" w:before="360" w:line="480" w:lineRule="auto"/>
+        <w:keepNext w:val="1"/>
+        <w:keepLines w:val="1"/>
+        <w:spacing w:after="0" w:before="120" w:line="480" w:lineRule="auto"/>
         <w:jc w:val="left"/>
         <w:rPr/>
       </w:pPr>
@@ -24113,7 +24244,9 @@
     </w:p>
     <w:p>
       <w:pPr>
-        <w:spacing w:after="120" w:before="360" w:line="480" w:lineRule="auto"/>
+        <w:keepNext w:val="1"/>
+        <w:keepLines w:val="1"/>
+        <w:spacing w:after="0" w:before="120" w:line="480" w:lineRule="auto"/>
         <w:jc w:val="left"/>
         <w:rPr/>
       </w:pPr>
@@ -24248,7 +24381,9 @@
     </w:p>
     <w:p>
       <w:pPr>
-        <w:spacing w:after="120" w:before="360" w:line="480" w:lineRule="auto"/>
+        <w:keepNext w:val="1"/>
+        <w:keepLines w:val="1"/>
+        <w:spacing w:after="0" w:before="120" w:line="480" w:lineRule="auto"/>
         <w:jc w:val="left"/>
         <w:rPr/>
       </w:pPr>
@@ -24341,7 +24476,9 @@
     </w:p>
     <w:p>
       <w:pPr>
-        <w:spacing w:after="120" w:before="360" w:line="480" w:lineRule="auto"/>
+        <w:keepNext w:val="1"/>
+        <w:keepLines w:val="1"/>
+        <w:spacing w:after="0" w:before="120" w:line="480" w:lineRule="auto"/>
         <w:jc w:val="left"/>
         <w:rPr/>
       </w:pPr>
@@ -24517,7 +24654,9 @@
     </w:p>
     <w:p>
       <w:pPr>
-        <w:spacing w:after="120" w:before="360" w:line="480" w:lineRule="auto"/>
+        <w:keepNext w:val="1"/>
+        <w:keepLines w:val="1"/>
+        <w:spacing w:after="0" w:before="120" w:line="480" w:lineRule="auto"/>
         <w:jc w:val="left"/>
         <w:rPr/>
       </w:pPr>
@@ -24568,7 +24707,9 @@
     </w:p>
     <w:p>
       <w:pPr>
-        <w:spacing w:after="120" w:before="360" w:line="480" w:lineRule="auto"/>
+        <w:keepNext w:val="1"/>
+        <w:keepLines w:val="1"/>
+        <w:spacing w:after="0" w:before="120" w:line="480" w:lineRule="auto"/>
         <w:jc w:val="left"/>
         <w:rPr/>
       </w:pPr>
@@ -24803,7 +24944,9 @@
     </w:p>
     <w:p>
       <w:pPr>
-        <w:spacing w:after="120" w:before="360" w:line="480" w:lineRule="auto"/>
+        <w:keepNext w:val="1"/>
+        <w:keepLines w:val="1"/>
+        <w:spacing w:after="0" w:before="120" w:line="480" w:lineRule="auto"/>
         <w:jc w:val="left"/>
         <w:rPr/>
       </w:pPr>
@@ -24937,7 +25080,9 @@
     </w:p>
     <w:p>
       <w:pPr>
-        <w:spacing w:after="120" w:before="360" w:line="480" w:lineRule="auto"/>
+        <w:keepNext w:val="1"/>
+        <w:keepLines w:val="1"/>
+        <w:spacing w:after="0" w:before="120" w:line="480" w:lineRule="auto"/>
         <w:jc w:val="left"/>
         <w:rPr/>
       </w:pPr>
@@ -25365,7 +25510,9 @@
     </w:p>
     <w:p>
       <w:pPr>
-        <w:spacing w:after="120" w:before="360" w:line="480" w:lineRule="auto"/>
+        <w:keepNext w:val="1"/>
+        <w:keepLines w:val="1"/>
+        <w:spacing w:after="0" w:before="120" w:line="480" w:lineRule="auto"/>
         <w:jc w:val="left"/>
         <w:rPr/>
       </w:pPr>
@@ -25541,7 +25688,9 @@
     </w:p>
     <w:p>
       <w:pPr>
-        <w:spacing w:after="120" w:before="360" w:line="480" w:lineRule="auto"/>
+        <w:keepNext w:val="1"/>
+        <w:keepLines w:val="1"/>
+        <w:spacing w:after="0" w:before="120" w:line="480" w:lineRule="auto"/>
         <w:jc w:val="left"/>
         <w:rPr/>
       </w:pPr>
@@ -25650,7 +25799,9 @@
     </w:p>
     <w:p>
       <w:pPr>
-        <w:spacing w:after="120" w:before="360" w:line="480" w:lineRule="auto"/>
+        <w:keepNext w:val="1"/>
+        <w:keepLines w:val="1"/>
+        <w:spacing w:after="0" w:before="120" w:line="480" w:lineRule="auto"/>
         <w:jc w:val="left"/>
         <w:rPr/>
       </w:pPr>
@@ -25785,7 +25936,9 @@
     </w:p>
     <w:p>
       <w:pPr>
-        <w:spacing w:after="120" w:before="360" w:line="480" w:lineRule="auto"/>
+        <w:keepNext w:val="1"/>
+        <w:keepLines w:val="1"/>
+        <w:spacing w:after="0" w:before="120" w:line="480" w:lineRule="auto"/>
         <w:jc w:val="left"/>
         <w:rPr/>
       </w:pPr>
@@ -25919,7 +26072,9 @@
     </w:p>
     <w:p>
       <w:pPr>
-        <w:spacing w:after="120" w:before="360" w:line="480" w:lineRule="auto"/>
+        <w:keepNext w:val="1"/>
+        <w:keepLines w:val="1"/>
+        <w:spacing w:after="0" w:before="120" w:line="480" w:lineRule="auto"/>
         <w:jc w:val="left"/>
         <w:rPr/>
       </w:pPr>
@@ -26012,7 +26167,9 @@
     </w:p>
     <w:p>
       <w:pPr>
-        <w:spacing w:after="120" w:before="360" w:line="480" w:lineRule="auto"/>
+        <w:keepNext w:val="1"/>
+        <w:keepLines w:val="1"/>
+        <w:spacing w:after="0" w:before="120" w:line="480" w:lineRule="auto"/>
         <w:jc w:val="left"/>
         <w:rPr/>
       </w:pPr>
@@ -26188,7 +26345,9 @@
     </w:p>
     <w:p>
       <w:pPr>
-        <w:spacing w:after="120" w:before="360" w:line="480" w:lineRule="auto"/>
+        <w:keepNext w:val="1"/>
+        <w:keepLines w:val="1"/>
+        <w:spacing w:after="0" w:before="120" w:line="480" w:lineRule="auto"/>
         <w:jc w:val="left"/>
         <w:rPr/>
       </w:pPr>
@@ -26323,7 +26482,9 @@
     </w:p>
     <w:p>
       <w:pPr>
-        <w:spacing w:after="120" w:before="360" w:line="480" w:lineRule="auto"/>
+        <w:keepNext w:val="1"/>
+        <w:keepLines w:val="1"/>
+        <w:spacing w:after="0" w:before="120" w:line="480" w:lineRule="auto"/>
         <w:jc w:val="left"/>
         <w:rPr/>
       </w:pPr>
@@ -26483,7 +26644,9 @@
     </w:p>
     <w:p>
       <w:pPr>
-        <w:spacing w:after="120" w:before="360" w:line="480" w:lineRule="auto"/>
+        <w:keepNext w:val="1"/>
+        <w:keepLines w:val="1"/>
+        <w:spacing w:after="0" w:before="120" w:line="480" w:lineRule="auto"/>
         <w:jc w:val="left"/>
         <w:rPr/>
       </w:pPr>
@@ -26618,7 +26781,9 @@
     </w:p>
     <w:p>
       <w:pPr>
-        <w:spacing w:after="120" w:before="360" w:line="480" w:lineRule="auto"/>
+        <w:keepNext w:val="1"/>
+        <w:keepLines w:val="1"/>
+        <w:spacing w:after="0" w:before="120" w:line="480" w:lineRule="auto"/>
         <w:jc w:val="left"/>
         <w:rPr/>
       </w:pPr>
@@ -26753,7 +26918,9 @@
     </w:p>
     <w:p>
       <w:pPr>
-        <w:spacing w:after="120" w:before="360" w:line="480" w:lineRule="auto"/>
+        <w:keepNext w:val="1"/>
+        <w:keepLines w:val="1"/>
+        <w:spacing w:after="0" w:before="120" w:line="480" w:lineRule="auto"/>
         <w:jc w:val="left"/>
         <w:rPr/>
       </w:pPr>
@@ -26929,7 +27096,9 @@
     </w:p>
     <w:p>
       <w:pPr>
-        <w:spacing w:after="120" w:before="360" w:line="480" w:lineRule="auto"/>
+        <w:keepNext w:val="1"/>
+        <w:keepLines w:val="1"/>
+        <w:spacing w:after="0" w:before="120" w:line="480" w:lineRule="auto"/>
         <w:jc w:val="left"/>
         <w:rPr/>
       </w:pPr>
@@ -27022,7 +27191,9 @@
     </w:p>
     <w:p>
       <w:pPr>
-        <w:spacing w:after="120" w:before="360" w:line="480" w:lineRule="auto"/>
+        <w:keepNext w:val="1"/>
+        <w:keepLines w:val="1"/>
+        <w:spacing w:after="0" w:before="120" w:line="480" w:lineRule="auto"/>
         <w:jc w:val="left"/>
         <w:rPr/>
       </w:pPr>
@@ -27214,7 +27385,9 @@
     </w:p>
     <w:p>
       <w:pPr>
-        <w:spacing w:after="120" w:before="360" w:line="480" w:lineRule="auto"/>
+        <w:keepNext w:val="1"/>
+        <w:keepLines w:val="1"/>
+        <w:spacing w:after="0" w:before="120" w:line="480" w:lineRule="auto"/>
         <w:jc w:val="left"/>
         <w:rPr/>
       </w:pPr>
@@ -27349,7 +27522,9 @@
     </w:p>
     <w:p>
       <w:pPr>
-        <w:spacing w:after="120" w:before="360" w:line="480" w:lineRule="auto"/>
+        <w:keepNext w:val="1"/>
+        <w:keepLines w:val="1"/>
+        <w:spacing w:after="0" w:before="120" w:line="480" w:lineRule="auto"/>
         <w:jc w:val="left"/>
         <w:rPr/>
       </w:pPr>
@@ -27526,7 +27701,9 @@
     </w:p>
     <w:p>
       <w:pPr>
-        <w:spacing w:after="120" w:before="360" w:line="480" w:lineRule="auto"/>
+        <w:keepNext w:val="1"/>
+        <w:keepLines w:val="1"/>
+        <w:spacing w:after="0" w:before="120" w:line="480" w:lineRule="auto"/>
         <w:jc w:val="left"/>
         <w:rPr/>
       </w:pPr>
@@ -27717,7 +27894,9 @@
     </w:p>
     <w:p>
       <w:pPr>
-        <w:spacing w:after="120" w:before="360" w:line="480" w:lineRule="auto"/>
+        <w:keepNext w:val="1"/>
+        <w:keepLines w:val="1"/>
+        <w:spacing w:after="0" w:before="120" w:line="480" w:lineRule="auto"/>
         <w:jc w:val="left"/>
         <w:rPr/>
       </w:pPr>
@@ -27893,7 +28072,9 @@
     </w:p>
     <w:p>
       <w:pPr>
-        <w:spacing w:after="120" w:before="360" w:line="480" w:lineRule="auto"/>
+        <w:keepNext w:val="1"/>
+        <w:keepLines w:val="1"/>
+        <w:spacing w:after="0" w:before="120" w:line="480" w:lineRule="auto"/>
         <w:jc w:val="left"/>
         <w:rPr/>
       </w:pPr>

</xml_diff>

<commit_message>
Draft_013: checklist formatting fixes
- Margins: 1.5" left, 1" right/top/bottom on all sections
- Major chapters: 3-before/3-after (720 twips), keepNext OFF so after-gap shows
- Sub1 after major: before=0 (major after only)
- Tables 1–5: merge caption into first header cell (fixes LO orphan captions)
- Appendix tables: remove spurious pageBreakBefore on labels
- Appendix A: double-space body; minor heads 1-0; FULL CODEBOOK new page
- Post-table body: 1-space before
</commit_message>
<xml_diff>
--- a/thesis/003_ThesisProposal_Draft_013.docx
+++ b/thesis/003_ThesisProposal_Draft_013.docx
@@ -611,36 +611,35 @@
     </w:p>
     <w:p>
       <w:pPr>
+        <w:keepLines w:val="1"/>
+        <w:spacing w:before="720" w:after="720" w:line="480" w:lineRule="auto"/>
+        <w:jc w:val="center"/>
+        <w:rPr/>
+      </w:pPr>
+      <w:r>
+        <w:rPr>
+          <w:rFonts w:ascii="Georgia" w:cs="Georgia" w:eastAsia="Georgia" w:hAnsi="Georgia"/>
+          <w:b w:val="1"/>
+          <w:bCs w:val="1"/>
+          <w:i w:val="0"/>
+          <w:iCs w:val="0"/>
+          <w:sz w:val="28"/>
+          <w:szCs w:val="28"/>
+          <w:rtl w:val="0"/>
+        </w:rPr>
+        <w:t xml:space="preserve">INTRODUCTION</w:t>
+      </w:r>
+      <w:r>
+        <w:rPr>
+          <w:rtl w:val="0"/>
+        </w:rPr>
+      </w:r>
+    </w:p>
+    <w:p>
+      <w:pPr>
         <w:keepNext w:val="1"/>
         <w:keepLines w:val="1"/>
-        <w:spacing w:before="360" w:after="360" w:line="480" w:lineRule="auto"/>
-        <w:jc w:val="center"/>
-        <w:rPr/>
-      </w:pPr>
-      <w:r>
-        <w:rPr>
-          <w:rFonts w:ascii="Georgia" w:cs="Georgia" w:eastAsia="Georgia" w:hAnsi="Georgia"/>
-          <w:b w:val="1"/>
-          <w:bCs w:val="1"/>
-          <w:i w:val="0"/>
-          <w:iCs w:val="0"/>
-          <w:sz w:val="28"/>
-          <w:szCs w:val="28"/>
-          <w:rtl w:val="0"/>
-        </w:rPr>
-        <w:t xml:space="preserve">INTRODUCTION</w:t>
-      </w:r>
-      <w:r>
-        <w:rPr>
-          <w:rtl w:val="0"/>
-        </w:rPr>
-      </w:r>
-    </w:p>
-    <w:p>
-      <w:pPr>
-        <w:keepNext w:val="1"/>
-        <w:keepLines w:val="1"/>
-        <w:spacing w:before="360" w:after="360" w:line="480" w:lineRule="auto"/>
+        <w:spacing w:before="0" w:after="720" w:line="480" w:lineRule="auto"/>
         <w:jc w:val="left"/>
         <w:rPr/>
       </w:pPr>
@@ -771,7 +770,7 @@
       <w:pPr>
         <w:keepNext w:val="1"/>
         <w:keepLines w:val="1"/>
-        <w:spacing w:before="360" w:after="360" w:line="480" w:lineRule="auto"/>
+        <w:spacing w:before="720" w:after="720" w:line="480" w:lineRule="auto"/>
         <w:jc w:val="left"/>
         <w:rPr/>
       </w:pPr>
@@ -850,7 +849,7 @@
       <w:pPr>
         <w:keepNext w:val="1"/>
         <w:keepLines w:val="1"/>
-        <w:spacing w:before="360" w:after="360" w:line="480" w:lineRule="auto"/>
+        <w:spacing w:before="720" w:after="720" w:line="480" w:lineRule="auto"/>
         <w:jc w:val="left"/>
         <w:rPr/>
       </w:pPr>
@@ -929,7 +928,7 @@
       <w:pPr>
         <w:keepNext w:val="1"/>
         <w:keepLines w:val="1"/>
-        <w:spacing w:before="360" w:after="360" w:line="480" w:lineRule="auto"/>
+        <w:spacing w:before="720" w:after="720" w:line="480" w:lineRule="auto"/>
         <w:jc w:val="left"/>
         <w:rPr/>
       </w:pPr>
@@ -1008,7 +1007,7 @@
       <w:pPr>
         <w:keepNext w:val="1"/>
         <w:keepLines w:val="1"/>
-        <w:spacing w:before="360" w:after="360" w:line="480" w:lineRule="auto"/>
+        <w:spacing w:before="720" w:after="720" w:line="480" w:lineRule="auto"/>
         <w:jc w:val="left"/>
         <w:rPr/>
       </w:pPr>
@@ -1061,7 +1060,7 @@
       <w:pPr>
         <w:keepNext w:val="1"/>
         <w:keepLines w:val="1"/>
-        <w:spacing w:before="360" w:after="360" w:line="480" w:lineRule="auto"/>
+        <w:spacing w:before="720" w:after="720" w:line="480" w:lineRule="auto"/>
         <w:jc w:val="left"/>
         <w:rPr/>
       </w:pPr>
@@ -1166,7 +1165,7 @@
       <w:pPr>
         <w:keepNext w:val="1"/>
         <w:keepLines w:val="1"/>
-        <w:spacing w:before="360" w:after="360" w:line="480" w:lineRule="auto"/>
+        <w:spacing w:before="720" w:after="720" w:line="480" w:lineRule="auto"/>
         <w:jc w:val="left"/>
         <w:rPr/>
       </w:pPr>
@@ -1345,7 +1344,7 @@
       <w:pPr>
         <w:keepNext w:val="1"/>
         <w:keepLines w:val="1"/>
-        <w:spacing w:before="360" w:after="360" w:line="480" w:lineRule="auto"/>
+        <w:spacing w:before="720" w:after="720" w:line="480" w:lineRule="auto"/>
         <w:jc w:val="left"/>
         <w:rPr/>
       </w:pPr>
@@ -1568,7 +1567,7 @@
       <w:pPr>
         <w:keepNext w:val="1"/>
         <w:keepLines w:val="1"/>
-        <w:spacing w:before="360" w:after="360" w:line="480" w:lineRule="auto"/>
+        <w:spacing w:before="720" w:after="720" w:line="480" w:lineRule="auto"/>
         <w:jc w:val="left"/>
         <w:rPr/>
       </w:pPr>
@@ -1711,7 +1710,7 @@
       <w:pPr>
         <w:keepNext w:val="1"/>
         <w:keepLines w:val="1"/>
-        <w:spacing w:before="360" w:after="360" w:line="480" w:lineRule="auto"/>
+        <w:spacing w:before="720" w:after="720" w:line="480" w:lineRule="auto"/>
         <w:jc w:val="left"/>
         <w:rPr/>
       </w:pPr>
@@ -1896,7 +1895,7 @@
       <w:pPr>
         <w:keepNext w:val="1"/>
         <w:keepLines w:val="1"/>
-        <w:spacing w:before="360" w:after="360" w:line="480" w:lineRule="auto"/>
+        <w:spacing w:before="720" w:after="720" w:line="480" w:lineRule="auto"/>
         <w:jc w:val="left"/>
         <w:rPr/>
       </w:pPr>
@@ -2501,9 +2500,8 @@
     </w:p>
     <w:p>
       <w:pPr>
-        <w:keepNext w:val="1"/>
         <w:keepLines w:val="1"/>
-        <w:spacing w:before="360" w:after="360" w:line="480" w:lineRule="auto"/>
+        <w:spacing w:before="720" w:after="720" w:line="480" w:lineRule="auto"/>
         <w:jc w:val="center"/>
         <w:rPr/>
       </w:pPr>
@@ -2556,7 +2554,7 @@
       <w:pPr>
         <w:keepNext w:val="1"/>
         <w:keepLines w:val="1"/>
-        <w:spacing w:before="360" w:after="360" w:line="480" w:lineRule="auto"/>
+        <w:spacing w:before="720" w:after="720" w:line="480" w:lineRule="auto"/>
         <w:jc w:val="left"/>
         <w:rPr/>
       </w:pPr>
@@ -2661,7 +2659,7 @@
       <w:pPr>
         <w:keepNext w:val="1"/>
         <w:keepLines w:val="1"/>
-        <w:spacing w:before="360" w:after="360" w:line="480" w:lineRule="auto"/>
+        <w:spacing w:before="720" w:after="720" w:line="480" w:lineRule="auto"/>
         <w:jc w:val="left"/>
         <w:rPr/>
       </w:pPr>
@@ -2714,7 +2712,7 @@
       <w:pPr>
         <w:keepNext w:val="1"/>
         <w:keepLines w:val="1"/>
-        <w:spacing w:before="360" w:after="360" w:line="480" w:lineRule="auto"/>
+        <w:spacing w:before="720" w:after="720" w:line="480" w:lineRule="auto"/>
         <w:jc w:val="left"/>
         <w:rPr/>
       </w:pPr>
@@ -3001,7 +2999,7 @@
       <w:pPr>
         <w:keepNext w:val="1"/>
         <w:keepLines w:val="1"/>
-        <w:spacing w:before="360" w:after="360" w:line="480" w:lineRule="auto"/>
+        <w:spacing w:before="720" w:after="720" w:line="480" w:lineRule="auto"/>
         <w:jc w:val="left"/>
         <w:rPr/>
       </w:pPr>
@@ -3054,7 +3052,7 @@
       <w:pPr>
         <w:keepNext w:val="1"/>
         <w:keepLines w:val="1"/>
-        <w:spacing w:before="360" w:after="360" w:line="480" w:lineRule="auto"/>
+        <w:spacing w:before="720" w:after="720" w:line="480" w:lineRule="auto"/>
         <w:jc w:val="left"/>
         <w:rPr/>
       </w:pPr>
@@ -3096,57 +3094,6 @@
           <w:rtl w:val="0"/>
         </w:rPr>
         <w:t xml:space="preserve">This study uses a text corpus rather than human participants. The corpus consists of 60 undergraduate thesis abstracts from Agriculture, Veterinary Medicine, and Biology programs at PSAU. This study employs disproportionate stratified systematic sampling, with discipline as the stratification variable and fixed analytical targets per stratum (n=20 for Biology, n=20 for Veterinary Medicine, n=10 for Animal Science, and n=10 for Crop Science) to ensure equal representation regardless of population size. This means the sampling rate varies by population size, prioritizing equal sample sizes over proportional representation. For the Agriculture discipline, the sample is equally split between Crop Science (n=10) and Animal Science (n=10) to ensure balanced representation of the sub-disciplines. Within each stratum, a sampling interval k was calculated as k = N/n. The intervals were Biology k=7 (145÷20=7.25), Veterinary Medicine k=5 (104÷20=5.2), Animal Science k=4 (38÷10=3.8), and Crop Science k=9 (94÷10=9.4). Sampling began from a randomly selected position around the middle of each stratum’s catalog, proceeded forward by taking every kth thesis, and wrapped around to the beginning of the catalog when needed until the target sample was met. This sample size is appropriate for the study’s scope. Khunasathitchai et al. (2025) used 60 abstracts in a comparable corpus study, and Wang (2022) used similar per-discipline proportions. For a manually coded functional analysis at a single institution, 60 texts allow sufficient depth of interpretation within the timeframe and resources of a BA thesis. The study treats findings as baseline descriptive data for institutional curriculum review.</w:t>
-      </w:r>
-      <w:r>
-        <w:rPr>
-          <w:rtl w:val="0"/>
-        </w:rPr>
-      </w:r>
-    </w:p>
-    <w:p>
-      <w:pPr>
-        <w:keepNext w:val="1"/>
-        <w:keepLines w:val="1"/>
-        <w:pageBreakBefore w:val="1"/>
-        <w:spacing w:before="360" w:after="0" w:line="480" w:lineRule="auto"/>
-        <w:rPr/>
-      </w:pPr>
-      <w:r>
-        <w:rPr>
-          <w:rFonts w:ascii="Georgia" w:cs="Georgia" w:eastAsia="Georgia" w:hAnsi="Georgia"/>
-          <w:b w:val="1"/>
-          <w:bCs w:val="1"/>
-          <w:i w:val="0"/>
-          <w:iCs w:val="0"/>
-          <w:sz w:val="22"/>
-          <w:szCs w:val="22"/>
-          <w:rtl w:val="0"/>
-        </w:rPr>
-        <w:t xml:space="preserve">Table 1</w:t>
-      </w:r>
-      <w:r>
-        <w:rPr>
-          <w:rtl w:val="0"/>
-        </w:rPr>
-      </w:r>
-    </w:p>
-    <w:p>
-      <w:pPr>
-        <w:spacing w:before="0" w:after="0" w:line="480" w:lineRule="auto"/>
-        <w:rPr/>
-      </w:pPr>
-      <w:r>
-        <w:rPr>
-          <w:rFonts w:ascii="Georgia" w:cs="Georgia" w:eastAsia="Georgia" w:hAnsi="Georgia"/>
-          <w:b w:val="0"/>
-          <w:bCs w:val="0"/>
-          <w:i w:val="1"/>
-          <w:iCs w:val="1"/>
-          <w:sz w:val="22"/>
-          <w:szCs w:val="22"/>
-          <w:rtl w:val="0"/>
-        </w:rPr>
-        <w:t xml:space="preserve">PSAU Thesis Repository: Population and Sampling Summary</w:t>
       </w:r>
       <w:r>
         <w:rPr>
@@ -3215,7 +3162,7 @@
                 <w:szCs w:val="20"/>
                 <w:rtl w:val="0"/>
               </w:rPr>
-              <w:t xml:space="preserve">Category</w:t>
+              <w:t xml:space="preserve">Table 1: PSAU Thesis Repository: Population and Sampling Summary | Category</w:t>
             </w:r>
             <w:r>
               <w:rPr>
@@ -4339,9 +4286,8 @@
     </w:p>
     <w:p>
       <w:pPr>
-        <w:keepNext w:val="1"/>
         <w:keepLines w:val="1"/>
-        <w:spacing w:before="360" w:after="360" w:line="480" w:lineRule="auto"/>
+        <w:spacing w:before="720" w:after="720" w:line="480" w:lineRule="auto"/>
         <w:jc w:val="center"/>
         <w:rPr/>
       </w:pPr>
@@ -4394,7 +4340,7 @@
       <w:pPr>
         <w:keepNext w:val="1"/>
         <w:keepLines w:val="1"/>
-        <w:spacing w:before="360" w:after="360" w:line="480" w:lineRule="auto"/>
+        <w:spacing w:before="720" w:after="720" w:line="480" w:lineRule="auto"/>
         <w:jc w:val="left"/>
         <w:rPr/>
       </w:pPr>
@@ -4436,57 +4382,6 @@
           <w:rtl w:val="0"/>
         </w:rPr>
         <w:t xml:space="preserve">The coding identified 60 hedge tokens across the 60-abstract corpus. These tokens were classified into four types following Hyland’s (1998) taxonomy: modal verbs, lexical hedges, adverbial hedges, and clause-level hedges. Table 2 presents the distribution of hedge types across the full corpus.</w:t>
-      </w:r>
-      <w:r>
-        <w:rPr>
-          <w:rtl w:val="0"/>
-        </w:rPr>
-      </w:r>
-    </w:p>
-    <w:p>
-      <w:pPr>
-        <w:keepNext w:val="1"/>
-        <w:keepLines w:val="1"/>
-        <w:pageBreakBefore w:val="1"/>
-        <w:spacing w:before="360" w:after="0" w:line="480" w:lineRule="auto"/>
-        <w:rPr/>
-      </w:pPr>
-      <w:r>
-        <w:rPr>
-          <w:rFonts w:ascii="Georgia" w:cs="Georgia" w:eastAsia="Georgia" w:hAnsi="Georgia"/>
-          <w:b w:val="1"/>
-          <w:bCs w:val="1"/>
-          <w:i w:val="0"/>
-          <w:iCs w:val="0"/>
-          <w:sz w:val="22"/>
-          <w:szCs w:val="22"/>
-          <w:rtl w:val="0"/>
-        </w:rPr>
-        <w:t xml:space="preserve">Table 2</w:t>
-      </w:r>
-      <w:r>
-        <w:rPr>
-          <w:rtl w:val="0"/>
-        </w:rPr>
-      </w:r>
-    </w:p>
-    <w:p>
-      <w:pPr>
-        <w:spacing w:before="0" w:after="0" w:line="480" w:lineRule="auto"/>
-        <w:rPr/>
-      </w:pPr>
-      <w:r>
-        <w:rPr>
-          <w:rFonts w:ascii="Georgia" w:cs="Georgia" w:eastAsia="Georgia" w:hAnsi="Georgia"/>
-          <w:b w:val="0"/>
-          <w:bCs w:val="0"/>
-          <w:i w:val="1"/>
-          <w:iCs w:val="1"/>
-          <w:sz w:val="22"/>
-          <w:szCs w:val="22"/>
-          <w:rtl w:val="0"/>
-        </w:rPr>
-        <w:t xml:space="preserve">Hedge Type Distribution Across the Corpus</w:t>
       </w:r>
       <w:r>
         <w:rPr>
@@ -4549,7 +4444,7 @@
                 <w:szCs w:val="20"/>
                 <w:rtl w:val="0"/>
               </w:rPr>
-              <w:t xml:space="preserve">Hedge Type</w:t>
+              <w:t xml:space="preserve">Table 2: Hedge Type Distribution Across the Corpus | Hedge Type</w:t>
             </w:r>
             <w:r>
               <w:rPr>
@@ -5111,57 +5006,6 @@
           <w:rtl w:val="0"/>
         </w:rPr>
         <w:t xml:space="preserve">The distribution of hedge types also varies meaningfully across disciplines. Table 3 presents the per-discipline breakdown of hedge types.</w:t>
-      </w:r>
-      <w:r>
-        <w:rPr>
-          <w:rtl w:val="0"/>
-        </w:rPr>
-      </w:r>
-    </w:p>
-    <w:p>
-      <w:pPr>
-        <w:keepNext w:val="1"/>
-        <w:keepLines w:val="1"/>
-        <w:pageBreakBefore w:val="1"/>
-        <w:spacing w:before="360" w:after="0" w:line="480" w:lineRule="auto"/>
-        <w:rPr/>
-      </w:pPr>
-      <w:r>
-        <w:rPr>
-          <w:rFonts w:ascii="Georgia" w:cs="Georgia" w:eastAsia="Georgia" w:hAnsi="Georgia"/>
-          <w:b w:val="1"/>
-          <w:bCs w:val="1"/>
-          <w:i w:val="0"/>
-          <w:iCs w:val="0"/>
-          <w:sz w:val="22"/>
-          <w:szCs w:val="22"/>
-          <w:rtl w:val="0"/>
-        </w:rPr>
-        <w:t xml:space="preserve">Table 3</w:t>
-      </w:r>
-      <w:r>
-        <w:rPr>
-          <w:rtl w:val="0"/>
-        </w:rPr>
-      </w:r>
-    </w:p>
-    <w:p>
-      <w:pPr>
-        <w:spacing w:before="0" w:after="0" w:line="480" w:lineRule="auto"/>
-        <w:rPr/>
-      </w:pPr>
-      <w:r>
-        <w:rPr>
-          <w:rFonts w:ascii="Georgia" w:cs="Georgia" w:eastAsia="Georgia" w:hAnsi="Georgia"/>
-          <w:b w:val="0"/>
-          <w:bCs w:val="0"/>
-          <w:i w:val="1"/>
-          <w:iCs w:val="1"/>
-          <w:sz w:val="22"/>
-          <w:szCs w:val="22"/>
-          <w:rtl w:val="0"/>
-        </w:rPr>
-        <w:t xml:space="preserve">Hedge Type Distribution by Discipline</w:t>
       </w:r>
       <w:r>
         <w:rPr>
@@ -5230,7 +5074,7 @@
                 <w:szCs w:val="20"/>
                 <w:rtl w:val="0"/>
               </w:rPr>
-              <w:t xml:space="preserve">Discipline</w:t>
+              <w:t xml:space="preserve">Table 3: Hedge Type Distribution by Discipline | Discipline</w:t>
             </w:r>
             <w:r>
               <w:rPr>
@@ -6199,7 +6043,7 @@
       <w:pPr>
         <w:keepNext w:val="1"/>
         <w:keepLines w:val="1"/>
-        <w:spacing w:before="360" w:after="360" w:line="480" w:lineRule="auto"/>
+        <w:spacing w:before="720" w:after="720" w:line="480" w:lineRule="auto"/>
         <w:jc w:val="left"/>
         <w:rPr/>
       </w:pPr>
@@ -6241,57 +6085,6 @@
           <w:rtl w:val="0"/>
         </w:rPr>
         <w:t xml:space="preserve">Cross-disciplinary comparison reveals substantial variation in hedge density. Table 4 presents the hedge counts, false positives, unhedged sites, and normalized frequency (hedges per 100 words) for each discipline.</w:t>
-      </w:r>
-      <w:r>
-        <w:rPr>
-          <w:rtl w:val="0"/>
-        </w:rPr>
-      </w:r>
-    </w:p>
-    <w:p>
-      <w:pPr>
-        <w:keepNext w:val="1"/>
-        <w:keepLines w:val="1"/>
-        <w:pageBreakBefore w:val="1"/>
-        <w:spacing w:before="360" w:after="0" w:line="480" w:lineRule="auto"/>
-        <w:rPr/>
-      </w:pPr>
-      <w:r>
-        <w:rPr>
-          <w:rFonts w:ascii="Georgia" w:cs="Georgia" w:eastAsia="Georgia" w:hAnsi="Georgia"/>
-          <w:b w:val="1"/>
-          <w:bCs w:val="1"/>
-          <w:i w:val="0"/>
-          <w:iCs w:val="0"/>
-          <w:sz w:val="22"/>
-          <w:szCs w:val="22"/>
-          <w:rtl w:val="0"/>
-        </w:rPr>
-        <w:t xml:space="preserve">Table 4</w:t>
-      </w:r>
-      <w:r>
-        <w:rPr>
-          <w:rtl w:val="0"/>
-        </w:rPr>
-      </w:r>
-    </w:p>
-    <w:p>
-      <w:pPr>
-        <w:spacing w:before="0" w:after="0" w:line="480" w:lineRule="auto"/>
-        <w:rPr/>
-      </w:pPr>
-      <w:r>
-        <w:rPr>
-          <w:rFonts w:ascii="Georgia" w:cs="Georgia" w:eastAsia="Georgia" w:hAnsi="Georgia"/>
-          <w:b w:val="0"/>
-          <w:bCs w:val="0"/>
-          <w:i w:val="1"/>
-          <w:iCs w:val="1"/>
-          <w:sz w:val="22"/>
-          <w:szCs w:val="22"/>
-          <w:rtl w:val="0"/>
-        </w:rPr>
-        <w:t xml:space="preserve">Hedge Frequency by Discipline</w:t>
       </w:r>
       <w:r>
         <w:rPr>
@@ -6364,7 +6157,7 @@
                 <w:szCs w:val="18"/>
                 <w:rtl w:val="0"/>
               </w:rPr>
-              <w:t xml:space="preserve">Discipline</w:t>
+              <w:t xml:space="preserve">Table 4: Hedge Frequency by Discipline | Discipline</w:t>
             </w:r>
             <w:r>
               <w:rPr>
@@ -7655,7 +7448,7 @@
       <w:pPr>
         <w:keepNext w:val="1"/>
         <w:keepLines w:val="1"/>
-        <w:spacing w:before="360" w:after="360" w:line="480" w:lineRule="auto"/>
+        <w:spacing w:before="720" w:after="720" w:line="480" w:lineRule="auto"/>
         <w:jc w:val="left"/>
         <w:rPr/>
       </w:pPr>
@@ -7697,57 +7490,6 @@
           <w:rtl w:val="0"/>
         </w:rPr>
         <w:t xml:space="preserve">All 60 hedge tokens in the corpus served the function of Epistemic Caution (EC). No instances of Politeness/Deference (P) or Discourse Organization (DO) were identified. Table 5 presents the function distribution.</w:t>
-      </w:r>
-      <w:r>
-        <w:rPr>
-          <w:rtl w:val="0"/>
-        </w:rPr>
-      </w:r>
-    </w:p>
-    <w:p>
-      <w:pPr>
-        <w:keepNext w:val="1"/>
-        <w:keepLines w:val="1"/>
-        <w:pageBreakBefore w:val="1"/>
-        <w:spacing w:before="360" w:after="0" w:line="480" w:lineRule="auto"/>
-        <w:rPr/>
-      </w:pPr>
-      <w:r>
-        <w:rPr>
-          <w:rFonts w:ascii="Georgia" w:cs="Georgia" w:eastAsia="Georgia" w:hAnsi="Georgia"/>
-          <w:b w:val="1"/>
-          <w:bCs w:val="1"/>
-          <w:i w:val="0"/>
-          <w:iCs w:val="0"/>
-          <w:sz w:val="22"/>
-          <w:szCs w:val="22"/>
-          <w:rtl w:val="0"/>
-        </w:rPr>
-        <w:t xml:space="preserve">Table 5</w:t>
-      </w:r>
-      <w:r>
-        <w:rPr>
-          <w:rtl w:val="0"/>
-        </w:rPr>
-      </w:r>
-    </w:p>
-    <w:p>
-      <w:pPr>
-        <w:spacing w:before="0" w:after="0" w:line="480" w:lineRule="auto"/>
-        <w:rPr/>
-      </w:pPr>
-      <w:r>
-        <w:rPr>
-          <w:rFonts w:ascii="Georgia" w:cs="Georgia" w:eastAsia="Georgia" w:hAnsi="Georgia"/>
-          <w:b w:val="0"/>
-          <w:bCs w:val="0"/>
-          <w:i w:val="1"/>
-          <w:iCs w:val="1"/>
-          <w:sz w:val="22"/>
-          <w:szCs w:val="22"/>
-          <w:rtl w:val="0"/>
-        </w:rPr>
-        <w:t xml:space="preserve">Hedge Function Distribution</w:t>
       </w:r>
       <w:r>
         <w:rPr>
@@ -7810,7 +7552,7 @@
                 <w:szCs w:val="20"/>
                 <w:rtl w:val="0"/>
               </w:rPr>
-              <w:t xml:space="preserve">Function</w:t>
+              <w:t xml:space="preserve">Table 5: Hedge Function Distribution | Function</w:t>
             </w:r>
             <w:r>
               <w:rPr>
@@ -8287,7 +8029,7 @@
       <w:pPr>
         <w:keepNext w:val="1"/>
         <w:keepLines w:val="1"/>
-        <w:spacing w:before="360" w:after="360" w:line="480" w:lineRule="auto"/>
+        <w:spacing w:before="720" w:after="720" w:line="480" w:lineRule="auto"/>
         <w:jc w:val="left"/>
         <w:rPr/>
       </w:pPr>
@@ -8485,10 +8227,9 @@
     </w:p>
     <w:p>
       <w:pPr>
-        <w:keepNext w:val="1"/>
         <w:keepLines w:val="1"/>
         <w:pageBreakBefore w:val="1"/>
-        <w:spacing w:before="360" w:after="360" w:line="480" w:lineRule="auto"/>
+        <w:spacing w:before="720" w:after="720" w:line="480" w:lineRule="auto"/>
         <w:jc w:val="center"/>
         <w:rPr/>
       </w:pPr>
@@ -8541,7 +8282,7 @@
       <w:pPr>
         <w:keepNext w:val="1"/>
         <w:keepLines w:val="1"/>
-        <w:spacing w:before="360" w:after="360" w:line="480" w:lineRule="auto"/>
+        <w:spacing w:before="720" w:after="720" w:line="480" w:lineRule="auto"/>
         <w:jc w:val="left"/>
         <w:rPr/>
       </w:pPr>
@@ -8620,7 +8361,7 @@
       <w:pPr>
         <w:keepNext w:val="1"/>
         <w:keepLines w:val="1"/>
-        <w:spacing w:before="360" w:after="360" w:line="480" w:lineRule="auto"/>
+        <w:spacing w:before="720" w:after="720" w:line="480" w:lineRule="auto"/>
         <w:jc w:val="left"/>
         <w:rPr/>
       </w:pPr>
@@ -8828,9 +8569,8 @@
     </w:p>
     <w:p>
       <w:pPr>
-        <w:keepNext w:val="1"/>
         <w:keepLines w:val="1"/>
-        <w:spacing w:before="360" w:after="360" w:line="480" w:lineRule="auto"/>
+        <w:spacing w:before="720" w:after="720" w:line="480" w:lineRule="auto"/>
         <w:jc w:val="center"/>
         <w:rPr/>
       </w:pPr>
@@ -9815,7 +9555,7 @@
       <w:pPr>
         <w:keepNext w:val="1"/>
         <w:keepLines w:val="1"/>
-        <w:spacing w:before="120" w:after="360" w:line="480" w:lineRule="auto"/>
+        <w:spacing w:before="0" w:after="720" w:line="480" w:lineRule="auto"/>
         <w:jc w:val="left"/>
         <w:rPr/>
       </w:pPr>
@@ -9838,7 +9578,7 @@
     </w:p>
     <w:p>
       <w:pPr>
-        <w:spacing w:before="0" w:after="0" w:line="240" w:lineRule="auto"/>
+        <w:spacing w:before="0" w:after="0" w:line="480" w:lineRule="auto"/>
         <w:jc w:val="left"/>
         <w:rPr/>
       </w:pPr>
@@ -9861,7 +9601,8 @@
     </w:p>
     <w:p>
       <w:pPr>
-        <w:spacing w:before="0" w:after="0" w:line="240" w:lineRule="auto"/>
+        <w:keepNext w:val="1"/>
+        <w:spacing w:before="120" w:after="120" w:line="480" w:lineRule="auto"/>
         <w:ind w:firstLine="720"/>
         <w:jc w:val="left"/>
         <w:rPr/>
@@ -9885,7 +9626,7 @@
     </w:p>
     <w:p>
       <w:pPr>
-        <w:spacing w:before="0" w:after="0" w:line="240" w:lineRule="auto"/>
+        <w:spacing w:before="0" w:after="0" w:line="480" w:lineRule="auto"/>
         <w:jc w:val="left"/>
         <w:rPr/>
       </w:pPr>
@@ -9908,7 +9649,8 @@
     </w:p>
     <w:p>
       <w:pPr>
-        <w:spacing w:before="0" w:after="0" w:line="240" w:lineRule="auto"/>
+        <w:keepNext w:val="1"/>
+        <w:spacing w:before="120" w:after="0" w:line="480" w:lineRule="auto"/>
         <w:jc w:val="left"/>
         <w:rPr/>
       </w:pPr>
@@ -9931,7 +9673,7 @@
     </w:p>
     <w:p>
       <w:pPr>
-        <w:spacing w:before="0" w:after="0" w:line="240" w:lineRule="auto"/>
+        <w:spacing w:before="0" w:after="0" w:line="480" w:lineRule="auto"/>
         <w:ind w:left="240" w:firstLine="0"/>
         <w:jc w:val="left"/>
         <w:rPr/>
@@ -9955,7 +9697,7 @@
     </w:p>
     <w:p>
       <w:pPr>
-        <w:spacing w:before="0" w:after="0" w:line="240" w:lineRule="auto"/>
+        <w:spacing w:before="0" w:after="0" w:line="480" w:lineRule="auto"/>
         <w:ind w:left="240" w:firstLine="0"/>
         <w:jc w:val="left"/>
         <w:rPr/>
@@ -9979,7 +9721,7 @@
     </w:p>
     <w:p>
       <w:pPr>
-        <w:spacing w:before="0" w:after="0" w:line="240" w:lineRule="auto"/>
+        <w:spacing w:before="0" w:after="0" w:line="480" w:lineRule="auto"/>
         <w:ind w:left="240" w:firstLine="0"/>
         <w:jc w:val="left"/>
         <w:rPr/>
@@ -10003,7 +9745,7 @@
     </w:p>
     <w:p>
       <w:pPr>
-        <w:spacing w:before="0" w:after="0" w:line="240" w:lineRule="auto"/>
+        <w:spacing w:before="0" w:after="0" w:line="480" w:lineRule="auto"/>
         <w:ind w:left="240" w:firstLine="0"/>
         <w:jc w:val="left"/>
         <w:rPr/>
@@ -10027,7 +9769,8 @@
     </w:p>
     <w:p>
       <w:pPr>
-        <w:spacing w:before="0" w:after="0" w:line="240" w:lineRule="auto"/>
+        <w:keepNext w:val="1"/>
+        <w:spacing w:before="120" w:after="0" w:line="480" w:lineRule="auto"/>
         <w:ind w:firstLine="720"/>
         <w:jc w:val="left"/>
         <w:rPr/>
@@ -10051,7 +9794,7 @@
     </w:p>
     <w:p>
       <w:pPr>
-        <w:spacing w:before="0" w:after="0" w:line="240" w:lineRule="auto"/>
+        <w:spacing w:before="0" w:after="0" w:line="480" w:lineRule="auto"/>
         <w:ind w:left="240" w:firstLine="720"/>
         <w:jc w:val="left"/>
         <w:rPr/>
@@ -10075,7 +9818,7 @@
     </w:p>
     <w:p>
       <w:pPr>
-        <w:spacing w:before="0" w:after="0" w:line="240" w:lineRule="auto"/>
+        <w:spacing w:before="0" w:after="0" w:line="480" w:lineRule="auto"/>
         <w:ind w:left="240" w:firstLine="720"/>
         <w:jc w:val="left"/>
         <w:rPr/>
@@ -10099,7 +9842,7 @@
     </w:p>
     <w:p>
       <w:pPr>
-        <w:spacing w:before="0" w:after="0" w:line="240" w:lineRule="auto"/>
+        <w:spacing w:before="0" w:after="0" w:line="480" w:lineRule="auto"/>
         <w:ind w:left="240" w:firstLine="0"/>
         <w:jc w:val="left"/>
         <w:rPr/>
@@ -10123,7 +9866,8 @@
     </w:p>
     <w:p>
       <w:pPr>
-        <w:spacing w:before="0" w:after="0" w:line="240" w:lineRule="auto"/>
+        <w:keepNext w:val="1"/>
+        <w:spacing w:before="120" w:after="0" w:line="480" w:lineRule="auto"/>
         <w:ind w:firstLine="720"/>
         <w:jc w:val="left"/>
         <w:rPr/>
@@ -10147,7 +9891,7 @@
     </w:p>
     <w:p>
       <w:pPr>
-        <w:spacing w:before="0" w:after="0" w:line="240" w:lineRule="auto"/>
+        <w:spacing w:before="0" w:after="0" w:line="480" w:lineRule="auto"/>
         <w:ind w:left="240" w:firstLine="720"/>
         <w:jc w:val="left"/>
         <w:rPr/>
@@ -10171,7 +9915,7 @@
     </w:p>
     <w:p>
       <w:pPr>
-        <w:spacing w:before="0" w:after="0" w:line="240" w:lineRule="auto"/>
+        <w:spacing w:before="0" w:after="0" w:line="480" w:lineRule="auto"/>
         <w:ind w:left="240" w:firstLine="720"/>
         <w:jc w:val="left"/>
         <w:rPr/>
@@ -10195,7 +9939,7 @@
     </w:p>
     <w:p>
       <w:pPr>
-        <w:spacing w:before="0" w:after="0" w:line="240" w:lineRule="auto"/>
+        <w:spacing w:before="0" w:after="0" w:line="480" w:lineRule="auto"/>
         <w:ind w:left="240" w:firstLine="720"/>
         <w:jc w:val="left"/>
         <w:rPr/>
@@ -10219,7 +9963,7 @@
     </w:p>
     <w:p>
       <w:pPr>
-        <w:spacing w:before="0" w:after="0" w:line="240" w:lineRule="auto"/>
+        <w:spacing w:before="0" w:after="0" w:line="480" w:lineRule="auto"/>
         <w:ind w:left="240" w:firstLine="0"/>
         <w:jc w:val="left"/>
         <w:rPr/>
@@ -10243,7 +9987,8 @@
     </w:p>
     <w:p>
       <w:pPr>
-        <w:spacing w:before="0" w:after="0" w:line="240" w:lineRule="auto"/>
+        <w:keepNext w:val="1"/>
+        <w:spacing w:before="120" w:after="0" w:line="480" w:lineRule="auto"/>
         <w:ind w:firstLine="720"/>
         <w:jc w:val="left"/>
         <w:rPr/>
@@ -10267,7 +10012,7 @@
     </w:p>
     <w:p>
       <w:pPr>
-        <w:spacing w:before="0" w:after="0" w:line="240" w:lineRule="auto"/>
+        <w:spacing w:before="0" w:after="0" w:line="480" w:lineRule="auto"/>
         <w:jc w:val="left"/>
         <w:rPr/>
       </w:pPr>
@@ -10290,7 +10035,9 @@
     </w:p>
     <w:p>
       <w:pPr>
-        <w:spacing w:before="0" w:after="0" w:line="240" w:lineRule="auto"/>
+        <w:keepNext w:val="1"/>
+        <w:pageBreakBefore w:val="1"/>
+        <w:spacing w:before="720" w:after="120" w:line="480" w:lineRule="auto"/>
         <w:jc w:val="left"/>
         <w:rPr/>
       </w:pPr>
@@ -10313,7 +10060,8 @@
     </w:p>
     <w:p>
       <w:pPr>
-        <w:spacing w:before="0" w:after="0" w:line="240" w:lineRule="auto"/>
+        <w:keepNext w:val="1"/>
+        <w:spacing w:before="120" w:after="0" w:line="480" w:lineRule="auto"/>
         <w:jc w:val="left"/>
         <w:rPr/>
       </w:pPr>
@@ -10338,7 +10086,7 @@
     </w:p>
     <w:p>
       <w:pPr>
-        <w:spacing w:before="0" w:after="0" w:line="240" w:lineRule="auto"/>
+        <w:spacing w:before="0" w:after="0" w:line="480" w:lineRule="auto"/>
         <w:ind w:firstLine="720"/>
         <w:jc w:val="left"/>
         <w:rPr/>
@@ -10362,7 +10110,8 @@
     </w:p>
     <w:p>
       <w:pPr>
-        <w:spacing w:before="0" w:after="0" w:line="240" w:lineRule="auto"/>
+        <w:keepNext w:val="1"/>
+        <w:spacing w:before="120" w:after="0" w:line="480" w:lineRule="auto"/>
         <w:jc w:val="left"/>
         <w:rPr/>
       </w:pPr>
@@ -10387,7 +10136,7 @@
     </w:p>
     <w:p>
       <w:pPr>
-        <w:spacing w:before="0" w:after="0" w:line="240" w:lineRule="auto"/>
+        <w:spacing w:before="0" w:after="0" w:line="480" w:lineRule="auto"/>
         <w:ind w:firstLine="720"/>
         <w:jc w:val="both"/>
         <w:rPr/>
@@ -10442,7 +10191,7 @@
     </w:p>
     <w:p>
       <w:pPr>
-        <w:spacing w:before="0" w:after="0" w:line="240" w:lineRule="auto"/>
+        <w:spacing w:before="0" w:after="0" w:line="480" w:lineRule="auto"/>
         <w:ind w:firstLine="720"/>
         <w:jc w:val="both"/>
         <w:rPr/>
@@ -10468,7 +10217,7 @@
     </w:p>
     <w:p>
       <w:pPr>
-        <w:spacing w:before="0" w:after="0" w:line="240" w:lineRule="auto"/>
+        <w:spacing w:before="0" w:after="0" w:line="480" w:lineRule="auto"/>
         <w:ind w:firstLine="720"/>
         <w:jc w:val="both"/>
         <w:rPr/>
@@ -10551,7 +10300,7 @@
     </w:p>
     <w:p>
       <w:pPr>
-        <w:spacing w:before="0" w:after="0" w:line="240" w:lineRule="auto"/>
+        <w:spacing w:before="0" w:after="0" w:line="480" w:lineRule="auto"/>
         <w:ind w:firstLine="720"/>
         <w:jc w:val="both"/>
         <w:rPr/>
@@ -10577,7 +10326,8 @@
     </w:p>
     <w:p>
       <w:pPr>
-        <w:spacing w:before="0" w:after="0" w:line="240" w:lineRule="auto"/>
+        <w:keepNext w:val="1"/>
+        <w:spacing w:before="120" w:after="0" w:line="480" w:lineRule="auto"/>
         <w:jc w:val="left"/>
         <w:rPr/>
       </w:pPr>
@@ -10602,7 +10352,9 @@
     </w:p>
     <w:p>
       <w:pPr>
-        <w:spacing w:before="0" w:after="0" w:line="240" w:lineRule="auto"/>
+        <w:keepNext w:val="1"/>
+        <w:keepLines w:val="1"/>
+        <w:spacing w:before="0" w:after="0" w:line="480" w:lineRule="auto"/>
         <w:ind w:firstLine="720"/>
         <w:jc w:val="both"/>
         <w:rPr/>
@@ -11342,6 +11094,7 @@
     </w:tbl>
     <w:p>
       <w:pPr>
+        <w:keepNext w:val="1"/>
         <w:spacing w:before="120" w:after="0" w:line="480" w:lineRule="auto"/>
         <w:ind w:firstLine="720"/>
         <w:jc w:val="both"/>
@@ -11397,7 +11150,8 @@
     </w:p>
     <w:p>
       <w:pPr>
-        <w:spacing w:before="0" w:after="0" w:line="240" w:lineRule="auto"/>
+        <w:keepNext w:val="1"/>
+        <w:spacing w:before="120" w:after="0" w:line="480" w:lineRule="auto"/>
         <w:ind w:firstLine="720"/>
         <w:jc w:val="both"/>
         <w:rPr/>
@@ -11602,7 +11356,9 @@
     </w:p>
     <w:p>
       <w:pPr>
-        <w:spacing w:before="0" w:after="0" w:line="240" w:lineRule="auto"/>
+        <w:keepNext w:val="1"/>
+        <w:keepLines w:val="1"/>
+        <w:spacing w:before="120" w:after="0" w:line="480" w:lineRule="auto"/>
         <w:jc w:val="left"/>
         <w:rPr/>
       </w:pPr>
@@ -12293,6 +12049,7 @@
     </w:tbl>
     <w:p>
       <w:pPr>
+        <w:keepNext w:val="1"/>
         <w:spacing w:before="120" w:after="0" w:line="480" w:lineRule="auto"/>
         <w:jc w:val="left"/>
         <w:rPr/>
@@ -12318,7 +12075,9 @@
     </w:p>
     <w:p>
       <w:pPr>
-        <w:spacing w:before="0" w:after="0" w:line="240" w:lineRule="auto"/>
+        <w:keepNext w:val="1"/>
+        <w:keepLines w:val="1"/>
+        <w:spacing w:before="0" w:after="0" w:line="480" w:lineRule="auto"/>
         <w:ind w:firstLine="720"/>
         <w:jc w:val="both"/>
         <w:rPr/>
@@ -13178,7 +12937,7 @@
     </w:p>
     <w:p>
       <w:pPr>
-        <w:spacing w:before="0" w:after="0" w:line="240" w:lineRule="auto"/>
+        <w:spacing w:before="0" w:after="0" w:line="480" w:lineRule="auto"/>
         <w:ind w:firstLine="720"/>
         <w:jc w:val="both"/>
         <w:rPr/>
@@ -13233,7 +12992,8 @@
     </w:p>
     <w:p>
       <w:pPr>
-        <w:spacing w:before="0" w:after="0" w:line="240" w:lineRule="auto"/>
+        <w:keepNext w:val="1"/>
+        <w:spacing w:before="120" w:after="0" w:line="480" w:lineRule="auto"/>
         <w:jc w:val="left"/>
         <w:rPr/>
       </w:pPr>
@@ -13258,7 +13018,9 @@
     </w:p>
     <w:p>
       <w:pPr>
-        <w:spacing w:before="0" w:after="0" w:line="240" w:lineRule="auto"/>
+        <w:keepNext w:val="1"/>
+        <w:keepLines w:val="1"/>
+        <w:spacing w:before="0" w:after="0" w:line="480" w:lineRule="auto"/>
         <w:ind w:firstLine="720"/>
         <w:jc w:val="both"/>
         <w:rPr/>
@@ -13988,6 +13750,7 @@
     </w:tbl>
     <w:p>
       <w:pPr>
+        <w:keepNext w:val="1"/>
         <w:spacing w:before="120" w:after="0" w:line="480" w:lineRule="auto"/>
         <w:jc w:val="left"/>
         <w:rPr/>
@@ -14013,7 +13776,9 @@
     </w:p>
     <w:p>
       <w:pPr>
-        <w:spacing w:before="0" w:after="0" w:line="240" w:lineRule="auto"/>
+        <w:keepNext w:val="1"/>
+        <w:keepLines w:val="1"/>
+        <w:spacing w:before="0" w:after="0" w:line="480" w:lineRule="auto"/>
         <w:ind w:firstLine="720"/>
         <w:jc w:val="both"/>
         <w:rPr/>
@@ -14672,6 +14437,7 @@
     </w:tbl>
     <w:p>
       <w:pPr>
+        <w:keepNext w:val="1"/>
         <w:spacing w:before="120" w:after="0" w:line="480" w:lineRule="auto"/>
         <w:jc w:val="left"/>
         <w:rPr/>
@@ -14697,7 +14463,9 @@
     </w:p>
     <w:p>
       <w:pPr>
-        <w:spacing w:before="0" w:after="0" w:line="240" w:lineRule="auto"/>
+        <w:keepNext w:val="1"/>
+        <w:keepLines w:val="1"/>
+        <w:spacing w:before="0" w:after="0" w:line="480" w:lineRule="auto"/>
         <w:ind w:firstLine="720"/>
         <w:jc w:val="both"/>
         <w:rPr/>
@@ -15221,6 +14989,7 @@
     </w:tbl>
     <w:p>
       <w:pPr>
+        <w:keepNext w:val="1"/>
         <w:spacing w:before="120" w:after="0" w:line="480" w:lineRule="auto"/>
         <w:jc w:val="left"/>
         <w:rPr/>
@@ -15246,7 +15015,7 @@
     </w:p>
     <w:p>
       <w:pPr>
-        <w:spacing w:before="0" w:after="0" w:line="240" w:lineRule="auto"/>
+        <w:spacing w:before="0" w:after="0" w:line="480" w:lineRule="auto"/>
         <w:ind w:firstLine="720"/>
         <w:jc w:val="both"/>
         <w:rPr/>
@@ -15509,7 +15278,7 @@
     </w:p>
     <w:p>
       <w:pPr>
-        <w:spacing w:before="0" w:after="0" w:line="240" w:lineRule="auto"/>
+        <w:spacing w:before="0" w:after="0" w:line="480" w:lineRule="auto"/>
         <w:ind w:firstLine="720"/>
         <w:jc w:val="both"/>
         <w:rPr/>
@@ -15545,7 +15314,8 @@
     </w:p>
     <w:p>
       <w:pPr>
-        <w:spacing w:before="0" w:after="0" w:line="240" w:lineRule="auto"/>
+        <w:keepNext w:val="1"/>
+        <w:spacing w:before="120" w:after="0" w:line="480" w:lineRule="auto"/>
         <w:jc w:val="left"/>
         <w:rPr/>
       </w:pPr>
@@ -15570,7 +15340,9 @@
     </w:p>
     <w:p>
       <w:pPr>
-        <w:spacing w:before="0" w:after="0" w:line="240" w:lineRule="auto"/>
+        <w:keepNext w:val="1"/>
+        <w:keepLines w:val="1"/>
+        <w:spacing w:before="0" w:after="0" w:line="480" w:lineRule="auto"/>
         <w:ind w:firstLine="720"/>
         <w:jc w:val="both"/>
         <w:rPr/>
@@ -16115,7 +15887,7 @@
     </w:p>
     <w:p>
       <w:pPr>
-        <w:spacing w:before="0" w:after="0" w:line="240" w:lineRule="auto"/>
+        <w:spacing w:before="0" w:after="0" w:line="480" w:lineRule="auto"/>
         <w:ind w:firstLine="720"/>
         <w:jc w:val="both"/>
         <w:rPr/>
@@ -16142,7 +15914,9 @@
     </w:p>
     <w:p>
       <w:pPr>
-        <w:spacing w:before="0" w:after="0" w:line="240" w:lineRule="auto"/>
+        <w:keepNext w:val="1"/>
+        <w:keepLines w:val="1"/>
+        <w:spacing w:before="120" w:after="0" w:line="480" w:lineRule="auto"/>
         <w:jc w:val="left"/>
         <w:rPr/>
       </w:pPr>
@@ -16545,6 +16319,7 @@
     </w:tbl>
     <w:p>
       <w:pPr>
+        <w:keepNext w:val="1"/>
         <w:spacing w:before="120" w:after="0" w:line="480" w:lineRule="auto"/>
         <w:jc w:val="left"/>
         <w:rPr/>
@@ -16570,7 +16345,9 @@
     </w:p>
     <w:p>
       <w:pPr>
-        <w:spacing w:before="0" w:after="0" w:line="240" w:lineRule="auto"/>
+        <w:keepNext w:val="1"/>
+        <w:keepLines w:val="1"/>
+        <w:spacing w:before="0" w:after="0" w:line="480" w:lineRule="auto"/>
         <w:ind w:firstLine="720"/>
         <w:jc w:val="both"/>
         <w:rPr/>
@@ -16974,10 +16751,9 @@
     </w:tbl>
     <w:p>
       <w:pPr>
-        <w:keepNext w:val="1"/>
         <w:keepLines w:val="1"/>
         <w:pageBreakBefore w:val="1"/>
-        <w:spacing w:before="360" w:after="360" w:line="480" w:lineRule="auto"/>
+        <w:spacing w:before="720" w:after="720" w:line="480" w:lineRule="auto"/>
         <w:jc w:val="left"/>
         <w:rPr/>
       </w:pPr>
@@ -17800,9 +17576,8 @@
     </w:p>
     <w:p>
       <w:pPr>
-        <w:keepNext w:val="1"/>
         <w:keepLines w:val="1"/>
-        <w:spacing w:before="0" w:after="360" w:line="480" w:lineRule="auto"/>
+        <w:spacing w:before="0" w:after="720" w:line="480" w:lineRule="auto"/>
         <w:jc w:val="left"/>
         <w:rPr/>
       </w:pPr>
@@ -27789,7 +27564,7 @@
     <w:sectPr>
       <w:type w:val="nextPage"/>
       <w:pgSz w:h="16838" w:w="11906" w:orient="portrait"/>
-      <w:pgMar w:bottom="1440" w:top="1440" w:left="1440" w:right="1440" w:header="360" w:footer="360"/>
+      <w:pgMar w:bottom="1440" w:top="1440" w:left="2160" w:right="1440" w:header="360" w:footer="360"/>
     </w:sectPr>
   </w:body>
 </w:document>

</xml_diff>

<commit_message>
Draft_013: line spacing 2.0 default; App A codebook tighter
- Body, App B, App C: double (line=480)
- Appendix A Quick-Reference: single (line=240 / 1.0)
- Appendix A Full Codebook: 1.5 (line=360)
- Fill missing spacing on body paragraphs; docDefaults double
</commit_message>
<xml_diff>
--- a/thesis/003_ThesisProposal_Draft_013.docx
+++ b/thesis/003_ThesisProposal_Draft_013.docx
@@ -1500,7 +1500,7 @@
     </w:p>
     <w:p>
       <w:pPr>
-        <w:spacing w:before="120" w:after="240"/>
+        <w:spacing w:before="120" w:after="240" w:line="480" w:lineRule="auto"/>
         <w:jc w:val="center"/>
       </w:pPr>
       <w:r>
@@ -3149,6 +3149,7 @@
           </w:tcPr>
           <w:p>
             <w:pPr>
+              <w:spacing w:before="0" w:after="0" w:line="480" w:lineRule="auto"/>
               <w:rPr/>
             </w:pPr>
             <w:r>
@@ -3179,6 +3180,7 @@
           </w:tcPr>
           <w:p>
             <w:pPr>
+              <w:spacing w:before="0" w:after="0" w:line="480" w:lineRule="auto"/>
               <w:rPr/>
             </w:pPr>
             <w:r>
@@ -3209,6 +3211,7 @@
           </w:tcPr>
           <w:p>
             <w:pPr>
+              <w:spacing w:before="0" w:after="0" w:line="480" w:lineRule="auto"/>
               <w:rPr/>
             </w:pPr>
             <w:r>
@@ -3239,6 +3242,7 @@
           </w:tcPr>
           <w:p>
             <w:pPr>
+              <w:spacing w:before="0" w:after="0" w:line="480" w:lineRule="auto"/>
               <w:rPr/>
             </w:pPr>
             <w:r>
@@ -3269,6 +3273,7 @@
           </w:tcPr>
           <w:p>
             <w:pPr>
+              <w:spacing w:before="0" w:after="0" w:line="480" w:lineRule="auto"/>
               <w:rPr/>
             </w:pPr>
             <w:r>
@@ -3299,6 +3304,7 @@
           </w:tcPr>
           <w:p>
             <w:pPr>
+              <w:spacing w:before="0" w:after="0" w:line="480" w:lineRule="auto"/>
               <w:rPr/>
             </w:pPr>
             <w:r>
@@ -3331,6 +3337,7 @@
           <w:tcPr/>
           <w:p>
             <w:pPr>
+              <w:spacing w:before="0" w:after="0" w:line="480" w:lineRule="auto"/>
               <w:rPr/>
             </w:pPr>
             <w:r>
@@ -3357,6 +3364,7 @@
           <w:tcPr/>
           <w:p>
             <w:pPr>
+              <w:spacing w:before="0" w:after="0" w:line="480" w:lineRule="auto"/>
               <w:rPr/>
             </w:pPr>
             <w:r>
@@ -3383,6 +3391,7 @@
           <w:tcPr/>
           <w:p>
             <w:pPr>
+              <w:spacing w:before="0" w:after="0" w:line="480" w:lineRule="auto"/>
               <w:rPr/>
             </w:pPr>
             <w:r>
@@ -3409,6 +3418,7 @@
           <w:tcPr/>
           <w:p>
             <w:pPr>
+              <w:spacing w:before="0" w:after="0" w:line="480" w:lineRule="auto"/>
               <w:rPr/>
             </w:pPr>
             <w:r>
@@ -3435,6 +3445,7 @@
           <w:tcPr/>
           <w:p>
             <w:pPr>
+              <w:spacing w:before="0" w:after="0" w:line="480" w:lineRule="auto"/>
               <w:rPr/>
             </w:pPr>
             <w:r>
@@ -3461,6 +3472,7 @@
           <w:tcPr/>
           <w:p>
             <w:pPr>
+              <w:spacing w:before="0" w:after="0" w:line="480" w:lineRule="auto"/>
               <w:rPr/>
             </w:pPr>
             <w:r>
@@ -3493,6 +3505,7 @@
           <w:tcPr/>
           <w:p>
             <w:pPr>
+              <w:spacing w:before="0" w:after="0" w:line="480" w:lineRule="auto"/>
               <w:rPr/>
             </w:pPr>
             <w:r>
@@ -3519,6 +3532,7 @@
           <w:tcPr/>
           <w:p>
             <w:pPr>
+              <w:spacing w:before="0" w:after="0" w:line="480" w:lineRule="auto"/>
               <w:rPr/>
             </w:pPr>
             <w:r>
@@ -3545,6 +3559,7 @@
           <w:tcPr/>
           <w:p>
             <w:pPr>
+              <w:spacing w:before="0" w:after="0" w:line="480" w:lineRule="auto"/>
               <w:rPr/>
             </w:pPr>
             <w:r>
@@ -3571,6 +3586,7 @@
           <w:tcPr/>
           <w:p>
             <w:pPr>
+              <w:spacing w:before="0" w:after="0" w:line="480" w:lineRule="auto"/>
               <w:rPr/>
             </w:pPr>
             <w:r>
@@ -3597,6 +3613,7 @@
           <w:tcPr/>
           <w:p>
             <w:pPr>
+              <w:spacing w:before="0" w:after="0" w:line="480" w:lineRule="auto"/>
               <w:rPr/>
             </w:pPr>
             <w:r>
@@ -3623,6 +3640,7 @@
           <w:tcPr/>
           <w:p>
             <w:pPr>
+              <w:spacing w:before="0" w:after="0" w:line="480" w:lineRule="auto"/>
               <w:rPr/>
             </w:pPr>
             <w:r>
@@ -3655,6 +3673,7 @@
           <w:tcPr/>
           <w:p>
             <w:pPr>
+              <w:spacing w:before="0" w:after="0" w:line="480" w:lineRule="auto"/>
               <w:rPr/>
             </w:pPr>
             <w:r>
@@ -3681,6 +3700,7 @@
           <w:tcPr/>
           <w:p>
             <w:pPr>
+              <w:spacing w:before="0" w:after="0" w:line="480" w:lineRule="auto"/>
               <w:rPr/>
             </w:pPr>
             <w:r>
@@ -3707,6 +3727,7 @@
           <w:tcPr/>
           <w:p>
             <w:pPr>
+              <w:spacing w:before="0" w:after="0" w:line="480" w:lineRule="auto"/>
               <w:rPr/>
             </w:pPr>
             <w:r>
@@ -3733,6 +3754,7 @@
           <w:tcPr/>
           <w:p>
             <w:pPr>
+              <w:spacing w:before="0" w:after="0" w:line="480" w:lineRule="auto"/>
               <w:rPr/>
             </w:pPr>
             <w:r>
@@ -3759,6 +3781,7 @@
           <w:tcPr/>
           <w:p>
             <w:pPr>
+              <w:spacing w:before="0" w:after="0" w:line="480" w:lineRule="auto"/>
               <w:rPr/>
             </w:pPr>
             <w:r>
@@ -3785,6 +3808,7 @@
           <w:tcPr/>
           <w:p>
             <w:pPr>
+              <w:spacing w:before="0" w:after="0" w:line="480" w:lineRule="auto"/>
               <w:rPr/>
             </w:pPr>
             <w:r>
@@ -3817,6 +3841,7 @@
           <w:tcPr/>
           <w:p>
             <w:pPr>
+              <w:spacing w:before="0" w:after="0" w:line="480" w:lineRule="auto"/>
               <w:rPr/>
             </w:pPr>
             <w:r>
@@ -3843,6 +3868,7 @@
           <w:tcPr/>
           <w:p>
             <w:pPr>
+              <w:spacing w:before="0" w:after="0" w:line="480" w:lineRule="auto"/>
               <w:rPr/>
             </w:pPr>
             <w:r>
@@ -3869,6 +3895,7 @@
           <w:tcPr/>
           <w:p>
             <w:pPr>
+              <w:spacing w:before="0" w:after="0" w:line="480" w:lineRule="auto"/>
               <w:rPr/>
             </w:pPr>
             <w:r>
@@ -3895,6 +3922,7 @@
           <w:tcPr/>
           <w:p>
             <w:pPr>
+              <w:spacing w:before="0" w:after="0" w:line="480" w:lineRule="auto"/>
               <w:rPr/>
             </w:pPr>
             <w:r>
@@ -3921,6 +3949,7 @@
           <w:tcPr/>
           <w:p>
             <w:pPr>
+              <w:spacing w:before="0" w:after="0" w:line="480" w:lineRule="auto"/>
               <w:rPr/>
             </w:pPr>
             <w:r>
@@ -3947,6 +3976,7 @@
           <w:tcPr/>
           <w:p>
             <w:pPr>
+              <w:spacing w:before="0" w:after="0" w:line="480" w:lineRule="auto"/>
               <w:rPr/>
             </w:pPr>
             <w:r>
@@ -3979,6 +4009,7 @@
           <w:tcPr/>
           <w:p>
             <w:pPr>
+              <w:spacing w:before="0" w:after="0" w:line="480" w:lineRule="auto"/>
               <w:rPr/>
             </w:pPr>
             <w:r>
@@ -4005,6 +4036,7 @@
           <w:tcPr/>
           <w:p>
             <w:pPr>
+              <w:spacing w:before="0" w:after="0" w:line="480" w:lineRule="auto"/>
               <w:rPr/>
             </w:pPr>
             <w:r>
@@ -4031,6 +4063,7 @@
           <w:tcPr/>
           <w:p>
             <w:pPr>
+              <w:spacing w:before="0" w:after="0" w:line="480" w:lineRule="auto"/>
               <w:rPr/>
             </w:pPr>
             <w:r>
@@ -4057,6 +4090,7 @@
           <w:tcPr/>
           <w:p>
             <w:pPr>
+              <w:spacing w:before="0" w:after="0" w:line="480" w:lineRule="auto"/>
               <w:rPr/>
             </w:pPr>
             <w:r>
@@ -4083,6 +4117,7 @@
           <w:tcPr/>
           <w:p>
             <w:pPr>
+              <w:spacing w:before="0" w:after="0" w:line="480" w:lineRule="auto"/>
               <w:rPr/>
             </w:pPr>
             <w:r>
@@ -4109,6 +4144,7 @@
           <w:tcPr/>
           <w:p>
             <w:pPr>
+              <w:spacing w:before="0" w:after="0" w:line="480" w:lineRule="auto"/>
               <w:rPr/>
             </w:pPr>
             <w:r>
@@ -4431,6 +4467,7 @@
           </w:tcPr>
           <w:p>
             <w:pPr>
+              <w:spacing w:before="0" w:after="0" w:line="480" w:lineRule="auto"/>
               <w:rPr/>
             </w:pPr>
             <w:r>
@@ -4461,6 +4498,7 @@
           </w:tcPr>
           <w:p>
             <w:pPr>
+              <w:spacing w:before="0" w:after="0" w:line="480" w:lineRule="auto"/>
               <w:rPr/>
             </w:pPr>
             <w:r>
@@ -4491,6 +4529,7 @@
           </w:tcPr>
           <w:p>
             <w:pPr>
+              <w:spacing w:before="0" w:after="0" w:line="480" w:lineRule="auto"/>
               <w:rPr/>
             </w:pPr>
             <w:r>
@@ -4523,6 +4562,7 @@
           <w:tcPr/>
           <w:p>
             <w:pPr>
+              <w:spacing w:before="0" w:after="0" w:line="480" w:lineRule="auto"/>
               <w:rPr/>
             </w:pPr>
             <w:r>
@@ -4549,6 +4589,7 @@
           <w:tcPr/>
           <w:p>
             <w:pPr>
+              <w:spacing w:before="0" w:after="0" w:line="480" w:lineRule="auto"/>
               <w:rPr/>
             </w:pPr>
             <w:r>
@@ -4575,6 +4616,7 @@
           <w:tcPr/>
           <w:p>
             <w:pPr>
+              <w:spacing w:before="0" w:after="0" w:line="480" w:lineRule="auto"/>
               <w:rPr/>
             </w:pPr>
             <w:r>
@@ -4607,6 +4649,7 @@
           <w:tcPr/>
           <w:p>
             <w:pPr>
+              <w:spacing w:before="0" w:after="0" w:line="480" w:lineRule="auto"/>
               <w:rPr/>
             </w:pPr>
             <w:r>
@@ -4633,6 +4676,7 @@
           <w:tcPr/>
           <w:p>
             <w:pPr>
+              <w:spacing w:before="0" w:after="0" w:line="480" w:lineRule="auto"/>
               <w:rPr/>
             </w:pPr>
             <w:r>
@@ -4659,6 +4703,7 @@
           <w:tcPr/>
           <w:p>
             <w:pPr>
+              <w:spacing w:before="0" w:after="0" w:line="480" w:lineRule="auto"/>
               <w:rPr/>
             </w:pPr>
             <w:r>
@@ -4691,6 +4736,7 @@
           <w:tcPr/>
           <w:p>
             <w:pPr>
+              <w:spacing w:before="0" w:after="0" w:line="480" w:lineRule="auto"/>
               <w:rPr/>
             </w:pPr>
             <w:r>
@@ -4717,6 +4763,7 @@
           <w:tcPr/>
           <w:p>
             <w:pPr>
+              <w:spacing w:before="0" w:after="0" w:line="480" w:lineRule="auto"/>
               <w:rPr/>
             </w:pPr>
             <w:r>
@@ -4743,6 +4790,7 @@
           <w:tcPr/>
           <w:p>
             <w:pPr>
+              <w:spacing w:before="0" w:after="0" w:line="480" w:lineRule="auto"/>
               <w:rPr/>
             </w:pPr>
             <w:r>
@@ -4775,6 +4823,7 @@
           <w:tcPr/>
           <w:p>
             <w:pPr>
+              <w:spacing w:before="0" w:after="0" w:line="480" w:lineRule="auto"/>
               <w:rPr/>
             </w:pPr>
             <w:r>
@@ -4801,6 +4850,7 @@
           <w:tcPr/>
           <w:p>
             <w:pPr>
+              <w:spacing w:before="0" w:after="0" w:line="480" w:lineRule="auto"/>
               <w:rPr/>
             </w:pPr>
             <w:r>
@@ -4827,6 +4877,7 @@
           <w:tcPr/>
           <w:p>
             <w:pPr>
+              <w:spacing w:before="0" w:after="0" w:line="480" w:lineRule="auto"/>
               <w:rPr/>
             </w:pPr>
             <w:r>
@@ -4859,6 +4910,7 @@
           <w:tcPr/>
           <w:p>
             <w:pPr>
+              <w:spacing w:before="0" w:after="0" w:line="480" w:lineRule="auto"/>
               <w:rPr/>
             </w:pPr>
             <w:r>
@@ -4885,6 +4937,7 @@
           <w:tcPr/>
           <w:p>
             <w:pPr>
+              <w:spacing w:before="0" w:after="0" w:line="480" w:lineRule="auto"/>
               <w:rPr/>
             </w:pPr>
             <w:r>
@@ -4911,6 +4964,7 @@
           <w:tcPr/>
           <w:p>
             <w:pPr>
+              <w:spacing w:before="0" w:after="0" w:line="480" w:lineRule="auto"/>
               <w:rPr/>
             </w:pPr>
             <w:r>
@@ -5061,6 +5115,7 @@
           </w:tcPr>
           <w:p>
             <w:pPr>
+              <w:spacing w:before="0" w:after="0" w:line="480" w:lineRule="auto"/>
               <w:rPr/>
             </w:pPr>
             <w:r>
@@ -5091,6 +5146,7 @@
           </w:tcPr>
           <w:p>
             <w:pPr>
+              <w:spacing w:before="0" w:after="0" w:line="480" w:lineRule="auto"/>
               <w:rPr/>
             </w:pPr>
             <w:r>
@@ -5121,6 +5177,7 @@
           </w:tcPr>
           <w:p>
             <w:pPr>
+              <w:spacing w:before="0" w:after="0" w:line="480" w:lineRule="auto"/>
               <w:rPr/>
             </w:pPr>
             <w:r>
@@ -5151,6 +5208,7 @@
           </w:tcPr>
           <w:p>
             <w:pPr>
+              <w:spacing w:before="0" w:after="0" w:line="480" w:lineRule="auto"/>
               <w:rPr/>
             </w:pPr>
             <w:r>
@@ -5181,6 +5239,7 @@
           </w:tcPr>
           <w:p>
             <w:pPr>
+              <w:spacing w:before="0" w:after="0" w:line="480" w:lineRule="auto"/>
               <w:rPr>
                 <w:rFonts w:ascii="Georgia" w:cs="Georgia" w:eastAsia="Georgia" w:hAnsi="Georgia"/>
                 <w:b w:val="1"/>
@@ -5207,6 +5266,7 @@
           </w:p>
           <w:p>
             <w:pPr>
+              <w:spacing w:before="0" w:after="0" w:line="480" w:lineRule="auto"/>
               <w:rPr/>
             </w:pPr>
             <w:r>
@@ -5237,6 +5297,7 @@
           </w:tcPr>
           <w:p>
             <w:pPr>
+              <w:spacing w:before="0" w:after="0" w:line="480" w:lineRule="auto"/>
               <w:rPr/>
             </w:pPr>
             <w:r>
@@ -5269,6 +5330,7 @@
           <w:tcPr/>
           <w:p>
             <w:pPr>
+              <w:spacing w:before="0" w:after="0" w:line="480" w:lineRule="auto"/>
               <w:rPr/>
             </w:pPr>
             <w:r>
@@ -5295,6 +5357,7 @@
           <w:tcPr/>
           <w:p>
             <w:pPr>
+              <w:spacing w:before="0" w:after="0" w:line="480" w:lineRule="auto"/>
               <w:rPr/>
             </w:pPr>
             <w:r>
@@ -5321,6 +5384,7 @@
           <w:tcPr/>
           <w:p>
             <w:pPr>
+              <w:spacing w:before="0" w:after="0" w:line="480" w:lineRule="auto"/>
               <w:rPr/>
             </w:pPr>
             <w:r>
@@ -5347,6 +5411,7 @@
           <w:tcPr/>
           <w:p>
             <w:pPr>
+              <w:spacing w:before="0" w:after="0" w:line="480" w:lineRule="auto"/>
               <w:rPr/>
             </w:pPr>
             <w:r>
@@ -5373,6 +5438,7 @@
           <w:tcPr/>
           <w:p>
             <w:pPr>
+              <w:spacing w:before="0" w:after="0" w:line="480" w:lineRule="auto"/>
               <w:rPr/>
             </w:pPr>
             <w:r>
@@ -5399,6 +5465,7 @@
           <w:tcPr/>
           <w:p>
             <w:pPr>
+              <w:spacing w:before="0" w:after="0" w:line="480" w:lineRule="auto"/>
               <w:rPr/>
             </w:pPr>
             <w:r>
@@ -5431,6 +5498,7 @@
           <w:tcPr/>
           <w:p>
             <w:pPr>
+              <w:spacing w:before="0" w:after="0" w:line="480" w:lineRule="auto"/>
               <w:rPr/>
             </w:pPr>
             <w:r>
@@ -5457,6 +5525,7 @@
           <w:tcPr/>
           <w:p>
             <w:pPr>
+              <w:spacing w:before="0" w:after="0" w:line="480" w:lineRule="auto"/>
               <w:rPr/>
             </w:pPr>
             <w:r>
@@ -5483,6 +5552,7 @@
           <w:tcPr/>
           <w:p>
             <w:pPr>
+              <w:spacing w:before="0" w:after="0" w:line="480" w:lineRule="auto"/>
               <w:rPr/>
             </w:pPr>
             <w:r>
@@ -5509,6 +5579,7 @@
           <w:tcPr/>
           <w:p>
             <w:pPr>
+              <w:spacing w:before="0" w:after="0" w:line="480" w:lineRule="auto"/>
               <w:rPr/>
             </w:pPr>
             <w:r>
@@ -5535,6 +5606,7 @@
           <w:tcPr/>
           <w:p>
             <w:pPr>
+              <w:spacing w:before="0" w:after="0" w:line="480" w:lineRule="auto"/>
               <w:rPr/>
             </w:pPr>
             <w:r>
@@ -5561,6 +5633,7 @@
           <w:tcPr/>
           <w:p>
             <w:pPr>
+              <w:spacing w:before="0" w:after="0" w:line="480" w:lineRule="auto"/>
               <w:rPr/>
             </w:pPr>
             <w:r>
@@ -5593,6 +5666,7 @@
           <w:tcPr/>
           <w:p>
             <w:pPr>
+              <w:spacing w:before="0" w:after="0" w:line="480" w:lineRule="auto"/>
               <w:rPr/>
             </w:pPr>
             <w:r>
@@ -5619,6 +5693,7 @@
           <w:tcPr/>
           <w:p>
             <w:pPr>
+              <w:spacing w:before="0" w:after="0" w:line="480" w:lineRule="auto"/>
               <w:rPr/>
             </w:pPr>
             <w:r>
@@ -5645,6 +5720,7 @@
           <w:tcPr/>
           <w:p>
             <w:pPr>
+              <w:spacing w:before="0" w:after="0" w:line="480" w:lineRule="auto"/>
               <w:rPr/>
             </w:pPr>
             <w:r>
@@ -5671,6 +5747,7 @@
           <w:tcPr/>
           <w:p>
             <w:pPr>
+              <w:spacing w:before="0" w:after="0" w:line="480" w:lineRule="auto"/>
               <w:rPr/>
             </w:pPr>
             <w:r>
@@ -5697,6 +5774,7 @@
           <w:tcPr/>
           <w:p>
             <w:pPr>
+              <w:spacing w:before="0" w:after="0" w:line="480" w:lineRule="auto"/>
               <w:rPr/>
             </w:pPr>
             <w:r>
@@ -5723,6 +5801,7 @@
           <w:tcPr/>
           <w:p>
             <w:pPr>
+              <w:spacing w:before="0" w:after="0" w:line="480" w:lineRule="auto"/>
               <w:rPr/>
             </w:pPr>
             <w:r>
@@ -5755,6 +5834,7 @@
           <w:tcPr/>
           <w:p>
             <w:pPr>
+              <w:spacing w:before="0" w:after="0" w:line="480" w:lineRule="auto"/>
               <w:rPr/>
             </w:pPr>
             <w:r>
@@ -5781,6 +5861,7 @@
           <w:tcPr/>
           <w:p>
             <w:pPr>
+              <w:spacing w:before="0" w:after="0" w:line="480" w:lineRule="auto"/>
               <w:rPr/>
             </w:pPr>
             <w:r>
@@ -5807,6 +5888,7 @@
           <w:tcPr/>
           <w:p>
             <w:pPr>
+              <w:spacing w:before="0" w:after="0" w:line="480" w:lineRule="auto"/>
               <w:rPr/>
             </w:pPr>
             <w:r>
@@ -5833,6 +5915,7 @@
           <w:tcPr/>
           <w:p>
             <w:pPr>
+              <w:spacing w:before="0" w:after="0" w:line="480" w:lineRule="auto"/>
               <w:rPr/>
             </w:pPr>
             <w:r>
@@ -5859,6 +5942,7 @@
           <w:tcPr/>
           <w:p>
             <w:pPr>
+              <w:spacing w:before="0" w:after="0" w:line="480" w:lineRule="auto"/>
               <w:rPr/>
             </w:pPr>
             <w:r>
@@ -5885,6 +5969,7 @@
           <w:tcPr/>
           <w:p>
             <w:pPr>
+              <w:spacing w:before="0" w:after="0" w:line="480" w:lineRule="auto"/>
               <w:rPr/>
             </w:pPr>
             <w:r>
@@ -6144,6 +6229,7 @@
           </w:tcPr>
           <w:p>
             <w:pPr>
+              <w:spacing w:before="0" w:after="0" w:line="480" w:lineRule="auto"/>
               <w:rPr/>
             </w:pPr>
             <w:r>
@@ -6174,6 +6260,7 @@
           </w:tcPr>
           <w:p>
             <w:pPr>
+              <w:spacing w:before="0" w:after="0" w:line="480" w:lineRule="auto"/>
               <w:rPr/>
             </w:pPr>
             <w:r>
@@ -6204,6 +6291,7 @@
           </w:tcPr>
           <w:p>
             <w:pPr>
+              <w:spacing w:before="0" w:after="0" w:line="480" w:lineRule="auto"/>
               <w:rPr/>
             </w:pPr>
             <w:r>
@@ -6234,6 +6322,7 @@
           </w:tcPr>
           <w:p>
             <w:pPr>
+              <w:spacing w:before="0" w:after="0" w:line="480" w:lineRule="auto"/>
               <w:rPr/>
             </w:pPr>
             <w:r>
@@ -6264,6 +6353,7 @@
           </w:tcPr>
           <w:p>
             <w:pPr>
+              <w:spacing w:before="0" w:after="0" w:line="480" w:lineRule="auto"/>
               <w:rPr/>
             </w:pPr>
             <w:r>
@@ -6294,6 +6384,7 @@
           </w:tcPr>
           <w:p>
             <w:pPr>
+              <w:spacing w:before="0" w:after="0" w:line="480" w:lineRule="auto"/>
               <w:rPr/>
             </w:pPr>
             <w:r>
@@ -6324,6 +6415,7 @@
           </w:tcPr>
           <w:p>
             <w:pPr>
+              <w:spacing w:before="0" w:after="0" w:line="480" w:lineRule="auto"/>
               <w:rPr>
                 <w:b w:val="1"/>
                 <w:bCs w:val="1"/>
@@ -6352,6 +6444,7 @@
           </w:p>
           <w:p>
             <w:pPr>
+              <w:spacing w:before="0" w:after="0" w:line="480" w:lineRule="auto"/>
               <w:rPr/>
             </w:pPr>
             <w:r>
@@ -6382,6 +6475,7 @@
           </w:tcPr>
           <w:p>
             <w:pPr>
+              <w:spacing w:before="0" w:after="0" w:line="480" w:lineRule="auto"/>
               <w:rPr>
                 <w:rFonts w:ascii="Georgia" w:cs="Georgia" w:eastAsia="Georgia" w:hAnsi="Georgia"/>
                 <w:b w:val="1"/>
@@ -6408,6 +6502,7 @@
           </w:p>
           <w:p>
             <w:pPr>
+              <w:spacing w:before="0" w:after="0" w:line="480" w:lineRule="auto"/>
               <w:rPr/>
             </w:pPr>
             <w:r>
@@ -6440,6 +6535,7 @@
           <w:tcPr/>
           <w:p>
             <w:pPr>
+              <w:spacing w:before="0" w:after="0" w:line="480" w:lineRule="auto"/>
               <w:rPr/>
             </w:pPr>
             <w:r>
@@ -6466,6 +6562,7 @@
           <w:tcPr/>
           <w:p>
             <w:pPr>
+              <w:spacing w:before="0" w:after="0" w:line="480" w:lineRule="auto"/>
               <w:rPr/>
             </w:pPr>
             <w:r>
@@ -6492,6 +6589,7 @@
           <w:tcPr/>
           <w:p>
             <w:pPr>
+              <w:spacing w:before="0" w:after="0" w:line="480" w:lineRule="auto"/>
               <w:rPr/>
             </w:pPr>
             <w:r>
@@ -6518,6 +6616,7 @@
           <w:tcPr/>
           <w:p>
             <w:pPr>
+              <w:spacing w:before="0" w:after="0" w:line="480" w:lineRule="auto"/>
               <w:rPr/>
             </w:pPr>
             <w:r>
@@ -6544,6 +6643,7 @@
           <w:tcPr/>
           <w:p>
             <w:pPr>
+              <w:spacing w:before="0" w:after="0" w:line="480" w:lineRule="auto"/>
               <w:rPr/>
             </w:pPr>
             <w:r>
@@ -6570,6 +6670,7 @@
           <w:tcPr/>
           <w:p>
             <w:pPr>
+              <w:spacing w:before="0" w:after="0" w:line="480" w:lineRule="auto"/>
               <w:rPr/>
             </w:pPr>
             <w:r>
@@ -6596,6 +6697,7 @@
           <w:tcPr/>
           <w:p>
             <w:pPr>
+              <w:spacing w:before="0" w:after="0" w:line="480" w:lineRule="auto"/>
               <w:rPr/>
             </w:pPr>
             <w:r>
@@ -6622,6 +6724,7 @@
           <w:tcPr/>
           <w:p>
             <w:pPr>
+              <w:spacing w:before="0" w:after="0" w:line="480" w:lineRule="auto"/>
               <w:rPr/>
             </w:pPr>
             <w:r>
@@ -6654,6 +6757,7 @@
           <w:tcPr/>
           <w:p>
             <w:pPr>
+              <w:spacing w:before="0" w:after="0" w:line="480" w:lineRule="auto"/>
               <w:rPr/>
             </w:pPr>
             <w:r>
@@ -6680,6 +6784,7 @@
           <w:tcPr/>
           <w:p>
             <w:pPr>
+              <w:spacing w:before="0" w:after="0" w:line="480" w:lineRule="auto"/>
               <w:rPr/>
             </w:pPr>
             <w:r>
@@ -6706,6 +6811,7 @@
           <w:tcPr/>
           <w:p>
             <w:pPr>
+              <w:spacing w:before="0" w:after="0" w:line="480" w:lineRule="auto"/>
               <w:rPr/>
             </w:pPr>
             <w:r>
@@ -6732,6 +6838,7 @@
           <w:tcPr/>
           <w:p>
             <w:pPr>
+              <w:spacing w:before="0" w:after="0" w:line="480" w:lineRule="auto"/>
               <w:rPr/>
             </w:pPr>
             <w:r>
@@ -6758,6 +6865,7 @@
           <w:tcPr/>
           <w:p>
             <w:pPr>
+              <w:spacing w:before="0" w:after="0" w:line="480" w:lineRule="auto"/>
               <w:rPr/>
             </w:pPr>
             <w:r>
@@ -6784,6 +6892,7 @@
           <w:tcPr/>
           <w:p>
             <w:pPr>
+              <w:spacing w:before="0" w:after="0" w:line="480" w:lineRule="auto"/>
               <w:rPr/>
             </w:pPr>
             <w:r>
@@ -6810,6 +6919,7 @@
           <w:tcPr/>
           <w:p>
             <w:pPr>
+              <w:spacing w:before="0" w:after="0" w:line="480" w:lineRule="auto"/>
               <w:rPr/>
             </w:pPr>
             <w:r>
@@ -6836,6 +6946,7 @@
           <w:tcPr/>
           <w:p>
             <w:pPr>
+              <w:spacing w:before="0" w:after="0" w:line="480" w:lineRule="auto"/>
               <w:rPr/>
             </w:pPr>
             <w:r>
@@ -6868,6 +6979,7 @@
           <w:tcPr/>
           <w:p>
             <w:pPr>
+              <w:spacing w:before="0" w:after="0" w:line="480" w:lineRule="auto"/>
               <w:rPr/>
             </w:pPr>
             <w:r>
@@ -6894,6 +7006,7 @@
           <w:tcPr/>
           <w:p>
             <w:pPr>
+              <w:spacing w:before="0" w:after="0" w:line="480" w:lineRule="auto"/>
               <w:rPr/>
             </w:pPr>
             <w:r>
@@ -6920,6 +7033,7 @@
           <w:tcPr/>
           <w:p>
             <w:pPr>
+              <w:spacing w:before="0" w:after="0" w:line="480" w:lineRule="auto"/>
               <w:rPr/>
             </w:pPr>
             <w:r>
@@ -6946,6 +7060,7 @@
           <w:tcPr/>
           <w:p>
             <w:pPr>
+              <w:spacing w:before="0" w:after="0" w:line="480" w:lineRule="auto"/>
               <w:rPr/>
             </w:pPr>
             <w:r>
@@ -6972,6 +7087,7 @@
           <w:tcPr/>
           <w:p>
             <w:pPr>
+              <w:spacing w:before="0" w:after="0" w:line="480" w:lineRule="auto"/>
               <w:rPr/>
             </w:pPr>
             <w:r>
@@ -6998,6 +7114,7 @@
           <w:tcPr/>
           <w:p>
             <w:pPr>
+              <w:spacing w:before="0" w:after="0" w:line="480" w:lineRule="auto"/>
               <w:rPr/>
             </w:pPr>
             <w:r>
@@ -7024,6 +7141,7 @@
           <w:tcPr/>
           <w:p>
             <w:pPr>
+              <w:spacing w:before="0" w:after="0" w:line="480" w:lineRule="auto"/>
               <w:rPr/>
             </w:pPr>
             <w:r>
@@ -7050,6 +7168,7 @@
           <w:tcPr/>
           <w:p>
             <w:pPr>
+              <w:spacing w:before="0" w:after="0" w:line="480" w:lineRule="auto"/>
               <w:rPr/>
             </w:pPr>
             <w:r>
@@ -7082,6 +7201,7 @@
           <w:tcPr/>
           <w:p>
             <w:pPr>
+              <w:spacing w:before="0" w:after="0" w:line="480" w:lineRule="auto"/>
               <w:rPr/>
             </w:pPr>
             <w:r>
@@ -7108,6 +7228,7 @@
           <w:tcPr/>
           <w:p>
             <w:pPr>
+              <w:spacing w:before="0" w:after="0" w:line="480" w:lineRule="auto"/>
               <w:rPr/>
             </w:pPr>
             <w:r>
@@ -7134,6 +7255,7 @@
           <w:tcPr/>
           <w:p>
             <w:pPr>
+              <w:spacing w:before="0" w:after="0" w:line="480" w:lineRule="auto"/>
               <w:rPr/>
             </w:pPr>
             <w:r>
@@ -7160,6 +7282,7 @@
           <w:tcPr/>
           <w:p>
             <w:pPr>
+              <w:spacing w:before="0" w:after="0" w:line="480" w:lineRule="auto"/>
               <w:rPr/>
             </w:pPr>
             <w:r>
@@ -7186,6 +7309,7 @@
           <w:tcPr/>
           <w:p>
             <w:pPr>
+              <w:spacing w:before="0" w:after="0" w:line="480" w:lineRule="auto"/>
               <w:rPr/>
             </w:pPr>
             <w:r>
@@ -7212,6 +7336,7 @@
           <w:tcPr/>
           <w:p>
             <w:pPr>
+              <w:spacing w:before="0" w:after="0" w:line="480" w:lineRule="auto"/>
               <w:rPr/>
             </w:pPr>
             <w:r>
@@ -7238,6 +7363,7 @@
           <w:tcPr/>
           <w:p>
             <w:pPr>
+              <w:spacing w:before="0" w:after="0" w:line="480" w:lineRule="auto"/>
               <w:rPr/>
             </w:pPr>
             <w:r>
@@ -7264,6 +7390,7 @@
           <w:tcPr/>
           <w:p>
             <w:pPr>
+              <w:spacing w:before="0" w:after="0" w:line="480" w:lineRule="auto"/>
               <w:rPr/>
             </w:pPr>
             <w:r>
@@ -7539,6 +7666,7 @@
           </w:tcPr>
           <w:p>
             <w:pPr>
+              <w:spacing w:before="0" w:after="0" w:line="480" w:lineRule="auto"/>
               <w:rPr/>
             </w:pPr>
             <w:r>
@@ -7569,6 +7697,7 @@
           </w:tcPr>
           <w:p>
             <w:pPr>
+              <w:spacing w:before="0" w:after="0" w:line="480" w:lineRule="auto"/>
               <w:rPr/>
             </w:pPr>
             <w:r>
@@ -7599,6 +7728,7 @@
           </w:tcPr>
           <w:p>
             <w:pPr>
+              <w:spacing w:before="0" w:after="0" w:line="480" w:lineRule="auto"/>
               <w:rPr/>
             </w:pPr>
             <w:r>
@@ -7631,6 +7761,7 @@
           <w:tcPr/>
           <w:p>
             <w:pPr>
+              <w:spacing w:before="0" w:after="0" w:line="480" w:lineRule="auto"/>
               <w:rPr/>
             </w:pPr>
             <w:r>
@@ -7657,6 +7788,7 @@
           <w:tcPr/>
           <w:p>
             <w:pPr>
+              <w:spacing w:before="0" w:after="0" w:line="480" w:lineRule="auto"/>
               <w:rPr/>
             </w:pPr>
             <w:r>
@@ -7683,6 +7815,7 @@
           <w:tcPr/>
           <w:p>
             <w:pPr>
+              <w:spacing w:before="0" w:after="0" w:line="480" w:lineRule="auto"/>
               <w:rPr/>
             </w:pPr>
             <w:r>
@@ -7715,6 +7848,7 @@
           <w:tcPr/>
           <w:p>
             <w:pPr>
+              <w:spacing w:before="0" w:after="0" w:line="480" w:lineRule="auto"/>
               <w:rPr/>
             </w:pPr>
             <w:r>
@@ -7741,6 +7875,7 @@
           <w:tcPr/>
           <w:p>
             <w:pPr>
+              <w:spacing w:before="0" w:after="0" w:line="480" w:lineRule="auto"/>
               <w:rPr/>
             </w:pPr>
             <w:r>
@@ -7767,6 +7902,7 @@
           <w:tcPr/>
           <w:p>
             <w:pPr>
+              <w:spacing w:before="0" w:after="0" w:line="480" w:lineRule="auto"/>
               <w:rPr/>
             </w:pPr>
             <w:r>
@@ -7799,6 +7935,7 @@
           <w:tcPr/>
           <w:p>
             <w:pPr>
+              <w:spacing w:before="0" w:after="0" w:line="480" w:lineRule="auto"/>
               <w:rPr/>
             </w:pPr>
             <w:r>
@@ -7825,6 +7962,7 @@
           <w:tcPr/>
           <w:p>
             <w:pPr>
+              <w:spacing w:before="0" w:after="0" w:line="480" w:lineRule="auto"/>
               <w:rPr/>
             </w:pPr>
             <w:r>
@@ -7851,6 +7989,7 @@
           <w:tcPr/>
           <w:p>
             <w:pPr>
+              <w:spacing w:before="0" w:after="0" w:line="480" w:lineRule="auto"/>
               <w:rPr/>
             </w:pPr>
             <w:r>
@@ -7883,6 +8022,7 @@
           <w:tcPr/>
           <w:p>
             <w:pPr>
+              <w:spacing w:before="0" w:after="0" w:line="480" w:lineRule="auto"/>
               <w:rPr/>
             </w:pPr>
             <w:r>
@@ -7909,6 +8049,7 @@
           <w:tcPr/>
           <w:p>
             <w:pPr>
+              <w:spacing w:before="0" w:after="0" w:line="480" w:lineRule="auto"/>
               <w:rPr/>
             </w:pPr>
             <w:r>
@@ -7935,6 +8076,7 @@
           <w:tcPr/>
           <w:p>
             <w:pPr>
+              <w:spacing w:before="0" w:after="0" w:line="480" w:lineRule="auto"/>
               <w:rPr/>
             </w:pPr>
             <w:r>
@@ -9602,7 +9744,7 @@
     <w:p>
       <w:pPr>
         <w:keepNext w:val="1"/>
-        <w:spacing w:before="120" w:after="120" w:line="480" w:lineRule="auto"/>
+        <w:spacing w:before="120" w:after="120" w:line="240" w:lineRule="auto"/>
         <w:ind w:firstLine="720"/>
         <w:jc w:val="left"/>
         <w:rPr/>
@@ -9626,7 +9768,7 @@
     </w:p>
     <w:p>
       <w:pPr>
-        <w:spacing w:before="0" w:after="0" w:line="480" w:lineRule="auto"/>
+        <w:spacing w:before="0" w:after="0" w:line="240" w:lineRule="auto"/>
         <w:jc w:val="left"/>
         <w:rPr/>
       </w:pPr>
@@ -9650,7 +9792,7 @@
     <w:p>
       <w:pPr>
         <w:keepNext w:val="1"/>
-        <w:spacing w:before="120" w:after="0" w:line="480" w:lineRule="auto"/>
+        <w:spacing w:before="120" w:after="0" w:line="240" w:lineRule="auto"/>
         <w:jc w:val="left"/>
         <w:rPr/>
       </w:pPr>
@@ -9673,7 +9815,7 @@
     </w:p>
     <w:p>
       <w:pPr>
-        <w:spacing w:before="0" w:after="0" w:line="480" w:lineRule="auto"/>
+        <w:spacing w:before="0" w:after="0" w:line="240" w:lineRule="auto"/>
         <w:ind w:left="240" w:firstLine="0"/>
         <w:jc w:val="left"/>
         <w:rPr/>
@@ -9697,7 +9839,7 @@
     </w:p>
     <w:p>
       <w:pPr>
-        <w:spacing w:before="0" w:after="0" w:line="480" w:lineRule="auto"/>
+        <w:spacing w:before="0" w:after="0" w:line="240" w:lineRule="auto"/>
         <w:ind w:left="240" w:firstLine="0"/>
         <w:jc w:val="left"/>
         <w:rPr/>
@@ -9721,7 +9863,7 @@
     </w:p>
     <w:p>
       <w:pPr>
-        <w:spacing w:before="0" w:after="0" w:line="480" w:lineRule="auto"/>
+        <w:spacing w:before="0" w:after="0" w:line="240" w:lineRule="auto"/>
         <w:ind w:left="240" w:firstLine="0"/>
         <w:jc w:val="left"/>
         <w:rPr/>
@@ -9745,7 +9887,7 @@
     </w:p>
     <w:p>
       <w:pPr>
-        <w:spacing w:before="0" w:after="0" w:line="480" w:lineRule="auto"/>
+        <w:spacing w:before="0" w:after="0" w:line="240" w:lineRule="auto"/>
         <w:ind w:left="240" w:firstLine="0"/>
         <w:jc w:val="left"/>
         <w:rPr/>
@@ -9770,7 +9912,7 @@
     <w:p>
       <w:pPr>
         <w:keepNext w:val="1"/>
-        <w:spacing w:before="120" w:after="0" w:line="480" w:lineRule="auto"/>
+        <w:spacing w:before="120" w:after="0" w:line="240" w:lineRule="auto"/>
         <w:ind w:firstLine="720"/>
         <w:jc w:val="left"/>
         <w:rPr/>
@@ -9794,7 +9936,7 @@
     </w:p>
     <w:p>
       <w:pPr>
-        <w:spacing w:before="0" w:after="0" w:line="480" w:lineRule="auto"/>
+        <w:spacing w:before="0" w:after="0" w:line="240" w:lineRule="auto"/>
         <w:ind w:left="240" w:firstLine="720"/>
         <w:jc w:val="left"/>
         <w:rPr/>
@@ -9818,7 +9960,7 @@
     </w:p>
     <w:p>
       <w:pPr>
-        <w:spacing w:before="0" w:after="0" w:line="480" w:lineRule="auto"/>
+        <w:spacing w:before="0" w:after="0" w:line="240" w:lineRule="auto"/>
         <w:ind w:left="240" w:firstLine="720"/>
         <w:jc w:val="left"/>
         <w:rPr/>
@@ -9842,7 +9984,7 @@
     </w:p>
     <w:p>
       <w:pPr>
-        <w:spacing w:before="0" w:after="0" w:line="480" w:lineRule="auto"/>
+        <w:spacing w:before="0" w:after="0" w:line="240" w:lineRule="auto"/>
         <w:ind w:left="240" w:firstLine="0"/>
         <w:jc w:val="left"/>
         <w:rPr/>
@@ -9867,7 +10009,7 @@
     <w:p>
       <w:pPr>
         <w:keepNext w:val="1"/>
-        <w:spacing w:before="120" w:after="0" w:line="480" w:lineRule="auto"/>
+        <w:spacing w:before="120" w:after="0" w:line="240" w:lineRule="auto"/>
         <w:ind w:firstLine="720"/>
         <w:jc w:val="left"/>
         <w:rPr/>
@@ -9891,7 +10033,7 @@
     </w:p>
     <w:p>
       <w:pPr>
-        <w:spacing w:before="0" w:after="0" w:line="480" w:lineRule="auto"/>
+        <w:spacing w:before="0" w:after="0" w:line="240" w:lineRule="auto"/>
         <w:ind w:left="240" w:firstLine="720"/>
         <w:jc w:val="left"/>
         <w:rPr/>
@@ -9915,7 +10057,7 @@
     </w:p>
     <w:p>
       <w:pPr>
-        <w:spacing w:before="0" w:after="0" w:line="480" w:lineRule="auto"/>
+        <w:spacing w:before="0" w:after="0" w:line="240" w:lineRule="auto"/>
         <w:ind w:left="240" w:firstLine="720"/>
         <w:jc w:val="left"/>
         <w:rPr/>
@@ -9939,7 +10081,7 @@
     </w:p>
     <w:p>
       <w:pPr>
-        <w:spacing w:before="0" w:after="0" w:line="480" w:lineRule="auto"/>
+        <w:spacing w:before="0" w:after="0" w:line="240" w:lineRule="auto"/>
         <w:ind w:left="240" w:firstLine="720"/>
         <w:jc w:val="left"/>
         <w:rPr/>
@@ -9963,7 +10105,7 @@
     </w:p>
     <w:p>
       <w:pPr>
-        <w:spacing w:before="0" w:after="0" w:line="480" w:lineRule="auto"/>
+        <w:spacing w:before="0" w:after="0" w:line="240" w:lineRule="auto"/>
         <w:ind w:left="240" w:firstLine="0"/>
         <w:jc w:val="left"/>
         <w:rPr/>
@@ -9988,7 +10130,7 @@
     <w:p>
       <w:pPr>
         <w:keepNext w:val="1"/>
-        <w:spacing w:before="120" w:after="0" w:line="480" w:lineRule="auto"/>
+        <w:spacing w:before="120" w:after="0" w:line="240" w:lineRule="auto"/>
         <w:ind w:firstLine="720"/>
         <w:jc w:val="left"/>
         <w:rPr/>
@@ -10012,7 +10154,7 @@
     </w:p>
     <w:p>
       <w:pPr>
-        <w:spacing w:before="0" w:after="0" w:line="480" w:lineRule="auto"/>
+        <w:spacing w:before="0" w:after="0" w:line="240" w:lineRule="auto"/>
         <w:jc w:val="left"/>
         <w:rPr/>
       </w:pPr>
@@ -10037,7 +10179,7 @@
       <w:pPr>
         <w:keepNext w:val="1"/>
         <w:pageBreakBefore w:val="1"/>
-        <w:spacing w:before="720" w:after="120" w:line="480" w:lineRule="auto"/>
+        <w:spacing w:before="720" w:after="120" w:line="360" w:lineRule="auto"/>
         <w:jc w:val="left"/>
         <w:rPr/>
       </w:pPr>
@@ -10061,7 +10203,7 @@
     <w:p>
       <w:pPr>
         <w:keepNext w:val="1"/>
-        <w:spacing w:before="120" w:after="0" w:line="480" w:lineRule="auto"/>
+        <w:spacing w:before="120" w:after="0" w:line="360" w:lineRule="auto"/>
         <w:jc w:val="left"/>
         <w:rPr/>
       </w:pPr>
@@ -10086,7 +10228,7 @@
     </w:p>
     <w:p>
       <w:pPr>
-        <w:spacing w:before="0" w:after="0" w:line="480" w:lineRule="auto"/>
+        <w:spacing w:before="0" w:after="0" w:line="360" w:lineRule="auto"/>
         <w:ind w:firstLine="720"/>
         <w:jc w:val="left"/>
         <w:rPr/>
@@ -10111,7 +10253,7 @@
     <w:p>
       <w:pPr>
         <w:keepNext w:val="1"/>
-        <w:spacing w:before="120" w:after="0" w:line="480" w:lineRule="auto"/>
+        <w:spacing w:before="120" w:after="0" w:line="360" w:lineRule="auto"/>
         <w:jc w:val="left"/>
         <w:rPr/>
       </w:pPr>
@@ -10136,7 +10278,7 @@
     </w:p>
     <w:p>
       <w:pPr>
-        <w:spacing w:before="0" w:after="0" w:line="480" w:lineRule="auto"/>
+        <w:spacing w:before="0" w:after="0" w:line="360" w:lineRule="auto"/>
         <w:ind w:firstLine="720"/>
         <w:jc w:val="both"/>
         <w:rPr/>
@@ -10191,7 +10333,7 @@
     </w:p>
     <w:p>
       <w:pPr>
-        <w:spacing w:before="0" w:after="0" w:line="480" w:lineRule="auto"/>
+        <w:spacing w:before="0" w:after="0" w:line="360" w:lineRule="auto"/>
         <w:ind w:firstLine="720"/>
         <w:jc w:val="both"/>
         <w:rPr/>
@@ -10217,7 +10359,7 @@
     </w:p>
     <w:p>
       <w:pPr>
-        <w:spacing w:before="0" w:after="0" w:line="480" w:lineRule="auto"/>
+        <w:spacing w:before="0" w:after="0" w:line="360" w:lineRule="auto"/>
         <w:ind w:firstLine="720"/>
         <w:jc w:val="both"/>
         <w:rPr/>
@@ -10300,7 +10442,7 @@
     </w:p>
     <w:p>
       <w:pPr>
-        <w:spacing w:before="0" w:after="0" w:line="480" w:lineRule="auto"/>
+        <w:spacing w:before="0" w:after="0" w:line="360" w:lineRule="auto"/>
         <w:ind w:firstLine="720"/>
         <w:jc w:val="both"/>
         <w:rPr/>
@@ -10327,7 +10469,7 @@
     <w:p>
       <w:pPr>
         <w:keepNext w:val="1"/>
-        <w:spacing w:before="120" w:after="0" w:line="480" w:lineRule="auto"/>
+        <w:spacing w:before="120" w:after="0" w:line="360" w:lineRule="auto"/>
         <w:jc w:val="left"/>
         <w:rPr/>
       </w:pPr>
@@ -10354,7 +10496,7 @@
       <w:pPr>
         <w:keepNext w:val="1"/>
         <w:keepLines w:val="1"/>
-        <w:spacing w:before="0" w:after="0" w:line="480" w:lineRule="auto"/>
+        <w:spacing w:before="0" w:after="0" w:line="360" w:lineRule="auto"/>
         <w:ind w:firstLine="720"/>
         <w:jc w:val="both"/>
         <w:rPr/>
@@ -10423,7 +10565,7 @@
           </w:tcPr>
           <w:p>
             <w:pPr>
-              <w:spacing w:before="0" w:after="0" w:line="240" w:lineRule="auto"/>
+              <w:spacing w:before="0" w:after="0" w:line="360" w:lineRule="auto"/>
               <w:jc w:val="left"/>
               <w:rPr/>
             </w:pPr>
@@ -10454,7 +10596,7 @@
           </w:tcPr>
           <w:p>
             <w:pPr>
-              <w:spacing w:before="0" w:after="0" w:line="240" w:lineRule="auto"/>
+              <w:spacing w:before="0" w:after="0" w:line="360" w:lineRule="auto"/>
               <w:jc w:val="left"/>
               <w:rPr/>
             </w:pPr>
@@ -10485,7 +10627,7 @@
           </w:tcPr>
           <w:p>
             <w:pPr>
-              <w:spacing w:before="0" w:after="0" w:line="240" w:lineRule="auto"/>
+              <w:spacing w:before="0" w:after="0" w:line="360" w:lineRule="auto"/>
               <w:jc w:val="left"/>
               <w:rPr/>
             </w:pPr>
@@ -10516,7 +10658,7 @@
           </w:tcPr>
           <w:p>
             <w:pPr>
-              <w:spacing w:before="0" w:after="0" w:line="240" w:lineRule="auto"/>
+              <w:spacing w:before="0" w:after="0" w:line="360" w:lineRule="auto"/>
               <w:jc w:val="left"/>
               <w:rPr/>
             </w:pPr>
@@ -10550,7 +10692,7 @@
           </w:tcPr>
           <w:p>
             <w:pPr>
-              <w:spacing w:before="0" w:after="0" w:line="240" w:lineRule="auto"/>
+              <w:spacing w:before="0" w:after="0" w:line="360" w:lineRule="auto"/>
               <w:jc w:val="left"/>
               <w:rPr/>
             </w:pPr>
@@ -10575,7 +10717,7 @@
           <w:tcPr/>
           <w:p>
             <w:pPr>
-              <w:spacing w:before="0" w:after="0" w:line="240" w:lineRule="auto"/>
+              <w:spacing w:before="0" w:after="0" w:line="360" w:lineRule="auto"/>
               <w:jc w:val="left"/>
               <w:rPr/>
             </w:pPr>
@@ -10599,7 +10741,7 @@
           <w:tcPr/>
           <w:p>
             <w:pPr>
-              <w:spacing w:before="0" w:after="0" w:line="240" w:lineRule="auto"/>
+              <w:spacing w:before="0" w:after="0" w:line="360" w:lineRule="auto"/>
               <w:jc w:val="left"/>
               <w:rPr/>
             </w:pPr>
@@ -10623,7 +10765,7 @@
           <w:tcPr/>
           <w:p>
             <w:pPr>
-              <w:spacing w:before="0" w:after="0" w:line="240" w:lineRule="auto"/>
+              <w:spacing w:before="0" w:after="0" w:line="360" w:lineRule="auto"/>
               <w:jc w:val="left"/>
               <w:rPr/>
             </w:pPr>
@@ -10688,7 +10830,7 @@
           </w:tcPr>
           <w:p>
             <w:pPr>
-              <w:spacing w:before="0" w:after="0" w:line="240" w:lineRule="auto"/>
+              <w:spacing w:before="0" w:after="0" w:line="360" w:lineRule="auto"/>
               <w:jc w:val="left"/>
               <w:rPr/>
             </w:pPr>
@@ -10713,7 +10855,7 @@
           <w:tcPr/>
           <w:p>
             <w:pPr>
-              <w:spacing w:before="0" w:after="0" w:line="240" w:lineRule="auto"/>
+              <w:spacing w:before="0" w:after="0" w:line="360" w:lineRule="auto"/>
               <w:jc w:val="left"/>
               <w:rPr/>
             </w:pPr>
@@ -10737,7 +10879,7 @@
           <w:tcPr/>
           <w:p>
             <w:pPr>
-              <w:spacing w:before="0" w:after="0" w:line="240" w:lineRule="auto"/>
+              <w:spacing w:before="0" w:after="0" w:line="360" w:lineRule="auto"/>
               <w:jc w:val="left"/>
               <w:rPr/>
             </w:pPr>
@@ -10761,7 +10903,7 @@
           <w:tcPr/>
           <w:p>
             <w:pPr>
-              <w:spacing w:before="0" w:after="0" w:line="240" w:lineRule="auto"/>
+              <w:spacing w:before="0" w:after="0" w:line="360" w:lineRule="auto"/>
               <w:jc w:val="left"/>
               <w:rPr/>
             </w:pPr>
@@ -10826,7 +10968,7 @@
           </w:tcPr>
           <w:p>
             <w:pPr>
-              <w:spacing w:before="0" w:after="0" w:line="240" w:lineRule="auto"/>
+              <w:spacing w:before="0" w:after="0" w:line="360" w:lineRule="auto"/>
               <w:jc w:val="left"/>
               <w:rPr/>
             </w:pPr>
@@ -10851,7 +10993,7 @@
           <w:tcPr/>
           <w:p>
             <w:pPr>
-              <w:spacing w:before="0" w:after="0" w:line="240" w:lineRule="auto"/>
+              <w:spacing w:before="0" w:after="0" w:line="360" w:lineRule="auto"/>
               <w:jc w:val="left"/>
               <w:rPr/>
             </w:pPr>
@@ -10875,7 +11017,7 @@
           <w:tcPr/>
           <w:p>
             <w:pPr>
-              <w:spacing w:before="0" w:after="0" w:line="240" w:lineRule="auto"/>
+              <w:spacing w:before="0" w:after="0" w:line="360" w:lineRule="auto"/>
               <w:jc w:val="left"/>
               <w:rPr/>
             </w:pPr>
@@ -10899,7 +11041,7 @@
           <w:tcPr/>
           <w:p>
             <w:pPr>
-              <w:spacing w:before="0" w:after="0" w:line="240" w:lineRule="auto"/>
+              <w:spacing w:before="0" w:after="0" w:line="360" w:lineRule="auto"/>
               <w:jc w:val="left"/>
               <w:rPr/>
             </w:pPr>
@@ -10964,7 +11106,7 @@
           </w:tcPr>
           <w:p>
             <w:pPr>
-              <w:spacing w:before="0" w:after="0" w:line="240" w:lineRule="auto"/>
+              <w:spacing w:before="0" w:after="0" w:line="360" w:lineRule="auto"/>
               <w:jc w:val="left"/>
               <w:rPr/>
             </w:pPr>
@@ -10989,7 +11131,7 @@
           <w:tcPr/>
           <w:p>
             <w:pPr>
-              <w:spacing w:before="0" w:after="0" w:line="240" w:lineRule="auto"/>
+              <w:spacing w:before="0" w:after="0" w:line="360" w:lineRule="auto"/>
               <w:jc w:val="left"/>
               <w:rPr/>
             </w:pPr>
@@ -11013,7 +11155,7 @@
           <w:tcPr/>
           <w:p>
             <w:pPr>
-              <w:spacing w:before="0" w:after="0" w:line="240" w:lineRule="auto"/>
+              <w:spacing w:before="0" w:after="0" w:line="360" w:lineRule="auto"/>
               <w:jc w:val="left"/>
               <w:rPr/>
             </w:pPr>
@@ -11037,7 +11179,7 @@
           <w:tcPr/>
           <w:p>
             <w:pPr>
-              <w:spacing w:before="0" w:after="0" w:line="240" w:lineRule="auto"/>
+              <w:spacing w:before="0" w:after="0" w:line="360" w:lineRule="auto"/>
               <w:jc w:val="left"/>
               <w:rPr/>
             </w:pPr>
@@ -11095,7 +11237,7 @@
     <w:p>
       <w:pPr>
         <w:keepNext w:val="1"/>
-        <w:spacing w:before="120" w:after="0" w:line="480" w:lineRule="auto"/>
+        <w:spacing w:before="120" w:after="0" w:line="360" w:lineRule="auto"/>
         <w:ind w:firstLine="720"/>
         <w:jc w:val="both"/>
         <w:rPr/>
@@ -11151,7 +11293,7 @@
     <w:p>
       <w:pPr>
         <w:keepNext w:val="1"/>
-        <w:spacing w:before="120" w:after="0" w:line="480" w:lineRule="auto"/>
+        <w:spacing w:before="120" w:after="0" w:line="360" w:lineRule="auto"/>
         <w:ind w:firstLine="720"/>
         <w:jc w:val="both"/>
         <w:rPr/>
@@ -11358,7 +11500,7 @@
       <w:pPr>
         <w:keepNext w:val="1"/>
         <w:keepLines w:val="1"/>
-        <w:spacing w:before="120" w:after="0" w:line="480" w:lineRule="auto"/>
+        <w:spacing w:before="120" w:after="0" w:line="360" w:lineRule="auto"/>
         <w:jc w:val="left"/>
         <w:rPr/>
       </w:pPr>
@@ -11426,7 +11568,7 @@
           </w:tcPr>
           <w:p>
             <w:pPr>
-              <w:spacing w:before="0" w:after="0" w:line="240" w:lineRule="auto"/>
+              <w:spacing w:before="0" w:after="0" w:line="360" w:lineRule="auto"/>
               <w:jc w:val="left"/>
               <w:rPr/>
             </w:pPr>
@@ -11457,7 +11599,7 @@
           </w:tcPr>
           <w:p>
             <w:pPr>
-              <w:spacing w:before="0" w:after="0" w:line="240" w:lineRule="auto"/>
+              <w:spacing w:before="0" w:after="0" w:line="360" w:lineRule="auto"/>
               <w:jc w:val="left"/>
               <w:rPr/>
             </w:pPr>
@@ -11488,7 +11630,7 @@
           </w:tcPr>
           <w:p>
             <w:pPr>
-              <w:spacing w:before="0" w:after="0" w:line="240" w:lineRule="auto"/>
+              <w:spacing w:before="0" w:after="0" w:line="360" w:lineRule="auto"/>
               <w:jc w:val="left"/>
               <w:rPr/>
             </w:pPr>
@@ -11519,7 +11661,7 @@
           </w:tcPr>
           <w:p>
             <w:pPr>
-              <w:spacing w:before="0" w:after="0" w:line="240" w:lineRule="auto"/>
+              <w:spacing w:before="0" w:after="0" w:line="360" w:lineRule="auto"/>
               <w:jc w:val="left"/>
               <w:rPr/>
             </w:pPr>
@@ -11551,7 +11693,7 @@
           <w:tcPr/>
           <w:p>
             <w:pPr>
-              <w:spacing w:before="0" w:after="0" w:line="240" w:lineRule="auto"/>
+              <w:spacing w:before="0" w:after="0" w:line="360" w:lineRule="auto"/>
               <w:jc w:val="left"/>
               <w:rPr/>
             </w:pPr>
@@ -11580,7 +11722,7 @@
           <w:tcPr/>
           <w:p>
             <w:pPr>
-              <w:spacing w:before="0" w:after="0" w:line="240" w:lineRule="auto"/>
+              <w:spacing w:before="0" w:after="0" w:line="360" w:lineRule="auto"/>
               <w:jc w:val="left"/>
               <w:rPr/>
             </w:pPr>
@@ -11604,7 +11746,7 @@
           <w:tcPr/>
           <w:p>
             <w:pPr>
-              <w:spacing w:before="0" w:after="0" w:line="240" w:lineRule="auto"/>
+              <w:spacing w:before="0" w:after="0" w:line="360" w:lineRule="auto"/>
               <w:jc w:val="left"/>
               <w:rPr/>
             </w:pPr>
@@ -11628,7 +11770,7 @@
           <w:tcPr/>
           <w:p>
             <w:pPr>
-              <w:spacing w:before="0" w:after="0" w:line="240" w:lineRule="auto"/>
+              <w:spacing w:before="0" w:after="0" w:line="360" w:lineRule="auto"/>
               <w:jc w:val="left"/>
               <w:rPr/>
             </w:pPr>
@@ -11719,7 +11861,7 @@
           <w:tcPr/>
           <w:p>
             <w:pPr>
-              <w:spacing w:before="0" w:after="0" w:line="240" w:lineRule="auto"/>
+              <w:spacing w:before="0" w:after="0" w:line="360" w:lineRule="auto"/>
               <w:jc w:val="left"/>
               <w:rPr/>
             </w:pPr>
@@ -11748,7 +11890,7 @@
           <w:tcPr/>
           <w:p>
             <w:pPr>
-              <w:spacing w:before="0" w:after="0" w:line="240" w:lineRule="auto"/>
+              <w:spacing w:before="0" w:after="0" w:line="360" w:lineRule="auto"/>
               <w:jc w:val="left"/>
               <w:rPr/>
             </w:pPr>
@@ -11772,7 +11914,7 @@
           <w:tcPr/>
           <w:p>
             <w:pPr>
-              <w:spacing w:before="0" w:after="0" w:line="240" w:lineRule="auto"/>
+              <w:spacing w:before="0" w:after="0" w:line="360" w:lineRule="auto"/>
               <w:jc w:val="left"/>
               <w:rPr/>
             </w:pPr>
@@ -11796,7 +11938,7 @@
           <w:tcPr/>
           <w:p>
             <w:pPr>
-              <w:spacing w:before="0" w:after="0" w:line="240" w:lineRule="auto"/>
+              <w:spacing w:before="0" w:after="0" w:line="360" w:lineRule="auto"/>
               <w:jc w:val="left"/>
               <w:rPr/>
             </w:pPr>
@@ -11887,7 +12029,7 @@
           <w:tcPr/>
           <w:p>
             <w:pPr>
-              <w:spacing w:before="0" w:after="0" w:line="240" w:lineRule="auto"/>
+              <w:spacing w:before="0" w:after="0" w:line="360" w:lineRule="auto"/>
               <w:jc w:val="left"/>
               <w:rPr/>
             </w:pPr>
@@ -11916,7 +12058,7 @@
           <w:tcPr/>
           <w:p>
             <w:pPr>
-              <w:spacing w:before="0" w:after="0" w:line="240" w:lineRule="auto"/>
+              <w:spacing w:before="0" w:after="0" w:line="360" w:lineRule="auto"/>
               <w:jc w:val="left"/>
               <w:rPr/>
             </w:pPr>
@@ -11940,7 +12082,7 @@
           <w:tcPr/>
           <w:p>
             <w:pPr>
-              <w:spacing w:before="0" w:after="0" w:line="240" w:lineRule="auto"/>
+              <w:spacing w:before="0" w:after="0" w:line="360" w:lineRule="auto"/>
               <w:jc w:val="left"/>
               <w:rPr/>
             </w:pPr>
@@ -11964,7 +12106,7 @@
           <w:tcPr/>
           <w:p>
             <w:pPr>
-              <w:spacing w:before="0" w:after="0" w:line="240" w:lineRule="auto"/>
+              <w:spacing w:before="0" w:after="0" w:line="360" w:lineRule="auto"/>
               <w:jc w:val="left"/>
               <w:rPr/>
             </w:pPr>
@@ -12050,7 +12192,7 @@
     <w:p>
       <w:pPr>
         <w:keepNext w:val="1"/>
-        <w:spacing w:before="120" w:after="0" w:line="480" w:lineRule="auto"/>
+        <w:spacing w:before="120" w:after="0" w:line="360" w:lineRule="auto"/>
         <w:jc w:val="left"/>
         <w:rPr/>
       </w:pPr>
@@ -12077,7 +12219,7 @@
       <w:pPr>
         <w:keepNext w:val="1"/>
         <w:keepLines w:val="1"/>
-        <w:spacing w:before="0" w:after="0" w:line="480" w:lineRule="auto"/>
+        <w:spacing w:before="0" w:after="0" w:line="360" w:lineRule="auto"/>
         <w:ind w:firstLine="720"/>
         <w:jc w:val="both"/>
         <w:rPr/>
@@ -12144,7 +12286,7 @@
           </w:tcPr>
           <w:p>
             <w:pPr>
-              <w:spacing w:before="0" w:after="0" w:line="240" w:lineRule="auto"/>
+              <w:spacing w:before="0" w:after="0" w:line="360" w:lineRule="auto"/>
               <w:jc w:val="left"/>
               <w:rPr/>
             </w:pPr>
@@ -12175,7 +12317,7 @@
           </w:tcPr>
           <w:p>
             <w:pPr>
-              <w:spacing w:before="0" w:after="0" w:line="240" w:lineRule="auto"/>
+              <w:spacing w:before="0" w:after="0" w:line="360" w:lineRule="auto"/>
               <w:jc w:val="left"/>
               <w:rPr/>
             </w:pPr>
@@ -12206,7 +12348,7 @@
           </w:tcPr>
           <w:p>
             <w:pPr>
-              <w:spacing w:before="0" w:after="0" w:line="240" w:lineRule="auto"/>
+              <w:spacing w:before="0" w:after="0" w:line="360" w:lineRule="auto"/>
               <w:jc w:val="left"/>
               <w:rPr/>
             </w:pPr>
@@ -12238,7 +12380,7 @@
           <w:tcPr/>
           <w:p>
             <w:pPr>
-              <w:spacing w:before="0" w:after="0" w:line="240" w:lineRule="auto"/>
+              <w:spacing w:before="0" w:after="0" w:line="360" w:lineRule="auto"/>
               <w:jc w:val="left"/>
               <w:rPr/>
             </w:pPr>
@@ -12267,7 +12409,7 @@
           <w:tcPr/>
           <w:p>
             <w:pPr>
-              <w:spacing w:before="0" w:after="0" w:line="240" w:lineRule="auto"/>
+              <w:spacing w:before="0" w:after="0" w:line="360" w:lineRule="auto"/>
               <w:jc w:val="left"/>
               <w:rPr/>
             </w:pPr>
@@ -12291,7 +12433,7 @@
           <w:tcPr/>
           <w:p>
             <w:pPr>
-              <w:spacing w:before="0" w:after="0" w:line="240" w:lineRule="auto"/>
+              <w:spacing w:before="0" w:after="0" w:line="360" w:lineRule="auto"/>
               <w:jc w:val="left"/>
               <w:rPr/>
             </w:pPr>
@@ -12321,7 +12463,7 @@
           <w:tcPr/>
           <w:p>
             <w:pPr>
-              <w:spacing w:before="0" w:after="0" w:line="240" w:lineRule="auto"/>
+              <w:spacing w:before="0" w:after="0" w:line="360" w:lineRule="auto"/>
               <w:jc w:val="left"/>
               <w:rPr/>
             </w:pPr>
@@ -12350,7 +12492,7 @@
           <w:tcPr/>
           <w:p>
             <w:pPr>
-              <w:spacing w:before="0" w:after="0" w:line="240" w:lineRule="auto"/>
+              <w:spacing w:before="0" w:after="0" w:line="360" w:lineRule="auto"/>
               <w:jc w:val="left"/>
               <w:rPr/>
             </w:pPr>
@@ -12374,7 +12516,7 @@
           <w:tcPr/>
           <w:p>
             <w:pPr>
-              <w:spacing w:before="0" w:after="0" w:line="240" w:lineRule="auto"/>
+              <w:spacing w:before="0" w:after="0" w:line="360" w:lineRule="auto"/>
               <w:jc w:val="left"/>
               <w:rPr/>
             </w:pPr>
@@ -12404,7 +12546,7 @@
           <w:tcPr/>
           <w:p>
             <w:pPr>
-              <w:spacing w:before="0" w:after="0" w:line="240" w:lineRule="auto"/>
+              <w:spacing w:before="0" w:after="0" w:line="360" w:lineRule="auto"/>
               <w:jc w:val="left"/>
               <w:rPr/>
             </w:pPr>
@@ -12433,7 +12575,7 @@
           <w:tcPr/>
           <w:p>
             <w:pPr>
-              <w:spacing w:before="0" w:after="0" w:line="240" w:lineRule="auto"/>
+              <w:spacing w:before="0" w:after="0" w:line="360" w:lineRule="auto"/>
               <w:jc w:val="left"/>
               <w:rPr/>
             </w:pPr>
@@ -12457,7 +12599,7 @@
           <w:tcPr/>
           <w:p>
             <w:pPr>
-              <w:spacing w:before="0" w:after="0" w:line="240" w:lineRule="auto"/>
+              <w:spacing w:before="0" w:after="0" w:line="360" w:lineRule="auto"/>
               <w:jc w:val="left"/>
               <w:rPr/>
             </w:pPr>
@@ -12487,7 +12629,7 @@
           <w:tcPr/>
           <w:p>
             <w:pPr>
-              <w:spacing w:before="0" w:after="0" w:line="240" w:lineRule="auto"/>
+              <w:spacing w:before="0" w:after="0" w:line="360" w:lineRule="auto"/>
               <w:jc w:val="left"/>
               <w:rPr/>
             </w:pPr>
@@ -12516,7 +12658,7 @@
           <w:tcPr/>
           <w:p>
             <w:pPr>
-              <w:spacing w:before="0" w:after="0" w:line="240" w:lineRule="auto"/>
+              <w:spacing w:before="0" w:after="0" w:line="360" w:lineRule="auto"/>
               <w:jc w:val="left"/>
               <w:rPr/>
             </w:pPr>
@@ -12540,7 +12682,7 @@
           <w:tcPr/>
           <w:p>
             <w:pPr>
-              <w:spacing w:before="0" w:after="0" w:line="240" w:lineRule="auto"/>
+              <w:spacing w:before="0" w:after="0" w:line="360" w:lineRule="auto"/>
               <w:jc w:val="left"/>
               <w:rPr/>
             </w:pPr>
@@ -12570,7 +12712,7 @@
           <w:tcPr/>
           <w:p>
             <w:pPr>
-              <w:spacing w:before="0" w:after="0" w:line="240" w:lineRule="auto"/>
+              <w:spacing w:before="0" w:after="0" w:line="360" w:lineRule="auto"/>
               <w:jc w:val="left"/>
               <w:rPr/>
             </w:pPr>
@@ -12599,7 +12741,7 @@
           <w:tcPr/>
           <w:p>
             <w:pPr>
-              <w:spacing w:before="0" w:after="0" w:line="240" w:lineRule="auto"/>
+              <w:spacing w:before="0" w:after="0" w:line="360" w:lineRule="auto"/>
               <w:jc w:val="left"/>
               <w:rPr/>
             </w:pPr>
@@ -12623,7 +12765,7 @@
           <w:tcPr/>
           <w:p>
             <w:pPr>
-              <w:spacing w:before="0" w:after="0" w:line="240" w:lineRule="auto"/>
+              <w:spacing w:before="0" w:after="0" w:line="360" w:lineRule="auto"/>
               <w:jc w:val="left"/>
               <w:rPr/>
             </w:pPr>
@@ -12653,7 +12795,7 @@
           <w:tcPr/>
           <w:p>
             <w:pPr>
-              <w:spacing w:before="0" w:after="0" w:line="240" w:lineRule="auto"/>
+              <w:spacing w:before="0" w:after="0" w:line="360" w:lineRule="auto"/>
               <w:jc w:val="left"/>
               <w:rPr/>
             </w:pPr>
@@ -12682,7 +12824,7 @@
           <w:tcPr/>
           <w:p>
             <w:pPr>
-              <w:spacing w:before="0" w:after="0" w:line="240" w:lineRule="auto"/>
+              <w:spacing w:before="0" w:after="0" w:line="360" w:lineRule="auto"/>
               <w:jc w:val="left"/>
               <w:rPr/>
             </w:pPr>
@@ -12706,7 +12848,7 @@
           <w:tcPr/>
           <w:p>
             <w:pPr>
-              <w:spacing w:before="0" w:after="0" w:line="240" w:lineRule="auto"/>
+              <w:spacing w:before="0" w:after="0" w:line="360" w:lineRule="auto"/>
               <w:jc w:val="left"/>
               <w:rPr/>
             </w:pPr>
@@ -12736,7 +12878,7 @@
           <w:tcPr/>
           <w:p>
             <w:pPr>
-              <w:spacing w:before="0" w:after="0" w:line="240" w:lineRule="auto"/>
+              <w:spacing w:before="0" w:after="0" w:line="360" w:lineRule="auto"/>
               <w:jc w:val="left"/>
               <w:rPr/>
             </w:pPr>
@@ -12765,7 +12907,7 @@
           <w:tcPr/>
           <w:p>
             <w:pPr>
-              <w:spacing w:before="0" w:after="0" w:line="240" w:lineRule="auto"/>
+              <w:spacing w:before="0" w:after="0" w:line="360" w:lineRule="auto"/>
               <w:jc w:val="left"/>
               <w:rPr/>
             </w:pPr>
@@ -12789,7 +12931,7 @@
           <w:tcPr/>
           <w:p>
             <w:pPr>
-              <w:spacing w:before="0" w:after="0" w:line="240" w:lineRule="auto"/>
+              <w:spacing w:before="0" w:after="0" w:line="360" w:lineRule="auto"/>
               <w:jc w:val="left"/>
               <w:rPr/>
             </w:pPr>
@@ -12819,7 +12961,7 @@
           <w:tcPr/>
           <w:p>
             <w:pPr>
-              <w:spacing w:before="0" w:after="0" w:line="240" w:lineRule="auto"/>
+              <w:spacing w:before="0" w:after="0" w:line="360" w:lineRule="auto"/>
               <w:jc w:val="left"/>
               <w:rPr/>
             </w:pPr>
@@ -12848,7 +12990,7 @@
           <w:tcPr/>
           <w:p>
             <w:pPr>
-              <w:spacing w:before="0" w:after="0" w:line="240" w:lineRule="auto"/>
+              <w:spacing w:before="0" w:after="0" w:line="360" w:lineRule="auto"/>
               <w:jc w:val="left"/>
               <w:rPr/>
             </w:pPr>
@@ -12872,7 +13014,7 @@
           <w:tcPr/>
           <w:p>
             <w:pPr>
-              <w:spacing w:before="0" w:after="0" w:line="240" w:lineRule="auto"/>
+              <w:spacing w:before="0" w:after="0" w:line="360" w:lineRule="auto"/>
               <w:jc w:val="left"/>
               <w:rPr/>
             </w:pPr>
@@ -12896,7 +13038,7 @@
     </w:tbl>
     <w:p>
       <w:pPr>
-        <w:spacing w:before="120" w:after="0" w:line="480" w:lineRule="auto"/>
+        <w:spacing w:before="120" w:after="0" w:line="360" w:lineRule="auto"/>
         <w:ind w:firstLine="720"/>
         <w:jc w:val="both"/>
         <w:rPr/>
@@ -12937,7 +13079,7 @@
     </w:p>
     <w:p>
       <w:pPr>
-        <w:spacing w:before="0" w:after="0" w:line="480" w:lineRule="auto"/>
+        <w:spacing w:before="0" w:after="0" w:line="360" w:lineRule="auto"/>
         <w:ind w:firstLine="720"/>
         <w:jc w:val="both"/>
         <w:rPr/>
@@ -12993,7 +13135,7 @@
     <w:p>
       <w:pPr>
         <w:keepNext w:val="1"/>
-        <w:spacing w:before="120" w:after="0" w:line="480" w:lineRule="auto"/>
+        <w:spacing w:before="120" w:after="0" w:line="360" w:lineRule="auto"/>
         <w:jc w:val="left"/>
         <w:rPr/>
       </w:pPr>
@@ -13020,7 +13162,7 @@
       <w:pPr>
         <w:keepNext w:val="1"/>
         <w:keepLines w:val="1"/>
-        <w:spacing w:before="0" w:after="0" w:line="480" w:lineRule="auto"/>
+        <w:spacing w:before="0" w:after="0" w:line="360" w:lineRule="auto"/>
         <w:ind w:firstLine="720"/>
         <w:jc w:val="both"/>
         <w:rPr/>
@@ -13087,7 +13229,7 @@
           </w:tcPr>
           <w:p>
             <w:pPr>
-              <w:spacing w:before="0" w:after="0" w:line="240" w:lineRule="auto"/>
+              <w:spacing w:before="0" w:after="0" w:line="360" w:lineRule="auto"/>
               <w:jc w:val="left"/>
               <w:rPr/>
             </w:pPr>
@@ -13118,7 +13260,7 @@
           </w:tcPr>
           <w:p>
             <w:pPr>
-              <w:spacing w:before="0" w:after="0" w:line="240" w:lineRule="auto"/>
+              <w:spacing w:before="0" w:after="0" w:line="360" w:lineRule="auto"/>
               <w:jc w:val="left"/>
               <w:rPr/>
             </w:pPr>
@@ -13149,7 +13291,7 @@
           </w:tcPr>
           <w:p>
             <w:pPr>
-              <w:spacing w:before="0" w:after="0" w:line="240" w:lineRule="auto"/>
+              <w:spacing w:before="0" w:after="0" w:line="360" w:lineRule="auto"/>
               <w:jc w:val="left"/>
               <w:rPr/>
             </w:pPr>
@@ -13181,7 +13323,7 @@
           <w:tcPr/>
           <w:p>
             <w:pPr>
-              <w:spacing w:before="0" w:after="0" w:line="240" w:lineRule="auto"/>
+              <w:spacing w:before="0" w:after="0" w:line="360" w:lineRule="auto"/>
               <w:jc w:val="left"/>
               <w:rPr/>
             </w:pPr>
@@ -13210,7 +13352,7 @@
           <w:tcPr/>
           <w:p>
             <w:pPr>
-              <w:spacing w:before="0" w:after="0" w:line="240" w:lineRule="auto"/>
+              <w:spacing w:before="0" w:after="0" w:line="360" w:lineRule="auto"/>
               <w:jc w:val="left"/>
               <w:rPr/>
             </w:pPr>
@@ -13234,7 +13376,7 @@
           <w:tcPr/>
           <w:p>
             <w:pPr>
-              <w:spacing w:before="0" w:after="0" w:line="240" w:lineRule="auto"/>
+              <w:spacing w:before="0" w:after="0" w:line="360" w:lineRule="auto"/>
               <w:jc w:val="left"/>
               <w:rPr/>
             </w:pPr>
@@ -13296,7 +13438,7 @@
           <w:tcPr/>
           <w:p>
             <w:pPr>
-              <w:spacing w:before="0" w:after="0" w:line="240" w:lineRule="auto"/>
+              <w:spacing w:before="0" w:after="0" w:line="360" w:lineRule="auto"/>
               <w:jc w:val="left"/>
               <w:rPr/>
             </w:pPr>
@@ -13325,7 +13467,7 @@
           <w:tcPr/>
           <w:p>
             <w:pPr>
-              <w:spacing w:before="0" w:after="0" w:line="240" w:lineRule="auto"/>
+              <w:spacing w:before="0" w:after="0" w:line="360" w:lineRule="auto"/>
               <w:jc w:val="left"/>
               <w:rPr/>
             </w:pPr>
@@ -13349,7 +13491,7 @@
           <w:tcPr/>
           <w:p>
             <w:pPr>
-              <w:spacing w:before="0" w:after="0" w:line="240" w:lineRule="auto"/>
+              <w:spacing w:before="0" w:after="0" w:line="360" w:lineRule="auto"/>
               <w:jc w:val="left"/>
               <w:rPr/>
             </w:pPr>
@@ -13411,7 +13553,7 @@
           <w:tcPr/>
           <w:p>
             <w:pPr>
-              <w:spacing w:before="0" w:after="0" w:line="240" w:lineRule="auto"/>
+              <w:spacing w:before="0" w:after="0" w:line="360" w:lineRule="auto"/>
               <w:jc w:val="left"/>
               <w:rPr/>
             </w:pPr>
@@ -13440,7 +13582,7 @@
           <w:tcPr/>
           <w:p>
             <w:pPr>
-              <w:spacing w:before="0" w:after="0" w:line="240" w:lineRule="auto"/>
+              <w:spacing w:before="0" w:after="0" w:line="360" w:lineRule="auto"/>
               <w:jc w:val="left"/>
               <w:rPr/>
             </w:pPr>
@@ -13464,7 +13606,7 @@
           <w:tcPr/>
           <w:p>
             <w:pPr>
-              <w:spacing w:before="0" w:after="0" w:line="240" w:lineRule="auto"/>
+              <w:spacing w:before="0" w:after="0" w:line="360" w:lineRule="auto"/>
               <w:jc w:val="left"/>
               <w:rPr/>
             </w:pPr>
@@ -13526,7 +13668,7 @@
           <w:tcPr/>
           <w:p>
             <w:pPr>
-              <w:spacing w:before="0" w:after="0" w:line="240" w:lineRule="auto"/>
+              <w:spacing w:before="0" w:after="0" w:line="360" w:lineRule="auto"/>
               <w:jc w:val="left"/>
               <w:rPr/>
             </w:pPr>
@@ -13555,7 +13697,7 @@
           <w:tcPr/>
           <w:p>
             <w:pPr>
-              <w:spacing w:before="0" w:after="0" w:line="240" w:lineRule="auto"/>
+              <w:spacing w:before="0" w:after="0" w:line="360" w:lineRule="auto"/>
               <w:jc w:val="left"/>
               <w:rPr/>
             </w:pPr>
@@ -13579,7 +13721,7 @@
           <w:tcPr/>
           <w:p>
             <w:pPr>
-              <w:spacing w:before="0" w:after="0" w:line="240" w:lineRule="auto"/>
+              <w:spacing w:before="0" w:after="0" w:line="360" w:lineRule="auto"/>
               <w:jc w:val="left"/>
               <w:rPr/>
             </w:pPr>
@@ -13641,7 +13783,7 @@
           <w:tcPr/>
           <w:p>
             <w:pPr>
-              <w:spacing w:before="0" w:after="0" w:line="240" w:lineRule="auto"/>
+              <w:spacing w:before="0" w:after="0" w:line="360" w:lineRule="auto"/>
               <w:jc w:val="left"/>
               <w:rPr/>
             </w:pPr>
@@ -13670,7 +13812,7 @@
           <w:tcPr/>
           <w:p>
             <w:pPr>
-              <w:spacing w:before="0" w:after="0" w:line="240" w:lineRule="auto"/>
+              <w:spacing w:before="0" w:after="0" w:line="360" w:lineRule="auto"/>
               <w:jc w:val="left"/>
               <w:rPr/>
             </w:pPr>
@@ -13694,7 +13836,7 @@
           <w:tcPr/>
           <w:p>
             <w:pPr>
-              <w:spacing w:before="0" w:after="0" w:line="240" w:lineRule="auto"/>
+              <w:spacing w:before="0" w:after="0" w:line="360" w:lineRule="auto"/>
               <w:jc w:val="left"/>
               <w:rPr/>
             </w:pPr>
@@ -13751,7 +13893,7 @@
     <w:p>
       <w:pPr>
         <w:keepNext w:val="1"/>
-        <w:spacing w:before="120" w:after="0" w:line="480" w:lineRule="auto"/>
+        <w:spacing w:before="120" w:after="0" w:line="360" w:lineRule="auto"/>
         <w:jc w:val="left"/>
         <w:rPr/>
       </w:pPr>
@@ -13778,7 +13920,7 @@
       <w:pPr>
         <w:keepNext w:val="1"/>
         <w:keepLines w:val="1"/>
-        <w:spacing w:before="0" w:after="0" w:line="480" w:lineRule="auto"/>
+        <w:spacing w:before="0" w:after="0" w:line="360" w:lineRule="auto"/>
         <w:ind w:firstLine="720"/>
         <w:jc w:val="both"/>
         <w:rPr/>
@@ -13904,7 +14046,7 @@
           </w:tcPr>
           <w:p>
             <w:pPr>
-              <w:spacing w:before="0" w:after="0" w:line="240" w:lineRule="auto"/>
+              <w:spacing w:before="0" w:after="0" w:line="360" w:lineRule="auto"/>
               <w:jc w:val="left"/>
               <w:rPr/>
             </w:pPr>
@@ -13935,7 +14077,7 @@
           </w:tcPr>
           <w:p>
             <w:pPr>
-              <w:spacing w:before="0" w:after="0" w:line="240" w:lineRule="auto"/>
+              <w:spacing w:before="0" w:after="0" w:line="360" w:lineRule="auto"/>
               <w:jc w:val="left"/>
               <w:rPr/>
             </w:pPr>
@@ -13966,7 +14108,7 @@
           </w:tcPr>
           <w:p>
             <w:pPr>
-              <w:spacing w:before="0" w:after="0" w:line="240" w:lineRule="auto"/>
+              <w:spacing w:before="0" w:after="0" w:line="360" w:lineRule="auto"/>
               <w:jc w:val="left"/>
               <w:rPr/>
             </w:pPr>
@@ -13997,7 +14139,7 @@
           </w:tcPr>
           <w:p>
             <w:pPr>
-              <w:spacing w:before="0" w:after="0" w:line="240" w:lineRule="auto"/>
+              <w:spacing w:before="0" w:after="0" w:line="360" w:lineRule="auto"/>
               <w:jc w:val="left"/>
               <w:rPr/>
             </w:pPr>
@@ -14031,7 +14173,7 @@
           </w:tcPr>
           <w:p>
             <w:pPr>
-              <w:spacing w:before="0" w:after="0" w:line="240" w:lineRule="auto"/>
+              <w:spacing w:before="0" w:after="0" w:line="360" w:lineRule="auto"/>
               <w:jc w:val="left"/>
               <w:rPr/>
             </w:pPr>
@@ -14056,7 +14198,7 @@
           <w:tcPr/>
           <w:p>
             <w:pPr>
-              <w:spacing w:before="0" w:after="0" w:line="240" w:lineRule="auto"/>
+              <w:spacing w:before="0" w:after="0" w:line="360" w:lineRule="auto"/>
               <w:jc w:val="left"/>
               <w:rPr/>
             </w:pPr>
@@ -14080,7 +14222,7 @@
           <w:tcPr/>
           <w:p>
             <w:pPr>
-              <w:spacing w:before="0" w:after="0" w:line="240" w:lineRule="auto"/>
+              <w:spacing w:before="0" w:after="0" w:line="360" w:lineRule="auto"/>
               <w:jc w:val="left"/>
               <w:rPr/>
             </w:pPr>
@@ -14104,7 +14246,7 @@
           <w:tcPr/>
           <w:p>
             <w:pPr>
-              <w:spacing w:before="0" w:after="0" w:line="240" w:lineRule="auto"/>
+              <w:spacing w:before="0" w:after="0" w:line="360" w:lineRule="auto"/>
               <w:jc w:val="left"/>
               <w:rPr/>
             </w:pPr>
@@ -14169,7 +14311,7 @@
           </w:tcPr>
           <w:p>
             <w:pPr>
-              <w:spacing w:before="0" w:after="0" w:line="240" w:lineRule="auto"/>
+              <w:spacing w:before="0" w:after="0" w:line="360" w:lineRule="auto"/>
               <w:jc w:val="left"/>
               <w:rPr/>
             </w:pPr>
@@ -14194,7 +14336,7 @@
           <w:tcPr/>
           <w:p>
             <w:pPr>
-              <w:spacing w:before="0" w:after="0" w:line="240" w:lineRule="auto"/>
+              <w:spacing w:before="0" w:after="0" w:line="360" w:lineRule="auto"/>
               <w:jc w:val="left"/>
               <w:rPr/>
             </w:pPr>
@@ -14218,7 +14360,7 @@
           <w:tcPr/>
           <w:p>
             <w:pPr>
-              <w:spacing w:before="0" w:after="0" w:line="240" w:lineRule="auto"/>
+              <w:spacing w:before="0" w:after="0" w:line="360" w:lineRule="auto"/>
               <w:jc w:val="left"/>
               <w:rPr/>
             </w:pPr>
@@ -14242,7 +14384,7 @@
           <w:tcPr/>
           <w:p>
             <w:pPr>
-              <w:spacing w:before="0" w:after="0" w:line="240" w:lineRule="auto"/>
+              <w:spacing w:before="0" w:after="0" w:line="360" w:lineRule="auto"/>
               <w:jc w:val="left"/>
               <w:rPr/>
             </w:pPr>
@@ -14307,7 +14449,7 @@
           </w:tcPr>
           <w:p>
             <w:pPr>
-              <w:spacing w:before="0" w:after="0" w:line="240" w:lineRule="auto"/>
+              <w:spacing w:before="0" w:after="0" w:line="360" w:lineRule="auto"/>
               <w:jc w:val="left"/>
               <w:rPr/>
             </w:pPr>
@@ -14332,7 +14474,7 @@
           <w:tcPr/>
           <w:p>
             <w:pPr>
-              <w:spacing w:before="0" w:after="0" w:line="240" w:lineRule="auto"/>
+              <w:spacing w:before="0" w:after="0" w:line="360" w:lineRule="auto"/>
               <w:jc w:val="left"/>
               <w:rPr/>
             </w:pPr>
@@ -14356,7 +14498,7 @@
           <w:tcPr/>
           <w:p>
             <w:pPr>
-              <w:spacing w:before="0" w:after="0" w:line="240" w:lineRule="auto"/>
+              <w:spacing w:before="0" w:after="0" w:line="360" w:lineRule="auto"/>
               <w:jc w:val="left"/>
               <w:rPr/>
             </w:pPr>
@@ -14380,7 +14522,7 @@
           <w:tcPr/>
           <w:p>
             <w:pPr>
-              <w:spacing w:before="0" w:after="0" w:line="240" w:lineRule="auto"/>
+              <w:spacing w:before="0" w:after="0" w:line="360" w:lineRule="auto"/>
               <w:jc w:val="left"/>
               <w:rPr/>
             </w:pPr>
@@ -14438,7 +14580,7 @@
     <w:p>
       <w:pPr>
         <w:keepNext w:val="1"/>
-        <w:spacing w:before="120" w:after="0" w:line="480" w:lineRule="auto"/>
+        <w:spacing w:before="120" w:after="0" w:line="360" w:lineRule="auto"/>
         <w:jc w:val="left"/>
         <w:rPr/>
       </w:pPr>
@@ -14465,7 +14607,7 @@
       <w:pPr>
         <w:keepNext w:val="1"/>
         <w:keepLines w:val="1"/>
-        <w:spacing w:before="0" w:after="0" w:line="480" w:lineRule="auto"/>
+        <w:spacing w:before="0" w:after="0" w:line="360" w:lineRule="auto"/>
         <w:ind w:firstLine="720"/>
         <w:jc w:val="both"/>
         <w:rPr/>
@@ -14530,7 +14672,7 @@
           </w:tcPr>
           <w:p>
             <w:pPr>
-              <w:spacing w:before="0" w:after="0" w:line="240" w:lineRule="auto"/>
+              <w:spacing w:before="0" w:after="0" w:line="360" w:lineRule="auto"/>
               <w:jc w:val="left"/>
               <w:rPr/>
             </w:pPr>
@@ -14561,7 +14703,7 @@
           </w:tcPr>
           <w:p>
             <w:pPr>
-              <w:spacing w:before="0" w:after="0" w:line="240" w:lineRule="auto"/>
+              <w:spacing w:before="0" w:after="0" w:line="360" w:lineRule="auto"/>
               <w:jc w:val="left"/>
               <w:rPr/>
             </w:pPr>
@@ -14593,7 +14735,7 @@
           <w:tcPr/>
           <w:p>
             <w:pPr>
-              <w:spacing w:before="0" w:after="0" w:line="240" w:lineRule="auto"/>
+              <w:spacing w:before="0" w:after="0" w:line="360" w:lineRule="auto"/>
               <w:jc w:val="left"/>
               <w:rPr/>
             </w:pPr>
@@ -14629,7 +14771,7 @@
           </w:p>
           <w:p>
             <w:pPr>
-              <w:spacing w:before="0" w:after="0" w:line="240" w:lineRule="auto"/>
+              <w:spacing w:before="0" w:after="0" w:line="360" w:lineRule="auto"/>
               <w:jc w:val="left"/>
               <w:rPr/>
             </w:pPr>
@@ -14665,7 +14807,7 @@
           </w:p>
           <w:p>
             <w:pPr>
-              <w:spacing w:before="0" w:after="0" w:line="240" w:lineRule="auto"/>
+              <w:spacing w:before="0" w:after="0" w:line="360" w:lineRule="auto"/>
               <w:jc w:val="left"/>
               <w:rPr/>
             </w:pPr>
@@ -14701,7 +14843,7 @@
           </w:p>
           <w:p>
             <w:pPr>
-              <w:spacing w:before="0" w:after="0" w:line="240" w:lineRule="auto"/>
+              <w:spacing w:before="0" w:after="0" w:line="360" w:lineRule="auto"/>
               <w:jc w:val="left"/>
               <w:rPr/>
             </w:pPr>
@@ -14740,7 +14882,7 @@
           <w:tcPr/>
           <w:p>
             <w:pPr>
-              <w:spacing w:before="0" w:after="0" w:line="240" w:lineRule="auto"/>
+              <w:spacing w:before="0" w:after="0" w:line="360" w:lineRule="auto"/>
               <w:jc w:val="left"/>
               <w:rPr/>
             </w:pPr>
@@ -14780,7 +14922,7 @@
           </w:p>
           <w:p>
             <w:pPr>
-              <w:spacing w:before="0" w:after="0" w:line="240" w:lineRule="auto"/>
+              <w:spacing w:before="0" w:after="0" w:line="360" w:lineRule="auto"/>
               <w:jc w:val="left"/>
               <w:rPr/>
             </w:pPr>
@@ -14820,7 +14962,7 @@
           </w:p>
           <w:p>
             <w:pPr>
-              <w:spacing w:before="0" w:after="0" w:line="240" w:lineRule="auto"/>
+              <w:spacing w:before="0" w:after="0" w:line="360" w:lineRule="auto"/>
               <w:jc w:val="left"/>
               <w:rPr/>
             </w:pPr>
@@ -14869,7 +15011,7 @@
           <w:tcPr/>
           <w:p>
             <w:pPr>
-              <w:spacing w:before="0" w:after="0" w:line="240" w:lineRule="auto"/>
+              <w:spacing w:before="0" w:after="0" w:line="360" w:lineRule="auto"/>
               <w:jc w:val="left"/>
               <w:rPr/>
             </w:pPr>
@@ -14895,7 +15037,7 @@
           </w:p>
           <w:p>
             <w:pPr>
-              <w:spacing w:before="0" w:after="0" w:line="240" w:lineRule="auto"/>
+              <w:spacing w:before="0" w:after="0" w:line="360" w:lineRule="auto"/>
               <w:jc w:val="left"/>
               <w:rPr/>
             </w:pPr>
@@ -14934,7 +15076,7 @@
           <w:tcPr/>
           <w:p>
             <w:pPr>
-              <w:spacing w:before="0" w:after="0" w:line="240" w:lineRule="auto"/>
+              <w:spacing w:before="0" w:after="0" w:line="360" w:lineRule="auto"/>
               <w:jc w:val="left"/>
               <w:rPr/>
             </w:pPr>
@@ -14960,7 +15102,7 @@
           </w:p>
           <w:p>
             <w:pPr>
-              <w:spacing w:before="0" w:after="0" w:line="240" w:lineRule="auto"/>
+              <w:spacing w:before="0" w:after="0" w:line="360" w:lineRule="auto"/>
               <w:jc w:val="left"/>
               <w:rPr/>
             </w:pPr>
@@ -14990,7 +15132,7 @@
     <w:p>
       <w:pPr>
         <w:keepNext w:val="1"/>
-        <w:spacing w:before="120" w:after="0" w:line="480" w:lineRule="auto"/>
+        <w:spacing w:before="120" w:after="0" w:line="360" w:lineRule="auto"/>
         <w:jc w:val="left"/>
         <w:rPr/>
       </w:pPr>
@@ -15015,7 +15157,7 @@
     </w:p>
     <w:p>
       <w:pPr>
-        <w:spacing w:before="0" w:after="0" w:line="480" w:lineRule="auto"/>
+        <w:spacing w:before="0" w:after="0" w:line="360" w:lineRule="auto"/>
         <w:ind w:firstLine="720"/>
         <w:jc w:val="both"/>
         <w:rPr/>
@@ -15278,7 +15420,7 @@
     </w:p>
     <w:p>
       <w:pPr>
-        <w:spacing w:before="0" w:after="0" w:line="480" w:lineRule="auto"/>
+        <w:spacing w:before="0" w:after="0" w:line="360" w:lineRule="auto"/>
         <w:ind w:firstLine="720"/>
         <w:jc w:val="both"/>
         <w:rPr/>
@@ -15315,7 +15457,7 @@
     <w:p>
       <w:pPr>
         <w:keepNext w:val="1"/>
-        <w:spacing w:before="120" w:after="0" w:line="480" w:lineRule="auto"/>
+        <w:spacing w:before="120" w:after="0" w:line="360" w:lineRule="auto"/>
         <w:jc w:val="left"/>
         <w:rPr/>
       </w:pPr>
@@ -15342,7 +15484,7 @@
       <w:pPr>
         <w:keepNext w:val="1"/>
         <w:keepLines w:val="1"/>
-        <w:spacing w:before="0" w:after="0" w:line="480" w:lineRule="auto"/>
+        <w:spacing w:before="0" w:after="0" w:line="360" w:lineRule="auto"/>
         <w:ind w:firstLine="720"/>
         <w:jc w:val="both"/>
         <w:rPr/>
@@ -15419,7 +15561,7 @@
           </w:tcPr>
           <w:p>
             <w:pPr>
-              <w:spacing w:before="0" w:after="0" w:line="240" w:lineRule="auto"/>
+              <w:spacing w:before="0" w:after="0" w:line="360" w:lineRule="auto"/>
               <w:jc w:val="left"/>
               <w:rPr/>
             </w:pPr>
@@ -15450,7 +15592,7 @@
           </w:tcPr>
           <w:p>
             <w:pPr>
-              <w:spacing w:before="0" w:after="0" w:line="240" w:lineRule="auto"/>
+              <w:spacing w:before="0" w:after="0" w:line="360" w:lineRule="auto"/>
               <w:jc w:val="left"/>
               <w:rPr/>
             </w:pPr>
@@ -15481,7 +15623,7 @@
           </w:tcPr>
           <w:p>
             <w:pPr>
-              <w:spacing w:before="0" w:after="0" w:line="240" w:lineRule="auto"/>
+              <w:spacing w:before="0" w:after="0" w:line="360" w:lineRule="auto"/>
               <w:jc w:val="left"/>
               <w:rPr/>
             </w:pPr>
@@ -15512,7 +15654,7 @@
           </w:tcPr>
           <w:p>
             <w:pPr>
-              <w:spacing w:before="0" w:after="0" w:line="240" w:lineRule="auto"/>
+              <w:spacing w:before="0" w:after="0" w:line="360" w:lineRule="auto"/>
               <w:jc w:val="left"/>
               <w:rPr/>
             </w:pPr>
@@ -15543,7 +15685,7 @@
           </w:tcPr>
           <w:p>
             <w:pPr>
-              <w:spacing w:before="0" w:after="0" w:line="240" w:lineRule="auto"/>
+              <w:spacing w:before="0" w:after="0" w:line="360" w:lineRule="auto"/>
               <w:jc w:val="left"/>
               <w:rPr/>
             </w:pPr>
@@ -15574,7 +15716,7 @@
           </w:tcPr>
           <w:p>
             <w:pPr>
-              <w:spacing w:before="0" w:after="0" w:line="240" w:lineRule="auto"/>
+              <w:spacing w:before="0" w:after="0" w:line="360" w:lineRule="auto"/>
               <w:jc w:val="left"/>
               <w:rPr/>
             </w:pPr>
@@ -15605,7 +15747,7 @@
           </w:tcPr>
           <w:p>
             <w:pPr>
-              <w:spacing w:before="0" w:after="0" w:line="240" w:lineRule="auto"/>
+              <w:spacing w:before="0" w:after="0" w:line="360" w:lineRule="auto"/>
               <w:jc w:val="left"/>
               <w:rPr/>
             </w:pPr>
@@ -15636,7 +15778,7 @@
           </w:tcPr>
           <w:p>
             <w:pPr>
-              <w:spacing w:before="0" w:after="0" w:line="240" w:lineRule="auto"/>
+              <w:spacing w:before="0" w:after="0" w:line="360" w:lineRule="auto"/>
               <w:jc w:val="left"/>
               <w:rPr/>
             </w:pPr>
@@ -15668,7 +15810,7 @@
           <w:tcPr/>
           <w:p>
             <w:pPr>
-              <w:spacing w:before="0" w:after="0" w:line="240" w:lineRule="auto"/>
+              <w:spacing w:before="0" w:after="0" w:line="360" w:lineRule="auto"/>
               <w:jc w:val="left"/>
               <w:rPr/>
             </w:pPr>
@@ -15692,7 +15834,7 @@
           <w:tcPr/>
           <w:p>
             <w:pPr>
-              <w:spacing w:before="0" w:after="0" w:line="240" w:lineRule="auto"/>
+              <w:spacing w:before="0" w:after="0" w:line="360" w:lineRule="auto"/>
               <w:jc w:val="left"/>
               <w:rPr/>
             </w:pPr>
@@ -15716,7 +15858,7 @@
           <w:tcPr/>
           <w:p>
             <w:pPr>
-              <w:spacing w:before="0" w:after="0" w:line="240" w:lineRule="auto"/>
+              <w:spacing w:before="0" w:after="0" w:line="360" w:lineRule="auto"/>
               <w:jc w:val="left"/>
               <w:rPr/>
             </w:pPr>
@@ -15740,7 +15882,7 @@
           <w:tcPr/>
           <w:p>
             <w:pPr>
-              <w:spacing w:before="0" w:after="0" w:line="240" w:lineRule="auto"/>
+              <w:spacing w:before="0" w:after="0" w:line="360" w:lineRule="auto"/>
               <w:jc w:val="left"/>
               <w:rPr/>
             </w:pPr>
@@ -15764,7 +15906,7 @@
           <w:tcPr/>
           <w:p>
             <w:pPr>
-              <w:spacing w:before="0" w:after="0" w:line="240" w:lineRule="auto"/>
+              <w:spacing w:before="0" w:after="0" w:line="360" w:lineRule="auto"/>
               <w:jc w:val="left"/>
               <w:rPr/>
             </w:pPr>
@@ -15788,7 +15930,7 @@
           <w:tcPr/>
           <w:p>
             <w:pPr>
-              <w:spacing w:before="0" w:after="0" w:line="240" w:lineRule="auto"/>
+              <w:spacing w:before="0" w:after="0" w:line="360" w:lineRule="auto"/>
               <w:jc w:val="left"/>
               <w:rPr/>
             </w:pPr>
@@ -15812,7 +15954,7 @@
           <w:tcPr/>
           <w:p>
             <w:pPr>
-              <w:spacing w:before="0" w:after="0" w:line="240" w:lineRule="auto"/>
+              <w:spacing w:before="0" w:after="0" w:line="360" w:lineRule="auto"/>
               <w:jc w:val="left"/>
               <w:rPr/>
             </w:pPr>
@@ -15836,7 +15978,7 @@
           <w:tcPr/>
           <w:p>
             <w:pPr>
-              <w:spacing w:before="0" w:after="0" w:line="240" w:lineRule="auto"/>
+              <w:spacing w:before="0" w:after="0" w:line="360" w:lineRule="auto"/>
               <w:jc w:val="left"/>
               <w:rPr/>
             </w:pPr>
@@ -15860,7 +16002,7 @@
     </w:tbl>
     <w:p>
       <w:pPr>
-        <w:spacing w:before="120" w:after="0" w:line="480" w:lineRule="auto"/>
+        <w:spacing w:before="120" w:after="0" w:line="360" w:lineRule="auto"/>
         <w:ind w:firstLine="720"/>
         <w:jc w:val="both"/>
         <w:rPr/>
@@ -15887,7 +16029,7 @@
     </w:p>
     <w:p>
       <w:pPr>
-        <w:spacing w:before="0" w:after="0" w:line="480" w:lineRule="auto"/>
+        <w:spacing w:before="0" w:after="0" w:line="360" w:lineRule="auto"/>
         <w:ind w:firstLine="720"/>
         <w:jc w:val="both"/>
         <w:rPr/>
@@ -15916,7 +16058,7 @@
       <w:pPr>
         <w:keepNext w:val="1"/>
         <w:keepLines w:val="1"/>
-        <w:spacing w:before="120" w:after="0" w:line="480" w:lineRule="auto"/>
+        <w:spacing w:before="120" w:after="0" w:line="360" w:lineRule="auto"/>
         <w:jc w:val="left"/>
         <w:rPr/>
       </w:pPr>
@@ -15988,7 +16130,7 @@
           </w:tcPr>
           <w:p>
             <w:pPr>
-              <w:spacing w:before="0" w:after="0" w:line="240" w:lineRule="auto"/>
+              <w:spacing w:before="0" w:after="0" w:line="360" w:lineRule="auto"/>
               <w:jc w:val="left"/>
               <w:rPr/>
             </w:pPr>
@@ -16019,7 +16161,7 @@
           </w:tcPr>
           <w:p>
             <w:pPr>
-              <w:spacing w:before="0" w:after="0" w:line="240" w:lineRule="auto"/>
+              <w:spacing w:before="0" w:after="0" w:line="360" w:lineRule="auto"/>
               <w:jc w:val="left"/>
               <w:rPr/>
             </w:pPr>
@@ -16050,7 +16192,7 @@
           </w:tcPr>
           <w:p>
             <w:pPr>
-              <w:spacing w:before="0" w:after="0" w:line="240" w:lineRule="auto"/>
+              <w:spacing w:before="0" w:after="0" w:line="360" w:lineRule="auto"/>
               <w:jc w:val="left"/>
               <w:rPr/>
             </w:pPr>
@@ -16081,7 +16223,7 @@
           </w:tcPr>
           <w:p>
             <w:pPr>
-              <w:spacing w:before="0" w:after="0" w:line="240" w:lineRule="auto"/>
+              <w:spacing w:before="0" w:after="0" w:line="360" w:lineRule="auto"/>
               <w:jc w:val="left"/>
               <w:rPr/>
             </w:pPr>
@@ -16112,7 +16254,7 @@
           </w:tcPr>
           <w:p>
             <w:pPr>
-              <w:spacing w:before="0" w:after="0" w:line="240" w:lineRule="auto"/>
+              <w:spacing w:before="0" w:after="0" w:line="360" w:lineRule="auto"/>
               <w:jc w:val="left"/>
               <w:rPr/>
             </w:pPr>
@@ -16143,7 +16285,7 @@
           </w:tcPr>
           <w:p>
             <w:pPr>
-              <w:spacing w:before="0" w:after="0" w:line="240" w:lineRule="auto"/>
+              <w:spacing w:before="0" w:after="0" w:line="360" w:lineRule="auto"/>
               <w:jc w:val="left"/>
               <w:rPr/>
             </w:pPr>
@@ -16175,7 +16317,7 @@
           <w:tcPr/>
           <w:p>
             <w:pPr>
-              <w:spacing w:before="0" w:after="0" w:line="240" w:lineRule="auto"/>
+              <w:spacing w:before="0" w:after="0" w:line="360" w:lineRule="auto"/>
               <w:jc w:val="left"/>
               <w:rPr/>
             </w:pPr>
@@ -16199,7 +16341,7 @@
           <w:tcPr/>
           <w:p>
             <w:pPr>
-              <w:spacing w:before="0" w:after="0" w:line="240" w:lineRule="auto"/>
+              <w:spacing w:before="0" w:after="0" w:line="360" w:lineRule="auto"/>
               <w:jc w:val="left"/>
               <w:rPr/>
             </w:pPr>
@@ -16223,7 +16365,7 @@
           <w:tcPr/>
           <w:p>
             <w:pPr>
-              <w:spacing w:before="0" w:after="0" w:line="240" w:lineRule="auto"/>
+              <w:spacing w:before="0" w:after="0" w:line="360" w:lineRule="auto"/>
               <w:jc w:val="left"/>
               <w:rPr/>
             </w:pPr>
@@ -16247,7 +16389,7 @@
           <w:tcPr/>
           <w:p>
             <w:pPr>
-              <w:spacing w:before="0" w:after="0" w:line="240" w:lineRule="auto"/>
+              <w:spacing w:before="0" w:after="0" w:line="360" w:lineRule="auto"/>
               <w:jc w:val="left"/>
               <w:rPr/>
             </w:pPr>
@@ -16271,7 +16413,7 @@
           <w:tcPr/>
           <w:p>
             <w:pPr>
-              <w:spacing w:before="0" w:after="0" w:line="240" w:lineRule="auto"/>
+              <w:spacing w:before="0" w:after="0" w:line="360" w:lineRule="auto"/>
               <w:jc w:val="left"/>
               <w:rPr/>
             </w:pPr>
@@ -16295,7 +16437,7 @@
           <w:tcPr/>
           <w:p>
             <w:pPr>
-              <w:spacing w:before="0" w:after="0" w:line="240" w:lineRule="auto"/>
+              <w:spacing w:before="0" w:after="0" w:line="360" w:lineRule="auto"/>
               <w:jc w:val="left"/>
               <w:rPr/>
             </w:pPr>
@@ -16320,7 +16462,7 @@
     <w:p>
       <w:pPr>
         <w:keepNext w:val="1"/>
-        <w:spacing w:before="120" w:after="0" w:line="480" w:lineRule="auto"/>
+        <w:spacing w:before="120" w:after="0" w:line="360" w:lineRule="auto"/>
         <w:jc w:val="left"/>
         <w:rPr/>
       </w:pPr>
@@ -16347,7 +16489,7 @@
       <w:pPr>
         <w:keepNext w:val="1"/>
         <w:keepLines w:val="1"/>
-        <w:spacing w:before="0" w:after="0" w:line="480" w:lineRule="auto"/>
+        <w:spacing w:before="0" w:after="0" w:line="360" w:lineRule="auto"/>
         <w:ind w:firstLine="720"/>
         <w:jc w:val="both"/>
         <w:rPr/>
@@ -16420,7 +16562,7 @@
           </w:tcPr>
           <w:p>
             <w:pPr>
-              <w:spacing w:before="0" w:after="0" w:line="240" w:lineRule="auto"/>
+              <w:spacing w:before="0" w:after="0" w:line="360" w:lineRule="auto"/>
               <w:jc w:val="left"/>
               <w:rPr/>
             </w:pPr>
@@ -16451,7 +16593,7 @@
           </w:tcPr>
           <w:p>
             <w:pPr>
-              <w:spacing w:before="0" w:after="0" w:line="240" w:lineRule="auto"/>
+              <w:spacing w:before="0" w:after="0" w:line="360" w:lineRule="auto"/>
               <w:jc w:val="left"/>
               <w:rPr/>
             </w:pPr>
@@ -16482,7 +16624,7 @@
           </w:tcPr>
           <w:p>
             <w:pPr>
-              <w:spacing w:before="0" w:after="0" w:line="240" w:lineRule="auto"/>
+              <w:spacing w:before="0" w:after="0" w:line="360" w:lineRule="auto"/>
               <w:jc w:val="left"/>
               <w:rPr/>
             </w:pPr>
@@ -16513,7 +16655,7 @@
           </w:tcPr>
           <w:p>
             <w:pPr>
-              <w:spacing w:before="0" w:after="0" w:line="240" w:lineRule="auto"/>
+              <w:spacing w:before="0" w:after="0" w:line="360" w:lineRule="auto"/>
               <w:jc w:val="left"/>
               <w:rPr/>
             </w:pPr>
@@ -16544,7 +16686,7 @@
           </w:tcPr>
           <w:p>
             <w:pPr>
-              <w:spacing w:before="0" w:after="0" w:line="240" w:lineRule="auto"/>
+              <w:spacing w:before="0" w:after="0" w:line="360" w:lineRule="auto"/>
               <w:jc w:val="left"/>
               <w:rPr/>
             </w:pPr>
@@ -16575,7 +16717,7 @@
           </w:tcPr>
           <w:p>
             <w:pPr>
-              <w:spacing w:before="0" w:after="0" w:line="240" w:lineRule="auto"/>
+              <w:spacing w:before="0" w:after="0" w:line="360" w:lineRule="auto"/>
               <w:jc w:val="left"/>
               <w:rPr/>
             </w:pPr>
@@ -16607,7 +16749,7 @@
           <w:tcPr/>
           <w:p>
             <w:pPr>
-              <w:spacing w:before="0" w:after="0" w:line="240" w:lineRule="auto"/>
+              <w:spacing w:before="0" w:after="0" w:line="360" w:lineRule="auto"/>
               <w:jc w:val="left"/>
               <w:rPr/>
             </w:pPr>
@@ -16631,7 +16773,7 @@
           <w:tcPr/>
           <w:p>
             <w:pPr>
-              <w:spacing w:before="0" w:after="0" w:line="240" w:lineRule="auto"/>
+              <w:spacing w:before="0" w:after="0" w:line="360" w:lineRule="auto"/>
               <w:jc w:val="left"/>
               <w:rPr/>
             </w:pPr>
@@ -16655,7 +16797,7 @@
           <w:tcPr/>
           <w:p>
             <w:pPr>
-              <w:spacing w:before="0" w:after="0" w:line="240" w:lineRule="auto"/>
+              <w:spacing w:before="0" w:after="0" w:line="360" w:lineRule="auto"/>
               <w:jc w:val="left"/>
               <w:rPr/>
             </w:pPr>
@@ -16679,7 +16821,7 @@
           <w:tcPr/>
           <w:p>
             <w:pPr>
-              <w:spacing w:before="0" w:after="0" w:line="240" w:lineRule="auto"/>
+              <w:spacing w:before="0" w:after="0" w:line="360" w:lineRule="auto"/>
               <w:jc w:val="left"/>
               <w:rPr/>
             </w:pPr>
@@ -16703,7 +16845,7 @@
           <w:tcPr/>
           <w:p>
             <w:pPr>
-              <w:spacing w:before="0" w:after="0" w:line="240" w:lineRule="auto"/>
+              <w:spacing w:before="0" w:after="0" w:line="360" w:lineRule="auto"/>
               <w:jc w:val="left"/>
               <w:rPr/>
             </w:pPr>
@@ -16727,7 +16869,7 @@
           <w:tcPr/>
           <w:p>
             <w:pPr>
-              <w:spacing w:before="0" w:after="0" w:line="240" w:lineRule="auto"/>
+              <w:spacing w:before="0" w:after="0" w:line="360" w:lineRule="auto"/>
               <w:jc w:val="left"/>
               <w:rPr/>
             </w:pPr>
@@ -28307,7 +28449,7 @@
     </w:rPrDefault>
     <w:pPrDefault>
       <w:pPr>
-        <w:spacing w:after="200" w:line="276" w:lineRule="auto"/>
+        <w:spacing w:after="200" w:line="480" w:lineRule="auto"/>
       </w:pPr>
     </w:pPrDefault>
   </w:docDefaults>

</xml_diff>

<commit_message>
Draft_013: Appendix major heads 1-space so quick-ref fits one page
</commit_message>
<xml_diff>
--- a/thesis/003_ThesisProposal_Draft_013.docx
+++ b/thesis/003_ThesisProposal_Draft_013.docx
@@ -9670,7 +9670,7 @@
       <w:pPr>
         <w:keepNext w:val="1"/>
         <w:keepLines w:val="1"/>
-        <w:spacing w:before="0" w:after="120" w:line="480" w:lineRule="auto"/>
+        <w:spacing w:before="120" w:after="120" w:line="240" w:lineRule="auto"/>
         <w:jc w:val="center"/>
         <w:rPr/>
       </w:pPr>
@@ -9697,7 +9697,7 @@
       <w:pPr>
         <w:keepNext w:val="1"/>
         <w:keepLines w:val="1"/>
-        <w:spacing w:before="0" w:after="720" w:line="480" w:lineRule="auto"/>
+        <w:spacing w:before="120" w:after="120" w:line="240" w:lineRule="auto"/>
         <w:jc w:val="left"/>
         <w:rPr/>
       </w:pPr>
@@ -16895,7 +16895,7 @@
       <w:pPr>
         <w:keepLines w:val="1"/>
         <w:pageBreakBefore w:val="1"/>
-        <w:spacing w:before="720" w:after="720" w:line="480" w:lineRule="auto"/>
+        <w:spacing w:before="120" w:after="120" w:line="480" w:lineRule="auto"/>
         <w:jc w:val="left"/>
         <w:rPr/>
       </w:pPr>
@@ -17719,7 +17719,7 @@
     <w:p>
       <w:pPr>
         <w:keepLines w:val="1"/>
-        <w:spacing w:before="0" w:after="720" w:line="480" w:lineRule="auto"/>
+        <w:spacing w:before="120" w:after="120" w:line="480" w:lineRule="auto"/>
         <w:jc w:val="left"/>
         <w:rPr/>
       </w:pPr>

</xml_diff>

<commit_message>
Draft_013: APPENDICES major only; A/B/C minor headings
</commit_message>
<xml_diff>
--- a/thesis/003_ThesisProposal_Draft_013.docx
+++ b/thesis/003_ThesisProposal_Draft_013.docx
@@ -9670,6 +9670,7 @@
       <w:pPr>
         <w:keepNext w:val="1"/>
         <w:keepLines w:val="1"/>
+        <w:pageBreakBefore w:val="1"/>
         <w:spacing w:before="120" w:after="120" w:line="240" w:lineRule="auto"/>
         <w:jc w:val="center"/>
         <w:rPr/>
@@ -9697,7 +9698,7 @@
       <w:pPr>
         <w:keepNext w:val="1"/>
         <w:keepLines w:val="1"/>
-        <w:spacing w:before="120" w:after="120" w:line="240" w:lineRule="auto"/>
+        <w:spacing w:before="120" w:after="0" w:line="240" w:lineRule="auto"/>
         <w:jc w:val="left"/>
         <w:rPr/>
       </w:pPr>
@@ -16893,9 +16894,10 @@
     </w:tbl>
     <w:p>
       <w:pPr>
+        <w:keepNext w:val="1"/>
         <w:keepLines w:val="1"/>
         <w:pageBreakBefore w:val="1"/>
-        <w:spacing w:before="120" w:after="120" w:line="480" w:lineRule="auto"/>
+        <w:spacing w:before="120" w:after="0" w:line="480" w:lineRule="auto"/>
         <w:jc w:val="left"/>
         <w:rPr/>
       </w:pPr>
@@ -17718,8 +17720,9 @@
     </w:p>
     <w:p>
       <w:pPr>
+        <w:keepNext w:val="1"/>
         <w:keepLines w:val="1"/>
-        <w:spacing w:before="120" w:after="120" w:line="480" w:lineRule="auto"/>
+        <w:spacing w:before="120" w:after="0" w:line="480" w:lineRule="auto"/>
         <w:jc w:val="left"/>
         <w:rPr/>
       </w:pPr>

</xml_diff>

<commit_message>
Draft_013: title page layout; name/date stay on page 1
Structure: 3 empty, title 14pt bold, 3 empty, faculty block,
3 empty, degree block, 3 empty, By, 8 empty, name bold, 1 empty, date.
Title page single-spaced so name/date fit bottom of page 1;
body remains double. INTRODUCTION at top of page 2.
</commit_message>
<xml_diff>
--- a/thesis/003_ThesisProposal_Draft_013.docx
+++ b/thesis/003_ThesisProposal_Draft_013.docx
@@ -5,563 +5,300 @@
     <w:p>
       <w:pPr>
         <w:spacing w:before="0" w:after="0" w:line="240" w:lineRule="auto"/>
-        <w:rPr/>
-      </w:pPr>
-      <w:r>
-        <w:rPr>
-          <w:rtl w:val="0"/>
-        </w:rPr>
-      </w:r>
-    </w:p>
-    <w:p>
-      <w:pPr>
-        <w:rPr/>
-      </w:pPr>
-      <w:r>
-        <w:rPr>
-          <w:rtl w:val="0"/>
-        </w:rPr>
-      </w:r>
+      </w:pPr>
+    </w:p>
+    <w:p>
+      <w:pPr>
+        <w:spacing w:before="0" w:after="0" w:line="240" w:lineRule="auto"/>
+      </w:pPr>
+    </w:p>
+    <w:p>
+      <w:pPr>
+        <w:spacing w:before="0" w:after="0" w:line="240" w:lineRule="auto"/>
+      </w:pPr>
     </w:p>
     <w:p>
       <w:pPr>
         <w:spacing w:before="0" w:after="0" w:line="240" w:lineRule="auto"/>
         <w:jc w:val="center"/>
-        <w:rPr/>
-      </w:pPr>
-      <w:r>
-        <w:rPr>
-          <w:rFonts w:ascii="Georgia" w:cs="Georgia" w:eastAsia="Georgia" w:hAnsi="Georgia"/>
-          <w:b w:val="1"/>
-          <w:bCs w:val="1"/>
-          <w:i w:val="0"/>
-          <w:iCs w:val="0"/>
+      </w:pPr>
+      <w:r>
+        <w:rPr>
+          <w:rFonts w:ascii="Georgia" w:hAnsi="Georgia"/>
           <w:sz w:val="28"/>
           <w:szCs w:val="28"/>
-          <w:rtl w:val="0"/>
+          <w:b/>
+          <w:bCs/>
         </w:rPr>
         <w:t xml:space="preserve">THE USE OF HEDGES IN RESEARCH ABSTRACTS</w:t>
-      </w:r>
-      <w:r>
-        <w:rPr>
-          <w:rtl w:val="0"/>
-        </w:rPr>
       </w:r>
     </w:p>
     <w:p>
       <w:pPr>
         <w:spacing w:before="0" w:after="0" w:line="240" w:lineRule="auto"/>
         <w:jc w:val="center"/>
-        <w:rPr/>
-      </w:pPr>
-      <w:r>
-        <w:rPr>
-          <w:rFonts w:ascii="Georgia" w:cs="Georgia" w:eastAsia="Georgia" w:hAnsi="Georgia"/>
-          <w:b w:val="1"/>
-          <w:bCs w:val="1"/>
-          <w:i w:val="0"/>
-          <w:iCs w:val="0"/>
+      </w:pPr>
+      <w:r>
+        <w:rPr>
+          <w:rFonts w:ascii="Georgia" w:hAnsi="Georgia"/>
           <w:sz w:val="28"/>
           <w:szCs w:val="28"/>
-          <w:rtl w:val="0"/>
+          <w:b/>
+          <w:bCs/>
         </w:rPr>
         <w:t xml:space="preserve">ACROSS APPLIED LIFE SCIENCES</w:t>
       </w:r>
-      <w:r>
-        <w:rPr>
-          <w:rtl w:val="0"/>
-        </w:rPr>
-      </w:r>
     </w:p>
     <w:p>
       <w:pPr>
         <w:spacing w:before="0" w:after="0" w:line="240" w:lineRule="auto"/>
-        <w:rPr/>
-      </w:pPr>
-      <w:r>
-        <w:rPr>
-          <w:rtl w:val="0"/>
-        </w:rPr>
-      </w:r>
+      </w:pPr>
     </w:p>
     <w:p>
       <w:pPr>
         <w:spacing w:before="0" w:after="0" w:line="240" w:lineRule="auto"/>
-        <w:rPr/>
-      </w:pPr>
-      <w:r>
-        <w:rPr>
-          <w:rtl w:val="0"/>
-        </w:rPr>
-      </w:r>
-    </w:p>
-    <w:p>
-      <w:pPr>
-        <w:rPr/>
-      </w:pPr>
-      <w:r>
-        <w:rPr>
-          <w:rtl w:val="0"/>
-        </w:rPr>
-      </w:r>
+      </w:pPr>
+    </w:p>
+    <w:p>
+      <w:pPr>
+        <w:spacing w:before="0" w:after="0" w:line="240" w:lineRule="auto"/>
+      </w:pPr>
     </w:p>
     <w:p>
       <w:pPr>
         <w:spacing w:before="0" w:after="0" w:line="240" w:lineRule="auto"/>
         <w:jc w:val="center"/>
-        <w:rPr/>
-      </w:pPr>
-      <w:r>
-        <w:rPr>
-          <w:rFonts w:ascii="Georgia" w:cs="Georgia" w:eastAsia="Georgia" w:hAnsi="Georgia"/>
-          <w:b w:val="0"/>
-          <w:bCs w:val="0"/>
-          <w:i w:val="0"/>
-          <w:iCs w:val="0"/>
+      </w:pPr>
+      <w:r>
+        <w:rPr>
+          <w:rFonts w:ascii="Georgia" w:hAnsi="Georgia"/>
           <w:sz w:val="24"/>
           <w:szCs w:val="24"/>
-          <w:rtl w:val="0"/>
         </w:rPr>
         <w:t xml:space="preserve">A Thesis</w:t>
-      </w:r>
-      <w:r>
-        <w:rPr>
-          <w:rtl w:val="0"/>
-        </w:rPr>
       </w:r>
     </w:p>
     <w:p>
       <w:pPr>
         <w:spacing w:before="0" w:after="0" w:line="240" w:lineRule="auto"/>
         <w:jc w:val="center"/>
-        <w:rPr/>
-      </w:pPr>
-      <w:r>
-        <w:rPr>
-          <w:rFonts w:ascii="Georgia" w:cs="Georgia" w:eastAsia="Georgia" w:hAnsi="Georgia"/>
-          <w:b w:val="0"/>
-          <w:bCs w:val="0"/>
-          <w:i w:val="0"/>
-          <w:iCs w:val="0"/>
+      </w:pPr>
+      <w:r>
+        <w:rPr>
+          <w:rFonts w:ascii="Georgia" w:hAnsi="Georgia"/>
           <w:sz w:val="24"/>
           <w:szCs w:val="24"/>
-          <w:rtl w:val="0"/>
         </w:rPr>
         <w:t xml:space="preserve">Presented to the Faculty of</w:t>
-      </w:r>
-      <w:r>
-        <w:rPr>
-          <w:rtl w:val="0"/>
-        </w:rPr>
       </w:r>
     </w:p>
     <w:p>
       <w:pPr>
         <w:spacing w:before="0" w:after="0" w:line="240" w:lineRule="auto"/>
         <w:jc w:val="center"/>
-        <w:rPr/>
-      </w:pPr>
-      <w:r>
-        <w:rPr>
-          <w:rFonts w:ascii="Georgia" w:cs="Georgia" w:eastAsia="Georgia" w:hAnsi="Georgia"/>
-          <w:b w:val="0"/>
-          <w:bCs w:val="0"/>
-          <w:i w:val="0"/>
-          <w:iCs w:val="0"/>
+      </w:pPr>
+      <w:r>
+        <w:rPr>
+          <w:rFonts w:ascii="Georgia" w:hAnsi="Georgia"/>
           <w:sz w:val="24"/>
           <w:szCs w:val="24"/>
-          <w:rtl w:val="0"/>
         </w:rPr>
         <w:t xml:space="preserve">Department of English</w:t>
-      </w:r>
-      <w:r>
-        <w:rPr>
-          <w:rtl w:val="0"/>
-        </w:rPr>
       </w:r>
     </w:p>
     <w:p>
       <w:pPr>
         <w:spacing w:before="0" w:after="0" w:line="240" w:lineRule="auto"/>
         <w:jc w:val="center"/>
-        <w:rPr/>
-      </w:pPr>
-      <w:r>
-        <w:rPr>
-          <w:rFonts w:ascii="Georgia" w:cs="Georgia" w:eastAsia="Georgia" w:hAnsi="Georgia"/>
-          <w:b w:val="0"/>
-          <w:bCs w:val="0"/>
-          <w:i w:val="0"/>
-          <w:iCs w:val="0"/>
+      </w:pPr>
+      <w:r>
+        <w:rPr>
+          <w:rFonts w:ascii="Georgia" w:hAnsi="Georgia"/>
           <w:sz w:val="24"/>
           <w:szCs w:val="24"/>
-          <w:rtl w:val="0"/>
         </w:rPr>
         <w:t xml:space="preserve">College of Arts and Sciences</w:t>
-      </w:r>
-      <w:r>
-        <w:rPr>
-          <w:rtl w:val="0"/>
-        </w:rPr>
       </w:r>
     </w:p>
     <w:p>
       <w:pPr>
         <w:spacing w:before="0" w:after="0" w:line="240" w:lineRule="auto"/>
         <w:jc w:val="center"/>
-        <w:rPr/>
-      </w:pPr>
-      <w:r>
-        <w:rPr>
-          <w:rFonts w:ascii="Georgia" w:cs="Georgia" w:eastAsia="Georgia" w:hAnsi="Georgia"/>
-          <w:b w:val="0"/>
-          <w:bCs w:val="0"/>
-          <w:i w:val="0"/>
-          <w:iCs w:val="0"/>
+      </w:pPr>
+      <w:r>
+        <w:rPr>
+          <w:rFonts w:ascii="Georgia" w:hAnsi="Georgia"/>
           <w:sz w:val="24"/>
           <w:szCs w:val="24"/>
-          <w:rtl w:val="0"/>
         </w:rPr>
         <w:t xml:space="preserve">Pampanga State Agricultural University</w:t>
-      </w:r>
-      <w:r>
-        <w:rPr>
-          <w:rtl w:val="0"/>
-        </w:rPr>
       </w:r>
     </w:p>
     <w:p>
       <w:pPr>
         <w:spacing w:before="0" w:after="0" w:line="240" w:lineRule="auto"/>
         <w:jc w:val="center"/>
-        <w:rPr/>
-      </w:pPr>
-      <w:r>
-        <w:rPr>
-          <w:rFonts w:ascii="Georgia" w:cs="Georgia" w:eastAsia="Georgia" w:hAnsi="Georgia"/>
-          <w:b w:val="0"/>
-          <w:bCs w:val="0"/>
-          <w:i w:val="0"/>
-          <w:iCs w:val="0"/>
+      </w:pPr>
+      <w:r>
+        <w:rPr>
+          <w:rFonts w:ascii="Georgia" w:hAnsi="Georgia"/>
           <w:sz w:val="24"/>
           <w:szCs w:val="24"/>
-          <w:rtl w:val="0"/>
         </w:rPr>
         <w:t xml:space="preserve">Magalang, Pampanga</w:t>
       </w:r>
-      <w:r>
-        <w:rPr>
-          <w:rtl w:val="0"/>
-        </w:rPr>
-      </w:r>
     </w:p>
     <w:p>
       <w:pPr>
         <w:spacing w:before="0" w:after="0" w:line="240" w:lineRule="auto"/>
-        <w:rPr/>
-      </w:pPr>
-      <w:r>
-        <w:rPr>
-          <w:rtl w:val="0"/>
-        </w:rPr>
-      </w:r>
+      </w:pPr>
     </w:p>
     <w:p>
       <w:pPr>
         <w:spacing w:before="0" w:after="0" w:line="240" w:lineRule="auto"/>
-        <w:rPr/>
-      </w:pPr>
-      <w:r>
-        <w:rPr>
-          <w:rtl w:val="0"/>
-        </w:rPr>
-      </w:r>
-    </w:p>
-    <w:p>
-      <w:pPr>
-        <w:rPr/>
-      </w:pPr>
-      <w:r>
-        <w:rPr>
-          <w:rtl w:val="0"/>
-        </w:rPr>
-      </w:r>
+      </w:pPr>
+    </w:p>
+    <w:p>
+      <w:pPr>
+        <w:spacing w:before="0" w:after="0" w:line="240" w:lineRule="auto"/>
+      </w:pPr>
     </w:p>
     <w:p>
       <w:pPr>
         <w:spacing w:before="0" w:after="0" w:line="240" w:lineRule="auto"/>
         <w:jc w:val="center"/>
-        <w:rPr/>
-      </w:pPr>
-      <w:r>
-        <w:rPr>
-          <w:rFonts w:ascii="Georgia" w:cs="Georgia" w:eastAsia="Georgia" w:hAnsi="Georgia"/>
-          <w:b w:val="0"/>
-          <w:bCs w:val="0"/>
-          <w:i w:val="0"/>
-          <w:iCs w:val="0"/>
+      </w:pPr>
+      <w:r>
+        <w:rPr>
+          <w:rFonts w:ascii="Georgia" w:hAnsi="Georgia"/>
           <w:sz w:val="24"/>
           <w:szCs w:val="24"/>
-          <w:rtl w:val="0"/>
         </w:rPr>
         <w:t xml:space="preserve">In Partial Fulfillment</w:t>
-      </w:r>
-      <w:r>
-        <w:rPr>
-          <w:rtl w:val="0"/>
-        </w:rPr>
       </w:r>
     </w:p>
     <w:p>
       <w:pPr>
         <w:spacing w:before="0" w:after="0" w:line="240" w:lineRule="auto"/>
         <w:jc w:val="center"/>
-        <w:rPr/>
-      </w:pPr>
-      <w:r>
-        <w:rPr>
-          <w:rFonts w:ascii="Georgia" w:cs="Georgia" w:eastAsia="Georgia" w:hAnsi="Georgia"/>
-          <w:b w:val="0"/>
-          <w:bCs w:val="0"/>
-          <w:i w:val="0"/>
-          <w:iCs w:val="0"/>
+      </w:pPr>
+      <w:r>
+        <w:rPr>
+          <w:rFonts w:ascii="Georgia" w:hAnsi="Georgia"/>
           <w:sz w:val="24"/>
           <w:szCs w:val="24"/>
-          <w:rtl w:val="0"/>
         </w:rPr>
         <w:t xml:space="preserve">of the Requirements for the Degree</w:t>
-      </w:r>
-      <w:r>
-        <w:rPr>
-          <w:rtl w:val="0"/>
-        </w:rPr>
       </w:r>
     </w:p>
     <w:p>
       <w:pPr>
         <w:spacing w:before="0" w:after="0" w:line="240" w:lineRule="auto"/>
         <w:jc w:val="center"/>
-        <w:rPr/>
-      </w:pPr>
-      <w:r>
-        <w:rPr>
-          <w:rFonts w:ascii="Georgia" w:cs="Georgia" w:eastAsia="Georgia" w:hAnsi="Georgia"/>
-          <w:b w:val="0"/>
-          <w:bCs w:val="0"/>
-          <w:i w:val="0"/>
-          <w:iCs w:val="0"/>
+      </w:pPr>
+      <w:r>
+        <w:rPr>
+          <w:rFonts w:ascii="Georgia" w:hAnsi="Georgia"/>
           <w:sz w:val="24"/>
           <w:szCs w:val="24"/>
-          <w:rtl w:val="0"/>
         </w:rPr>
         <w:t xml:space="preserve">BACHELOR OF ARTS IN ENGLISH LANGUAGE STUDIES</w:t>
       </w:r>
-      <w:r>
-        <w:rPr>
-          <w:rtl w:val="0"/>
-        </w:rPr>
-      </w:r>
     </w:p>
     <w:p>
       <w:pPr>
         <w:spacing w:before="0" w:after="0" w:line="240" w:lineRule="auto"/>
-        <w:rPr/>
-      </w:pPr>
-      <w:r>
-        <w:rPr>
-          <w:rtl w:val="0"/>
-        </w:rPr>
-      </w:r>
+      </w:pPr>
     </w:p>
     <w:p>
       <w:pPr>
         <w:spacing w:before="0" w:after="0" w:line="240" w:lineRule="auto"/>
-        <w:rPr/>
-      </w:pPr>
-      <w:r>
-        <w:rPr>
-          <w:rtl w:val="0"/>
-        </w:rPr>
-      </w:r>
-    </w:p>
-    <w:p>
-      <w:pPr>
-        <w:rPr/>
-      </w:pPr>
-      <w:r>
-        <w:rPr>
-          <w:rtl w:val="0"/>
-        </w:rPr>
-      </w:r>
+      </w:pPr>
+    </w:p>
+    <w:p>
+      <w:pPr>
+        <w:spacing w:before="0" w:after="0" w:line="240" w:lineRule="auto"/>
+      </w:pPr>
     </w:p>
     <w:p>
       <w:pPr>
         <w:spacing w:before="0" w:after="0" w:line="240" w:lineRule="auto"/>
         <w:jc w:val="center"/>
-        <w:rPr/>
-      </w:pPr>
-      <w:r>
-        <w:rPr>
-          <w:rFonts w:ascii="Georgia" w:cs="Georgia" w:eastAsia="Georgia" w:hAnsi="Georgia"/>
-          <w:b w:val="0"/>
-          <w:bCs w:val="0"/>
-          <w:i w:val="0"/>
-          <w:iCs w:val="0"/>
+      </w:pPr>
+      <w:r>
+        <w:rPr>
+          <w:rFonts w:ascii="Georgia" w:hAnsi="Georgia"/>
           <w:sz w:val="24"/>
           <w:szCs w:val="24"/>
-          <w:rtl w:val="0"/>
         </w:rPr>
         <w:t xml:space="preserve">By</w:t>
       </w:r>
-      <w:r>
-        <w:rPr>
-          <w:rtl w:val="0"/>
-        </w:rPr>
-      </w:r>
     </w:p>
     <w:p>
       <w:pPr>
         <w:spacing w:before="0" w:after="0" w:line="240" w:lineRule="auto"/>
-        <w:rPr/>
-      </w:pPr>
-      <w:r>
-        <w:rPr>
-          <w:rtl w:val="0"/>
-        </w:rPr>
-      </w:r>
+      </w:pPr>
     </w:p>
     <w:p>
       <w:pPr>
         <w:spacing w:before="0" w:after="0" w:line="240" w:lineRule="auto"/>
-        <w:rPr/>
-      </w:pPr>
-      <w:r>
-        <w:rPr>
-          <w:rtl w:val="0"/>
-        </w:rPr>
-      </w:r>
-    </w:p>
-    <w:p>
-      <w:pPr>
-        <w:rPr/>
-      </w:pPr>
-      <w:r>
-        <w:rPr>
-          <w:rtl w:val="0"/>
-        </w:rPr>
-      </w:r>
-    </w:p>
-    <w:p>
-      <w:pPr>
-        <w:rPr/>
-      </w:pPr>
-      <w:r>
-        <w:rPr>
-          <w:rtl w:val="0"/>
-        </w:rPr>
-      </w:r>
-    </w:p>
-    <w:p>
-      <w:pPr>
-        <w:rPr/>
-      </w:pPr>
-      <w:r>
-        <w:rPr>
-          <w:rtl w:val="0"/>
-        </w:rPr>
-      </w:r>
-    </w:p>
-    <w:p>
-      <w:pPr>
-        <w:rPr/>
-      </w:pPr>
-      <w:r>
-        <w:rPr>
-          <w:rtl w:val="0"/>
-        </w:rPr>
-      </w:r>
-    </w:p>
-    <w:p>
-      <w:pPr>
-        <w:rPr/>
-      </w:pPr>
-      <w:r>
-        <w:rPr>
-          <w:rtl w:val="0"/>
-        </w:rPr>
-      </w:r>
-    </w:p>
-    <w:p>
-      <w:pPr>
-        <w:rPr/>
-      </w:pPr>
-      <w:r>
-        <w:rPr>
-          <w:rtl w:val="0"/>
-        </w:rPr>
-      </w:r>
-    </w:p>
-    <w:p>
-      <w:pPr>
-        <w:rPr/>
-      </w:pPr>
-      <w:r>
-        <w:rPr>
-          <w:rtl w:val="0"/>
-        </w:rPr>
-      </w:r>
-    </w:p>
-    <w:p>
-      <w:pPr>
-        <w:rPr/>
-      </w:pPr>
-      <w:r>
-        <w:rPr>
-          <w:rtl w:val="0"/>
-        </w:rPr>
-      </w:r>
+      </w:pPr>
+    </w:p>
+    <w:p>
+      <w:pPr>
+        <w:spacing w:before="0" w:after="0" w:line="240" w:lineRule="auto"/>
+      </w:pPr>
+    </w:p>
+    <w:p>
+      <w:pPr>
+        <w:spacing w:before="0" w:after="0" w:line="240" w:lineRule="auto"/>
+      </w:pPr>
+    </w:p>
+    <w:p>
+      <w:pPr>
+        <w:spacing w:before="0" w:after="0" w:line="240" w:lineRule="auto"/>
+      </w:pPr>
+    </w:p>
+    <w:p>
+      <w:pPr>
+        <w:spacing w:before="0" w:after="0" w:line="240" w:lineRule="auto"/>
+      </w:pPr>
+    </w:p>
+    <w:p>
+      <w:pPr>
+        <w:spacing w:before="0" w:after="0" w:line="240" w:lineRule="auto"/>
+      </w:pPr>
+    </w:p>
+    <w:p>
+      <w:pPr>
+        <w:spacing w:before="0" w:after="0" w:line="240" w:lineRule="auto"/>
+      </w:pPr>
     </w:p>
     <w:p>
       <w:pPr>
         <w:spacing w:before="0" w:after="0" w:line="240" w:lineRule="auto"/>
         <w:jc w:val="center"/>
-        <w:rPr/>
-      </w:pPr>
-      <w:r>
-        <w:rPr>
-          <w:rFonts w:ascii="Georgia" w:cs="Georgia" w:eastAsia="Georgia" w:hAnsi="Georgia"/>
-          <w:b w:val="1"/>
-          <w:bCs w:val="1"/>
-          <w:i w:val="0"/>
-          <w:iCs w:val="0"/>
+      </w:pPr>
+      <w:r>
+        <w:rPr>
+          <w:rFonts w:ascii="Georgia" w:hAnsi="Georgia"/>
           <w:sz w:val="24"/>
           <w:szCs w:val="24"/>
-          <w:rtl w:val="0"/>
+          <w:b/>
+          <w:bCs/>
         </w:rPr>
         <w:t xml:space="preserve">CHRYZ KEAN F. MANUEL</w:t>
       </w:r>
-      <w:r>
-        <w:rPr>
-          <w:rtl w:val="0"/>
-        </w:rPr>
-      </w:r>
     </w:p>
     <w:p>
       <w:pPr>
         <w:spacing w:before="0" w:after="0" w:line="240" w:lineRule="auto"/>
-        <w:rPr/>
-      </w:pPr>
-      <w:r>
-        <w:rPr>
-          <w:rtl w:val="0"/>
-        </w:rPr>
-      </w:r>
+      </w:pPr>
     </w:p>
     <w:p>
       <w:pPr>
         <w:spacing w:before="0" w:after="0" w:line="240" w:lineRule="auto"/>
         <w:jc w:val="center"/>
-        <w:rPr/>
         <w:sectPr>
           <w:headerReference r:id="rId6" w:type="default"/>
           <w:footerReference r:id="rId7" w:type="default"/>
@@ -572,47 +309,17 @@
       </w:pPr>
       <w:r>
         <w:rPr>
-          <w:rFonts w:ascii="Georgia" w:cs="Georgia" w:eastAsia="Georgia" w:hAnsi="Georgia"/>
-          <w:b w:val="0"/>
-          <w:bCs w:val="0"/>
-          <w:i w:val="0"/>
-          <w:iCs w:val="0"/>
+          <w:rFonts w:ascii="Georgia" w:hAnsi="Georgia"/>
           <w:sz w:val="24"/>
           <w:szCs w:val="24"/>
-          <w:rtl w:val="0"/>
         </w:rPr>
         <w:t xml:space="preserve">October 2026</w:t>
       </w:r>
-      <w:r>
-        <w:rPr>
-          <w:rtl w:val="0"/>
-        </w:rPr>
-      </w:r>
-    </w:p>
-    <w:p>
-      <w:pPr>
-        <w:rPr/>
-      </w:pPr>
-      <w:r>
-        <w:rPr>
-          <w:rtl w:val="0"/>
-        </w:rPr>
-      </w:r>
-    </w:p>
-    <w:p>
-      <w:pPr>
-        <w:rPr/>
-      </w:pPr>
-      <w:r>
-        <w:rPr>
-          <w:rtl w:val="0"/>
-        </w:rPr>
-      </w:r>
     </w:p>
     <w:p>
       <w:pPr>
         <w:keepLines w:val="1"/>
-        <w:spacing w:before="720" w:after="720" w:line="480" w:lineRule="auto"/>
+        <w:spacing w:before="0" w:after="720" w:line="480" w:lineRule="auto"/>
         <w:jc w:val="center"/>
         <w:rPr/>
       </w:pPr>
@@ -659,6 +366,11 @@
       <w:r>
         <w:rPr>
           <w:rtl w:val="0"/>
+          <w:rFonts w:ascii="Georgia" w:hAnsi="Georgia"/>
+          <w:sz w:val="24"/>
+          <w:szCs w:val="24"/>
+          <w:b/>
+          <w:bCs/>
         </w:rPr>
       </w:r>
     </w:p>

</xml_diff>

<commit_message>
Draft_013: title page 1.5 line spacing; name lower on page 1
</commit_message>
<xml_diff>
--- a/thesis/003_ThesisProposal_Draft_013.docx
+++ b/thesis/003_ThesisProposal_Draft_013.docx
@@ -4,22 +4,22 @@
   <w:body>
     <w:p>
       <w:pPr>
-        <w:spacing w:before="0" w:after="0" w:line="240" w:lineRule="auto"/>
-      </w:pPr>
-    </w:p>
-    <w:p>
-      <w:pPr>
-        <w:spacing w:before="0" w:after="0" w:line="240" w:lineRule="auto"/>
-      </w:pPr>
-    </w:p>
-    <w:p>
-      <w:pPr>
-        <w:spacing w:before="0" w:after="0" w:line="240" w:lineRule="auto"/>
-      </w:pPr>
-    </w:p>
-    <w:p>
-      <w:pPr>
-        <w:spacing w:before="0" w:after="0" w:line="240" w:lineRule="auto"/>
+        <w:spacing w:before="0" w:after="0" w:line="360" w:lineRule="auto"/>
+      </w:pPr>
+    </w:p>
+    <w:p>
+      <w:pPr>
+        <w:spacing w:before="0" w:after="0" w:line="360" w:lineRule="auto"/>
+      </w:pPr>
+    </w:p>
+    <w:p>
+      <w:pPr>
+        <w:spacing w:before="0" w:after="0" w:line="360" w:lineRule="auto"/>
+      </w:pPr>
+    </w:p>
+    <w:p>
+      <w:pPr>
+        <w:spacing w:before="0" w:after="0" w:line="360" w:lineRule="auto"/>
         <w:jc w:val="center"/>
       </w:pPr>
       <w:r>
@@ -35,7 +35,7 @@
     </w:p>
     <w:p>
       <w:pPr>
-        <w:spacing w:before="0" w:after="0" w:line="240" w:lineRule="auto"/>
+        <w:spacing w:before="0" w:after="0" w:line="360" w:lineRule="auto"/>
         <w:jc w:val="center"/>
       </w:pPr>
       <w:r>
@@ -51,22 +51,22 @@
     </w:p>
     <w:p>
       <w:pPr>
-        <w:spacing w:before="0" w:after="0" w:line="240" w:lineRule="auto"/>
-      </w:pPr>
-    </w:p>
-    <w:p>
-      <w:pPr>
-        <w:spacing w:before="0" w:after="0" w:line="240" w:lineRule="auto"/>
-      </w:pPr>
-    </w:p>
-    <w:p>
-      <w:pPr>
-        <w:spacing w:before="0" w:after="0" w:line="240" w:lineRule="auto"/>
-      </w:pPr>
-    </w:p>
-    <w:p>
-      <w:pPr>
-        <w:spacing w:before="0" w:after="0" w:line="240" w:lineRule="auto"/>
+        <w:spacing w:before="0" w:after="0" w:line="360" w:lineRule="auto"/>
+      </w:pPr>
+    </w:p>
+    <w:p>
+      <w:pPr>
+        <w:spacing w:before="0" w:after="0" w:line="360" w:lineRule="auto"/>
+      </w:pPr>
+    </w:p>
+    <w:p>
+      <w:pPr>
+        <w:spacing w:before="0" w:after="0" w:line="360" w:lineRule="auto"/>
+      </w:pPr>
+    </w:p>
+    <w:p>
+      <w:pPr>
+        <w:spacing w:before="0" w:after="0" w:line="360" w:lineRule="auto"/>
         <w:jc w:val="center"/>
       </w:pPr>
       <w:r>
@@ -80,7 +80,7 @@
     </w:p>
     <w:p>
       <w:pPr>
-        <w:spacing w:before="0" w:after="0" w:line="240" w:lineRule="auto"/>
+        <w:spacing w:before="0" w:after="0" w:line="360" w:lineRule="auto"/>
         <w:jc w:val="center"/>
       </w:pPr>
       <w:r>
@@ -94,7 +94,7 @@
     </w:p>
     <w:p>
       <w:pPr>
-        <w:spacing w:before="0" w:after="0" w:line="240" w:lineRule="auto"/>
+        <w:spacing w:before="0" w:after="0" w:line="360" w:lineRule="auto"/>
         <w:jc w:val="center"/>
       </w:pPr>
       <w:r>
@@ -108,7 +108,7 @@
     </w:p>
     <w:p>
       <w:pPr>
-        <w:spacing w:before="0" w:after="0" w:line="240" w:lineRule="auto"/>
+        <w:spacing w:before="0" w:after="0" w:line="360" w:lineRule="auto"/>
         <w:jc w:val="center"/>
       </w:pPr>
       <w:r>
@@ -122,7 +122,7 @@
     </w:p>
     <w:p>
       <w:pPr>
-        <w:spacing w:before="0" w:after="0" w:line="240" w:lineRule="auto"/>
+        <w:spacing w:before="0" w:after="0" w:line="360" w:lineRule="auto"/>
         <w:jc w:val="center"/>
       </w:pPr>
       <w:r>
@@ -136,7 +136,7 @@
     </w:p>
     <w:p>
       <w:pPr>
-        <w:spacing w:before="0" w:after="0" w:line="240" w:lineRule="auto"/>
+        <w:spacing w:before="0" w:after="0" w:line="360" w:lineRule="auto"/>
         <w:jc w:val="center"/>
       </w:pPr>
       <w:r>
@@ -150,22 +150,22 @@
     </w:p>
     <w:p>
       <w:pPr>
-        <w:spacing w:before="0" w:after="0" w:line="240" w:lineRule="auto"/>
-      </w:pPr>
-    </w:p>
-    <w:p>
-      <w:pPr>
-        <w:spacing w:before="0" w:after="0" w:line="240" w:lineRule="auto"/>
-      </w:pPr>
-    </w:p>
-    <w:p>
-      <w:pPr>
-        <w:spacing w:before="0" w:after="0" w:line="240" w:lineRule="auto"/>
-      </w:pPr>
-    </w:p>
-    <w:p>
-      <w:pPr>
-        <w:spacing w:before="0" w:after="0" w:line="240" w:lineRule="auto"/>
+        <w:spacing w:before="0" w:after="0" w:line="360" w:lineRule="auto"/>
+      </w:pPr>
+    </w:p>
+    <w:p>
+      <w:pPr>
+        <w:spacing w:before="0" w:after="0" w:line="360" w:lineRule="auto"/>
+      </w:pPr>
+    </w:p>
+    <w:p>
+      <w:pPr>
+        <w:spacing w:before="0" w:after="0" w:line="360" w:lineRule="auto"/>
+      </w:pPr>
+    </w:p>
+    <w:p>
+      <w:pPr>
+        <w:spacing w:before="0" w:after="0" w:line="360" w:lineRule="auto"/>
         <w:jc w:val="center"/>
       </w:pPr>
       <w:r>
@@ -179,7 +179,7 @@
     </w:p>
     <w:p>
       <w:pPr>
-        <w:spacing w:before="0" w:after="0" w:line="240" w:lineRule="auto"/>
+        <w:spacing w:before="0" w:after="0" w:line="360" w:lineRule="auto"/>
         <w:jc w:val="center"/>
       </w:pPr>
       <w:r>
@@ -193,7 +193,7 @@
     </w:p>
     <w:p>
       <w:pPr>
-        <w:spacing w:before="0" w:after="0" w:line="240" w:lineRule="auto"/>
+        <w:spacing w:before="0" w:after="0" w:line="360" w:lineRule="auto"/>
         <w:jc w:val="center"/>
       </w:pPr>
       <w:r>
@@ -207,22 +207,22 @@
     </w:p>
     <w:p>
       <w:pPr>
-        <w:spacing w:before="0" w:after="0" w:line="240" w:lineRule="auto"/>
-      </w:pPr>
-    </w:p>
-    <w:p>
-      <w:pPr>
-        <w:spacing w:before="0" w:after="0" w:line="240" w:lineRule="auto"/>
-      </w:pPr>
-    </w:p>
-    <w:p>
-      <w:pPr>
-        <w:spacing w:before="0" w:after="0" w:line="240" w:lineRule="auto"/>
-      </w:pPr>
-    </w:p>
-    <w:p>
-      <w:pPr>
-        <w:spacing w:before="0" w:after="0" w:line="240" w:lineRule="auto"/>
+        <w:spacing w:before="0" w:after="0" w:line="360" w:lineRule="auto"/>
+      </w:pPr>
+    </w:p>
+    <w:p>
+      <w:pPr>
+        <w:spacing w:before="0" w:after="0" w:line="360" w:lineRule="auto"/>
+      </w:pPr>
+    </w:p>
+    <w:p>
+      <w:pPr>
+        <w:spacing w:before="0" w:after="0" w:line="360" w:lineRule="auto"/>
+      </w:pPr>
+    </w:p>
+    <w:p>
+      <w:pPr>
+        <w:spacing w:before="0" w:after="0" w:line="360" w:lineRule="auto"/>
         <w:jc w:val="center"/>
       </w:pPr>
       <w:r>
@@ -236,47 +236,32 @@
     </w:p>
     <w:p>
       <w:pPr>
-        <w:spacing w:before="0" w:after="0" w:line="240" w:lineRule="auto"/>
-      </w:pPr>
-    </w:p>
-    <w:p>
-      <w:pPr>
-        <w:spacing w:before="0" w:after="0" w:line="240" w:lineRule="auto"/>
-      </w:pPr>
-    </w:p>
-    <w:p>
-      <w:pPr>
-        <w:spacing w:before="0" w:after="0" w:line="240" w:lineRule="auto"/>
-      </w:pPr>
-    </w:p>
-    <w:p>
-      <w:pPr>
-        <w:spacing w:before="0" w:after="0" w:line="240" w:lineRule="auto"/>
-      </w:pPr>
-    </w:p>
-    <w:p>
-      <w:pPr>
-        <w:spacing w:before="0" w:after="0" w:line="240" w:lineRule="auto"/>
-      </w:pPr>
-    </w:p>
-    <w:p>
-      <w:pPr>
-        <w:spacing w:before="0" w:after="0" w:line="240" w:lineRule="auto"/>
-      </w:pPr>
-    </w:p>
-    <w:p>
-      <w:pPr>
-        <w:spacing w:before="0" w:after="0" w:line="240" w:lineRule="auto"/>
-      </w:pPr>
-    </w:p>
-    <w:p>
-      <w:pPr>
-        <w:spacing w:before="0" w:after="0" w:line="240" w:lineRule="auto"/>
-      </w:pPr>
-    </w:p>
-    <w:p>
-      <w:pPr>
-        <w:spacing w:before="0" w:after="0" w:line="240" w:lineRule="auto"/>
+        <w:spacing w:before="0" w:after="0" w:line="360" w:lineRule="auto"/>
+      </w:pPr>
+    </w:p>
+    <w:p>
+      <w:pPr>
+        <w:spacing w:before="0" w:after="0" w:line="360" w:lineRule="auto"/>
+      </w:pPr>
+    </w:p>
+    <w:p>
+      <w:pPr>
+        <w:spacing w:before="0" w:after="0" w:line="360" w:lineRule="auto"/>
+      </w:pPr>
+    </w:p>
+    <w:p>
+      <w:pPr>
+        <w:spacing w:before="0" w:after="0" w:line="360" w:lineRule="auto"/>
+      </w:pPr>
+    </w:p>
+    <w:p>
+      <w:pPr>
+        <w:spacing w:before="0" w:after="0" w:line="360" w:lineRule="auto"/>
+      </w:pPr>
+    </w:p>
+    <w:p>
+      <w:pPr>
+        <w:spacing w:before="0" w:after="0" w:line="360" w:lineRule="auto"/>
         <w:jc w:val="center"/>
       </w:pPr>
       <w:r>
@@ -292,12 +277,12 @@
     </w:p>
     <w:p>
       <w:pPr>
-        <w:spacing w:before="0" w:after="0" w:line="240" w:lineRule="auto"/>
-      </w:pPr>
-    </w:p>
-    <w:p>
-      <w:pPr>
-        <w:spacing w:before="0" w:after="0" w:line="240" w:lineRule="auto"/>
+        <w:spacing w:before="0" w:after="0" w:line="360" w:lineRule="auto"/>
+      </w:pPr>
+    </w:p>
+    <w:p>
+      <w:pPr>
+        <w:spacing w:before="0" w:after="0" w:line="360" w:lineRule="auto"/>
         <w:jc w:val="center"/>
         <w:sectPr>
           <w:headerReference r:id="rId6" w:type="default"/>

</xml_diff>

<commit_message>
Draft_013: minor heads 1/0; table labels outside tables
- Minors (Background, Part I–IV, Research Context, etc.): before=120 after=0
- Majors: before/after=720 (distinct from minors)
- Remove Table 1–5 labels from first header cells; restore as
  external caption paragraphs above each table
</commit_message>
<xml_diff>
--- a/thesis/003_ThesisProposal_Draft_013.docx
+++ b/thesis/003_ThesisProposal_Draft_013.docx
@@ -331,7 +331,7 @@
       <w:pPr>
         <w:keepNext w:val="1"/>
         <w:keepLines w:val="1"/>
-        <w:spacing w:before="0" w:after="720" w:line="480" w:lineRule="auto"/>
+        <w:spacing w:before="120" w:after="0" w:line="480" w:lineRule="auto"/>
         <w:jc w:val="left"/>
         <w:rPr/>
       </w:pPr>
@@ -467,7 +467,7 @@
       <w:pPr>
         <w:keepNext w:val="1"/>
         <w:keepLines w:val="1"/>
-        <w:spacing w:before="720" w:after="720" w:line="480" w:lineRule="auto"/>
+        <w:spacing w:before="120" w:after="0" w:line="480" w:lineRule="auto"/>
         <w:jc w:val="left"/>
         <w:rPr/>
       </w:pPr>
@@ -546,7 +546,7 @@
       <w:pPr>
         <w:keepNext w:val="1"/>
         <w:keepLines w:val="1"/>
-        <w:spacing w:before="720" w:after="720" w:line="480" w:lineRule="auto"/>
+        <w:spacing w:before="120" w:after="0" w:line="480" w:lineRule="auto"/>
         <w:jc w:val="left"/>
         <w:rPr/>
       </w:pPr>
@@ -625,7 +625,7 @@
       <w:pPr>
         <w:keepNext w:val="1"/>
         <w:keepLines w:val="1"/>
-        <w:spacing w:before="720" w:after="720" w:line="480" w:lineRule="auto"/>
+        <w:spacing w:before="120" w:after="0" w:line="480" w:lineRule="auto"/>
         <w:jc w:val="left"/>
         <w:rPr/>
       </w:pPr>
@@ -704,7 +704,7 @@
       <w:pPr>
         <w:keepNext w:val="1"/>
         <w:keepLines w:val="1"/>
-        <w:spacing w:before="720" w:after="720" w:line="480" w:lineRule="auto"/>
+        <w:spacing w:before="120" w:after="0" w:line="480" w:lineRule="auto"/>
         <w:jc w:val="left"/>
         <w:rPr/>
       </w:pPr>
@@ -757,7 +757,7 @@
       <w:pPr>
         <w:keepNext w:val="1"/>
         <w:keepLines w:val="1"/>
-        <w:spacing w:before="720" w:after="720" w:line="480" w:lineRule="auto"/>
+        <w:spacing w:before="120" w:after="0" w:line="480" w:lineRule="auto"/>
         <w:jc w:val="left"/>
         <w:rPr/>
       </w:pPr>
@@ -862,7 +862,7 @@
       <w:pPr>
         <w:keepNext w:val="1"/>
         <w:keepLines w:val="1"/>
-        <w:spacing w:before="720" w:after="720" w:line="480" w:lineRule="auto"/>
+        <w:spacing w:before="120" w:after="0" w:line="480" w:lineRule="auto"/>
         <w:jc w:val="left"/>
         <w:rPr/>
       </w:pPr>
@@ -1041,7 +1041,7 @@
       <w:pPr>
         <w:keepNext w:val="1"/>
         <w:keepLines w:val="1"/>
-        <w:spacing w:before="720" w:after="720" w:line="480" w:lineRule="auto"/>
+        <w:spacing w:before="120" w:after="0" w:line="480" w:lineRule="auto"/>
         <w:jc w:val="left"/>
         <w:rPr/>
       </w:pPr>
@@ -1264,7 +1264,7 @@
       <w:pPr>
         <w:keepNext w:val="1"/>
         <w:keepLines w:val="1"/>
-        <w:spacing w:before="720" w:after="720" w:line="480" w:lineRule="auto"/>
+        <w:spacing w:before="120" w:after="0" w:line="480" w:lineRule="auto"/>
         <w:jc w:val="left"/>
         <w:rPr/>
       </w:pPr>
@@ -1407,7 +1407,7 @@
       <w:pPr>
         <w:keepNext w:val="1"/>
         <w:keepLines w:val="1"/>
-        <w:spacing w:before="720" w:after="720" w:line="480" w:lineRule="auto"/>
+        <w:spacing w:before="120" w:after="0" w:line="480" w:lineRule="auto"/>
         <w:jc w:val="left"/>
         <w:rPr/>
       </w:pPr>
@@ -1592,7 +1592,7 @@
       <w:pPr>
         <w:keepNext w:val="1"/>
         <w:keepLines w:val="1"/>
-        <w:spacing w:before="720" w:after="720" w:line="480" w:lineRule="auto"/>
+        <w:spacing w:before="120" w:after="0" w:line="480" w:lineRule="auto"/>
         <w:jc w:val="left"/>
         <w:rPr/>
       </w:pPr>
@@ -2251,7 +2251,7 @@
       <w:pPr>
         <w:keepNext w:val="1"/>
         <w:keepLines w:val="1"/>
-        <w:spacing w:before="720" w:after="720" w:line="480" w:lineRule="auto"/>
+        <w:spacing w:before="120" w:after="0" w:line="480" w:lineRule="auto"/>
         <w:jc w:val="left"/>
         <w:rPr/>
       </w:pPr>
@@ -2356,7 +2356,7 @@
       <w:pPr>
         <w:keepNext w:val="1"/>
         <w:keepLines w:val="1"/>
-        <w:spacing w:before="720" w:after="720" w:line="480" w:lineRule="auto"/>
+        <w:spacing w:before="120" w:after="0" w:line="480" w:lineRule="auto"/>
         <w:jc w:val="left"/>
         <w:rPr/>
       </w:pPr>
@@ -2409,7 +2409,7 @@
       <w:pPr>
         <w:keepNext w:val="1"/>
         <w:keepLines w:val="1"/>
-        <w:spacing w:before="720" w:after="720" w:line="480" w:lineRule="auto"/>
+        <w:spacing w:before="120" w:after="0" w:line="480" w:lineRule="auto"/>
         <w:jc w:val="left"/>
         <w:rPr/>
       </w:pPr>
@@ -2696,7 +2696,7 @@
       <w:pPr>
         <w:keepNext w:val="1"/>
         <w:keepLines w:val="1"/>
-        <w:spacing w:before="720" w:after="720" w:line="480" w:lineRule="auto"/>
+        <w:spacing w:before="120" w:after="0" w:line="480" w:lineRule="auto"/>
         <w:jc w:val="left"/>
         <w:rPr/>
       </w:pPr>
@@ -2749,7 +2749,7 @@
       <w:pPr>
         <w:keepNext w:val="1"/>
         <w:keepLines w:val="1"/>
-        <w:spacing w:before="720" w:after="720" w:line="480" w:lineRule="auto"/>
+        <w:spacing w:before="120" w:after="0" w:line="480" w:lineRule="auto"/>
         <w:jc w:val="left"/>
         <w:rPr/>
       </w:pPr>
@@ -2796,6 +2796,37 @@
         <w:rPr>
           <w:rtl w:val="0"/>
         </w:rPr>
+      </w:r>
+    </w:p>
+    <w:p>
+      <w:pPr>
+        <w:keepNext w:val="1"/>
+        <w:keepLines w:val="1"/>
+        <w:spacing w:before="720" w:after="0" w:line="480" w:lineRule="auto"/>
+        <w:jc w:val="center"/>
+      </w:pPr>
+      <w:r>
+        <w:rPr>
+          <w:rFonts w:ascii="Georgia" w:hAnsi="Georgia"/>
+          <w:b/>
+          <w:sz w:val="24"/>
+        </w:rPr>
+        <w:t>Table 1</w:t>
+      </w:r>
+    </w:p>
+    <w:p>
+      <w:pPr>
+        <w:keepNext w:val="1"/>
+        <w:keepLines w:val="1"/>
+        <w:spacing w:before="0" w:after="60" w:line="480" w:lineRule="auto"/>
+        <w:jc w:val="center"/>
+      </w:pPr>
+      <w:r>
+        <w:rPr>
+          <w:rFonts w:ascii="Georgia" w:hAnsi="Georgia"/>
+          <w:sz w:val="24"/>
+        </w:rPr>
+        <w:t>PSAU Thesis Repository: Population and Sampling Summary</w:t>
       </w:r>
     </w:p>
     <w:tbl>
@@ -2860,7 +2891,7 @@
                 <w:szCs w:val="20"/>
                 <w:rtl w:val="0"/>
               </w:rPr>
-              <w:t xml:space="preserve">Table 1: PSAU Thesis Repository: Population and Sampling Summary | Category</w:t>
+              <w:t xml:space="preserve">Category</w:t>
             </w:r>
             <w:r>
               <w:rPr>
@@ -4073,7 +4104,7 @@
       <w:pPr>
         <w:keepNext w:val="1"/>
         <w:keepLines w:val="1"/>
-        <w:spacing w:before="720" w:after="720" w:line="480" w:lineRule="auto"/>
+        <w:spacing w:before="120" w:after="0" w:line="480" w:lineRule="auto"/>
         <w:jc w:val="left"/>
         <w:rPr/>
       </w:pPr>
@@ -4120,6 +4151,37 @@
         <w:rPr>
           <w:rtl w:val="0"/>
         </w:rPr>
+      </w:r>
+    </w:p>
+    <w:p>
+      <w:pPr>
+        <w:keepNext w:val="1"/>
+        <w:keepLines w:val="1"/>
+        <w:spacing w:before="720" w:after="0" w:line="480" w:lineRule="auto"/>
+        <w:jc w:val="center"/>
+      </w:pPr>
+      <w:r>
+        <w:rPr>
+          <w:rFonts w:ascii="Georgia" w:hAnsi="Georgia"/>
+          <w:b/>
+          <w:sz w:val="24"/>
+        </w:rPr>
+        <w:t>Table 2</w:t>
+      </w:r>
+    </w:p>
+    <w:p>
+      <w:pPr>
+        <w:keepNext w:val="1"/>
+        <w:keepLines w:val="1"/>
+        <w:spacing w:before="0" w:after="60" w:line="480" w:lineRule="auto"/>
+        <w:jc w:val="center"/>
+      </w:pPr>
+      <w:r>
+        <w:rPr>
+          <w:rFonts w:ascii="Georgia" w:hAnsi="Georgia"/>
+          <w:sz w:val="24"/>
+        </w:rPr>
+        <w:t>Hedge Type Distribution Across the Corpus</w:t>
       </w:r>
     </w:p>
     <w:tbl>
@@ -4178,7 +4240,7 @@
                 <w:szCs w:val="20"/>
                 <w:rtl w:val="0"/>
               </w:rPr>
-              <w:t xml:space="preserve">Table 2: Hedge Type Distribution Across the Corpus | Hedge Type</w:t>
+              <w:t xml:space="preserve">Hedge Type</w:t>
             </w:r>
             <w:r>
               <w:rPr>
@@ -4762,6 +4824,37 @@
         <w:rPr>
           <w:rtl w:val="0"/>
         </w:rPr>
+      </w:r>
+    </w:p>
+    <w:p>
+      <w:pPr>
+        <w:keepNext w:val="1"/>
+        <w:keepLines w:val="1"/>
+        <w:spacing w:before="720" w:after="0" w:line="480" w:lineRule="auto"/>
+        <w:jc w:val="center"/>
+      </w:pPr>
+      <w:r>
+        <w:rPr>
+          <w:rFonts w:ascii="Georgia" w:hAnsi="Georgia"/>
+          <w:b/>
+          <w:sz w:val="24"/>
+        </w:rPr>
+        <w:t>Table 3</w:t>
+      </w:r>
+    </w:p>
+    <w:p>
+      <w:pPr>
+        <w:keepNext w:val="1"/>
+        <w:keepLines w:val="1"/>
+        <w:spacing w:before="0" w:after="60" w:line="480" w:lineRule="auto"/>
+        <w:jc w:val="center"/>
+      </w:pPr>
+      <w:r>
+        <w:rPr>
+          <w:rFonts w:ascii="Georgia" w:hAnsi="Georgia"/>
+          <w:sz w:val="24"/>
+        </w:rPr>
+        <w:t>Hedge Type Distribution by Discipline</w:t>
       </w:r>
     </w:p>
     <w:tbl>
@@ -4826,7 +4919,7 @@
                 <w:szCs w:val="20"/>
                 <w:rtl w:val="0"/>
               </w:rPr>
-              <w:t xml:space="preserve">Table 3: Hedge Type Distribution by Discipline | Discipline</w:t>
+              <w:t xml:space="preserve">Discipline</w:t>
             </w:r>
             <w:r>
               <w:rPr>
@@ -5825,7 +5918,7 @@
       <w:pPr>
         <w:keepNext w:val="1"/>
         <w:keepLines w:val="1"/>
-        <w:spacing w:before="720" w:after="720" w:line="480" w:lineRule="auto"/>
+        <w:spacing w:before="120" w:after="0" w:line="480" w:lineRule="auto"/>
         <w:jc w:val="left"/>
         <w:rPr/>
       </w:pPr>
@@ -5872,6 +5965,37 @@
         <w:rPr>
           <w:rtl w:val="0"/>
         </w:rPr>
+      </w:r>
+    </w:p>
+    <w:p>
+      <w:pPr>
+        <w:keepNext w:val="1"/>
+        <w:keepLines w:val="1"/>
+        <w:spacing w:before="720" w:after="0" w:line="480" w:lineRule="auto"/>
+        <w:jc w:val="center"/>
+      </w:pPr>
+      <w:r>
+        <w:rPr>
+          <w:rFonts w:ascii="Georgia" w:hAnsi="Georgia"/>
+          <w:b/>
+          <w:sz w:val="24"/>
+        </w:rPr>
+        <w:t>Table 4</w:t>
+      </w:r>
+    </w:p>
+    <w:p>
+      <w:pPr>
+        <w:keepNext w:val="1"/>
+        <w:keepLines w:val="1"/>
+        <w:spacing w:before="0" w:after="60" w:line="480" w:lineRule="auto"/>
+        <w:jc w:val="center"/>
+      </w:pPr>
+      <w:r>
+        <w:rPr>
+          <w:rFonts w:ascii="Georgia" w:hAnsi="Georgia"/>
+          <w:sz w:val="24"/>
+        </w:rPr>
+        <w:t>Hedge Frequency by Discipline</w:t>
       </w:r>
     </w:p>
     <w:tbl>
@@ -5940,7 +6064,7 @@
                 <w:szCs w:val="18"/>
                 <w:rtl w:val="0"/>
               </w:rPr>
-              <w:t xml:space="preserve">Table 4: Hedge Frequency by Discipline | Discipline</w:t>
+              <w:t xml:space="preserve">Discipline</w:t>
             </w:r>
             <w:r>
               <w:rPr>
@@ -7272,7 +7396,7 @@
       <w:pPr>
         <w:keepNext w:val="1"/>
         <w:keepLines w:val="1"/>
-        <w:spacing w:before="720" w:after="720" w:line="480" w:lineRule="auto"/>
+        <w:spacing w:before="120" w:after="0" w:line="480" w:lineRule="auto"/>
         <w:jc w:val="left"/>
         <w:rPr/>
       </w:pPr>
@@ -7319,6 +7443,37 @@
         <w:rPr>
           <w:rtl w:val="0"/>
         </w:rPr>
+      </w:r>
+    </w:p>
+    <w:p>
+      <w:pPr>
+        <w:keepNext w:val="1"/>
+        <w:keepLines w:val="1"/>
+        <w:spacing w:before="720" w:after="0" w:line="480" w:lineRule="auto"/>
+        <w:jc w:val="center"/>
+      </w:pPr>
+      <w:r>
+        <w:rPr>
+          <w:rFonts w:ascii="Georgia" w:hAnsi="Georgia"/>
+          <w:b/>
+          <w:sz w:val="24"/>
+        </w:rPr>
+        <w:t>Table 5</w:t>
+      </w:r>
+    </w:p>
+    <w:p>
+      <w:pPr>
+        <w:keepNext w:val="1"/>
+        <w:keepLines w:val="1"/>
+        <w:spacing w:before="0" w:after="60" w:line="480" w:lineRule="auto"/>
+        <w:jc w:val="center"/>
+      </w:pPr>
+      <w:r>
+        <w:rPr>
+          <w:rFonts w:ascii="Georgia" w:hAnsi="Georgia"/>
+          <w:sz w:val="24"/>
+        </w:rPr>
+        <w:t>Hedge Function Distribution</w:t>
       </w:r>
     </w:p>
     <w:tbl>
@@ -7377,7 +7532,7 @@
                 <w:szCs w:val="20"/>
                 <w:rtl w:val="0"/>
               </w:rPr>
-              <w:t xml:space="preserve">Table 5: Hedge Function Distribution | Function</w:t>
+              <w:t xml:space="preserve">Function</w:t>
             </w:r>
             <w:r>
               <w:rPr>
@@ -7868,7 +8023,7 @@
       <w:pPr>
         <w:keepNext w:val="1"/>
         <w:keepLines w:val="1"/>
-        <w:spacing w:before="720" w:after="720" w:line="480" w:lineRule="auto"/>
+        <w:spacing w:before="120" w:after="0" w:line="480" w:lineRule="auto"/>
         <w:jc w:val="left"/>
         <w:rPr/>
       </w:pPr>
@@ -8121,7 +8276,7 @@
       <w:pPr>
         <w:keepNext w:val="1"/>
         <w:keepLines w:val="1"/>
-        <w:spacing w:before="720" w:after="720" w:line="480" w:lineRule="auto"/>
+        <w:spacing w:before="120" w:after="0" w:line="480" w:lineRule="auto"/>
         <w:jc w:val="left"/>
         <w:rPr/>
       </w:pPr>
@@ -8200,7 +8355,7 @@
       <w:pPr>
         <w:keepNext w:val="1"/>
         <w:keepLines w:val="1"/>
-        <w:spacing w:before="720" w:after="720" w:line="480" w:lineRule="auto"/>
+        <w:spacing w:before="120" w:after="0" w:line="480" w:lineRule="auto"/>
         <w:jc w:val="left"/>
         <w:rPr/>
       </w:pPr>
@@ -9365,37 +9520,36 @@
     </w:p>
     <w:p>
       <w:pPr>
+        <w:keepLines w:val="1"/>
+        <w:pageBreakBefore w:val="1"/>
+        <w:spacing w:before="720" w:after="720" w:line="480" w:lineRule="auto"/>
+        <w:jc w:val="center"/>
+        <w:rPr/>
+      </w:pPr>
+      <w:r>
+        <w:rPr>
+          <w:rFonts w:ascii="Georgia" w:cs="Georgia" w:eastAsia="Georgia" w:hAnsi="Georgia"/>
+          <w:b w:val="1"/>
+          <w:bCs w:val="1"/>
+          <w:i w:val="0"/>
+          <w:iCs w:val="0"/>
+          <w:sz w:val="28"/>
+          <w:szCs w:val="28"/>
+          <w:rtl w:val="0"/>
+        </w:rPr>
+        <w:t xml:space="preserve">APPENDICES</w:t>
+      </w:r>
+      <w:r>
+        <w:rPr>
+          <w:rtl w:val="0"/>
+        </w:rPr>
+      </w:r>
+    </w:p>
+    <w:p>
+      <w:pPr>
         <w:keepNext w:val="1"/>
         <w:keepLines w:val="1"/>
-        <w:pageBreakBefore w:val="1"/>
-        <w:spacing w:before="120" w:after="120" w:line="240" w:lineRule="auto"/>
-        <w:jc w:val="center"/>
-        <w:rPr/>
-      </w:pPr>
-      <w:r>
-        <w:rPr>
-          <w:rFonts w:ascii="Georgia" w:cs="Georgia" w:eastAsia="Georgia" w:hAnsi="Georgia"/>
-          <w:b w:val="1"/>
-          <w:bCs w:val="1"/>
-          <w:i w:val="0"/>
-          <w:iCs w:val="0"/>
-          <w:sz w:val="28"/>
-          <w:szCs w:val="28"/>
-          <w:rtl w:val="0"/>
-        </w:rPr>
-        <w:t xml:space="preserve">APPENDICES</w:t>
-      </w:r>
-      <w:r>
-        <w:rPr>
-          <w:rtl w:val="0"/>
-        </w:rPr>
-      </w:r>
-    </w:p>
-    <w:p>
-      <w:pPr>
-        <w:keepNext w:val="1"/>
-        <w:keepLines w:val="1"/>
-        <w:spacing w:before="120" w:after="0" w:line="240" w:lineRule="auto"/>
+        <w:spacing w:before="120" w:after="0" w:line="480" w:lineRule="auto"/>
         <w:jc w:val="left"/>
         <w:rPr/>
       </w:pPr>
@@ -10935,7 +11089,7 @@
     <w:p>
       <w:pPr>
         <w:keepNext w:val="1"/>
-        <w:spacing w:before="120" w:after="0" w:line="360" w:lineRule="auto"/>
+        <w:spacing w:before="120" w:after="0" w:line="480" w:lineRule="auto"/>
         <w:ind w:firstLine="720"/>
         <w:jc w:val="both"/>
         <w:rPr/>
@@ -11890,7 +12044,7 @@
     <w:p>
       <w:pPr>
         <w:keepNext w:val="1"/>
-        <w:spacing w:before="120" w:after="0" w:line="360" w:lineRule="auto"/>
+        <w:spacing w:before="120" w:after="0" w:line="480" w:lineRule="auto"/>
         <w:jc w:val="left"/>
         <w:rPr/>
       </w:pPr>
@@ -12736,7 +12890,7 @@
     </w:tbl>
     <w:p>
       <w:pPr>
-        <w:spacing w:before="120" w:after="0" w:line="360" w:lineRule="auto"/>
+        <w:spacing w:before="120" w:after="0" w:line="480" w:lineRule="auto"/>
         <w:ind w:firstLine="720"/>
         <w:jc w:val="both"/>
         <w:rPr/>
@@ -13591,7 +13745,7 @@
     <w:p>
       <w:pPr>
         <w:keepNext w:val="1"/>
-        <w:spacing w:before="120" w:after="0" w:line="360" w:lineRule="auto"/>
+        <w:spacing w:before="120" w:after="0" w:line="480" w:lineRule="auto"/>
         <w:jc w:val="left"/>
         <w:rPr/>
       </w:pPr>
@@ -14278,7 +14432,7 @@
     <w:p>
       <w:pPr>
         <w:keepNext w:val="1"/>
-        <w:spacing w:before="120" w:after="0" w:line="360" w:lineRule="auto"/>
+        <w:spacing w:before="120" w:after="0" w:line="480" w:lineRule="auto"/>
         <w:jc w:val="left"/>
         <w:rPr/>
       </w:pPr>
@@ -14830,7 +14984,7 @@
     <w:p>
       <w:pPr>
         <w:keepNext w:val="1"/>
-        <w:spacing w:before="120" w:after="0" w:line="360" w:lineRule="auto"/>
+        <w:spacing w:before="120" w:after="0" w:line="480" w:lineRule="auto"/>
         <w:jc w:val="left"/>
         <w:rPr/>
       </w:pPr>
@@ -15700,7 +15854,7 @@
     </w:tbl>
     <w:p>
       <w:pPr>
-        <w:spacing w:before="120" w:after="0" w:line="360" w:lineRule="auto"/>
+        <w:spacing w:before="120" w:after="0" w:line="480" w:lineRule="auto"/>
         <w:ind w:firstLine="720"/>
         <w:jc w:val="both"/>
         <w:rPr/>
@@ -16160,7 +16314,7 @@
     <w:p>
       <w:pPr>
         <w:keepNext w:val="1"/>
-        <w:spacing w:before="120" w:after="0" w:line="360" w:lineRule="auto"/>
+        <w:spacing w:before="120" w:after="0" w:line="480" w:lineRule="auto"/>
         <w:jc w:val="left"/>
         <w:rPr/>
       </w:pPr>

</xml_diff>

<commit_message>
Draft_013: 1-space after tables (not before)
</commit_message>
<xml_diff>
--- a/thesis/003_ThesisProposal_Draft_013.docx
+++ b/thesis/003_ThesisProposal_Draft_013.docx
@@ -8375,7 +8375,7 @@
     </w:tbl>
     <w:p>
       <w:pPr>
-        <w:spacing w:before="120" w:after="0" w:line="480" w:lineRule="auto"/>
+        <w:spacing w:before="240" w:after="0" w:line="480" w:lineRule="auto"/>
         <w:ind w:firstLine="720"/>
         <w:jc w:val="both"/>
         <w:rPr/>
@@ -11569,7 +11569,7 @@
     <w:p>
       <w:pPr>
         <w:keepNext w:val="1"/>
-        <w:spacing w:before="120" w:after="0" w:line="480" w:lineRule="auto"/>
+        <w:spacing w:before="240" w:after="0" w:line="480" w:lineRule="auto"/>
         <w:ind w:firstLine="720"/>
         <w:jc w:val="both"/>
         <w:rPr/>
@@ -12572,7 +12572,7 @@
     <w:p>
       <w:pPr>
         <w:keepNext w:val="1"/>
-        <w:spacing w:before="120" w:after="0" w:line="480" w:lineRule="auto"/>
+        <w:spacing w:before="240" w:after="0" w:line="480" w:lineRule="auto"/>
         <w:jc w:val="left"/>
         <w:rPr/>
       </w:pPr>
@@ -13499,7 +13499,7 @@
     </w:tbl>
     <w:p>
       <w:pPr>
-        <w:spacing w:before="120" w:after="0" w:line="480" w:lineRule="auto"/>
+        <w:spacing w:before="240" w:after="0" w:line="480" w:lineRule="auto"/>
         <w:ind w:firstLine="720"/>
         <w:jc w:val="both"/>
         <w:rPr/>
@@ -14408,7 +14408,7 @@
     <w:p>
       <w:pPr>
         <w:keepNext w:val="1"/>
-        <w:spacing w:before="120" w:after="0" w:line="480" w:lineRule="auto"/>
+        <w:spacing w:before="240" w:after="0" w:line="480" w:lineRule="auto"/>
         <w:jc w:val="left"/>
         <w:rPr/>
       </w:pPr>
@@ -15143,7 +15143,7 @@
     <w:p>
       <w:pPr>
         <w:keepNext w:val="1"/>
-        <w:spacing w:before="120" w:after="0" w:line="480" w:lineRule="auto"/>
+        <w:spacing w:before="240" w:after="0" w:line="480" w:lineRule="auto"/>
         <w:jc w:val="left"/>
         <w:rPr/>
       </w:pPr>
@@ -15734,7 +15734,7 @@
     <w:p>
       <w:pPr>
         <w:keepNext w:val="1"/>
-        <w:spacing w:before="120" w:after="0" w:line="480" w:lineRule="auto"/>
+        <w:spacing w:before="240" w:after="0" w:line="480" w:lineRule="auto"/>
         <w:jc w:val="left"/>
         <w:rPr/>
       </w:pPr>
@@ -16652,7 +16652,7 @@
     </w:tbl>
     <w:p>
       <w:pPr>
-        <w:spacing w:before="120" w:after="0" w:line="480" w:lineRule="auto"/>
+        <w:spacing w:before="240" w:after="0" w:line="480" w:lineRule="auto"/>
         <w:ind w:firstLine="720"/>
         <w:jc w:val="both"/>
         <w:rPr/>
@@ -17148,7 +17148,7 @@
     <w:p>
       <w:pPr>
         <w:keepNext w:val="1"/>
-        <w:spacing w:before="120" w:after="0" w:line="480" w:lineRule="auto"/>
+        <w:spacing w:before="240" w:after="0" w:line="480" w:lineRule="auto"/>
         <w:jc w:val="left"/>
         <w:rPr/>
       </w:pPr>

</xml_diff>

<commit_message>
Draft_013: unify post-table body spacing to 240 (1-space)
</commit_message>
<xml_diff>
--- a/thesis/003_ThesisProposal_Draft_013.docx
+++ b/thesis/003_ThesisProposal_Draft_013.docx
@@ -4007,7 +4007,7 @@
     </w:tbl>
     <w:p>
       <w:pPr>
-        <w:spacing w:before="120" w:after="0" w:line="480" w:lineRule="auto"/>
+        <w:spacing w:before="240" w:after="0" w:line="480" w:lineRule="auto"/>
         <w:ind w:firstLine="720"/>
         <w:jc w:val="both"/>
         <w:rPr/>
@@ -4912,7 +4912,7 @@
     </w:tbl>
     <w:p>
       <w:pPr>
-        <w:spacing w:before="120" w:after="0" w:line="480" w:lineRule="auto"/>
+        <w:spacing w:before="240" w:after="0" w:line="480" w:lineRule="auto"/>
         <w:ind w:firstLine="720"/>
         <w:jc w:val="both"/>
         <w:rPr/>
@@ -6038,7 +6038,7 @@
     </w:tbl>
     <w:p>
       <w:pPr>
-        <w:spacing w:before="120" w:after="0" w:line="480" w:lineRule="auto"/>
+        <w:spacing w:before="240" w:after="0" w:line="480" w:lineRule="auto"/>
         <w:ind w:firstLine="720"/>
         <w:jc w:val="both"/>
         <w:rPr/>
@@ -7613,7 +7613,7 @@
     </w:tbl>
     <w:p>
       <w:pPr>
-        <w:spacing w:before="120" w:after="0" w:line="480" w:lineRule="auto"/>
+        <w:spacing w:before="240" w:after="0" w:line="480" w:lineRule="auto"/>
         <w:ind w:firstLine="720"/>
         <w:jc w:val="both"/>
         <w:rPr/>

</xml_diff>

<commit_message>
Draft_013: Appendix A justified; Core decision rules Georgia italic
</commit_message>
<xml_diff>
--- a/thesis/003_ThesisProposal_Draft_013.docx
+++ b/thesis/003_ThesisProposal_Draft_013.docx
@@ -9993,7 +9993,7 @@
     <w:p>
       <w:pPr>
         <w:spacing w:before="0" w:after="0" w:line="480" w:lineRule="auto"/>
-        <w:jc w:val="left"/>
+        <w:jc w:val="both"/>
         <w:rPr/>
       </w:pPr>
       <w:r>
@@ -10041,7 +10041,7 @@
     <w:p>
       <w:pPr>
         <w:spacing w:before="0" w:after="0" w:line="240" w:lineRule="auto"/>
-        <w:jc w:val="left"/>
+        <w:jc w:val="both"/>
         <w:rPr/>
       </w:pPr>
       <w:r>
@@ -10089,7 +10089,7 @@
       <w:pPr>
         <w:spacing w:before="0" w:after="0" w:line="240" w:lineRule="auto"/>
         <w:ind w:left="240" w:firstLine="0"/>
-        <w:jc w:val="left"/>
+        <w:jc w:val="both"/>
         <w:rPr/>
       </w:pPr>
       <w:r>
@@ -10113,7 +10113,7 @@
       <w:pPr>
         <w:spacing w:before="0" w:after="0" w:line="240" w:lineRule="auto"/>
         <w:ind w:left="240" w:firstLine="0"/>
-        <w:jc w:val="left"/>
+        <w:jc w:val="both"/>
         <w:rPr/>
       </w:pPr>
       <w:r>
@@ -10137,7 +10137,7 @@
       <w:pPr>
         <w:spacing w:before="0" w:after="0" w:line="240" w:lineRule="auto"/>
         <w:ind w:left="240" w:firstLine="0"/>
-        <w:jc w:val="left"/>
+        <w:jc w:val="both"/>
         <w:rPr/>
       </w:pPr>
       <w:r>
@@ -10161,7 +10161,7 @@
       <w:pPr>
         <w:spacing w:before="0" w:after="0" w:line="240" w:lineRule="auto"/>
         <w:ind w:left="240" w:firstLine="0"/>
-        <w:jc w:val="left"/>
+        <w:jc w:val="both"/>
         <w:rPr/>
       </w:pPr>
       <w:r>
@@ -10210,7 +10210,7 @@
       <w:pPr>
         <w:spacing w:before="0" w:after="0" w:line="240" w:lineRule="auto"/>
         <w:ind w:left="240" w:firstLine="720"/>
-        <w:jc w:val="left"/>
+        <w:jc w:val="both"/>
         <w:rPr/>
       </w:pPr>
       <w:r>
@@ -10234,7 +10234,7 @@
       <w:pPr>
         <w:spacing w:before="0" w:after="0" w:line="240" w:lineRule="auto"/>
         <w:ind w:left="240" w:firstLine="720"/>
-        <w:jc w:val="left"/>
+        <w:jc w:val="both"/>
         <w:rPr/>
       </w:pPr>
       <w:r>
@@ -10258,7 +10258,7 @@
       <w:pPr>
         <w:spacing w:before="0" w:after="0" w:line="240" w:lineRule="auto"/>
         <w:ind w:left="240" w:firstLine="0"/>
-        <w:jc w:val="left"/>
+        <w:jc w:val="both"/>
         <w:rPr/>
       </w:pPr>
       <w:r>
@@ -10307,23 +10307,28 @@
       <w:pPr>
         <w:spacing w:before="0" w:after="0" w:line="240" w:lineRule="auto"/>
         <w:ind w:left="240" w:firstLine="720"/>
-        <w:jc w:val="left"/>
-        <w:rPr/>
-      </w:pPr>
-      <w:r>
-        <w:rPr>
-          <w:rFonts w:ascii="Cardo" w:cs="Cardo" w:eastAsia="Cardo" w:hAnsi="Cardo"/>
-          <w:b w:val="0"/>
-          <w:bCs w:val="0"/>
-          <w:sz w:val="22"/>
-          <w:szCs w:val="22"/>
-          <w:rtl w:val="0"/>
+        <w:jc w:val="both"/>
+        <w:rPr/>
+      </w:pPr>
+      <w:r>
+        <w:rPr>
+          <w:rFonts w:ascii="Georgia" w:cs="Cardo" w:eastAsia="Cardo" w:hAnsi="Georgia"/>
+          <w:sz w:val="24"/>
+          <w:szCs w:val="24"/>
+          <w:rtl w:val="0"/>
+          <w:i/>
+          <w:iCs/>
         </w:rPr>
         <w:t xml:space="preserve">suggest / indicate → hedge when introducing a finding; not a hedge when introducing a recommendation.</w:t>
       </w:r>
       <w:r>
         <w:rPr>
           <w:rtl w:val="0"/>
+          <w:rFonts w:ascii="Georgia" w:hAnsi="Georgia"/>
+          <w:sz w:val="24"/>
+          <w:szCs w:val="24"/>
+          <w:i/>
+          <w:iCs/>
         </w:rPr>
       </w:r>
     </w:p>
@@ -10331,23 +10336,28 @@
       <w:pPr>
         <w:spacing w:before="0" w:after="0" w:line="240" w:lineRule="auto"/>
         <w:ind w:left="240" w:firstLine="720"/>
-        <w:jc w:val="left"/>
-        <w:rPr/>
-      </w:pPr>
-      <w:r>
-        <w:rPr>
-          <w:rFonts w:ascii="Cardo" w:cs="Cardo" w:eastAsia="Cardo" w:hAnsi="Cardo"/>
-          <w:b w:val="0"/>
-          <w:bCs w:val="0"/>
-          <w:sz w:val="22"/>
-          <w:szCs w:val="22"/>
-          <w:rtl w:val="0"/>
+        <w:jc w:val="both"/>
+        <w:rPr/>
+      </w:pPr>
+      <w:r>
+        <w:rPr>
+          <w:rFonts w:ascii="Georgia" w:cs="Cardo" w:eastAsia="Cardo" w:hAnsi="Georgia"/>
+          <w:sz w:val="24"/>
+          <w:szCs w:val="24"/>
+          <w:rtl w:val="0"/>
+          <w:i/>
+          <w:iCs/>
         </w:rPr>
         <w:t xml:space="preserve">can / may → hedge when marking possibility; not a hedge when marking capability.</w:t>
       </w:r>
       <w:r>
         <w:rPr>
           <w:rtl w:val="0"/>
+          <w:rFonts w:ascii="Georgia" w:hAnsi="Georgia"/>
+          <w:sz w:val="24"/>
+          <w:szCs w:val="24"/>
+          <w:i/>
+          <w:iCs/>
         </w:rPr>
       </w:r>
     </w:p>
@@ -10355,23 +10365,28 @@
       <w:pPr>
         <w:spacing w:before="0" w:after="0" w:line="240" w:lineRule="auto"/>
         <w:ind w:left="240" w:firstLine="720"/>
-        <w:jc w:val="left"/>
-        <w:rPr/>
-      </w:pPr>
-      <w:r>
-        <w:rPr>
-          <w:rFonts w:ascii="Cardo" w:cs="Cardo" w:eastAsia="Cardo" w:hAnsi="Cardo"/>
-          <w:b w:val="0"/>
-          <w:bCs w:val="0"/>
-          <w:sz w:val="22"/>
-          <w:szCs w:val="22"/>
-          <w:rtl w:val="0"/>
+        <w:jc w:val="both"/>
+        <w:rPr/>
+      </w:pPr>
+      <w:r>
+        <w:rPr>
+          <w:rFonts w:ascii="Georgia" w:cs="Cardo" w:eastAsia="Cardo" w:hAnsi="Georgia"/>
+          <w:sz w:val="24"/>
+          <w:szCs w:val="24"/>
+          <w:rtl w:val="0"/>
+          <w:i/>
+          <w:iCs/>
         </w:rPr>
         <w:t xml:space="preserve">generally / typically → hedge when limiting the scope of a claim; not a hedge when describing a procedural norm.</w:t>
       </w:r>
       <w:r>
         <w:rPr>
           <w:rtl w:val="0"/>
+          <w:rFonts w:ascii="Georgia" w:hAnsi="Georgia"/>
+          <w:sz w:val="24"/>
+          <w:szCs w:val="24"/>
+          <w:i/>
+          <w:iCs/>
         </w:rPr>
       </w:r>
     </w:p>
@@ -10379,23 +10394,28 @@
       <w:pPr>
         <w:spacing w:before="0" w:after="0" w:line="240" w:lineRule="auto"/>
         <w:ind w:left="240" w:firstLine="0"/>
-        <w:jc w:val="left"/>
-        <w:rPr/>
-      </w:pPr>
-      <w:r>
-        <w:rPr>
-          <w:rFonts w:ascii="Cardo" w:cs="Cardo" w:eastAsia="Cardo" w:hAnsi="Cardo"/>
-          <w:b w:val="0"/>
-          <w:bCs w:val="0"/>
-          <w:sz w:val="22"/>
-          <w:szCs w:val="22"/>
-          <w:rtl w:val="0"/>
+        <w:jc w:val="both"/>
+        <w:rPr/>
+      </w:pPr>
+      <w:r>
+        <w:rPr>
+          <w:rFonts w:ascii="Georgia" w:cs="Cardo" w:eastAsia="Cardo" w:hAnsi="Georgia"/>
+          <w:sz w:val="24"/>
+          <w:szCs w:val="24"/>
+          <w:rtl w:val="0"/>
+          <w:i/>
+          <w:iCs/>
         </w:rPr>
         <w:t xml:space="preserve">appear / seem → hedge when expressing uncertainty about a result; not a hedge when pointing to location in a table or text.</w:t>
       </w:r>
       <w:r>
         <w:rPr>
           <w:rtl w:val="0"/>
+          <w:rFonts w:ascii="Georgia" w:hAnsi="Georgia"/>
+          <w:sz w:val="24"/>
+          <w:szCs w:val="24"/>
+          <w:i/>
+          <w:iCs/>
         </w:rPr>
       </w:r>
     </w:p>
@@ -10427,7 +10447,7 @@
     <w:p>
       <w:pPr>
         <w:spacing w:before="0" w:after="0" w:line="240" w:lineRule="auto"/>
-        <w:jc w:val="left"/>
+        <w:jc w:val="both"/>
         <w:rPr/>
       </w:pPr>
       <w:r>
@@ -10502,7 +10522,7 @@
       <w:pPr>
         <w:spacing w:before="0" w:after="0" w:line="360" w:lineRule="auto"/>
         <w:ind w:firstLine="720"/>
-        <w:jc w:val="left"/>
+        <w:jc w:val="both"/>
         <w:rPr/>
       </w:pPr>
       <w:r>
@@ -10838,7 +10858,7 @@
           <w:p>
             <w:pPr>
               <w:spacing w:before="0" w:after="0" w:line="240" w:lineRule="auto"/>
-              <w:jc w:val="left"/>
+              <w:jc w:val="both"/>
               <w:rPr/>
             </w:pPr>
             <w:r>
@@ -10872,7 +10892,7 @@
           <w:p>
             <w:pPr>
               <w:spacing w:before="0" w:after="0" w:line="240" w:lineRule="auto"/>
-              <w:jc w:val="left"/>
+              <w:jc w:val="both"/>
               <w:rPr/>
             </w:pPr>
             <w:r>
@@ -10906,7 +10926,7 @@
           <w:p>
             <w:pPr>
               <w:spacing w:before="0" w:after="0" w:line="240" w:lineRule="auto"/>
-              <w:jc w:val="left"/>
+              <w:jc w:val="both"/>
               <w:rPr/>
             </w:pPr>
             <w:r>
@@ -10940,7 +10960,7 @@
           <w:p>
             <w:pPr>
               <w:spacing w:before="0" w:after="0" w:line="240" w:lineRule="auto"/>
-              <w:jc w:val="left"/>
+              <w:jc w:val="both"/>
               <w:rPr/>
             </w:pPr>
             <w:r>
@@ -11005,7 +11025,7 @@
           <w:p>
             <w:pPr>
               <w:spacing w:before="0" w:after="0" w:line="240" w:lineRule="auto"/>
-              <w:jc w:val="left"/>
+              <w:jc w:val="both"/>
               <w:rPr/>
             </w:pPr>
             <w:r>
@@ -11032,7 +11052,7 @@
           <w:p>
             <w:pPr>
               <w:spacing w:before="0" w:after="0" w:line="240" w:lineRule="auto"/>
-              <w:jc w:val="left"/>
+              <w:jc w:val="both"/>
               <w:rPr/>
             </w:pPr>
             <w:r>
@@ -11059,7 +11079,7 @@
           <w:p>
             <w:pPr>
               <w:spacing w:before="0" w:after="0" w:line="240" w:lineRule="auto"/>
-              <w:jc w:val="left"/>
+              <w:jc w:val="both"/>
               <w:rPr/>
             </w:pPr>
             <w:r>
@@ -11155,7 +11175,7 @@
           <w:p>
             <w:pPr>
               <w:spacing w:before="0" w:after="0" w:line="240" w:lineRule="auto"/>
-              <w:jc w:val="left"/>
+              <w:jc w:val="both"/>
               <w:rPr/>
             </w:pPr>
             <w:r>
@@ -11182,7 +11202,7 @@
           <w:p>
             <w:pPr>
               <w:spacing w:before="0" w:after="0" w:line="240" w:lineRule="auto"/>
-              <w:jc w:val="left"/>
+              <w:jc w:val="both"/>
               <w:rPr/>
             </w:pPr>
             <w:r>
@@ -11209,7 +11229,7 @@
           <w:p>
             <w:pPr>
               <w:spacing w:before="0" w:after="0" w:line="240" w:lineRule="auto"/>
-              <w:jc w:val="left"/>
+              <w:jc w:val="both"/>
               <w:rPr/>
             </w:pPr>
             <w:r>
@@ -11305,7 +11325,7 @@
           <w:p>
             <w:pPr>
               <w:spacing w:before="0" w:after="0" w:line="240" w:lineRule="auto"/>
-              <w:jc w:val="left"/>
+              <w:jc w:val="both"/>
               <w:rPr/>
             </w:pPr>
             <w:r>
@@ -11332,7 +11352,7 @@
           <w:p>
             <w:pPr>
               <w:spacing w:before="0" w:after="0" w:line="240" w:lineRule="auto"/>
-              <w:jc w:val="left"/>
+              <w:jc w:val="both"/>
               <w:rPr/>
             </w:pPr>
             <w:r>
@@ -11359,7 +11379,7 @@
           <w:p>
             <w:pPr>
               <w:spacing w:before="0" w:after="0" w:line="240" w:lineRule="auto"/>
-              <w:jc w:val="left"/>
+              <w:jc w:val="both"/>
               <w:rPr/>
             </w:pPr>
             <w:r>
@@ -11455,7 +11475,7 @@
           <w:p>
             <w:pPr>
               <w:spacing w:before="0" w:after="0" w:line="240" w:lineRule="auto"/>
-              <w:jc w:val="left"/>
+              <w:jc w:val="both"/>
               <w:rPr/>
             </w:pPr>
             <w:r>
@@ -11482,7 +11502,7 @@
           <w:p>
             <w:pPr>
               <w:spacing w:before="0" w:after="0" w:line="240" w:lineRule="auto"/>
-              <w:jc w:val="left"/>
+              <w:jc w:val="both"/>
               <w:rPr/>
             </w:pPr>
             <w:r>
@@ -11509,7 +11529,7 @@
           <w:p>
             <w:pPr>
               <w:spacing w:before="0" w:after="0" w:line="240" w:lineRule="auto"/>
-              <w:jc w:val="left"/>
+              <w:jc w:val="both"/>
               <w:rPr/>
             </w:pPr>
             <w:r>
@@ -11901,7 +11921,7 @@
           <w:p>
             <w:pPr>
               <w:spacing w:before="0" w:after="0" w:line="240" w:lineRule="auto"/>
-              <w:jc w:val="left"/>
+              <w:jc w:val="both"/>
               <w:rPr/>
             </w:pPr>
             <w:r>
@@ -11935,7 +11955,7 @@
           <w:p>
             <w:pPr>
               <w:spacing w:before="0" w:after="0" w:line="240" w:lineRule="auto"/>
-              <w:jc w:val="left"/>
+              <w:jc w:val="both"/>
               <w:rPr/>
             </w:pPr>
             <w:r>
@@ -11969,7 +11989,7 @@
           <w:p>
             <w:pPr>
               <w:spacing w:before="0" w:after="0" w:line="240" w:lineRule="auto"/>
-              <w:jc w:val="left"/>
+              <w:jc w:val="both"/>
               <w:rPr/>
             </w:pPr>
             <w:r>
@@ -12003,7 +12023,7 @@
           <w:p>
             <w:pPr>
               <w:spacing w:before="0" w:after="0" w:line="240" w:lineRule="auto"/>
-              <w:jc w:val="left"/>
+              <w:jc w:val="both"/>
               <w:rPr/>
             </w:pPr>
             <w:r>
@@ -12070,7 +12090,7 @@
           <w:p>
             <w:pPr>
               <w:spacing w:before="0" w:after="0" w:line="240" w:lineRule="auto"/>
-              <w:jc w:val="left"/>
+              <w:jc w:val="both"/>
               <w:rPr/>
             </w:pPr>
             <w:r>
@@ -12097,7 +12117,7 @@
           <w:p>
             <w:pPr>
               <w:spacing w:before="0" w:after="0" w:line="240" w:lineRule="auto"/>
-              <w:jc w:val="left"/>
+              <w:jc w:val="both"/>
               <w:rPr/>
             </w:pPr>
             <w:r>
@@ -12124,7 +12144,7 @@
           <w:p>
             <w:pPr>
               <w:spacing w:before="0" w:after="0" w:line="240" w:lineRule="auto"/>
-              <w:jc w:val="left"/>
+              <w:jc w:val="both"/>
               <w:rPr/>
             </w:pPr>
             <w:r>
@@ -12250,7 +12270,7 @@
           <w:p>
             <w:pPr>
               <w:spacing w:before="0" w:after="0" w:line="240" w:lineRule="auto"/>
-              <w:jc w:val="left"/>
+              <w:jc w:val="both"/>
               <w:rPr/>
             </w:pPr>
             <w:r>
@@ -12277,7 +12297,7 @@
           <w:p>
             <w:pPr>
               <w:spacing w:before="0" w:after="0" w:line="240" w:lineRule="auto"/>
-              <w:jc w:val="left"/>
+              <w:jc w:val="both"/>
               <w:rPr/>
             </w:pPr>
             <w:r>
@@ -12304,7 +12324,7 @@
           <w:p>
             <w:pPr>
               <w:spacing w:before="0" w:after="0" w:line="240" w:lineRule="auto"/>
-              <w:jc w:val="left"/>
+              <w:jc w:val="both"/>
               <w:rPr/>
             </w:pPr>
             <w:r>
@@ -12430,7 +12450,7 @@
           <w:p>
             <w:pPr>
               <w:spacing w:before="0" w:after="0" w:line="240" w:lineRule="auto"/>
-              <w:jc w:val="left"/>
+              <w:jc w:val="both"/>
               <w:rPr/>
             </w:pPr>
             <w:r>
@@ -12457,7 +12477,7 @@
           <w:p>
             <w:pPr>
               <w:spacing w:before="0" w:after="0" w:line="240" w:lineRule="auto"/>
-              <w:jc w:val="left"/>
+              <w:jc w:val="both"/>
               <w:rPr/>
             </w:pPr>
             <w:r>
@@ -12484,7 +12504,7 @@
           <w:p>
             <w:pPr>
               <w:spacing w:before="0" w:after="0" w:line="240" w:lineRule="auto"/>
-              <w:jc w:val="left"/>
+              <w:jc w:val="both"/>
               <w:rPr/>
             </w:pPr>
             <w:r>
@@ -12667,7 +12687,7 @@
           <w:p>
             <w:pPr>
               <w:spacing w:before="0" w:after="0" w:line="240" w:lineRule="auto"/>
-              <w:jc w:val="left"/>
+              <w:jc w:val="both"/>
               <w:rPr/>
             </w:pPr>
             <w:r>
@@ -12701,7 +12721,7 @@
           <w:p>
             <w:pPr>
               <w:spacing w:before="0" w:after="0" w:line="240" w:lineRule="auto"/>
-              <w:jc w:val="left"/>
+              <w:jc w:val="both"/>
               <w:rPr/>
             </w:pPr>
             <w:r>
@@ -12735,7 +12755,7 @@
           <w:p>
             <w:pPr>
               <w:spacing w:before="0" w:after="0" w:line="240" w:lineRule="auto"/>
-              <w:jc w:val="left"/>
+              <w:jc w:val="both"/>
               <w:rPr/>
             </w:pPr>
             <w:r>
@@ -12770,7 +12790,7 @@
           <w:p>
             <w:pPr>
               <w:spacing w:before="0" w:after="0" w:line="240" w:lineRule="auto"/>
-              <w:jc w:val="left"/>
+              <w:jc w:val="both"/>
               <w:rPr/>
             </w:pPr>
             <w:r>
@@ -12802,7 +12822,7 @@
           <w:p>
             <w:pPr>
               <w:spacing w:before="0" w:after="0" w:line="240" w:lineRule="auto"/>
-              <w:jc w:val="left"/>
+              <w:jc w:val="both"/>
               <w:rPr/>
             </w:pPr>
             <w:r>
@@ -12829,7 +12849,7 @@
           <w:p>
             <w:pPr>
               <w:spacing w:before="0" w:after="0" w:line="240" w:lineRule="auto"/>
-              <w:jc w:val="left"/>
+              <w:jc w:val="both"/>
               <w:rPr/>
             </w:pPr>
             <w:r>
@@ -12862,7 +12882,7 @@
           <w:p>
             <w:pPr>
               <w:spacing w:before="0" w:after="0" w:line="240" w:lineRule="auto"/>
-              <w:jc w:val="left"/>
+              <w:jc w:val="both"/>
               <w:rPr/>
             </w:pPr>
             <w:r>
@@ -12894,7 +12914,7 @@
           <w:p>
             <w:pPr>
               <w:spacing w:before="0" w:after="0" w:line="240" w:lineRule="auto"/>
-              <w:jc w:val="left"/>
+              <w:jc w:val="both"/>
               <w:rPr/>
             </w:pPr>
             <w:r>
@@ -12921,7 +12941,7 @@
           <w:p>
             <w:pPr>
               <w:spacing w:before="0" w:after="0" w:line="240" w:lineRule="auto"/>
-              <w:jc w:val="left"/>
+              <w:jc w:val="both"/>
               <w:rPr/>
             </w:pPr>
             <w:r>
@@ -12954,7 +12974,7 @@
           <w:p>
             <w:pPr>
               <w:spacing w:before="0" w:after="0" w:line="240" w:lineRule="auto"/>
-              <w:jc w:val="left"/>
+              <w:jc w:val="both"/>
               <w:rPr/>
             </w:pPr>
             <w:r>
@@ -12986,7 +13006,7 @@
           <w:p>
             <w:pPr>
               <w:spacing w:before="0" w:after="0" w:line="240" w:lineRule="auto"/>
-              <w:jc w:val="left"/>
+              <w:jc w:val="both"/>
               <w:rPr/>
             </w:pPr>
             <w:r>
@@ -13013,7 +13033,7 @@
           <w:p>
             <w:pPr>
               <w:spacing w:before="0" w:after="0" w:line="240" w:lineRule="auto"/>
-              <w:jc w:val="left"/>
+              <w:jc w:val="both"/>
               <w:rPr/>
             </w:pPr>
             <w:r>
@@ -13046,7 +13066,7 @@
           <w:p>
             <w:pPr>
               <w:spacing w:before="0" w:after="0" w:line="240" w:lineRule="auto"/>
-              <w:jc w:val="left"/>
+              <w:jc w:val="both"/>
               <w:rPr/>
             </w:pPr>
             <w:r>
@@ -13078,7 +13098,7 @@
           <w:p>
             <w:pPr>
               <w:spacing w:before="0" w:after="0" w:line="240" w:lineRule="auto"/>
-              <w:jc w:val="left"/>
+              <w:jc w:val="both"/>
               <w:rPr/>
             </w:pPr>
             <w:r>
@@ -13105,7 +13125,7 @@
           <w:p>
             <w:pPr>
               <w:spacing w:before="0" w:after="0" w:line="240" w:lineRule="auto"/>
-              <w:jc w:val="left"/>
+              <w:jc w:val="both"/>
               <w:rPr/>
             </w:pPr>
             <w:r>
@@ -13138,7 +13158,7 @@
           <w:p>
             <w:pPr>
               <w:spacing w:before="0" w:after="0" w:line="240" w:lineRule="auto"/>
-              <w:jc w:val="left"/>
+              <w:jc w:val="both"/>
               <w:rPr/>
             </w:pPr>
             <w:r>
@@ -13170,7 +13190,7 @@
           <w:p>
             <w:pPr>
               <w:spacing w:before="0" w:after="0" w:line="240" w:lineRule="auto"/>
-              <w:jc w:val="left"/>
+              <w:jc w:val="both"/>
               <w:rPr/>
             </w:pPr>
             <w:r>
@@ -13197,7 +13217,7 @@
           <w:p>
             <w:pPr>
               <w:spacing w:before="0" w:after="0" w:line="240" w:lineRule="auto"/>
-              <w:jc w:val="left"/>
+              <w:jc w:val="both"/>
               <w:rPr/>
             </w:pPr>
             <w:r>
@@ -13230,7 +13250,7 @@
           <w:p>
             <w:pPr>
               <w:spacing w:before="0" w:after="0" w:line="240" w:lineRule="auto"/>
-              <w:jc w:val="left"/>
+              <w:jc w:val="both"/>
               <w:rPr/>
             </w:pPr>
             <w:r>
@@ -13262,7 +13282,7 @@
           <w:p>
             <w:pPr>
               <w:spacing w:before="0" w:after="0" w:line="240" w:lineRule="auto"/>
-              <w:jc w:val="left"/>
+              <w:jc w:val="both"/>
               <w:rPr/>
             </w:pPr>
             <w:r>
@@ -13289,7 +13309,7 @@
           <w:p>
             <w:pPr>
               <w:spacing w:before="0" w:after="0" w:line="240" w:lineRule="auto"/>
-              <w:jc w:val="left"/>
+              <w:jc w:val="both"/>
               <w:rPr/>
             </w:pPr>
             <w:r>
@@ -13322,7 +13342,7 @@
           <w:p>
             <w:pPr>
               <w:spacing w:before="0" w:after="0" w:line="240" w:lineRule="auto"/>
-              <w:jc w:val="left"/>
+              <w:jc w:val="both"/>
               <w:rPr/>
             </w:pPr>
             <w:r>
@@ -13354,7 +13374,7 @@
           <w:p>
             <w:pPr>
               <w:spacing w:before="0" w:after="0" w:line="240" w:lineRule="auto"/>
-              <w:jc w:val="left"/>
+              <w:jc w:val="both"/>
               <w:rPr/>
             </w:pPr>
             <w:r>
@@ -13381,7 +13401,7 @@
           <w:p>
             <w:pPr>
               <w:spacing w:before="0" w:after="0" w:line="240" w:lineRule="auto"/>
-              <w:jc w:val="left"/>
+              <w:jc w:val="both"/>
               <w:rPr/>
             </w:pPr>
             <w:r>
@@ -13414,7 +13434,7 @@
           <w:p>
             <w:pPr>
               <w:spacing w:before="0" w:after="0" w:line="240" w:lineRule="auto"/>
-              <w:jc w:val="left"/>
+              <w:jc w:val="both"/>
               <w:rPr/>
             </w:pPr>
             <w:r>
@@ -13446,7 +13466,7 @@
           <w:p>
             <w:pPr>
               <w:spacing w:before="0" w:after="0" w:line="240" w:lineRule="auto"/>
-              <w:jc w:val="left"/>
+              <w:jc w:val="both"/>
               <w:rPr/>
             </w:pPr>
             <w:r>
@@ -13473,7 +13493,7 @@
           <w:p>
             <w:pPr>
               <w:spacing w:before="0" w:after="0" w:line="240" w:lineRule="auto"/>
-              <w:jc w:val="left"/>
+              <w:jc w:val="both"/>
               <w:rPr/>
             </w:pPr>
             <w:r>
@@ -13691,7 +13711,7 @@
           <w:p>
             <w:pPr>
               <w:spacing w:before="0" w:after="0" w:line="240" w:lineRule="auto"/>
-              <w:jc w:val="left"/>
+              <w:jc w:val="both"/>
               <w:rPr/>
             </w:pPr>
             <w:r>
@@ -13725,7 +13745,7 @@
           <w:p>
             <w:pPr>
               <w:spacing w:before="0" w:after="0" w:line="240" w:lineRule="auto"/>
-              <w:jc w:val="left"/>
+              <w:jc w:val="both"/>
               <w:rPr/>
             </w:pPr>
             <w:r>
@@ -13759,7 +13779,7 @@
           <w:p>
             <w:pPr>
               <w:spacing w:before="0" w:after="0" w:line="240" w:lineRule="auto"/>
-              <w:jc w:val="left"/>
+              <w:jc w:val="both"/>
               <w:rPr/>
             </w:pPr>
             <w:r>
@@ -13794,7 +13814,7 @@
           <w:p>
             <w:pPr>
               <w:spacing w:before="0" w:after="0" w:line="240" w:lineRule="auto"/>
-              <w:jc w:val="left"/>
+              <w:jc w:val="both"/>
               <w:rPr/>
             </w:pPr>
             <w:r>
@@ -13826,7 +13846,7 @@
           <w:p>
             <w:pPr>
               <w:spacing w:before="0" w:after="0" w:line="240" w:lineRule="auto"/>
-              <w:jc w:val="left"/>
+              <w:jc w:val="both"/>
               <w:rPr/>
             </w:pPr>
             <w:r>
@@ -13853,7 +13873,7 @@
           <w:p>
             <w:pPr>
               <w:spacing w:before="0" w:after="0" w:line="240" w:lineRule="auto"/>
-              <w:jc w:val="left"/>
+              <w:jc w:val="both"/>
               <w:rPr/>
             </w:pPr>
             <w:r>
@@ -13918,7 +13938,7 @@
           <w:p>
             <w:pPr>
               <w:spacing w:before="0" w:after="0" w:line="240" w:lineRule="auto"/>
-              <w:jc w:val="left"/>
+              <w:jc w:val="both"/>
               <w:rPr/>
             </w:pPr>
             <w:r>
@@ -13950,7 +13970,7 @@
           <w:p>
             <w:pPr>
               <w:spacing w:before="0" w:after="0" w:line="240" w:lineRule="auto"/>
-              <w:jc w:val="left"/>
+              <w:jc w:val="both"/>
               <w:rPr/>
             </w:pPr>
             <w:r>
@@ -13977,7 +13997,7 @@
           <w:p>
             <w:pPr>
               <w:spacing w:before="0" w:after="0" w:line="240" w:lineRule="auto"/>
-              <w:jc w:val="left"/>
+              <w:jc w:val="both"/>
               <w:rPr/>
             </w:pPr>
             <w:r>
@@ -14042,7 +14062,7 @@
           <w:p>
             <w:pPr>
               <w:spacing w:before="0" w:after="0" w:line="240" w:lineRule="auto"/>
-              <w:jc w:val="left"/>
+              <w:jc w:val="both"/>
               <w:rPr/>
             </w:pPr>
             <w:r>
@@ -14074,7 +14094,7 @@
           <w:p>
             <w:pPr>
               <w:spacing w:before="0" w:after="0" w:line="240" w:lineRule="auto"/>
-              <w:jc w:val="left"/>
+              <w:jc w:val="both"/>
               <w:rPr/>
             </w:pPr>
             <w:r>
@@ -14101,7 +14121,7 @@
           <w:p>
             <w:pPr>
               <w:spacing w:before="0" w:after="0" w:line="240" w:lineRule="auto"/>
-              <w:jc w:val="left"/>
+              <w:jc w:val="both"/>
               <w:rPr/>
             </w:pPr>
             <w:r>
@@ -14166,7 +14186,7 @@
           <w:p>
             <w:pPr>
               <w:spacing w:before="0" w:after="0" w:line="240" w:lineRule="auto"/>
-              <w:jc w:val="left"/>
+              <w:jc w:val="both"/>
               <w:rPr/>
             </w:pPr>
             <w:r>
@@ -14198,7 +14218,7 @@
           <w:p>
             <w:pPr>
               <w:spacing w:before="0" w:after="0" w:line="240" w:lineRule="auto"/>
-              <w:jc w:val="left"/>
+              <w:jc w:val="both"/>
               <w:rPr/>
             </w:pPr>
             <w:r>
@@ -14225,7 +14245,7 @@
           <w:p>
             <w:pPr>
               <w:spacing w:before="0" w:after="0" w:line="240" w:lineRule="auto"/>
-              <w:jc w:val="left"/>
+              <w:jc w:val="both"/>
               <w:rPr/>
             </w:pPr>
             <w:r>
@@ -14290,7 +14310,7 @@
           <w:p>
             <w:pPr>
               <w:spacing w:before="0" w:after="0" w:line="240" w:lineRule="auto"/>
-              <w:jc w:val="left"/>
+              <w:jc w:val="both"/>
               <w:rPr/>
             </w:pPr>
             <w:r>
@@ -14322,7 +14342,7 @@
           <w:p>
             <w:pPr>
               <w:spacing w:before="0" w:after="0" w:line="240" w:lineRule="auto"/>
-              <w:jc w:val="left"/>
+              <w:jc w:val="both"/>
               <w:rPr/>
             </w:pPr>
             <w:r>
@@ -14349,7 +14369,7 @@
           <w:p>
             <w:pPr>
               <w:spacing w:before="0" w:after="0" w:line="240" w:lineRule="auto"/>
-              <w:jc w:val="left"/>
+              <w:jc w:val="both"/>
               <w:rPr/>
             </w:pPr>
             <w:r>
@@ -14562,7 +14582,7 @@
           <w:p>
             <w:pPr>
               <w:spacing w:before="0" w:after="0" w:line="240" w:lineRule="auto"/>
-              <w:jc w:val="left"/>
+              <w:jc w:val="both"/>
               <w:rPr/>
             </w:pPr>
             <w:r>
@@ -14596,7 +14616,7 @@
           <w:p>
             <w:pPr>
               <w:spacing w:before="0" w:after="0" w:line="240" w:lineRule="auto"/>
-              <w:jc w:val="left"/>
+              <w:jc w:val="both"/>
               <w:rPr/>
             </w:pPr>
             <w:r>
@@ -14630,7 +14650,7 @@
           <w:p>
             <w:pPr>
               <w:spacing w:before="0" w:after="0" w:line="240" w:lineRule="auto"/>
-              <w:jc w:val="left"/>
+              <w:jc w:val="both"/>
               <w:rPr/>
             </w:pPr>
             <w:r>
@@ -14664,7 +14684,7 @@
           <w:p>
             <w:pPr>
               <w:spacing w:before="0" w:after="0" w:line="240" w:lineRule="auto"/>
-              <w:jc w:val="left"/>
+              <w:jc w:val="both"/>
               <w:rPr/>
             </w:pPr>
             <w:r>
@@ -14729,7 +14749,7 @@
           <w:p>
             <w:pPr>
               <w:spacing w:before="0" w:after="0" w:line="240" w:lineRule="auto"/>
-              <w:jc w:val="left"/>
+              <w:jc w:val="both"/>
               <w:rPr/>
             </w:pPr>
             <w:r>
@@ -14756,7 +14776,7 @@
           <w:p>
             <w:pPr>
               <w:spacing w:before="0" w:after="0" w:line="240" w:lineRule="auto"/>
-              <w:jc w:val="left"/>
+              <w:jc w:val="both"/>
               <w:rPr/>
             </w:pPr>
             <w:r>
@@ -14783,7 +14803,7 @@
           <w:p>
             <w:pPr>
               <w:spacing w:before="0" w:after="0" w:line="240" w:lineRule="auto"/>
-              <w:jc w:val="left"/>
+              <w:jc w:val="both"/>
               <w:rPr/>
             </w:pPr>
             <w:r>
@@ -14879,7 +14899,7 @@
           <w:p>
             <w:pPr>
               <w:spacing w:before="0" w:after="0" w:line="240" w:lineRule="auto"/>
-              <w:jc w:val="left"/>
+              <w:jc w:val="both"/>
               <w:rPr/>
             </w:pPr>
             <w:r>
@@ -14906,7 +14926,7 @@
           <w:p>
             <w:pPr>
               <w:spacing w:before="0" w:after="0" w:line="240" w:lineRule="auto"/>
-              <w:jc w:val="left"/>
+              <w:jc w:val="both"/>
               <w:rPr/>
             </w:pPr>
             <w:r>
@@ -14933,7 +14953,7 @@
           <w:p>
             <w:pPr>
               <w:spacing w:before="0" w:after="0" w:line="240" w:lineRule="auto"/>
-              <w:jc w:val="left"/>
+              <w:jc w:val="both"/>
               <w:rPr/>
             </w:pPr>
             <w:r>
@@ -15029,7 +15049,7 @@
           <w:p>
             <w:pPr>
               <w:spacing w:before="0" w:after="0" w:line="240" w:lineRule="auto"/>
-              <w:jc w:val="left"/>
+              <w:jc w:val="both"/>
               <w:rPr/>
             </w:pPr>
             <w:r>
@@ -15056,7 +15076,7 @@
           <w:p>
             <w:pPr>
               <w:spacing w:before="0" w:after="0" w:line="240" w:lineRule="auto"/>
-              <w:jc w:val="left"/>
+              <w:jc w:val="both"/>
               <w:rPr/>
             </w:pPr>
             <w:r>
@@ -15083,7 +15103,7 @@
           <w:p>
             <w:pPr>
               <w:spacing w:before="0" w:after="0" w:line="240" w:lineRule="auto"/>
-              <w:jc w:val="left"/>
+              <w:jc w:val="both"/>
               <w:rPr/>
             </w:pPr>
             <w:r>
@@ -15236,7 +15256,7 @@
           <w:p>
             <w:pPr>
               <w:spacing w:before="0" w:after="0" w:line="240" w:lineRule="auto"/>
-              <w:jc w:val="left"/>
+              <w:jc w:val="both"/>
               <w:rPr/>
             </w:pPr>
             <w:r>
@@ -15270,7 +15290,7 @@
           <w:p>
             <w:pPr>
               <w:spacing w:before="0" w:after="0" w:line="240" w:lineRule="auto"/>
-              <w:jc w:val="left"/>
+              <w:jc w:val="both"/>
               <w:rPr/>
             </w:pPr>
             <w:r>
@@ -15305,7 +15325,7 @@
           <w:p>
             <w:pPr>
               <w:spacing w:before="0" w:after="0" w:line="240" w:lineRule="auto"/>
-              <w:jc w:val="left"/>
+              <w:jc w:val="both"/>
               <w:rPr/>
             </w:pPr>
             <w:r>
@@ -15344,7 +15364,7 @@
           <w:p>
             <w:pPr>
               <w:spacing w:before="0" w:after="0" w:line="240" w:lineRule="auto"/>
-              <w:jc w:val="left"/>
+              <w:jc w:val="both"/>
               <w:rPr/>
             </w:pPr>
             <w:r>
@@ -15383,7 +15403,7 @@
           <w:p>
             <w:pPr>
               <w:spacing w:before="0" w:after="0" w:line="240" w:lineRule="auto"/>
-              <w:jc w:val="left"/>
+              <w:jc w:val="both"/>
               <w:rPr/>
             </w:pPr>
             <w:r>
@@ -15422,7 +15442,7 @@
           <w:p>
             <w:pPr>
               <w:spacing w:before="0" w:after="0" w:line="240" w:lineRule="auto"/>
-              <w:jc w:val="left"/>
+              <w:jc w:val="both"/>
               <w:rPr/>
             </w:pPr>
             <w:r>
@@ -15464,7 +15484,7 @@
           <w:p>
             <w:pPr>
               <w:spacing w:before="0" w:after="0" w:line="240" w:lineRule="auto"/>
-              <w:jc w:val="left"/>
+              <w:jc w:val="both"/>
               <w:rPr/>
             </w:pPr>
             <w:r>
@@ -15507,7 +15527,7 @@
           <w:p>
             <w:pPr>
               <w:spacing w:before="0" w:after="0" w:line="240" w:lineRule="auto"/>
-              <w:jc w:val="left"/>
+              <w:jc w:val="both"/>
               <w:rPr/>
             </w:pPr>
             <w:r>
@@ -15550,7 +15570,7 @@
           <w:p>
             <w:pPr>
               <w:spacing w:before="0" w:after="0" w:line="240" w:lineRule="auto"/>
-              <w:jc w:val="left"/>
+              <w:jc w:val="both"/>
               <w:rPr/>
             </w:pPr>
             <w:r>
@@ -15602,7 +15622,7 @@
           <w:p>
             <w:pPr>
               <w:spacing w:before="0" w:after="0" w:line="240" w:lineRule="auto"/>
-              <w:jc w:val="left"/>
+              <w:jc w:val="both"/>
               <w:rPr/>
             </w:pPr>
             <w:r>
@@ -15631,7 +15651,7 @@
           <w:p>
             <w:pPr>
               <w:spacing w:before="0" w:after="0" w:line="240" w:lineRule="auto"/>
-              <w:jc w:val="left"/>
+              <w:jc w:val="both"/>
               <w:rPr/>
             </w:pPr>
             <w:r>
@@ -15673,7 +15693,7 @@
           <w:p>
             <w:pPr>
               <w:spacing w:before="0" w:after="0" w:line="240" w:lineRule="auto"/>
-              <w:jc w:val="left"/>
+              <w:jc w:val="both"/>
               <w:rPr/>
             </w:pPr>
             <w:r>
@@ -15702,7 +15722,7 @@
           <w:p>
             <w:pPr>
               <w:spacing w:before="0" w:after="0" w:line="240" w:lineRule="auto"/>
-              <w:jc w:val="left"/>
+              <w:jc w:val="both"/>
               <w:rPr/>
             </w:pPr>
             <w:r>
@@ -16164,7 +16184,7 @@
           <w:p>
             <w:pPr>
               <w:spacing w:before="0" w:after="0" w:line="240" w:lineRule="auto"/>
-              <w:jc w:val="left"/>
+              <w:jc w:val="both"/>
               <w:rPr/>
             </w:pPr>
             <w:r>
@@ -16198,7 +16218,7 @@
           <w:p>
             <w:pPr>
               <w:spacing w:before="0" w:after="0" w:line="240" w:lineRule="auto"/>
-              <w:jc w:val="left"/>
+              <w:jc w:val="both"/>
               <w:rPr/>
             </w:pPr>
             <w:r>
@@ -16232,7 +16252,7 @@
           <w:p>
             <w:pPr>
               <w:spacing w:before="0" w:after="0" w:line="240" w:lineRule="auto"/>
-              <w:jc w:val="left"/>
+              <w:jc w:val="both"/>
               <w:rPr/>
             </w:pPr>
             <w:r>
@@ -16266,7 +16286,7 @@
           <w:p>
             <w:pPr>
               <w:spacing w:before="0" w:after="0" w:line="240" w:lineRule="auto"/>
-              <w:jc w:val="left"/>
+              <w:jc w:val="both"/>
               <w:rPr/>
             </w:pPr>
             <w:r>
@@ -16300,7 +16320,7 @@
           <w:p>
             <w:pPr>
               <w:spacing w:before="0" w:after="0" w:line="240" w:lineRule="auto"/>
-              <w:jc w:val="left"/>
+              <w:jc w:val="both"/>
               <w:rPr/>
             </w:pPr>
             <w:r>
@@ -16334,7 +16354,7 @@
           <w:p>
             <w:pPr>
               <w:spacing w:before="0" w:after="0" w:line="240" w:lineRule="auto"/>
-              <w:jc w:val="left"/>
+              <w:jc w:val="both"/>
               <w:rPr/>
             </w:pPr>
             <w:r>
@@ -16368,7 +16388,7 @@
           <w:p>
             <w:pPr>
               <w:spacing w:before="0" w:after="0" w:line="240" w:lineRule="auto"/>
-              <w:jc w:val="left"/>
+              <w:jc w:val="both"/>
               <w:rPr/>
             </w:pPr>
             <w:r>
@@ -16402,7 +16422,7 @@
           <w:p>
             <w:pPr>
               <w:spacing w:before="0" w:after="0" w:line="240" w:lineRule="auto"/>
-              <w:jc w:val="left"/>
+              <w:jc w:val="both"/>
               <w:rPr/>
             </w:pPr>
             <w:r>
@@ -16781,7 +16801,7 @@
           <w:p>
             <w:pPr>
               <w:spacing w:before="0" w:after="0" w:line="240" w:lineRule="auto"/>
-              <w:jc w:val="left"/>
+              <w:jc w:val="both"/>
               <w:rPr/>
             </w:pPr>
             <w:r>
@@ -16815,7 +16835,7 @@
           <w:p>
             <w:pPr>
               <w:spacing w:before="0" w:after="0" w:line="240" w:lineRule="auto"/>
-              <w:jc w:val="left"/>
+              <w:jc w:val="both"/>
               <w:rPr/>
             </w:pPr>
             <w:r>
@@ -16849,7 +16869,7 @@
           <w:p>
             <w:pPr>
               <w:spacing w:before="0" w:after="0" w:line="240" w:lineRule="auto"/>
-              <w:jc w:val="left"/>
+              <w:jc w:val="both"/>
               <w:rPr/>
             </w:pPr>
             <w:r>
@@ -16883,7 +16903,7 @@
           <w:p>
             <w:pPr>
               <w:spacing w:before="0" w:after="0" w:line="240" w:lineRule="auto"/>
-              <w:jc w:val="left"/>
+              <w:jc w:val="both"/>
               <w:rPr/>
             </w:pPr>
             <w:r>
@@ -16917,7 +16937,7 @@
           <w:p>
             <w:pPr>
               <w:spacing w:before="0" w:after="0" w:line="240" w:lineRule="auto"/>
-              <w:jc w:val="left"/>
+              <w:jc w:val="both"/>
               <w:rPr/>
             </w:pPr>
             <w:r>
@@ -16951,7 +16971,7 @@
           <w:p>
             <w:pPr>
               <w:spacing w:before="0" w:after="0" w:line="240" w:lineRule="auto"/>
-              <w:jc w:val="left"/>
+              <w:jc w:val="both"/>
               <w:rPr/>
             </w:pPr>
             <w:r>
@@ -17249,7 +17269,7 @@
           <w:p>
             <w:pPr>
               <w:spacing w:before="0" w:after="0" w:line="240" w:lineRule="auto"/>
-              <w:jc w:val="left"/>
+              <w:jc w:val="both"/>
               <w:rPr/>
             </w:pPr>
             <w:r>
@@ -17283,7 +17303,7 @@
           <w:p>
             <w:pPr>
               <w:spacing w:before="0" w:after="0" w:line="240" w:lineRule="auto"/>
-              <w:jc w:val="left"/>
+              <w:jc w:val="both"/>
               <w:rPr/>
             </w:pPr>
             <w:r>
@@ -17317,7 +17337,7 @@
           <w:p>
             <w:pPr>
               <w:spacing w:before="0" w:after="0" w:line="240" w:lineRule="auto"/>
-              <w:jc w:val="left"/>
+              <w:jc w:val="both"/>
               <w:rPr/>
             </w:pPr>
             <w:r>
@@ -17351,7 +17371,7 @@
           <w:p>
             <w:pPr>
               <w:spacing w:before="0" w:after="0" w:line="240" w:lineRule="auto"/>
-              <w:jc w:val="left"/>
+              <w:jc w:val="both"/>
               <w:rPr/>
             </w:pPr>
             <w:r>
@@ -17385,7 +17405,7 @@
           <w:p>
             <w:pPr>
               <w:spacing w:before="0" w:after="0" w:line="240" w:lineRule="auto"/>
-              <w:jc w:val="left"/>
+              <w:jc w:val="both"/>
               <w:rPr/>
             </w:pPr>
             <w:r>
@@ -17419,7 +17439,7 @@
           <w:p>
             <w:pPr>
               <w:spacing w:before="0" w:after="0" w:line="240" w:lineRule="auto"/>
-              <w:jc w:val="left"/>
+              <w:jc w:val="both"/>
               <w:rPr/>
             </w:pPr>
             <w:r>

</xml_diff>